<commit_message>
docs: style RE.docx to match Guidebook-WaterMeterOCR.docx layout
- Cover page: centered, TH Sarabun style, colors #1F4E79/#595959, spacing 240, page break (like guidebook)
- Keep reference-doc styles: headers/footers, heading numbering, table shading, code block gray, A4 margins
- Content: TUTORIAL v1.1 APA7 (11 refs), 4 mermaid diagrams with fallbacks
- File size ~2.47MB, cover now renders at top before main title
</commit_message>
<xml_diff>
--- a/RE.docx
+++ b/RE.docx
@@ -2,6 +2,175 @@
 <file path=word/document.xml><?xml version="1.0" encoding="utf-8"?>
 <w:document xmlns:w="http://schemas.openxmlformats.org/wordprocessingml/2006/main" xmlns:m="http://schemas.openxmlformats.org/officeDocument/2006/math" xmlns:r="http://schemas.openxmlformats.org/officeDocument/2006/relationships" xmlns:o="urn:schemas-microsoft-com:office:office" xmlns:v="urn:schemas-microsoft-com:vml" xmlns:w10="urn:schemas-microsoft-com:office:word" xmlns:a="http://schemas.openxmlformats.org/drawingml/2006/main" xmlns:pic="http://schemas.openxmlformats.org/drawingml/2006/picture" xmlns:wp="http://schemas.openxmlformats.org/drawingml/2006/wordprocessingDrawing">
   <w:body>
+    <w:p>
+      <w:pPr>
+        <w:jc w:val="center"/>
+        <w:spacing w:before="800" w:line="240" w:lineRule="auto"/>
+      </w:pPr>
+      <w:r>
+        <w:rPr/>
+        <w:t xml:space="preserve"/>
+      </w:r>
+    </w:p>
+    <w:p>
+      <w:pPr>
+        <w:jc w:val="center"/>
+        <w:spacing w:after="120" w:line="240" w:lineRule="auto"/>
+      </w:pPr>
+      <w:r>
+        <w:rPr>
+          <w:b/>
+          <w:bCs/>
+          <w:sz w:val="32"/>
+          <w:szCs w:val="32"/>
+        </w:rPr>
+        <w:t xml:space="preserve">เอกสารประกอบการสอน</w:t>
+      </w:r>
+    </w:p>
+    <w:p>
+      <w:pPr>
+        <w:jc w:val="center"/>
+        <w:spacing w:after="80" w:line="240" w:lineRule="auto"/>
+      </w:pPr>
+      <w:r>
+        <w:rPr>
+          <w:b/>
+          <w:bCs/>
+          <w:sz w:val="36"/>
+          <w:szCs w:val="36"/>
+          <w:color w:val="1F4E79"/>
+        </w:rPr>
+        <w:t xml:space="preserve">ระบบอ่านค่ามิเตอร์น้ำด้วยเทคโนโลยีการรู้จำอักขระด้วยแสง</w:t>
+      </w:r>
+    </w:p>
+    <w:p>
+      <w:pPr>
+        <w:jc w:val="center"/>
+        <w:spacing w:after="80" w:line="240" w:lineRule="auto"/>
+      </w:pPr>
+      <w:r>
+        <w:rPr>
+          <w:b/>
+          <w:bCs/>
+          <w:sz w:val="28"/>
+          <w:szCs w:val="28"/>
+          <w:color w:val="1F4E79"/>
+        </w:rPr>
+        <w:t xml:space="preserve">Water Meter OCR</w:t>
+      </w:r>
+    </w:p>
+    <w:p>
+      <w:pPr>
+        <w:jc w:val="center"/>
+        <w:spacing w:after="320" w:line="240" w:lineRule="auto"/>
+      </w:pPr>
+      <w:r>
+        <w:rPr>
+          <w:b/>
+          <w:bCs/>
+          <w:sz w:val="22"/>
+          <w:szCs w:val="22"/>
+          <w:color w:val="595959"/>
+        </w:rPr>
+        <w:t xml:space="preserve">ฉบับปรับปรุง RE - v1.1 (APA 7th, Mermaid Diagrams, 11 References)</w:t>
+      </w:r>
+    </w:p>
+    <w:p>
+      <w:pPr>
+        <w:jc w:val="center"/>
+        <w:spacing w:after="80" w:line="240" w:lineRule="auto"/>
+      </w:pPr>
+      <w:r>
+        <w:rPr>
+          <w:sz w:val="26"/>
+          <w:szCs w:val="26"/>
+        </w:rPr>
+        <w:t xml:space="preserve">นายจิรเมธ ทองเปลว  รหัสประจำตัว 674230013</w:t>
+      </w:r>
+    </w:p>
+    <w:p>
+      <w:pPr>
+        <w:jc w:val="center"/>
+        <w:spacing w:after="120" w:line="240" w:lineRule="auto"/>
+      </w:pPr>
+      <w:r>
+        <w:rPr>
+          <w:sz w:val="24"/>
+          <w:szCs w:val="24"/>
+        </w:rPr>
+        <w:t xml:space="preserve">หมู่เรียน 67/44</w:t>
+      </w:r>
+    </w:p>
+    <w:p>
+      <w:pPr>
+        <w:jc w:val="center"/>
+        <w:spacing w:after="60" w:line="240" w:lineRule="auto"/>
+      </w:pPr>
+      <w:r>
+        <w:rPr>
+          <w:sz w:val="22"/>
+          <w:szCs w:val="22"/>
+        </w:rPr>
+        <w:t xml:space="preserve">โครงงานนี้เป็นส่วนหนึ่งของการศึกษารายวิชา 7203602</w:t>
+      </w:r>
+    </w:p>
+    <w:p>
+      <w:pPr>
+        <w:jc w:val="center"/>
+        <w:spacing w:after="60" w:line="240" w:lineRule="auto"/>
+      </w:pPr>
+      <w:r>
+        <w:rPr>
+          <w:sz w:val="22"/>
+          <w:szCs w:val="22"/>
+        </w:rPr>
+        <w:t xml:space="preserve">สาขาวิชาเทคโนโลยีสารสนเทศ  คณะวิทยาศาสตร์และเทคโนโลยี</w:t>
+      </w:r>
+    </w:p>
+    <w:p>
+      <w:pPr>
+        <w:jc w:val="center"/>
+        <w:spacing w:after="60" w:line="240" w:lineRule="auto"/>
+      </w:pPr>
+      <w:r>
+        <w:rPr>
+          <w:sz w:val="22"/>
+          <w:szCs w:val="22"/>
+        </w:rPr>
+        <w:t xml:space="preserve">มหาวิทยาลัยราชภัฏนครปฐม</w:t>
+      </w:r>
+    </w:p>
+    <w:p>
+      <w:pPr>
+        <w:jc w:val="center"/>
+        <w:spacing w:after="400" w:line="240" w:lineRule="auto"/>
+      </w:pPr>
+      <w:r>
+        <w:rPr>
+          <w:sz w:val="22"/>
+          <w:szCs w:val="22"/>
+        </w:rPr>
+        <w:t xml:space="preserve">ภาคเรียนที่ 1  ปีการศึกษา 2569</w:t>
+      </w:r>
+    </w:p>
+    <w:p>
+      <w:pPr>
+        <w:jc w:val="center"/>
+        <w:spacing w:after="200" w:line="240" w:lineRule="auto"/>
+      </w:pPr>
+      <w:r>
+        <w:rPr>
+          <w:sz w:val="22"/>
+          <w:szCs w:val="22"/>
+        </w:rPr>
+        <w:t xml:space="preserve">สิงหาคม 2569</w:t>
+      </w:r>
+    </w:p>
+    <w:p>
+      <w:r>
+        <w:br w:type="page"/>
+      </w:r>
+    </w:p>
     <w:bookmarkStart w:id="28" w:name="Xf658fe35d448c2726ccce00f5e714fca03c1a8d"/>
     <w:p>
       <w:pPr>

</xml_diff>

<commit_message>
docs: RE.docx front matter exactly like Guidebook (cover, preface, TOC, LOF)
- Copy first 39 elements (cover with logo, คำนำ, สารบัญ, สารบัญภาพ with fields) from Guidebook-WaterMeterOCR.docx verbatim via lxml
- Keep RE content from Heading1 ข้อแนะนำเบื้องต้น onwards (polished TUTORIAL v1.1: mermaid 4 diagrams, APA7 11 refs, conservative claims)
- Preserve styles, media, rels, headers/footers; file now 2.47MB with correct front matter
</commit_message>
<xml_diff>
--- a/RE.docx
+++ b/RE.docx
@@ -2,531 +2,1753 @@
 <file path=word/document.xml><?xml version="1.0" encoding="utf-8"?>
 <w:document xmlns:w="http://schemas.openxmlformats.org/wordprocessingml/2006/main" xmlns:m="http://schemas.openxmlformats.org/officeDocument/2006/math" xmlns:r="http://schemas.openxmlformats.org/officeDocument/2006/relationships" xmlns:o="urn:schemas-microsoft-com:office:office" xmlns:v="urn:schemas-microsoft-com:vml" xmlns:w10="urn:schemas-microsoft-com:office:word" xmlns:a="http://schemas.openxmlformats.org/drawingml/2006/main" xmlns:pic="http://schemas.openxmlformats.org/drawingml/2006/picture" xmlns:wp="http://schemas.openxmlformats.org/drawingml/2006/wordprocessingDrawing">
   <w:body>
-    <w:p>
-      <w:pPr>
+    <w:p xmlns:w14="http://schemas.microsoft.com/office/word/2010/wordml" xmlns:wp14="http://schemas.microsoft.com/office/word/2010/wordprocessingDrawing">
+      <w:pPr>
+        <w:spacing w:before="160" w:after="320" w:line="240" w:lineRule="auto"/>
         <w:jc w:val="center"/>
-        <w:spacing w:before="800" w:line="240" w:lineRule="auto"/>
-      </w:pPr>
-      <w:r>
-        <w:rPr/>
-        <w:t xml:space="preserve"/>
-      </w:r>
-    </w:p>
-    <w:p>
-      <w:pPr>
+        <w:rPr>
+          <w:rFonts w:hint="cs"/>
+          <w:cs/>
+        </w:rPr>
+      </w:pPr>
+      <w:r>
+        <w:rPr>
+          <w:noProof/>
+        </w:rPr>
+        <w:drawing>
+          <wp:inline distT="0" distB="0" distL="0" distR="0" wp14:anchorId="1D7977BB" wp14:editId="57F2F35C">
+            <wp:extent cx="1260000" cy="1591200"/>
+            <wp:effectExtent l="0" t="0" r="0" b="9525"/>
+            <wp:docPr id="1" name="Picture 1" descr="111"/>
+            <wp:cNvGraphicFramePr>
+              <a:graphicFrameLocks noChangeAspect="1"/>
+            </wp:cNvGraphicFramePr>
+            <a:graphic>
+              <a:graphicData uri="http://schemas.openxmlformats.org/drawingml/2006/picture">
+                <pic:pic>
+                  <pic:nvPicPr>
+                    <pic:cNvPr id="1" name="Picture 1" descr="111"/>
+                    <pic:cNvPicPr/>
+                  </pic:nvPicPr>
+                  <pic:blipFill>
+                    <a:blip r:embed="rId8" cstate="print"/>
+                    <a:srcRect/>
+                    <a:stretch>
+                      <a:fillRect/>
+                    </a:stretch>
+                  </pic:blipFill>
+                  <pic:spPr bwMode="auto">
+                    <a:xfrm>
+                      <a:off x="0" y="0"/>
+                      <a:ext cx="1260000" cy="1591200"/>
+                    </a:xfrm>
+                    <a:prstGeom prst="rect">
+                      <a:avLst/>
+                    </a:prstGeom>
+                    <a:noFill/>
+                    <a:ln w="9525">
+                      <a:noFill/>
+                      <a:miter lim="800000"/>
+                      <a:headEnd/>
+                      <a:tailEnd/>
+                    </a:ln>
+                  </pic:spPr>
+                </pic:pic>
+              </a:graphicData>
+            </a:graphic>
+          </wp:inline>
+        </w:drawing>
+      </w:r>
+    </w:p>
+    <w:p xmlns:w14="http://schemas.microsoft.com/office/word/2010/wordml">
+      <w:pPr>
+        <w:spacing w:before="280" w:line="240" w:lineRule="auto"/>
         <w:jc w:val="center"/>
-        <w:spacing w:after="120" w:line="240" w:lineRule="auto"/>
-      </w:pPr>
-      <w:r>
-        <w:rPr>
-          <w:b/>
-          <w:bCs/>
-          <w:sz w:val="32"/>
-          <w:szCs w:val="32"/>
-        </w:rPr>
-        <w:t xml:space="preserve">เอกสารประกอบการสอน</w:t>
-      </w:r>
-    </w:p>
-    <w:p>
-      <w:pPr>
-        <w:jc w:val="center"/>
-        <w:spacing w:after="80" w:line="240" w:lineRule="auto"/>
-      </w:pPr>
-      <w:r>
         <w:rPr>
           <w:b/>
           <w:bCs/>
           <w:sz w:val="36"/>
-          <w:szCs w:val="36"/>
-          <w:color w:val="1F4E79"/>
-        </w:rPr>
-        <w:t xml:space="preserve">ระบบอ่านค่ามิเตอร์น้ำด้วยเทคโนโลยีการรู้จำอักขระด้วยแสง</w:t>
-      </w:r>
-    </w:p>
-    <w:p>
-      <w:pPr>
-        <w:jc w:val="center"/>
-        <w:spacing w:after="80" w:line="240" w:lineRule="auto"/>
+          <w:szCs w:val="40"/>
+        </w:rPr>
       </w:pPr>
       <w:r>
         <w:rPr>
           <w:b/>
           <w:bCs/>
-          <w:sz w:val="28"/>
-          <w:szCs w:val="28"/>
-          <w:color w:val="1F4E79"/>
-        </w:rPr>
-        <w:t xml:space="preserve">Water Meter OCR</w:t>
-      </w:r>
-    </w:p>
-    <w:p>
-      <w:pPr>
+          <w:sz w:val="36"/>
+          <w:szCs w:val="40"/>
+          <w:cs/>
+        </w:rPr>
+        <w:t>เอกสารประกอบการสอน</w:t>
+      </w:r>
+    </w:p>
+    <w:p xmlns:w14="http://schemas.microsoft.com/office/word/2010/wordml">
+      <w:pPr>
+        <w:spacing w:before="160" w:line="240" w:lineRule="auto"/>
         <w:jc w:val="center"/>
-        <w:spacing w:after="320" w:line="240" w:lineRule="auto"/>
-      </w:pPr>
-      <w:r>
         <w:rPr>
           <w:b/>
           <w:bCs/>
-          <w:sz w:val="22"/>
-          <w:szCs w:val="22"/>
-          <w:color w:val="595959"/>
-        </w:rPr>
-        <w:t xml:space="preserve">ฉบับปรับปรุง RE - v1.1 (APA 7th, Mermaid Diagrams, 11 References)</w:t>
-      </w:r>
-    </w:p>
-    <w:p>
-      <w:pPr>
-        <w:jc w:val="center"/>
-        <w:spacing w:after="80" w:line="240" w:lineRule="auto"/>
-      </w:pPr>
-      <w:r>
-        <w:rPr>
-          <w:sz w:val="26"/>
-          <w:szCs w:val="26"/>
-        </w:rPr>
-        <w:t xml:space="preserve">นายจิรเมธ ทองเปลว  รหัสประจำตัว 674230013</w:t>
-      </w:r>
-    </w:p>
-    <w:p>
-      <w:pPr>
-        <w:jc w:val="center"/>
-        <w:spacing w:after="120" w:line="240" w:lineRule="auto"/>
-      </w:pPr>
-      <w:r>
-        <w:rPr>
-          <w:sz w:val="24"/>
-          <w:szCs w:val="24"/>
-        </w:rPr>
-        <w:t xml:space="preserve">หมู่เรียน 67/44</w:t>
-      </w:r>
-    </w:p>
-    <w:p>
-      <w:pPr>
-        <w:jc w:val="center"/>
-        <w:spacing w:after="60" w:line="240" w:lineRule="auto"/>
-      </w:pPr>
-      <w:r>
-        <w:rPr>
-          <w:sz w:val="22"/>
-          <w:szCs w:val="22"/>
-        </w:rPr>
-        <w:t xml:space="preserve">โครงงานนี้เป็นส่วนหนึ่งของการศึกษารายวิชา 7203602</w:t>
-      </w:r>
-    </w:p>
-    <w:p>
-      <w:pPr>
-        <w:jc w:val="center"/>
-        <w:spacing w:after="60" w:line="240" w:lineRule="auto"/>
-      </w:pPr>
-      <w:r>
-        <w:rPr>
-          <w:sz w:val="22"/>
-          <w:szCs w:val="22"/>
-        </w:rPr>
-        <w:t xml:space="preserve">สาขาวิชาเทคโนโลยีสารสนเทศ  คณะวิทยาศาสตร์และเทคโนโลยี</w:t>
-      </w:r>
-    </w:p>
-    <w:p>
-      <w:pPr>
-        <w:jc w:val="center"/>
-        <w:spacing w:after="60" w:line="240" w:lineRule="auto"/>
-      </w:pPr>
-      <w:r>
-        <w:rPr>
-          <w:sz w:val="22"/>
-          <w:szCs w:val="22"/>
-        </w:rPr>
-        <w:t xml:space="preserve">มหาวิทยาลัยราชภัฏนครปฐม</w:t>
-      </w:r>
-    </w:p>
-    <w:p>
-      <w:pPr>
-        <w:jc w:val="center"/>
-        <w:spacing w:after="400" w:line="240" w:lineRule="auto"/>
-      </w:pPr>
-      <w:r>
-        <w:rPr>
-          <w:sz w:val="22"/>
-          <w:szCs w:val="22"/>
-        </w:rPr>
-        <w:t xml:space="preserve">ภาคเรียนที่ 1  ปีการศึกษา 2569</w:t>
-      </w:r>
-    </w:p>
-    <w:p>
-      <w:pPr>
-        <w:jc w:val="center"/>
-        <w:spacing w:after="200" w:line="240" w:lineRule="auto"/>
-      </w:pPr>
-      <w:r>
-        <w:rPr>
-          <w:sz w:val="22"/>
-          <w:szCs w:val="22"/>
-        </w:rPr>
-        <w:t xml:space="preserve">สิงหาคม 2569</w:t>
-      </w:r>
-    </w:p>
-    <w:p>
-      <w:r>
-        <w:br w:type="page"/>
-      </w:r>
-    </w:p>
-    <w:bookmarkStart w:id="28" w:name="Xf658fe35d448c2726ccce00f5e714fca03c1a8d"/>
-    <w:p>
-      <w:pPr>
-        <w:pStyle w:val="Heading1"/>
-      </w:pPr>
-      <w:r>
-        <w:t xml:space="preserve">คู่มือการพัฒนาระบบอ่านค่ามาตรวัดน้ำอัตโนมัติด้วยปัญญาประดิษฐ์</w:t>
-      </w:r>
-    </w:p>
-    <w:bookmarkStart w:id="25" w:name="X90af988a9e0c93cd4b3acb48eb44aa0420d9552"/>
-    <w:p>
-      <w:pPr>
-        <w:pStyle w:val="Heading2"/>
-      </w:pPr>
-      <w:r>
-        <w:t xml:space="preserve">Automated Water Meter Reading System using Deep Learning &amp; Computer Vision</w:t>
-      </w:r>
-    </w:p>
-    <w:p>
-      <w:pPr>
-        <w:pStyle w:val="FirstParagraph"/>
-      </w:pPr>
-      <w:r>
-        <w:t xml:space="preserve">  คู่มือฉบับนี้ออกแบบสำหรับนักศึกษาที่เขียน Python พื้นฐานได้ อยากลองสร้าง</w:t>
-      </w:r>
-      <w:r>
-        <w:t xml:space="preserve"> </w:t>
-      </w:r>
+          <w:sz w:val="36"/>
+          <w:szCs w:val="40"/>
+        </w:rPr>
+      </w:pPr>
       <w:r>
         <w:rPr>
           <w:b/>
           <w:bCs/>
-        </w:rPr>
-        <w:t xml:space="preserve">ระบบอ่านตัวเลขมิเตอร์น้ำจากภาพถ่าย (Water Meter OCR)</w:t>
-      </w:r>
-      <w:r>
-        <w:t xml:space="preserve"> </w:t>
-      </w:r>
-      <w:r>
-        <w:t xml:space="preserve">แบบทำได้จริง — คุณไม่จำเป็นต้องเชี่ยวชาญ AI, YOLO, SigLIP2 หรือ OpenCV มาก่อน เครื่องมือเหล่านี้คือสิ่งที่โปรเจกต์หยิบมาใช้ให้คุณได้ลองเล่น ส่วนหน้าที่ของคุณคือค่อยๆ ทำความเข้าใจทีละขั้นตอนว่าแต่ละส่วนทำงานอย่างไร ผ่านโค้ดที่แบ่งเป็นฟังก์ชันเล็กๆ ตามหน้าที่ อ่านง่าย ทดลองแยกส่วนได้</w:t>
-      </w:r>
-    </w:p>
-    <w:p>
-      <w:pPr>
-        <w:pStyle w:val="BlockText"/>
-      </w:pPr>
-      <w:r>
+          <w:sz w:val="36"/>
+          <w:szCs w:val="40"/>
+          <w:cs/>
+        </w:rPr>
+        <w:t>ระบบอ่านค่ามิเตอร์น้ำด้วยเทคโนโลยีการรู้จำอักขระด้วยแสง</w:t>
+      </w:r>
+    </w:p>
+    <w:p xmlns:w14="http://schemas.microsoft.com/office/word/2010/wordml">
+      <w:pPr>
+        <w:spacing w:before="160" w:line="240" w:lineRule="auto"/>
+        <w:jc w:val="center"/>
         <w:rPr>
           <w:b/>
           <w:bCs/>
-        </w:rPr>
-        <w:t xml:space="preserve">เทคโนโลยีที่โปรเจกต์ใช้ (ไม่ใช่สิ่งที่ต้องรู้ก่อนเริ่ม):</w:t>
-      </w:r>
-      <w:r>
-        <w:t xml:space="preserve"> </w:t>
-      </w:r>
-      <w:r>
-        <w:t xml:space="preserve">Python • YOLO (ตรวจจับตัวเลข) • SigLIP2 (คัดกรองภาพ) • OpenCV (หมุนภาพ/ปรับแสง) • FastAPI (ทำ API) • Gradio (ทำหน้าเว็บ) •</w:t>
-      </w:r>
-      <w:r>
-        <w:t xml:space="preserve"> </w:t>
-      </w:r>
-      <w:r>
-        <w:rPr>
-          <w:rStyle w:val="VerbatimChar"/>
-        </w:rPr>
-        <w:t xml:space="preserve">uv</w:t>
-      </w:r>
-      <w:r>
-        <w:t xml:space="preserve"> </w:t>
-      </w:r>
-      <w:r>
-        <w:t xml:space="preserve">(ติดตั้งไลบรารีเร็ว) — เอกสารจะพาไปรู้จักแต่ละตัวตอนที่ต้องใช้งานจริง</w:t>
-      </w:r>
-    </w:p>
-    <w:p>
-      <w:r>
-        <w:pict>
-          <v:rect style="width:0;height:1.5pt" o:hralign="center" o:hrstd="t" o:hr="t"/>
-        </w:pict>
-      </w:r>
-    </w:p>
-    <w:bookmarkEnd w:id="25"/>
-    <w:bookmarkStart w:id="26" w:name="สารบญเนอหา-table-of-contents"/>
-    <w:p>
-      <w:pPr>
-        <w:pStyle w:val="Heading2"/>
-      </w:pPr>
-      <w:r>
-        <w:t xml:space="preserve">สารบัญเนื้อหา (Table of Contents)</w:t>
-      </w:r>
-    </w:p>
-    <w:p>
-      <w:pPr>
-        <w:pStyle w:val="Compact"/>
-        <w:numPr>
-          <w:ilvl w:val="0"/>
-          <w:numId w:val="1001"/>
-        </w:numPr>
-      </w:pPr>
-      <w:hyperlink w:anchor="ข้อแนะนำเบื้องต้นสำหรับการศึกษา">
+          <w:sz w:val="36"/>
+          <w:szCs w:val="40"/>
+        </w:rPr>
+      </w:pPr>
+      <w:r>
+        <w:rPr>
+          <w:b/>
+          <w:bCs/>
+          <w:sz w:val="36"/>
+          <w:szCs w:val="40"/>
+        </w:rPr>
+        <w:t>Water Meter OCR</w:t>
+      </w:r>
+    </w:p>
+    <w:p xmlns:w14="http://schemas.microsoft.com/office/word/2010/wordml">
+      <w:pPr>
+        <w:spacing w:before="160" w:line="240" w:lineRule="auto"/>
+        <w:jc w:val="center"/>
+        <w:rPr>
+          <w:b/>
+          <w:bCs/>
+          <w:sz w:val="36"/>
+          <w:szCs w:val="40"/>
+        </w:rPr>
+      </w:pPr>
+    </w:p>
+    <w:p xmlns:w14="http://schemas.microsoft.com/office/word/2010/wordml">
+      <w:pPr>
+        <w:spacing w:before="160" w:line="240" w:lineRule="auto"/>
+        <w:jc w:val="center"/>
+        <w:rPr>
+          <w:b/>
+          <w:bCs/>
+          <w:sz w:val="36"/>
+          <w:szCs w:val="40"/>
+        </w:rPr>
+      </w:pPr>
+    </w:p>
+    <w:p xmlns:w14="http://schemas.microsoft.com/office/word/2010/wordml">
+      <w:pPr>
+        <w:spacing w:before="160" w:line="240" w:lineRule="auto"/>
+        <w:jc w:val="center"/>
+        <w:rPr>
+          <w:b/>
+          <w:bCs/>
+          <w:sz w:val="36"/>
+          <w:szCs w:val="40"/>
+        </w:rPr>
+      </w:pPr>
+      <w:r>
+        <w:rPr>
+          <w:rFonts w:hint="cs"/>
+          <w:b/>
+          <w:bCs/>
+          <w:sz w:val="36"/>
+          <w:szCs w:val="40"/>
+          <w:cs/>
+        </w:rPr>
+        <w:t>นาย</w:t>
+      </w:r>
+      <w:r>
+        <w:rPr>
+          <w:b/>
+          <w:bCs/>
+          <w:sz w:val="36"/>
+          <w:szCs w:val="40"/>
+        </w:rPr>
+        <w:t>.</w:t>
+      </w:r>
+      <w:r>
+        <w:rPr>
+          <w:rFonts w:hint="cs"/>
+          <w:b/>
+          <w:bCs/>
+          <w:sz w:val="36"/>
+          <w:szCs w:val="40"/>
+          <w:cs/>
+        </w:rPr>
+        <w:t>จิรเมธ ทองเปลว</w:t>
+      </w:r>
+      <w:r>
+        <w:rPr>
+          <w:b/>
+          <w:bCs/>
+          <w:sz w:val="36"/>
+          <w:szCs w:val="40"/>
+        </w:rPr>
+        <w:tab/>
+      </w:r>
+      <w:r>
+        <w:rPr>
+          <w:rFonts w:hint="cs"/>
+          <w:b/>
+          <w:bCs/>
+          <w:sz w:val="36"/>
+          <w:szCs w:val="40"/>
+          <w:cs/>
+        </w:rPr>
+        <w:t>รหัสประจำตัว</w:t>
+      </w:r>
+      <w:r>
+        <w:rPr>
+          <w:b/>
+          <w:bCs/>
+          <w:sz w:val="36"/>
+          <w:szCs w:val="40"/>
+        </w:rPr>
+        <w:t xml:space="preserve"> 674230013</w:t>
+      </w:r>
+    </w:p>
+    <w:p xmlns:w14="http://schemas.microsoft.com/office/word/2010/wordml">
+      <w:pPr>
+        <w:spacing w:before="160" w:line="240" w:lineRule="auto"/>
+        <w:jc w:val="center"/>
+        <w:rPr>
+          <w:b/>
+          <w:bCs/>
+          <w:sz w:val="36"/>
+          <w:szCs w:val="40"/>
+        </w:rPr>
+      </w:pPr>
+      <w:r>
+        <w:rPr>
+          <w:rFonts w:hint="cs"/>
+          <w:b/>
+          <w:bCs/>
+          <w:sz w:val="36"/>
+          <w:szCs w:val="40"/>
+          <w:cs/>
+        </w:rPr>
+        <w:t>หมู่เรียน</w:t>
+      </w:r>
+      <w:r>
+        <w:rPr>
+          <w:b/>
+          <w:bCs/>
+          <w:sz w:val="36"/>
+          <w:szCs w:val="40"/>
+        </w:rPr>
+        <w:t xml:space="preserve"> 67/44</w:t>
+      </w:r>
+    </w:p>
+    <w:p xmlns:w14="http://schemas.microsoft.com/office/word/2010/wordml">
+      <w:pPr>
+        <w:spacing w:before="160" w:line="240" w:lineRule="auto"/>
+        <w:jc w:val="center"/>
+        <w:rPr>
+          <w:b/>
+          <w:bCs/>
+          <w:sz w:val="36"/>
+          <w:szCs w:val="40"/>
+        </w:rPr>
+      </w:pPr>
+    </w:p>
+    <w:p xmlns:w14="http://schemas.microsoft.com/office/word/2010/wordml">
+      <w:pPr>
+        <w:spacing w:before="160" w:line="240" w:lineRule="auto"/>
+        <w:rPr>
+          <w:b/>
+          <w:bCs/>
+          <w:sz w:val="36"/>
+          <w:szCs w:val="40"/>
+        </w:rPr>
+      </w:pPr>
+    </w:p>
+    <w:p xmlns:w14="http://schemas.microsoft.com/office/word/2010/wordml">
+      <w:pPr>
+        <w:spacing w:before="160" w:line="240" w:lineRule="auto"/>
+        <w:jc w:val="center"/>
+        <w:rPr>
+          <w:b/>
+          <w:bCs/>
+          <w:sz w:val="36"/>
+          <w:szCs w:val="40"/>
+        </w:rPr>
+      </w:pPr>
+      <w:r>
+        <w:rPr>
+          <w:rFonts w:hint="cs"/>
+          <w:b/>
+          <w:bCs/>
+          <w:sz w:val="36"/>
+          <w:szCs w:val="40"/>
+          <w:cs/>
+        </w:rPr>
+        <w:t>โครงงานนี้เป็นส่วนหนึ่งของการศึกษารายวิชา</w:t>
+      </w:r>
+      <w:r>
+        <w:rPr>
+          <w:b/>
+          <w:bCs/>
+          <w:sz w:val="36"/>
+          <w:szCs w:val="40"/>
+        </w:rPr>
+        <w:t xml:space="preserve"> </w:t>
+      </w:r>
+      <w:r>
+        <w:rPr>
+          <w:b/>
+          <w:bCs/>
+          <w:sz w:val="36"/>
+          <w:szCs w:val="40"/>
+        </w:rPr>
+        <w:t>7203602</w:t>
+      </w:r>
+    </w:p>
+    <w:p xmlns:w14="http://schemas.microsoft.com/office/word/2010/wordml">
+      <w:pPr>
+        <w:spacing w:before="160" w:line="240" w:lineRule="auto"/>
+        <w:jc w:val="center"/>
+        <w:rPr>
+          <w:b/>
+          <w:bCs/>
+          <w:sz w:val="36"/>
+          <w:szCs w:val="40"/>
+        </w:rPr>
+      </w:pPr>
+      <w:r>
+        <w:rPr>
+          <w:rFonts w:hint="cs"/>
+          <w:b/>
+          <w:bCs/>
+          <w:sz w:val="36"/>
+          <w:szCs w:val="40"/>
+          <w:cs/>
+        </w:rPr>
+        <w:t>สาขาวิชาเทคโนโลยีสารสนเทศ คณะวิทยาศาสตร์และเทคโนโลยี</w:t>
+      </w:r>
+    </w:p>
+    <w:p xmlns:w14="http://schemas.microsoft.com/office/word/2010/wordml">
+      <w:pPr>
+        <w:spacing w:before="160" w:line="240" w:lineRule="auto"/>
+        <w:jc w:val="center"/>
+        <w:rPr>
+          <w:b/>
+          <w:bCs/>
+          <w:sz w:val="36"/>
+          <w:szCs w:val="40"/>
+        </w:rPr>
+      </w:pPr>
+      <w:r>
+        <w:rPr>
+          <w:rFonts w:hint="cs"/>
+          <w:b/>
+          <w:bCs/>
+          <w:sz w:val="36"/>
+          <w:szCs w:val="40"/>
+          <w:cs/>
+        </w:rPr>
+        <w:t>มหาวิทยาลัยราชภัฏนครปฐม</w:t>
+      </w:r>
+    </w:p>
+    <w:p xmlns:w14="http://schemas.microsoft.com/office/word/2010/wordml">
+      <w:pPr>
+        <w:spacing w:before="160" w:line="240" w:lineRule="auto"/>
+        <w:jc w:val="center"/>
+        <w:rPr>
+          <w:b/>
+          <w:bCs/>
+          <w:sz w:val="36"/>
+          <w:szCs w:val="40"/>
+        </w:rPr>
+        <w:sectPr>
+          <w:pgSz w:w="11907" w:h="16840" w:code="9"/>
+          <w:pgMar w:top="1985" w:right="1418" w:bottom="1418" w:left="1985" w:header="720" w:footer="720" w:gutter="0"/>
+          <w:cols w:space="720"/>
+          <w:docGrid w:linePitch="360"/>
+        </w:sectPr>
+      </w:pPr>
+      <w:r>
+        <w:rPr>
+          <w:rFonts w:hint="cs"/>
+          <w:b/>
+          <w:bCs/>
+          <w:sz w:val="36"/>
+          <w:szCs w:val="40"/>
+          <w:cs/>
+        </w:rPr>
+        <w:t>ภาคเรียนที่</w:t>
+      </w:r>
+      <w:r>
+        <w:rPr>
+          <w:b/>
+          <w:bCs/>
+          <w:sz w:val="36"/>
+          <w:szCs w:val="40"/>
+        </w:rPr>
+        <w:t xml:space="preserve"> 1</w:t>
+      </w:r>
+      <w:r>
+        <w:rPr>
+          <w:rFonts w:hint="cs"/>
+          <w:b/>
+          <w:bCs/>
+          <w:sz w:val="36"/>
+          <w:szCs w:val="40"/>
+          <w:cs/>
+        </w:rPr>
+        <w:t xml:space="preserve"> ปีการศึกษา</w:t>
+      </w:r>
+      <w:r>
+        <w:rPr>
+          <w:b/>
+          <w:bCs/>
+          <w:sz w:val="36"/>
+          <w:szCs w:val="40"/>
+        </w:rPr>
+        <w:t xml:space="preserve"> 2569</w:t>
+      </w:r>
+    </w:p>
+    <w:p xmlns:w14="http://schemas.microsoft.com/office/word/2010/wordml">
+      <w:pPr>
+        <w:pStyle w:val="Heading1"/>
+      </w:pPr>
+      <w:bookmarkStart w:id="0" w:name="_Toc238392572"/>
+      <w:r>
+        <w:rPr>
+          <w:rFonts w:hint="cs"/>
+          <w:cs/>
+        </w:rPr>
+        <w:lastRenderedPageBreak/>
+        <w:t>คำนำ</w:t>
+      </w:r>
+      <w:bookmarkEnd w:id="0"/>
+    </w:p>
+    <w:p xmlns:w14="http://schemas.microsoft.com/office/word/2010/wordml">
+      <w:pPr>
+        <w:spacing w:after="0" w:line="240" w:lineRule="auto"/>
+        <w:ind w:firstLine="720"/>
+        <w:jc w:val="thaiDistribute"/>
+      </w:pPr>
+      <w:r>
+        <w:rPr>
+          <w:cs/>
+        </w:rPr>
+        <w:t>คู่มือฉบับนี้จัดทำขึ้นเพื่อใช้เป็นแนวทางในการศึกษาและพัฒนาระบบอ่านค่ามาตรวัดน้ำอัตโนมัติจากภาพถ่าย โดยประยุกต์ใช้เทคโนโลยีปัญญาประดิษฐ์ (</w:t>
+      </w:r>
+      <w:r>
+        <w:t xml:space="preserve">Artificial Intelligence) </w:t>
+      </w:r>
+      <w:r>
+        <w:br/>
+      </w:r>
+      <w:r>
+        <w:rPr>
+          <w:cs/>
+        </w:rPr>
+        <w:t>การประมวลผลภาพ (</w:t>
+      </w:r>
+      <w:r>
+        <w:t xml:space="preserve">Image Processing) </w:t>
+      </w:r>
+      <w:r>
+        <w:rPr>
+          <w:cs/>
+        </w:rPr>
+        <w:t>และการรู้จำอักขระจากภาพ (</w:t>
+      </w:r>
+      <w:r>
+        <w:t xml:space="preserve">Optical Character Recognition: OCR) </w:t>
+      </w:r>
+      <w:r>
+        <w:rPr>
+          <w:cs/>
+        </w:rPr>
+        <w:t>เพื่อเพิ่มประสิทธิภาพในการอ่านและจัดเก็บข้อมูลจากมาตรวัดน้ำ ตลอดจนเป็นแนวทางสำหรับผู้ที่สนใจนำเทคโนโลยีดังกล่าวไปประยุกต์ใช้ในการพัฒนาระบบอัตโนมัติในลักษณะอื่นต่อไป</w:t>
+      </w:r>
+    </w:p>
+    <w:p xmlns:w14="http://schemas.microsoft.com/office/word/2010/wordml">
+      <w:pPr>
+        <w:spacing w:after="0" w:line="240" w:lineRule="auto"/>
+        <w:ind w:firstLine="720"/>
+        <w:jc w:val="thaiDistribute"/>
+      </w:pPr>
+      <w:r>
+        <w:rPr>
+          <w:cs/>
+        </w:rPr>
+        <w:t xml:space="preserve">เนื้อหาของคู่มือฉบับนี้ครอบคลุมกระบวนการพัฒนาระบบอ่านค่ามาตรวัดน้ำอัตโนมัติอย่างเป็นลำดับ ตั้งแต่การรับและเตรียมข้อมูลภาพ การตรวจสอบและคัดกรองข้อมูล การปรับปรุงคุณภาพภาพด้วยเทคนิคการประมวลผลภาพ การตรวจจับตัวเลขบนหน้าปัดมาตรวัดน้ำ การอ่านและรู้จำตัวเลขด้วยเทคนิค </w:t>
+      </w:r>
+      <w:r>
+        <w:t xml:space="preserve">OCR </w:t>
+      </w:r>
+      <w:r>
+        <w:rPr>
+          <w:cs/>
+        </w:rPr>
+        <w:t xml:space="preserve">ตลอดจนการประมวลผลและส่งออกผลลัพธ์ของระบบ นอกจากนี้ ยังครอบคลุมการประยุกต์ใช้แบบจำลอง </w:t>
+      </w:r>
+      <w:r>
+        <w:t xml:space="preserve">YOLO </w:t>
+      </w:r>
+      <w:r>
+        <w:rPr>
+          <w:cs/>
+        </w:rPr>
+        <w:t xml:space="preserve">และ </w:t>
+      </w:r>
+      <w:r>
+        <w:t>SigLIP2</w:t>
+      </w:r>
+      <w:r>
+        <w:rPr>
+          <w:cs/>
+        </w:rPr>
+        <w:t xml:space="preserve"> รวมถึงการให้บริการแบบจำลองผ่าน </w:t>
+      </w:r>
+      <w:r>
+        <w:t xml:space="preserve">FastAPI </w:t>
+      </w:r>
+      <w:r>
+        <w:rPr>
+          <w:cs/>
+        </w:rPr>
+        <w:t xml:space="preserve">และการพัฒนาส่วนติดต่อผู้ใช้ด้วย </w:t>
+      </w:r>
+      <w:r>
+        <w:t xml:space="preserve">Gradio </w:t>
+      </w:r>
+      <w:r>
+        <w:rPr>
+          <w:cs/>
+        </w:rPr>
+        <w:t>เพื่อให้สามารถทดสอบการทำงานของระบบได้อย่างครบถ้วน</w:t>
+      </w:r>
+    </w:p>
+    <w:p xmlns:w14="http://schemas.microsoft.com/office/word/2010/wordml">
+      <w:pPr>
+        <w:spacing w:after="0" w:line="240" w:lineRule="auto"/>
+        <w:ind w:firstLine="720"/>
+        <w:jc w:val="thaiDistribute"/>
+      </w:pPr>
+      <w:r>
+        <w:rPr>
+          <w:cs/>
+        </w:rPr>
+        <w:t>ผู้จัดทำได้เรียบเรียงเนื้อหาและตัวอย่างการพัฒนาระบบโดยอาศัยการศึกษาค้นคว้าจากเอกสารทางวิชาการ งานวิจัย โครงการโอเพนซอร์ส และแหล่งข้อมูลทางเทคนิคที่เกี่ยวข้อง โดยจัดลำดับเนื้อหาให้มีความต่อเนื่องและสัมพันธ์กันตามกระบวนการทำงานของระบบ เพื่อให้ผู้อ่านสามารถศึกษา ทำความเข้าใจ และนำแนวทางรวมถึงตัวอย่างโค้ดไปประยุกต์ใช้ได้อย่างถูกต้องและเหมาะสม คู่มือฉบับนี้มุ่งหวังให้เป็นประโยชน์ต่อนักพัฒนาซอฟต์แวร์ นักศึกษา วิศวกรปัญญาประดิษฐ์ และผู้สนใจด้านคอมพิวเตอร์วิทัศน์ ตลอดจนผู้ที่ต้องการศึกษาแนวทางการประยุกต์ใช้ปัญญาประดิษฐ์เพื่อพัฒนาระบบอ่านข้อมูลจากภาพ</w:t>
+      </w:r>
+    </w:p>
+    <w:p xmlns:w14="http://schemas.microsoft.com/office/word/2010/wordml">
+      <w:pPr>
+        <w:spacing w:after="0" w:line="240" w:lineRule="auto"/>
+        <w:ind w:firstLine="720"/>
+        <w:jc w:val="thaiDistribute"/>
+        <w:rPr>
+          <w:rFonts w:hint="cs"/>
+        </w:rPr>
+      </w:pPr>
+      <w:r>
+        <w:rPr>
+          <w:cs/>
+        </w:rPr>
+        <w:t>ผู้จัดทำหวังเป็นอย่างยิ่งว่าคู่มือฉบับนี้จะเป็นประโยชน์ต่อการศึกษาและการพัฒนาระบบอ่านค่ามาตรวัดน้ำอัตโนมัติ รวมทั้งสามารถนำองค์ความรู้และแนวทางที่นำเสนอไปประยุกต์ใช้ในการพัฒนาระบบที่เกี่ยวข้องกับการตรวจจับและรู้จำข้อมูลจากภาพในอนาคต หากมีข้อเสนอแนะอันเป็นประโยชน์ต่อการปรับปรุงคู่มือฉบับนี้ ผู้จัดทำขอน้อมรับด้วยความขอบคุณยิ่ง</w:t>
+      </w:r>
+    </w:p>
+    <w:p xmlns:w14="http://schemas.microsoft.com/office/word/2010/wordml">
+      <w:pPr>
+        <w:spacing w:after="0" w:line="240" w:lineRule="auto"/>
+        <w:jc w:val="right"/>
+      </w:pPr>
+    </w:p>
+    <w:p xmlns:w14="http://schemas.microsoft.com/office/word/2010/wordml">
+      <w:pPr>
+        <w:spacing w:after="0" w:line="240" w:lineRule="auto"/>
+        <w:jc w:val="right"/>
+      </w:pPr>
+      <w:r>
+        <w:rPr>
+          <w:rFonts w:hint="cs"/>
+          <w:cs/>
+        </w:rPr>
+        <w:t>นาย</w:t>
+      </w:r>
+      <w:r>
+        <w:t xml:space="preserve">. </w:t>
+      </w:r>
+      <w:r>
+        <w:rPr>
+          <w:rFonts w:hint="cs"/>
+          <w:cs/>
+        </w:rPr>
+        <w:t>จิรเม</w:t>
+      </w:r>
+      <w:r>
+        <w:rPr>
+          <w:rFonts w:hint="cs"/>
+          <w:cs/>
+        </w:rPr>
+        <w:t>ธ</w:t>
+      </w:r>
+      <w:r>
+        <w:rPr>
+          <w:rFonts w:hint="cs"/>
+          <w:cs/>
+        </w:rPr>
+        <w:t xml:space="preserve"> ทองเปลว</w:t>
+      </w:r>
+    </w:p>
+    <w:p xmlns:w14="http://schemas.microsoft.com/office/word/2010/wordml">
+      <w:pPr>
+        <w:spacing w:after="0" w:line="240" w:lineRule="auto"/>
+        <w:jc w:val="right"/>
+      </w:pPr>
+      <w:r>
+        <w:rPr>
+          <w:rFonts w:hint="cs"/>
+          <w:cs/>
+        </w:rPr>
+        <w:t>สิงหาคม</w:t>
+      </w:r>
+      <w:r>
+        <w:t xml:space="preserve"> 2569</w:t>
+      </w:r>
+    </w:p>
+    <w:p xmlns:w14="http://schemas.microsoft.com/office/word/2010/wordml">
+      <w:pPr>
+        <w:pStyle w:val="Heading1"/>
+      </w:pPr>
+      <w:r>
+        <w:rPr>
+          <w:szCs w:val="32"/>
+        </w:rPr>
+        <w:br w:type="page"/>
+      </w:r>
+      <w:bookmarkStart w:id="1" w:name="_Toc238392573"/>
+      <w:r>
+        <w:rPr>
+          <w:rFonts w:hint="cs"/>
+          <w:cs/>
+        </w:rPr>
+        <w:lastRenderedPageBreak/>
+        <w:t>สารบัญ</w:t>
+      </w:r>
+      <w:bookmarkEnd w:id="1"/>
+    </w:p>
+    <w:p xmlns:w14="http://schemas.microsoft.com/office/word/2010/wordml">
+      <w:pPr>
+        <w:pStyle w:val="TOC1"/>
+        <w:tabs>
+          <w:tab w:val="right" w:leader="dot" w:pos="8494"/>
+        </w:tabs>
+        <w:rPr>
+          <w:rFonts w:asciiTheme="minorHAnsi" w:eastAsiaTheme="minorEastAsia" w:hAnsiTheme="minorHAnsi" w:cstheme="minorBidi"/>
+          <w:noProof/>
+          <w:sz w:val="24"/>
+          <w:szCs w:val="30"/>
+        </w:rPr>
+      </w:pPr>
+      <w:r>
+        <w:rPr>
+          <w:cs/>
+        </w:rPr>
+        <w:fldChar w:fldCharType="begin"/>
+      </w:r>
+      <w:r>
+        <w:rPr>
+          <w:cs/>
+        </w:rPr>
+        <w:instrText xml:space="preserve"> </w:instrText>
+      </w:r>
+      <w:r>
+        <w:rPr>
+          <w:rFonts w:hint="cs"/>
+        </w:rPr>
+        <w:instrText>TOC \o "</w:instrText>
+      </w:r>
+      <w:r>
+        <w:rPr>
+          <w:rFonts w:hint="cs"/>
+          <w:cs/>
+        </w:rPr>
+        <w:instrText xml:space="preserve">1-3" </w:instrText>
+      </w:r>
+      <w:r>
+        <w:rPr>
+          <w:rFonts w:hint="cs"/>
+        </w:rPr>
+        <w:instrText>\h \z \u</w:instrText>
+      </w:r>
+      <w:r>
+        <w:rPr>
+          <w:cs/>
+        </w:rPr>
+        <w:instrText xml:space="preserve"> </w:instrText>
+      </w:r>
+      <w:r>
+        <w:rPr>
+          <w:cs/>
+        </w:rPr>
+        <w:fldChar w:fldCharType="separate"/>
+      </w:r>
+      <w:hyperlink w:anchor="_Toc238392572" w:history="1">
         <w:r>
           <w:rPr>
             <w:rStyle w:val="Hyperlink"/>
+            <w:noProof/>
+            <w:cs/>
           </w:rPr>
-          <w:t xml:space="preserve">ข้อแนะนำเบื้องต้นสำหรับการศึกษา</w:t>
+          <w:t>คำนำ</w:t>
+        </w:r>
+        <w:r>
+          <w:rPr>
+            <w:noProof/>
+            <w:webHidden/>
+          </w:rPr>
+          <w:tab/>
+        </w:r>
+        <w:r>
+          <w:rPr>
+            <w:noProof/>
+            <w:webHidden/>
+          </w:rPr>
+          <w:fldChar w:fldCharType="begin"/>
+        </w:r>
+        <w:r>
+          <w:rPr>
+            <w:noProof/>
+            <w:webHidden/>
+          </w:rPr>
+          <w:instrText xml:space="preserve"> PAGEREF _Toc238392572 \h </w:instrText>
+        </w:r>
+        <w:r>
+          <w:rPr>
+            <w:noProof/>
+            <w:webHidden/>
+          </w:rPr>
+        </w:r>
+        <w:r>
+          <w:rPr>
+            <w:noProof/>
+            <w:webHidden/>
+          </w:rPr>
+          <w:fldChar w:fldCharType="separate"/>
+        </w:r>
+        <w:r>
+          <w:rPr>
+            <w:noProof/>
+            <w:webHidden/>
+          </w:rPr>
+          <w:t>1</w:t>
+        </w:r>
+        <w:r>
+          <w:rPr>
+            <w:noProof/>
+            <w:webHidden/>
+          </w:rPr>
+          <w:fldChar w:fldCharType="end"/>
         </w:r>
       </w:hyperlink>
     </w:p>
-    <w:p>
-      <w:pPr>
-        <w:pStyle w:val="Compact"/>
-        <w:numPr>
-          <w:ilvl w:val="0"/>
-          <w:numId w:val="1001"/>
-        </w:numPr>
-      </w:pPr>
-      <w:hyperlink w:anchor="Xe75dcfc2b7bd38a302ff5982a272a82b3c6e67e">
+    <w:p xmlns:w14="http://schemas.microsoft.com/office/word/2010/wordml">
+      <w:pPr>
+        <w:pStyle w:val="TOC1"/>
+        <w:tabs>
+          <w:tab w:val="right" w:leader="dot" w:pos="8494"/>
+        </w:tabs>
+        <w:rPr>
+          <w:rFonts w:asciiTheme="minorHAnsi" w:eastAsiaTheme="minorEastAsia" w:hAnsiTheme="minorHAnsi" w:cstheme="minorBidi"/>
+          <w:noProof/>
+          <w:sz w:val="24"/>
+          <w:szCs w:val="30"/>
+        </w:rPr>
+      </w:pPr>
+      <w:hyperlink w:anchor="_Toc238392573" w:history="1">
         <w:r>
           <w:rPr>
             <w:rStyle w:val="Hyperlink"/>
+            <w:noProof/>
+            <w:cs/>
           </w:rPr>
-          <w:t xml:space="preserve">บทที่ 1: พื้นฐาน การออกแบบ และการประมวลผลภาพ (Fundamentals, Design, and Image Processing)</w:t>
+          <w:t>สารบัญ</w:t>
+        </w:r>
+        <w:r>
+          <w:rPr>
+            <w:noProof/>
+            <w:webHidden/>
+          </w:rPr>
+          <w:tab/>
+        </w:r>
+        <w:r>
+          <w:rPr>
+            <w:noProof/>
+            <w:webHidden/>
+          </w:rPr>
+          <w:fldChar w:fldCharType="begin"/>
+        </w:r>
+        <w:r>
+          <w:rPr>
+            <w:noProof/>
+            <w:webHidden/>
+          </w:rPr>
+          <w:instrText xml:space="preserve"> PAGEREF _Toc238392573 \h </w:instrText>
+        </w:r>
+        <w:r>
+          <w:rPr>
+            <w:noProof/>
+            <w:webHidden/>
+          </w:rPr>
+        </w:r>
+        <w:r>
+          <w:rPr>
+            <w:noProof/>
+            <w:webHidden/>
+          </w:rPr>
+          <w:fldChar w:fldCharType="separate"/>
+        </w:r>
+        <w:r>
+          <w:rPr>
+            <w:noProof/>
+            <w:webHidden/>
+          </w:rPr>
+          <w:t>2</w:t>
+        </w:r>
+        <w:r>
+          <w:rPr>
+            <w:noProof/>
+            <w:webHidden/>
+          </w:rPr>
+          <w:fldChar w:fldCharType="end"/>
         </w:r>
       </w:hyperlink>
     </w:p>
-    <w:p>
-      <w:pPr>
-        <w:pStyle w:val="Compact"/>
-        <w:numPr>
-          <w:ilvl w:val="1"/>
-          <w:numId w:val="1002"/>
-        </w:numPr>
-      </w:pPr>
-      <w:hyperlink w:anchor="X104b1c787b3067a185150dee600e58f8be37d14">
+    <w:p xmlns:w14="http://schemas.microsoft.com/office/word/2010/wordml">
+      <w:pPr>
+        <w:pStyle w:val="TOC1"/>
+        <w:tabs>
+          <w:tab w:val="right" w:leader="dot" w:pos="8494"/>
+        </w:tabs>
+        <w:rPr>
+          <w:rFonts w:asciiTheme="minorHAnsi" w:eastAsiaTheme="minorEastAsia" w:hAnsiTheme="minorHAnsi" w:cstheme="minorBidi"/>
+          <w:noProof/>
+          <w:sz w:val="24"/>
+          <w:szCs w:val="30"/>
+        </w:rPr>
+      </w:pPr>
+      <w:hyperlink w:anchor="_Toc238392574" w:history="1">
         <w:r>
           <w:rPr>
             <w:rStyle w:val="Hyperlink"/>
+            <w:noProof/>
+            <w:cs/>
           </w:rPr>
-          <w:t xml:space="preserve">1.1 ทฤษฎีและหลักการพื้นฐาน (Theory &amp; Fundamentals)</w:t>
+          <w:t>ข้อแนะนำเบื้องต้นสำหรับการศึกษา</w:t>
+        </w:r>
+        <w:r>
+          <w:rPr>
+            <w:noProof/>
+            <w:webHidden/>
+          </w:rPr>
+          <w:tab/>
+        </w:r>
+        <w:r>
+          <w:rPr>
+            <w:noProof/>
+            <w:webHidden/>
+          </w:rPr>
+          <w:fldChar w:fldCharType="begin"/>
+        </w:r>
+        <w:r>
+          <w:rPr>
+            <w:noProof/>
+            <w:webHidden/>
+          </w:rPr>
+          <w:instrText xml:space="preserve"> PAGEREF _Toc238392574 \h </w:instrText>
+        </w:r>
+        <w:r>
+          <w:rPr>
+            <w:noProof/>
+            <w:webHidden/>
+          </w:rPr>
+        </w:r>
+        <w:r>
+          <w:rPr>
+            <w:noProof/>
+            <w:webHidden/>
+          </w:rPr>
+          <w:fldChar w:fldCharType="separate"/>
+        </w:r>
+        <w:r>
+          <w:rPr>
+            <w:noProof/>
+            <w:webHidden/>
+          </w:rPr>
+          <w:t>3</w:t>
+        </w:r>
+        <w:r>
+          <w:rPr>
+            <w:noProof/>
+            <w:webHidden/>
+          </w:rPr>
+          <w:fldChar w:fldCharType="end"/>
         </w:r>
       </w:hyperlink>
     </w:p>
-    <w:p>
-      <w:pPr>
-        <w:pStyle w:val="Compact"/>
-        <w:numPr>
-          <w:ilvl w:val="1"/>
-          <w:numId w:val="1002"/>
-        </w:numPr>
-      </w:pPr>
-      <w:hyperlink w:anchor="X70e75f3ce7ff118c54b550632a640bc457a2c9a">
+    <w:p xmlns:w14="http://schemas.microsoft.com/office/word/2010/wordml">
+      <w:pPr>
+        <w:pStyle w:val="TOC1"/>
+        <w:tabs>
+          <w:tab w:val="right" w:leader="dot" w:pos="8494"/>
+        </w:tabs>
+        <w:rPr>
+          <w:rFonts w:asciiTheme="minorHAnsi" w:eastAsiaTheme="minorEastAsia" w:hAnsiTheme="minorHAnsi" w:cstheme="minorBidi"/>
+          <w:noProof/>
+          <w:sz w:val="24"/>
+          <w:szCs w:val="30"/>
+        </w:rPr>
+      </w:pPr>
+      <w:hyperlink w:anchor="_Toc238392575" w:history="1">
         <w:r>
           <w:rPr>
             <w:rStyle w:val="Hyperlink"/>
+            <w:noProof/>
+            <w:cs/>
           </w:rPr>
-          <w:t xml:space="preserve">1.2 การฝึกแบบจำลองสำหรับการอ่านตัวเลข (Model Training)</w:t>
+          <w:t>บทที่ 1</w:t>
         </w:r>
-      </w:hyperlink>
-    </w:p>
-    <w:p>
-      <w:pPr>
-        <w:pStyle w:val="Compact"/>
-        <w:numPr>
-          <w:ilvl w:val="1"/>
-          <w:numId w:val="1002"/>
-        </w:numPr>
-      </w:pPr>
-      <w:hyperlink w:anchor="Xbdb836e5c002b2ab0cca0e80e7cb0ab38dacf77">
         <w:r>
           <w:rPr>
             <w:rStyle w:val="Hyperlink"/>
+            <w:noProof/>
           </w:rPr>
-          <w:t xml:space="preserve">1.3 สภาพแวดล้อมและการจัดการโปรเจกต์ด้วย uv (Environment &amp; Project Setup)</w:t>
+          <w:t xml:space="preserve"> </w:t>
         </w:r>
-      </w:hyperlink>
-    </w:p>
-    <w:p>
-      <w:pPr>
-        <w:pStyle w:val="Compact"/>
-        <w:numPr>
-          <w:ilvl w:val="1"/>
-          <w:numId w:val="1002"/>
-        </w:numPr>
-      </w:pPr>
-      <w:hyperlink w:anchor="Xbea97ce28bbc71f307e0e7d9397d574f316eed3">
         <w:r>
           <w:rPr>
             <w:rStyle w:val="Hyperlink"/>
+            <w:noProof/>
+            <w:cs/>
           </w:rPr>
-          <w:t xml:space="preserve">1.4 การคัดกรองภาพแบบซีโร่ช็อตด้วย SigLIP2 (Zero-shot Classification)</w:t>
+          <w:t>พื้นฐานการออกแบบและการประมวลผลภาพ</w:t>
+        </w:r>
+        <w:r>
+          <w:rPr>
+            <w:noProof/>
+            <w:webHidden/>
+          </w:rPr>
+          <w:tab/>
+        </w:r>
+        <w:r>
+          <w:rPr>
+            <w:noProof/>
+            <w:webHidden/>
+          </w:rPr>
+          <w:fldChar w:fldCharType="begin"/>
+        </w:r>
+        <w:r>
+          <w:rPr>
+            <w:noProof/>
+            <w:webHidden/>
+          </w:rPr>
+          <w:instrText xml:space="preserve"> PAGEREF _Toc238392575 \h </w:instrText>
+        </w:r>
+        <w:r>
+          <w:rPr>
+            <w:noProof/>
+            <w:webHidden/>
+          </w:rPr>
+        </w:r>
+        <w:r>
+          <w:rPr>
+            <w:noProof/>
+            <w:webHidden/>
+          </w:rPr>
+          <w:fldChar w:fldCharType="separate"/>
+        </w:r>
+        <w:r>
+          <w:rPr>
+            <w:noProof/>
+            <w:webHidden/>
+          </w:rPr>
+          <w:t>4</w:t>
+        </w:r>
+        <w:r>
+          <w:rPr>
+            <w:noProof/>
+            <w:webHidden/>
+          </w:rPr>
+          <w:fldChar w:fldCharType="end"/>
         </w:r>
       </w:hyperlink>
     </w:p>
-    <w:p>
-      <w:pPr>
-        <w:pStyle w:val="Compact"/>
-        <w:numPr>
-          <w:ilvl w:val="1"/>
-          <w:numId w:val="1002"/>
-        </w:numPr>
-      </w:pPr>
-      <w:hyperlink w:anchor="Xa718849c855113d661c0e2f414737930c30b6b4">
+    <w:p xmlns:w14="http://schemas.microsoft.com/office/word/2010/wordml">
+      <w:pPr>
+        <w:pStyle w:val="TOC2"/>
+        <w:tabs>
+          <w:tab w:val="right" w:leader="dot" w:pos="8494"/>
+        </w:tabs>
+        <w:rPr>
+          <w:rFonts w:asciiTheme="minorHAnsi" w:eastAsiaTheme="minorEastAsia" w:hAnsiTheme="minorHAnsi" w:cstheme="minorBidi"/>
+          <w:noProof/>
+          <w:sz w:val="24"/>
+          <w:szCs w:val="30"/>
+        </w:rPr>
+      </w:pPr>
+      <w:hyperlink w:anchor="_Toc238392576" w:history="1">
         <w:r>
           <w:rPr>
             <w:rStyle w:val="Hyperlink"/>
+            <w:noProof/>
           </w:rPr>
-          <w:t xml:space="preserve">1.5 การตรวจจับและอ่านค่าตัวเลข (Computer Vision &amp; Digit Detection Engine)</w:t>
+          <w:t xml:space="preserve">1.1 </w:t>
         </w:r>
-      </w:hyperlink>
-    </w:p>
-    <w:p>
-      <w:pPr>
-        <w:pStyle w:val="Compact"/>
-        <w:numPr>
-          <w:ilvl w:val="0"/>
-          <w:numId w:val="1001"/>
-        </w:numPr>
-      </w:pPr>
-      <w:hyperlink w:anchor="X0694600c5fc54889323eb107a2a1738152477b6">
         <w:r>
           <w:rPr>
             <w:rStyle w:val="Hyperlink"/>
+            <w:noProof/>
+            <w:cs/>
           </w:rPr>
-          <w:t xml:space="preserve">บทที่ 2: การพัฒนาแอปพลิเคชันและส่วนติดต่อผู้ใช้ (Application &amp; UI Development)</w:t>
+          <w:t>ทฤษฎีและหลักการพื้นฐาน (</w:t>
         </w:r>
-      </w:hyperlink>
-    </w:p>
-    <w:p>
-      <w:pPr>
-        <w:pStyle w:val="Compact"/>
-        <w:numPr>
-          <w:ilvl w:val="1"/>
-          <w:numId w:val="1003"/>
-        </w:numPr>
-      </w:pPr>
-      <w:hyperlink w:anchor="X694614821c3c8f22b6311d97a86e6bc4894126b">
         <w:r>
           <w:rPr>
             <w:rStyle w:val="Hyperlink"/>
+            <w:noProof/>
           </w:rPr>
-          <w:t xml:space="preserve">2.1 การบูรณาการระบบประมวลผลหลักและระบบความปลอดภัย (Core Pipeline &amp; Safety Guards)</w:t>
+          <w:t>Theory &amp; Fundamentals)</w:t>
+        </w:r>
+        <w:r>
+          <w:rPr>
+            <w:noProof/>
+            <w:webHidden/>
+          </w:rPr>
+          <w:tab/>
+        </w:r>
+        <w:r>
+          <w:rPr>
+            <w:noProof/>
+            <w:webHidden/>
+          </w:rPr>
+          <w:fldChar w:fldCharType="begin"/>
+        </w:r>
+        <w:r>
+          <w:rPr>
+            <w:noProof/>
+            <w:webHidden/>
+          </w:rPr>
+          <w:instrText xml:space="preserve"> PAGEREF _Toc238392576 \h </w:instrText>
+        </w:r>
+        <w:r>
+          <w:rPr>
+            <w:noProof/>
+            <w:webHidden/>
+          </w:rPr>
+        </w:r>
+        <w:r>
+          <w:rPr>
+            <w:noProof/>
+            <w:webHidden/>
+          </w:rPr>
+          <w:fldChar w:fldCharType="separate"/>
+        </w:r>
+        <w:r>
+          <w:rPr>
+            <w:noProof/>
+            <w:webHidden/>
+          </w:rPr>
+          <w:t>4</w:t>
+        </w:r>
+        <w:r>
+          <w:rPr>
+            <w:noProof/>
+            <w:webHidden/>
+          </w:rPr>
+          <w:fldChar w:fldCharType="end"/>
         </w:r>
       </w:hyperlink>
     </w:p>
-    <w:p>
-      <w:pPr>
-        <w:pStyle w:val="Compact"/>
-        <w:numPr>
-          <w:ilvl w:val="1"/>
-          <w:numId w:val="1003"/>
-        </w:numPr>
-      </w:pPr>
-      <w:hyperlink w:anchor="Xa2095b1ccffb89e930836b07edb5f3c649bab41">
+    <w:p xmlns:w14="http://schemas.microsoft.com/office/word/2010/wordml">
+      <w:pPr>
+        <w:pStyle w:val="TOC3"/>
+        <w:tabs>
+          <w:tab w:val="left" w:pos="1440"/>
+          <w:tab w:val="right" w:leader="dot" w:pos="8494"/>
+        </w:tabs>
+        <w:rPr>
+          <w:rFonts w:asciiTheme="minorHAnsi" w:eastAsiaTheme="minorEastAsia" w:hAnsiTheme="minorHAnsi" w:cstheme="minorBidi"/>
+          <w:noProof/>
+          <w:sz w:val="24"/>
+          <w:szCs w:val="30"/>
+        </w:rPr>
+      </w:pPr>
+      <w:hyperlink w:anchor="_Toc238392577" w:history="1">
         <w:r>
           <w:rPr>
             <w:rStyle w:val="Hyperlink"/>
+            <w:noProof/>
           </w:rPr>
-          <w:t xml:space="preserve">2.2 การพัฒนาส่วนเชื่อมต่อโปรแกรมประยุกต์ด้วย FastAPI (REST API Development)</w:t>
+          <w:t>1.1.1</w:t>
         </w:r>
-      </w:hyperlink>
-    </w:p>
-    <w:p>
-      <w:pPr>
-        <w:pStyle w:val="Compact"/>
-        <w:numPr>
-          <w:ilvl w:val="1"/>
-          <w:numId w:val="1003"/>
-        </w:numPr>
-      </w:pPr>
-      <w:hyperlink w:anchor="X8e1de64f891f336effd460439d0eaaa82435a3c">
+        <w:r>
+          <w:rPr>
+            <w:rFonts w:asciiTheme="minorHAnsi" w:eastAsiaTheme="minorEastAsia" w:hAnsiTheme="minorHAnsi" w:cstheme="minorBidi"/>
+            <w:noProof/>
+            <w:sz w:val="24"/>
+            <w:szCs w:val="30"/>
+          </w:rPr>
+          <w:tab/>
+        </w:r>
         <w:r>
           <w:rPr>
             <w:rStyle w:val="Hyperlink"/>
+            <w:noProof/>
+            <w:cs/>
           </w:rPr>
-          <w:t xml:space="preserve">2.3 การพัฒนาส่วนติดต่อผู้ใช้ด้วย Gradio (Frontend Development)</w:t>
+          <w:t>คอมพิวเตอร์วิทัศน์และการตรวจจับวัตถุ</w:t>
+        </w:r>
+        <w:r>
+          <w:rPr>
+            <w:noProof/>
+            <w:webHidden/>
+          </w:rPr>
+          <w:tab/>
+        </w:r>
+        <w:r>
+          <w:rPr>
+            <w:noProof/>
+            <w:webHidden/>
+          </w:rPr>
+          <w:fldChar w:fldCharType="begin"/>
+        </w:r>
+        <w:r>
+          <w:rPr>
+            <w:noProof/>
+            <w:webHidden/>
+          </w:rPr>
+          <w:instrText xml:space="preserve"> PAGEREF _Toc238392577 \h </w:instrText>
+        </w:r>
+        <w:r>
+          <w:rPr>
+            <w:noProof/>
+            <w:webHidden/>
+          </w:rPr>
+        </w:r>
+        <w:r>
+          <w:rPr>
+            <w:noProof/>
+            <w:webHidden/>
+          </w:rPr>
+          <w:fldChar w:fldCharType="separate"/>
+        </w:r>
+        <w:r>
+          <w:rPr>
+            <w:noProof/>
+            <w:webHidden/>
+          </w:rPr>
+          <w:t>4</w:t>
+        </w:r>
+        <w:r>
+          <w:rPr>
+            <w:noProof/>
+            <w:webHidden/>
+          </w:rPr>
+          <w:fldChar w:fldCharType="end"/>
         </w:r>
       </w:hyperlink>
     </w:p>
-    <w:p>
-      <w:pPr>
-        <w:pStyle w:val="Compact"/>
-        <w:numPr>
-          <w:ilvl w:val="1"/>
-          <w:numId w:val="1003"/>
-        </w:numPr>
-      </w:pPr>
-      <w:hyperlink w:anchor="Xcfa02e2227753c7abfae794696c291db4485dc3">
+    <w:p xmlns:w14="http://schemas.microsoft.com/office/word/2010/wordml">
+      <w:pPr>
+        <w:pStyle w:val="TOC3"/>
+        <w:tabs>
+          <w:tab w:val="left" w:pos="1440"/>
+          <w:tab w:val="right" w:leader="dot" w:pos="8494"/>
+        </w:tabs>
+        <w:rPr>
+          <w:rFonts w:asciiTheme="minorHAnsi" w:eastAsiaTheme="minorEastAsia" w:hAnsiTheme="minorHAnsi" w:cstheme="minorBidi"/>
+          <w:noProof/>
+          <w:sz w:val="24"/>
+          <w:szCs w:val="30"/>
+        </w:rPr>
+      </w:pPr>
+      <w:hyperlink w:anchor="_Toc238392578" w:history="1">
         <w:r>
           <w:rPr>
             <w:rStyle w:val="Hyperlink"/>
+            <w:noProof/>
           </w:rPr>
-          <w:t xml:space="preserve">2.4 การรัน ทดสอบ และคู่มือแก้ปัญหา (Testing &amp; Troubleshooting)</w:t>
+          <w:t>1.1.2</w:t>
         </w:r>
-      </w:hyperlink>
-    </w:p>
-    <w:p>
-      <w:pPr>
-        <w:pStyle w:val="Compact"/>
-        <w:numPr>
-          <w:ilvl w:val="1"/>
-          <w:numId w:val="1003"/>
-        </w:numPr>
-      </w:pPr>
-      <w:hyperlink w:anchor="X9232c420ebe9ea6350d342983b3355fa451532a">
+        <w:r>
+          <w:rPr>
+            <w:rFonts w:asciiTheme="minorHAnsi" w:eastAsiaTheme="minorEastAsia" w:hAnsiTheme="minorHAnsi" w:cstheme="minorBidi"/>
+            <w:noProof/>
+            <w:sz w:val="24"/>
+            <w:szCs w:val="30"/>
+          </w:rPr>
+          <w:tab/>
+        </w:r>
         <w:r>
           <w:rPr>
             <w:rStyle w:val="Hyperlink"/>
+            <w:noProof/>
+            <w:cs/>
           </w:rPr>
-          <w:t xml:space="preserve">2.5 ข้อควรพิจารณาก่อนการใช้งานจริง (Production Readiness)</w:t>
+          <w:t>การจำแนกภาพโดยไม่ใช้ชุดฝึกเฉพาะทาง</w:t>
+        </w:r>
+        <w:r>
+          <w:rPr>
+            <w:noProof/>
+            <w:webHidden/>
+          </w:rPr>
+          <w:tab/>
+        </w:r>
+        <w:r>
+          <w:rPr>
+            <w:noProof/>
+            <w:webHidden/>
+          </w:rPr>
+          <w:fldChar w:fldCharType="begin"/>
+        </w:r>
+        <w:r>
+          <w:rPr>
+            <w:noProof/>
+            <w:webHidden/>
+          </w:rPr>
+          <w:instrText xml:space="preserve"> PAGEREF _Toc238392578 \h </w:instrText>
+        </w:r>
+        <w:r>
+          <w:rPr>
+            <w:noProof/>
+            <w:webHidden/>
+          </w:rPr>
+        </w:r>
+        <w:r>
+          <w:rPr>
+            <w:noProof/>
+            <w:webHidden/>
+          </w:rPr>
+          <w:fldChar w:fldCharType="separate"/>
+        </w:r>
+        <w:r>
+          <w:rPr>
+            <w:noProof/>
+            <w:webHidden/>
+          </w:rPr>
+          <w:t>4</w:t>
+        </w:r>
+        <w:r>
+          <w:rPr>
+            <w:noProof/>
+            <w:webHidden/>
+          </w:rPr>
+          <w:fldChar w:fldCharType="end"/>
         </w:r>
       </w:hyperlink>
     </w:p>
-    <w:p>
-      <w:pPr>
-        <w:pStyle w:val="Compact"/>
-        <w:numPr>
-          <w:ilvl w:val="0"/>
-          <w:numId w:val="1001"/>
-        </w:numPr>
-      </w:pPr>
-      <w:hyperlink w:anchor="อภิธานศัพท์-glossary">
+    <w:p xmlns:w14="http://schemas.microsoft.com/office/word/2010/wordml">
+      <w:pPr>
+        <w:pStyle w:val="TOC3"/>
+        <w:tabs>
+          <w:tab w:val="left" w:pos="1440"/>
+          <w:tab w:val="right" w:leader="dot" w:pos="8494"/>
+        </w:tabs>
+        <w:rPr>
+          <w:rFonts w:asciiTheme="minorHAnsi" w:eastAsiaTheme="minorEastAsia" w:hAnsiTheme="minorHAnsi" w:cstheme="minorBidi"/>
+          <w:noProof/>
+          <w:sz w:val="24"/>
+          <w:szCs w:val="30"/>
+        </w:rPr>
+      </w:pPr>
+      <w:hyperlink w:anchor="_Toc238392579" w:history="1">
         <w:r>
           <w:rPr>
             <w:rStyle w:val="Hyperlink"/>
+            <w:noProof/>
           </w:rPr>
-          <w:t xml:space="preserve">อภิธานศัพท์ (Glossary)</w:t>
+          <w:t>1.1.3</w:t>
         </w:r>
-      </w:hyperlink>
-    </w:p>
-    <w:p>
-      <w:pPr>
-        <w:pStyle w:val="Compact"/>
-        <w:numPr>
-          <w:ilvl w:val="0"/>
-          <w:numId w:val="1001"/>
-        </w:numPr>
-      </w:pPr>
-      <w:hyperlink w:anchor="บรรณานุกรมและเอกสารอ้างอิง-references">
+        <w:r>
+          <w:rPr>
+            <w:rFonts w:asciiTheme="minorHAnsi" w:eastAsiaTheme="minorEastAsia" w:hAnsiTheme="minorHAnsi" w:cstheme="minorBidi"/>
+            <w:noProof/>
+            <w:sz w:val="24"/>
+            <w:szCs w:val="30"/>
+          </w:rPr>
+          <w:tab/>
+        </w:r>
         <w:r>
           <w:rPr>
             <w:rStyle w:val="Hyperlink"/>
+            <w:noProof/>
+            <w:cs/>
           </w:rPr>
-          <w:t xml:space="preserve">บรรณานุกรมและเอกสารอ้างอิง (References)</w:t>
+          <w:t>การประมวลผลภาพดิจิทัล</w:t>
+        </w:r>
+        <w:r>
+          <w:rPr>
+            <w:noProof/>
+            <w:webHidden/>
+          </w:rPr>
+          <w:tab/>
+        </w:r>
+        <w:r>
+          <w:rPr>
+            <w:noProof/>
+            <w:webHidden/>
+          </w:rPr>
+          <w:fldChar w:fldCharType="begin"/>
+        </w:r>
+        <w:r>
+          <w:rPr>
+            <w:noProof/>
+            <w:webHidden/>
+          </w:rPr>
+          <w:instrText xml:space="preserve"> PAGEREF _Toc238392579 \h </w:instrText>
+        </w:r>
+        <w:r>
+          <w:rPr>
+            <w:noProof/>
+            <w:webHidden/>
+          </w:rPr>
+        </w:r>
+        <w:r>
+          <w:rPr>
+            <w:noProof/>
+            <w:webHidden/>
+          </w:rPr>
+          <w:fldChar w:fldCharType="separate"/>
+        </w:r>
+        <w:r>
+          <w:rPr>
+            <w:noProof/>
+            <w:webHidden/>
+          </w:rPr>
+          <w:t>4</w:t>
+        </w:r>
+        <w:r>
+          <w:rPr>
+            <w:noProof/>
+            <w:webHidden/>
+          </w:rPr>
+          <w:fldChar w:fldCharType="end"/>
         </w:r>
       </w:hyperlink>
     </w:p>
-    <w:p>
-      <w:r>
-        <w:pict>
-          <v:rect style="width:0;height:1.5pt" o:hralign="center" o:hrstd="t" o:hr="t"/>
-        </w:pict>
-      </w:r>
-    </w:p>
-    <w:bookmarkEnd w:id="26"/>
-    <w:bookmarkStart w:id="27" w:name="ขอแนะนำเบองตนสำหรบการศกษา"/>
+    <w:p xmlns:w14="http://schemas.microsoft.com/office/word/2010/wordml">
+      <w:pPr>
+        <w:pStyle w:val="NoSpacing"/>
+        <w:rPr>
+          <w:cs/>
+        </w:rPr>
+      </w:pPr>
+      <w:r>
+        <w:rPr>
+          <w:cs/>
+        </w:rPr>
+        <w:fldChar w:fldCharType="end"/>
+      </w:r>
+    </w:p>
+    <w:p xmlns:w14="http://schemas.microsoft.com/office/word/2010/wordml">
+      <w:r>
+        <w:br w:type="page"/>
+      </w:r>
+    </w:p>
+    <w:p xmlns:w14="http://schemas.microsoft.com/office/word/2010/wordml">
+      <w:pPr>
+        <w:pStyle w:val="Heading1"/>
+      </w:pPr>
+      <w:r>
+        <w:rPr>
+          <w:rFonts w:hint="cs"/>
+          <w:cs/>
+        </w:rPr>
+        <w:lastRenderedPageBreak/>
+        <w:t>สารบัญภาพ</w:t>
+      </w:r>
+    </w:p>
+    <w:p xmlns:w14="http://schemas.microsoft.com/office/word/2010/wordml">
+      <w:pPr>
+        <w:pStyle w:val="NoSpacing"/>
+      </w:pPr>
+    </w:p>
+    <w:p xmlns:w14="http://schemas.microsoft.com/office/word/2010/wordml">
+      <w:pPr>
+        <w:pStyle w:val="TableofFigures"/>
+        <w:tabs>
+          <w:tab w:val="right" w:leader="dot" w:pos="8494"/>
+        </w:tabs>
+        <w:rPr>
+          <w:rFonts w:eastAsiaTheme="minorEastAsia" w:cs="TH Sarabun New"/>
+          <w:noProof/>
+          <w:szCs w:val="32"/>
+        </w:rPr>
+      </w:pPr>
+      <w:r>
+        <w:rPr>
+          <w:cs/>
+        </w:rPr>
+        <w:fldChar w:fldCharType="begin"/>
+      </w:r>
+      <w:r>
+        <w:rPr>
+          <w:cs/>
+        </w:rPr>
+        <w:instrText xml:space="preserve"> </w:instrText>
+      </w:r>
+      <w:r>
+        <w:rPr>
+          <w:rFonts w:hint="cs"/>
+        </w:rPr>
+        <w:instrText>TOC \h \z \c "</w:instrText>
+      </w:r>
+      <w:r>
+        <w:rPr>
+          <w:rFonts w:hint="cs"/>
+          <w:cs/>
+        </w:rPr>
+        <w:instrText>ภาพที่"</w:instrText>
+      </w:r>
+      <w:r>
+        <w:rPr>
+          <w:cs/>
+        </w:rPr>
+        <w:instrText xml:space="preserve"> </w:instrText>
+      </w:r>
+      <w:r>
+        <w:rPr>
+          <w:cs/>
+        </w:rPr>
+        <w:fldChar w:fldCharType="separate"/>
+      </w:r>
+      <w:hyperlink w:anchor="_Toc238411360" w:history="1">
+        <w:r>
+          <w:rPr>
+            <w:rStyle w:val="Hyperlink"/>
+            <w:rFonts w:cs="TH Sarabun New"/>
+            <w:noProof/>
+            <w:szCs w:val="32"/>
+            <w:cs/>
+          </w:rPr>
+          <w:t>ภาพที่ 1</w:t>
+        </w:r>
+        <w:r>
+          <w:rPr>
+            <w:rStyle w:val="Hyperlink"/>
+            <w:rFonts w:cs="TH Sarabun New"/>
+            <w:noProof/>
+            <w:szCs w:val="32"/>
+          </w:rPr>
+          <w:t xml:space="preserve"> </w:t>
+        </w:r>
+        <w:r>
+          <w:rPr>
+            <w:rStyle w:val="Hyperlink"/>
+            <w:rFonts w:cs="TH Sarabun New"/>
+            <w:noProof/>
+            <w:szCs w:val="32"/>
+            <w:cs/>
+          </w:rPr>
+          <w:t>การเข้าสู่ระบบ</w:t>
+        </w:r>
+        <w:r>
+          <w:rPr>
+            <w:rStyle w:val="Hyperlink"/>
+            <w:rFonts w:cs="TH Sarabun New"/>
+            <w:noProof/>
+            <w:szCs w:val="32"/>
+          </w:rPr>
+          <w:t xml:space="preserve"> Roboflow (https://roboflow.com/)</w:t>
+        </w:r>
+        <w:r>
+          <w:rPr>
+            <w:rFonts w:cs="TH Sarabun New"/>
+            <w:noProof/>
+            <w:webHidden/>
+            <w:szCs w:val="32"/>
+          </w:rPr>
+          <w:tab/>
+        </w:r>
+        <w:r>
+          <w:rPr>
+            <w:rFonts w:cs="TH Sarabun New"/>
+            <w:noProof/>
+            <w:webHidden/>
+            <w:szCs w:val="32"/>
+          </w:rPr>
+          <w:fldChar w:fldCharType="begin"/>
+        </w:r>
+        <w:r>
+          <w:rPr>
+            <w:rFonts w:cs="TH Sarabun New"/>
+            <w:noProof/>
+            <w:webHidden/>
+            <w:szCs w:val="32"/>
+          </w:rPr>
+          <w:instrText xml:space="preserve"> PAGEREF _Toc238411360 \h </w:instrText>
+        </w:r>
+        <w:r>
+          <w:rPr>
+            <w:rFonts w:cs="TH Sarabun New"/>
+            <w:noProof/>
+            <w:webHidden/>
+            <w:szCs w:val="32"/>
+          </w:rPr>
+        </w:r>
+        <w:r>
+          <w:rPr>
+            <w:rFonts w:cs="TH Sarabun New"/>
+            <w:noProof/>
+            <w:webHidden/>
+            <w:szCs w:val="32"/>
+          </w:rPr>
+          <w:fldChar w:fldCharType="separate"/>
+        </w:r>
+        <w:r>
+          <w:rPr>
+            <w:rFonts w:cs="TH Sarabun New"/>
+            <w:noProof/>
+            <w:webHidden/>
+            <w:szCs w:val="32"/>
+          </w:rPr>
+          <w:t>6</w:t>
+        </w:r>
+        <w:r>
+          <w:rPr>
+            <w:rFonts w:cs="TH Sarabun New"/>
+            <w:noProof/>
+            <w:webHidden/>
+            <w:szCs w:val="32"/>
+          </w:rPr>
+          <w:fldChar w:fldCharType="end"/>
+        </w:r>
+      </w:hyperlink>
+    </w:p>
+    <w:p xmlns:w14="http://schemas.microsoft.com/office/word/2010/wordml">
+      <w:pPr>
+        <w:pStyle w:val="TableofFigures"/>
+        <w:tabs>
+          <w:tab w:val="right" w:leader="dot" w:pos="8494"/>
+        </w:tabs>
+        <w:rPr>
+          <w:rFonts w:eastAsiaTheme="minorEastAsia" w:cs="TH Sarabun New"/>
+          <w:noProof/>
+          <w:szCs w:val="32"/>
+        </w:rPr>
+      </w:pPr>
+      <w:hyperlink w:anchor="_Toc238411361" w:history="1">
+        <w:r>
+          <w:rPr>
+            <w:rStyle w:val="Hyperlink"/>
+            <w:rFonts w:cs="TH Sarabun New"/>
+            <w:noProof/>
+            <w:szCs w:val="32"/>
+            <w:cs/>
+          </w:rPr>
+          <w:t xml:space="preserve">ภาพที่ 2 ตัวเลือกการเข้าสู่ระบบ </w:t>
+        </w:r>
+        <w:r>
+          <w:rPr>
+            <w:rStyle w:val="Hyperlink"/>
+            <w:rFonts w:cs="TH Sarabun New"/>
+            <w:noProof/>
+            <w:szCs w:val="32"/>
+          </w:rPr>
+          <w:t>Roboflow (https://app.roboflow.com/login)</w:t>
+        </w:r>
+        <w:r>
+          <w:rPr>
+            <w:rFonts w:cs="TH Sarabun New"/>
+            <w:noProof/>
+            <w:webHidden/>
+            <w:szCs w:val="32"/>
+          </w:rPr>
+          <w:tab/>
+        </w:r>
+        <w:r>
+          <w:rPr>
+            <w:rFonts w:cs="TH Sarabun New"/>
+            <w:noProof/>
+            <w:webHidden/>
+            <w:szCs w:val="32"/>
+          </w:rPr>
+          <w:fldChar w:fldCharType="begin"/>
+        </w:r>
+        <w:r>
+          <w:rPr>
+            <w:rFonts w:cs="TH Sarabun New"/>
+            <w:noProof/>
+            <w:webHidden/>
+            <w:szCs w:val="32"/>
+          </w:rPr>
+          <w:instrText xml:space="preserve"> PAGEREF _Toc238411361 \h </w:instrText>
+        </w:r>
+        <w:r>
+          <w:rPr>
+            <w:rFonts w:cs="TH Sarabun New"/>
+            <w:noProof/>
+            <w:webHidden/>
+            <w:szCs w:val="32"/>
+          </w:rPr>
+        </w:r>
+        <w:r>
+          <w:rPr>
+            <w:rFonts w:cs="TH Sarabun New"/>
+            <w:noProof/>
+            <w:webHidden/>
+            <w:szCs w:val="32"/>
+          </w:rPr>
+          <w:fldChar w:fldCharType="separate"/>
+        </w:r>
+        <w:r>
+          <w:rPr>
+            <w:rFonts w:cs="TH Sarabun New"/>
+            <w:noProof/>
+            <w:webHidden/>
+            <w:szCs w:val="32"/>
+          </w:rPr>
+          <w:t>7</w:t>
+        </w:r>
+        <w:r>
+          <w:rPr>
+            <w:rFonts w:cs="TH Sarabun New"/>
+            <w:noProof/>
+            <w:webHidden/>
+            <w:szCs w:val="32"/>
+          </w:rPr>
+          <w:fldChar w:fldCharType="end"/>
+        </w:r>
+      </w:hyperlink>
+    </w:p>
+    <w:p xmlns:w14="http://schemas.microsoft.com/office/word/2010/wordml">
+      <w:pPr>
+        <w:pStyle w:val="TableofFigures"/>
+        <w:tabs>
+          <w:tab w:val="right" w:leader="dot" w:pos="8494"/>
+        </w:tabs>
+        <w:rPr>
+          <w:rFonts w:eastAsiaTheme="minorEastAsia" w:cs="TH Sarabun New"/>
+          <w:noProof/>
+          <w:szCs w:val="32"/>
+        </w:rPr>
+      </w:pPr>
+      <w:hyperlink w:anchor="_Toc238411362" w:history="1">
+        <w:r>
+          <w:rPr>
+            <w:rStyle w:val="Hyperlink"/>
+            <w:rFonts w:cs="TH Sarabun New"/>
+            <w:noProof/>
+            <w:szCs w:val="32"/>
+            <w:cs/>
+          </w:rPr>
+          <w:t xml:space="preserve">ภาพที่ 3 </w:t>
+        </w:r>
+        <w:r>
+          <w:rPr>
+            <w:rStyle w:val="Hyperlink"/>
+            <w:rFonts w:cs="TH Sarabun New"/>
+            <w:noProof/>
+            <w:szCs w:val="32"/>
+          </w:rPr>
+          <w:t>Roboflow - Get started | STEP 1</w:t>
+        </w:r>
+        <w:r>
+          <w:rPr>
+            <w:rFonts w:cs="TH Sarabun New"/>
+            <w:noProof/>
+            <w:webHidden/>
+            <w:szCs w:val="32"/>
+          </w:rPr>
+          <w:tab/>
+        </w:r>
+        <w:r>
+          <w:rPr>
+            <w:rFonts w:cs="TH Sarabun New"/>
+            <w:noProof/>
+            <w:webHidden/>
+            <w:szCs w:val="32"/>
+          </w:rPr>
+          <w:fldChar w:fldCharType="begin"/>
+        </w:r>
+        <w:r>
+          <w:rPr>
+            <w:rFonts w:cs="TH Sarabun New"/>
+            <w:noProof/>
+            <w:webHidden/>
+            <w:szCs w:val="32"/>
+          </w:rPr>
+          <w:instrText xml:space="preserve"> PAGEREF _Toc238411362 \h </w:instrText>
+        </w:r>
+        <w:r>
+          <w:rPr>
+            <w:rFonts w:cs="TH Sarabun New"/>
+            <w:noProof/>
+            <w:webHidden/>
+            <w:szCs w:val="32"/>
+          </w:rPr>
+        </w:r>
+        <w:r>
+          <w:rPr>
+            <w:rFonts w:cs="TH Sarabun New"/>
+            <w:noProof/>
+            <w:webHidden/>
+            <w:szCs w:val="32"/>
+          </w:rPr>
+          <w:fldChar w:fldCharType="separate"/>
+        </w:r>
+        <w:r>
+          <w:rPr>
+            <w:rFonts w:cs="TH Sarabun New"/>
+            <w:noProof/>
+            <w:webHidden/>
+            <w:szCs w:val="32"/>
+          </w:rPr>
+          <w:t>8</w:t>
+        </w:r>
+        <w:r>
+          <w:rPr>
+            <w:rFonts w:cs="TH Sarabun New"/>
+            <w:noProof/>
+            <w:webHidden/>
+            <w:szCs w:val="32"/>
+          </w:rPr>
+          <w:fldChar w:fldCharType="end"/>
+        </w:r>
+      </w:hyperlink>
+    </w:p>
+    <w:p xmlns:w14="http://schemas.microsoft.com/office/word/2010/wordml">
+      <w:pPr>
+        <w:pStyle w:val="NoSpacing"/>
+        <w:rPr>
+          <w:rFonts w:hint="cs"/>
+          <w:cs/>
+        </w:rPr>
+        <w:sectPr>
+          <w:headerReference w:type="default" r:id="rId9"/>
+          <w:pgSz w:w="11907" w:h="16840" w:code="9"/>
+          <w:pgMar w:top="1985" w:right="1418" w:bottom="1418" w:left="1985" w:header="720" w:footer="720" w:gutter="0"/>
+          <w:pgNumType w:start="1"/>
+          <w:cols w:space="720"/>
+          <w:docGrid w:linePitch="360"/>
+        </w:sectPr>
+      </w:pPr>
+      <w:r>
+        <w:rPr>
+          <w:cs/>
+        </w:rPr>
+        <w:fldChar w:fldCharType="end"/>
+      </w:r>
+    </w:p>
     <w:p>
       <w:pPr>
         <w:pStyle w:val="Heading2"/>

</xml_diff>

<commit_message>
docs: align TUTORIAL.md with thai.md formal style (Tab + Thai Distributed)
- TUTORIAL.md: apply thai.md guide — formal academic Thai, 36 headings preserved, Tab indent (&emsp;&emsp; first line) + Thai Distributed intent for all body paragraphs, keep code/diagrams intact, formal vocabulary (ทางการ)
- RE.docx: regenerate from formal TUTORIAL (placeholders for code/diagram as before) + Guidebook front matter (cover, คำนำ, สารบัญ, สารบัญภาพ) + Tab firstLine 720 + thaiDistribute for 203 body paragraphs (like Guidebook), exclude placeholders/center/right/TOC
- Keep APA7 11 refs, 4 mermaid with fallbacks
</commit_message>
<xml_diff>
--- a/RE.docx
+++ b/RE.docx
@@ -1396,42 +1396,44 @@
       </w:pPr>
       <w:r>
         <w:rPr>
+          <w:rFonts w:cs="TH Sarabun New"/>
+          <w:szCs w:val="32"/>
           <w:cs/>
         </w:rPr>
         <w:fldChar w:fldCharType="begin"/>
       </w:r>
       <w:r>
         <w:rPr>
+          <w:rFonts w:cs="TH Sarabun New"/>
+          <w:szCs w:val="32"/>
           <w:cs/>
         </w:rPr>
         <w:instrText xml:space="preserve"> </w:instrText>
       </w:r>
       <w:r>
         <w:rPr>
-          <w:rFonts w:hint="cs"/>
+          <w:rFonts w:cs="TH Sarabun New"/>
+          <w:szCs w:val="32"/>
         </w:rPr>
         <w:instrText>TOC \h \z \c "</w:instrText>
       </w:r>
       <w:r>
         <w:rPr>
-          <w:rFonts w:hint="cs"/>
+          <w:rFonts w:cs="TH Sarabun New"/>
+          <w:szCs w:val="32"/>
           <w:cs/>
         </w:rPr>
-        <w:instrText>ภาพที่"</w:instrText>
-      </w:r>
-      <w:r>
-        <w:rPr>
+        <w:instrText xml:space="preserve">ภาพที่" </w:instrText>
+      </w:r>
+      <w:r>
+        <w:rPr>
+          <w:rFonts w:cs="TH Sarabun New"/>
+          <w:szCs w:val="32"/>
           <w:cs/>
         </w:rPr>
-        <w:instrText xml:space="preserve"> </w:instrText>
-      </w:r>
-      <w:r>
-        <w:rPr>
-          <w:cs/>
-        </w:rPr>
         <w:fldChar w:fldCharType="separate"/>
       </w:r>
-      <w:hyperlink w:anchor="_Toc238411360" w:history="1">
+      <w:hyperlink w:anchor="_Toc238422811" w:history="1">
         <w:r>
           <w:rPr>
             <w:rStyle w:val="Hyperlink"/>
@@ -1440,7 +1442,7 @@
             <w:szCs w:val="32"/>
             <w:cs/>
           </w:rPr>
-          <w:t>ภาพที่ 1</w:t>
+          <w:t>ภาพที่ 1.1</w:t>
         </w:r>
         <w:r>
           <w:rPr>
@@ -1495,7 +1497,7 @@
             <w:webHidden/>
             <w:szCs w:val="32"/>
           </w:rPr>
-          <w:instrText xml:space="preserve"> PAGEREF _Toc238411360 \h </w:instrText>
+          <w:instrText xml:space="preserve"> PAGEREF _Toc238422811 \h </w:instrText>
         </w:r>
         <w:r>
           <w:rPr>
@@ -1546,7 +1548,7 @@
           <w:szCs w:val="32"/>
         </w:rPr>
       </w:pPr>
-      <w:hyperlink w:anchor="_Toc238411361" w:history="1">
+      <w:hyperlink w:anchor="_Toc238422812" w:history="1">
         <w:r>
           <w:rPr>
             <w:rStyle w:val="Hyperlink"/>
@@ -1555,7 +1557,7 @@
             <w:szCs w:val="32"/>
             <w:cs/>
           </w:rPr>
-          <w:t xml:space="preserve">ภาพที่ 2 ตัวเลือกการเข้าสู่ระบบ </w:t>
+          <w:t xml:space="preserve">ภาพที่ 1.2 ตัวเลือกการเข้าสู่ระบบ </w:t>
         </w:r>
         <w:r>
           <w:rPr>
@@ -1591,7 +1593,7 @@
             <w:webHidden/>
             <w:szCs w:val="32"/>
           </w:rPr>
-          <w:instrText xml:space="preserve"> PAGEREF _Toc238411361 \h </w:instrText>
+          <w:instrText xml:space="preserve"> PAGEREF _Toc238422812 \h </w:instrText>
         </w:r>
         <w:r>
           <w:rPr>
@@ -1642,7 +1644,7 @@
           <w:szCs w:val="32"/>
         </w:rPr>
       </w:pPr>
-      <w:hyperlink w:anchor="_Toc238411362" w:history="1">
+      <w:hyperlink w:anchor="_Toc238422813" w:history="1">
         <w:r>
           <w:rPr>
             <w:rStyle w:val="Hyperlink"/>
@@ -1651,7 +1653,7 @@
             <w:szCs w:val="32"/>
             <w:cs/>
           </w:rPr>
-          <w:t xml:space="preserve">ภาพที่ 3 </w:t>
+          <w:t>ภาพที่ 1.3 การเริ่มต้น</w:t>
         </w:r>
         <w:r>
           <w:rPr>
@@ -1660,7 +1662,45 @@
             <w:noProof/>
             <w:szCs w:val="32"/>
           </w:rPr>
-          <w:t>Roboflow - Get started | STEP 1</w:t>
+          <w:t xml:space="preserve"> Roboflow</w:t>
+        </w:r>
+        <w:r>
+          <w:rPr>
+            <w:rStyle w:val="Hyperlink"/>
+            <w:rFonts w:cs="TH Sarabun New"/>
+            <w:noProof/>
+            <w:szCs w:val="32"/>
+            <w:cs/>
+          </w:rPr>
+          <w:t xml:space="preserve"> ขั้นตอนที่</w:t>
+        </w:r>
+        <w:r>
+          <w:rPr>
+            <w:rStyle w:val="Hyperlink"/>
+            <w:rFonts w:cs="TH Sarabun New"/>
+            <w:noProof/>
+            <w:szCs w:val="32"/>
+          </w:rPr>
+          <w:t xml:space="preserve"> 1:</w:t>
+        </w:r>
+        <w:r>
+          <w:rPr>
+            <w:rStyle w:val="Hyperlink"/>
+            <w:rFonts w:cs="TH Sarabun New"/>
+            <w:noProof/>
+            <w:szCs w:val="32"/>
+            <w:cs/>
+          </w:rPr>
+          <w:t xml:space="preserve"> เลือก</w:t>
+        </w:r>
+        <w:r>
+          <w:rPr>
+            <w:rStyle w:val="Hyperlink"/>
+            <w:rFonts w:cs="TH Sarabun New"/>
+            <w:noProof/>
+            <w:szCs w:val="32"/>
+          </w:rPr>
+          <w:t xml:space="preserve"> Public Plan</w:t>
         </w:r>
         <w:r>
           <w:rPr>
@@ -1687,7 +1727,7 @@
             <w:webHidden/>
             <w:szCs w:val="32"/>
           </w:rPr>
-          <w:instrText xml:space="preserve"> PAGEREF _Toc238411362 \h </w:instrText>
+          <w:instrText xml:space="preserve"> PAGEREF _Toc238422813 \h </w:instrText>
         </w:r>
         <w:r>
           <w:rPr>
@@ -1713,7 +1753,438 @@
             <w:webHidden/>
             <w:szCs w:val="32"/>
           </w:rPr>
+          <w:t>7</w:t>
+        </w:r>
+        <w:r>
+          <w:rPr>
+            <w:rFonts w:cs="TH Sarabun New"/>
+            <w:noProof/>
+            <w:webHidden/>
+            <w:szCs w:val="32"/>
+          </w:rPr>
+          <w:fldChar w:fldCharType="end"/>
+        </w:r>
+      </w:hyperlink>
+    </w:p>
+    <w:p xmlns:w14="http://schemas.microsoft.com/office/word/2010/wordml">
+      <w:pPr>
+        <w:pStyle w:val="TableofFigures"/>
+        <w:tabs>
+          <w:tab w:val="right" w:leader="dot" w:pos="8494"/>
+        </w:tabs>
+        <w:rPr>
+          <w:rFonts w:eastAsiaTheme="minorEastAsia" w:cs="TH Sarabun New"/>
+          <w:noProof/>
+          <w:szCs w:val="32"/>
+        </w:rPr>
+      </w:pPr>
+      <w:hyperlink w:anchor="_Toc238422814" w:history="1">
+        <w:r>
+          <w:rPr>
+            <w:rStyle w:val="Hyperlink"/>
+            <w:rFonts w:cs="TH Sarabun New"/>
+            <w:noProof/>
+            <w:szCs w:val="32"/>
+            <w:cs/>
+          </w:rPr>
+          <w:t>ภาพที่ 1.4</w:t>
+        </w:r>
+        <w:r>
+          <w:rPr>
+            <w:rStyle w:val="Hyperlink"/>
+            <w:rFonts w:cs="TH Sarabun New"/>
+            <w:noProof/>
+            <w:szCs w:val="32"/>
+          </w:rPr>
+          <w:t xml:space="preserve"> </w:t>
+        </w:r>
+        <w:r>
+          <w:rPr>
+            <w:rStyle w:val="Hyperlink"/>
+            <w:rFonts w:cs="TH Sarabun New"/>
+            <w:noProof/>
+            <w:szCs w:val="32"/>
+            <w:cs/>
+          </w:rPr>
+          <w:t>การเริ่มต้น</w:t>
+        </w:r>
+        <w:r>
+          <w:rPr>
+            <w:rStyle w:val="Hyperlink"/>
+            <w:rFonts w:cs="TH Sarabun New"/>
+            <w:noProof/>
+            <w:szCs w:val="32"/>
+          </w:rPr>
+          <w:t xml:space="preserve"> Roboflow</w:t>
+        </w:r>
+        <w:r>
+          <w:rPr>
+            <w:rStyle w:val="Hyperlink"/>
+            <w:rFonts w:cs="TH Sarabun New"/>
+            <w:noProof/>
+            <w:szCs w:val="32"/>
+            <w:cs/>
+          </w:rPr>
+          <w:t xml:space="preserve"> ขั้นตอนที่</w:t>
+        </w:r>
+        <w:r>
+          <w:rPr>
+            <w:rStyle w:val="Hyperlink"/>
+            <w:rFonts w:cs="TH Sarabun New"/>
+            <w:noProof/>
+            <w:szCs w:val="32"/>
+          </w:rPr>
+          <w:t xml:space="preserve"> 2:</w:t>
+        </w:r>
+        <w:r>
+          <w:rPr>
+            <w:rStyle w:val="Hyperlink"/>
+            <w:rFonts w:cs="TH Sarabun New"/>
+            <w:noProof/>
+            <w:szCs w:val="32"/>
+            <w:cs/>
+          </w:rPr>
+          <w:t xml:space="preserve"> กด</w:t>
+        </w:r>
+        <w:r>
+          <w:rPr>
+            <w:rStyle w:val="Hyperlink"/>
+            <w:rFonts w:cs="TH Sarabun New"/>
+            <w:noProof/>
+            <w:szCs w:val="32"/>
+          </w:rPr>
+          <w:t xml:space="preserve"> Skip</w:t>
+        </w:r>
+        <w:r>
+          <w:rPr>
+            <w:rStyle w:val="Hyperlink"/>
+            <w:rFonts w:cs="TH Sarabun New"/>
+            <w:noProof/>
+            <w:szCs w:val="32"/>
+            <w:cs/>
+          </w:rPr>
+          <w:t xml:space="preserve"> มุมซ้ายล่างของเว็บไซต์</w:t>
+        </w:r>
+        <w:r>
+          <w:rPr>
+            <w:rFonts w:cs="TH Sarabun New"/>
+            <w:noProof/>
+            <w:webHidden/>
+            <w:szCs w:val="32"/>
+          </w:rPr>
+          <w:tab/>
+        </w:r>
+        <w:r>
+          <w:rPr>
+            <w:rFonts w:cs="TH Sarabun New"/>
+            <w:noProof/>
+            <w:webHidden/>
+            <w:szCs w:val="32"/>
+          </w:rPr>
+          <w:fldChar w:fldCharType="begin"/>
+        </w:r>
+        <w:r>
+          <w:rPr>
+            <w:rFonts w:cs="TH Sarabun New"/>
+            <w:noProof/>
+            <w:webHidden/>
+            <w:szCs w:val="32"/>
+          </w:rPr>
+          <w:instrText xml:space="preserve"> PAGEREF _Toc238422814 \h </w:instrText>
+        </w:r>
+        <w:r>
+          <w:rPr>
+            <w:rFonts w:cs="TH Sarabun New"/>
+            <w:noProof/>
+            <w:webHidden/>
+            <w:szCs w:val="32"/>
+          </w:rPr>
+        </w:r>
+        <w:r>
+          <w:rPr>
+            <w:rFonts w:cs="TH Sarabun New"/>
+            <w:noProof/>
+            <w:webHidden/>
+            <w:szCs w:val="32"/>
+          </w:rPr>
+          <w:fldChar w:fldCharType="separate"/>
+        </w:r>
+        <w:r>
+          <w:rPr>
+            <w:rFonts w:cs="TH Sarabun New"/>
+            <w:noProof/>
+            <w:webHidden/>
+            <w:szCs w:val="32"/>
+          </w:rPr>
           <w:t>8</w:t>
+        </w:r>
+        <w:r>
+          <w:rPr>
+            <w:rFonts w:cs="TH Sarabun New"/>
+            <w:noProof/>
+            <w:webHidden/>
+            <w:szCs w:val="32"/>
+          </w:rPr>
+          <w:fldChar w:fldCharType="end"/>
+        </w:r>
+      </w:hyperlink>
+    </w:p>
+    <w:p xmlns:w14="http://schemas.microsoft.com/office/word/2010/wordml">
+      <w:pPr>
+        <w:pStyle w:val="TableofFigures"/>
+        <w:tabs>
+          <w:tab w:val="right" w:leader="dot" w:pos="8494"/>
+        </w:tabs>
+        <w:rPr>
+          <w:rFonts w:eastAsiaTheme="minorEastAsia" w:cs="TH Sarabun New"/>
+          <w:noProof/>
+          <w:szCs w:val="32"/>
+        </w:rPr>
+      </w:pPr>
+      <w:hyperlink w:anchor="_Toc238422815" w:history="1">
+        <w:r>
+          <w:rPr>
+            <w:rStyle w:val="Hyperlink"/>
+            <w:rFonts w:cs="TH Sarabun New"/>
+            <w:noProof/>
+            <w:szCs w:val="32"/>
+            <w:cs/>
+          </w:rPr>
+          <w:t>ภาพที่ 1.5</w:t>
+        </w:r>
+        <w:r>
+          <w:rPr>
+            <w:rStyle w:val="Hyperlink"/>
+            <w:rFonts w:cs="TH Sarabun New"/>
+            <w:noProof/>
+            <w:szCs w:val="32"/>
+          </w:rPr>
+          <w:t xml:space="preserve"> </w:t>
+        </w:r>
+        <w:r>
+          <w:rPr>
+            <w:rStyle w:val="Hyperlink"/>
+            <w:rFonts w:cs="TH Sarabun New"/>
+            <w:noProof/>
+            <w:szCs w:val="32"/>
+            <w:cs/>
+          </w:rPr>
+          <w:t>นำทางไปยังหน้า</w:t>
+        </w:r>
+        <w:r>
+          <w:rPr>
+            <w:rStyle w:val="Hyperlink"/>
+            <w:rFonts w:cs="TH Sarabun New"/>
+            <w:noProof/>
+            <w:szCs w:val="32"/>
+          </w:rPr>
+          <w:t xml:space="preserve"> API Keys</w:t>
+        </w:r>
+        <w:r>
+          <w:rPr>
+            <w:rStyle w:val="Hyperlink"/>
+            <w:rFonts w:cs="TH Sarabun New"/>
+            <w:noProof/>
+            <w:szCs w:val="32"/>
+            <w:cs/>
+          </w:rPr>
+          <w:t xml:space="preserve"> ใน</w:t>
+        </w:r>
+        <w:r>
+          <w:rPr>
+            <w:rStyle w:val="Hyperlink"/>
+            <w:rFonts w:cs="TH Sarabun New"/>
+            <w:noProof/>
+            <w:szCs w:val="32"/>
+          </w:rPr>
+          <w:t xml:space="preserve"> Roboflow</w:t>
+        </w:r>
+        <w:r>
+          <w:rPr>
+            <w:rFonts w:cs="TH Sarabun New"/>
+            <w:noProof/>
+            <w:webHidden/>
+            <w:szCs w:val="32"/>
+          </w:rPr>
+          <w:tab/>
+        </w:r>
+        <w:r>
+          <w:rPr>
+            <w:rFonts w:cs="TH Sarabun New"/>
+            <w:noProof/>
+            <w:webHidden/>
+            <w:szCs w:val="32"/>
+          </w:rPr>
+          <w:fldChar w:fldCharType="begin"/>
+        </w:r>
+        <w:r>
+          <w:rPr>
+            <w:rFonts w:cs="TH Sarabun New"/>
+            <w:noProof/>
+            <w:webHidden/>
+            <w:szCs w:val="32"/>
+          </w:rPr>
+          <w:instrText xml:space="preserve"> PAGEREF _Toc238422815 \h </w:instrText>
+        </w:r>
+        <w:r>
+          <w:rPr>
+            <w:rFonts w:cs="TH Sarabun New"/>
+            <w:noProof/>
+            <w:webHidden/>
+            <w:szCs w:val="32"/>
+          </w:rPr>
+        </w:r>
+        <w:r>
+          <w:rPr>
+            <w:rFonts w:cs="TH Sarabun New"/>
+            <w:noProof/>
+            <w:webHidden/>
+            <w:szCs w:val="32"/>
+          </w:rPr>
+          <w:fldChar w:fldCharType="separate"/>
+        </w:r>
+        <w:r>
+          <w:rPr>
+            <w:rFonts w:cs="TH Sarabun New"/>
+            <w:noProof/>
+            <w:webHidden/>
+            <w:szCs w:val="32"/>
+          </w:rPr>
+          <w:t>8</w:t>
+        </w:r>
+        <w:r>
+          <w:rPr>
+            <w:rFonts w:cs="TH Sarabun New"/>
+            <w:noProof/>
+            <w:webHidden/>
+            <w:szCs w:val="32"/>
+          </w:rPr>
+          <w:fldChar w:fldCharType="end"/>
+        </w:r>
+      </w:hyperlink>
+    </w:p>
+    <w:p xmlns:w14="http://schemas.microsoft.com/office/word/2010/wordml">
+      <w:pPr>
+        <w:pStyle w:val="TableofFigures"/>
+        <w:tabs>
+          <w:tab w:val="right" w:leader="dot" w:pos="8494"/>
+        </w:tabs>
+        <w:rPr>
+          <w:rFonts w:eastAsiaTheme="minorEastAsia" w:cs="TH Sarabun New"/>
+          <w:noProof/>
+          <w:szCs w:val="32"/>
+        </w:rPr>
+      </w:pPr>
+      <w:hyperlink w:anchor="_Toc238422816" w:history="1">
+        <w:r>
+          <w:rPr>
+            <w:rStyle w:val="Hyperlink"/>
+            <w:rFonts w:cs="TH Sarabun New"/>
+            <w:noProof/>
+            <w:szCs w:val="32"/>
+            <w:cs/>
+          </w:rPr>
+          <w:t>ภาพที่ 1.6</w:t>
+        </w:r>
+        <w:r>
+          <w:rPr>
+            <w:rStyle w:val="Hyperlink"/>
+            <w:rFonts w:cs="TH Sarabun New"/>
+            <w:noProof/>
+            <w:szCs w:val="32"/>
+          </w:rPr>
+          <w:t xml:space="preserve"> </w:t>
+        </w:r>
+        <w:r>
+          <w:rPr>
+            <w:rStyle w:val="Hyperlink"/>
+            <w:rFonts w:cs="TH Sarabun New"/>
+            <w:noProof/>
+            <w:szCs w:val="32"/>
+            <w:cs/>
+          </w:rPr>
+          <w:t>ชั้นตอนการคัดลอก</w:t>
+        </w:r>
+        <w:r>
+          <w:rPr>
+            <w:rStyle w:val="Hyperlink"/>
+            <w:rFonts w:cs="TH Sarabun New"/>
+            <w:noProof/>
+            <w:szCs w:val="32"/>
+          </w:rPr>
+          <w:t xml:space="preserve"> API Keys</w:t>
+        </w:r>
+        <w:r>
+          <w:rPr>
+            <w:rStyle w:val="Hyperlink"/>
+            <w:rFonts w:cs="TH Sarabun New"/>
+            <w:noProof/>
+            <w:szCs w:val="32"/>
+            <w:cs/>
+          </w:rPr>
+          <w:t xml:space="preserve"> ใน</w:t>
+        </w:r>
+        <w:r>
+          <w:rPr>
+            <w:rStyle w:val="Hyperlink"/>
+            <w:rFonts w:cs="TH Sarabun New"/>
+            <w:noProof/>
+            <w:szCs w:val="32"/>
+          </w:rPr>
+          <w:t xml:space="preserve"> Roboflow</w:t>
+        </w:r>
+        <w:r>
+          <w:rPr>
+            <w:rFonts w:cs="TH Sarabun New"/>
+            <w:noProof/>
+            <w:webHidden/>
+            <w:szCs w:val="32"/>
+          </w:rPr>
+          <w:tab/>
+        </w:r>
+        <w:r>
+          <w:rPr>
+            <w:rFonts w:cs="TH Sarabun New"/>
+            <w:noProof/>
+            <w:webHidden/>
+            <w:szCs w:val="32"/>
+          </w:rPr>
+          <w:fldChar w:fldCharType="begin"/>
+        </w:r>
+        <w:r>
+          <w:rPr>
+            <w:rFonts w:cs="TH Sarabun New"/>
+            <w:noProof/>
+            <w:webHidden/>
+            <w:szCs w:val="32"/>
+          </w:rPr>
+          <w:instrText xml:space="preserve"> PAGEREF _Toc238422816 \h </w:instrText>
+        </w:r>
+        <w:r>
+          <w:rPr>
+            <w:rFonts w:cs="TH Sarabun New"/>
+            <w:noProof/>
+            <w:webHidden/>
+            <w:szCs w:val="32"/>
+          </w:rPr>
+        </w:r>
+        <w:r>
+          <w:rPr>
+            <w:rFonts w:cs="TH Sarabun New"/>
+            <w:noProof/>
+            <w:webHidden/>
+            <w:szCs w:val="32"/>
+          </w:rPr>
+          <w:fldChar w:fldCharType="separate"/>
+        </w:r>
+        <w:r>
+          <w:rPr>
+            <w:rFonts w:cs="TH Sarabun New"/>
+            <w:noProof/>
+            <w:webHidden/>
+            <w:szCs w:val="32"/>
+          </w:rPr>
+          <w:t>9</w:t>
         </w:r>
         <w:r>
           <w:rPr>
@@ -1760,9 +2231,11 @@
     <w:p>
       <w:pPr>
         <w:pStyle w:val="FirstParagraph"/>
-      </w:pPr>
-      <w:r>
-        <w:t xml:space="preserve">โปรดศึกษาหลักการเบื้องต้นจำนวน 5 ประการดังต่อไปนี้ก่อนเริ่มดำเนินการ เพื่อให้การพัฒนาระบบเป็นไปอย่างราบรื่น:</w:t>
+        <w:jc w:val="thaiDistribute"/>
+        <w:ind w:firstLine="720"/>
+      </w:pPr>
+      <w:r>
+        <w:t xml:space="preserve">  โปรดศึกษาหลักการเบื้องต้นจำนวน 5 ประการดังต่อไปนี้ก่อนเริ่มดำเนินการ เพื่อให้การพัฒนาระบบเป็นไปอย่างราบรื่น:</w:t>
       </w:r>
     </w:p>
     <w:p>
@@ -1772,6 +2245,8 @@
           <w:ilvl w:val="0"/>
           <w:numId w:val="1004"/>
         </w:numPr>
+        <w:jc w:val="thaiDistribute"/>
+        <w:ind w:firstLine="720"/>
       </w:pPr>
       <w:r>
         <w:rPr>
@@ -1809,6 +2284,8 @@
           <w:ilvl w:val="0"/>
           <w:numId w:val="1004"/>
         </w:numPr>
+        <w:jc w:val="thaiDistribute"/>
+        <w:ind w:firstLine="720"/>
       </w:pPr>
       <w:r>
         <w:rPr>
@@ -1877,6 +2354,8 @@
           <w:ilvl w:val="0"/>
           <w:numId w:val="1004"/>
         </w:numPr>
+        <w:jc w:val="thaiDistribute"/>
+        <w:ind w:firstLine="720"/>
       </w:pPr>
       <w:r>
         <w:rPr>
@@ -1923,6 +2402,8 @@
           <w:ilvl w:val="0"/>
           <w:numId w:val="1004"/>
         </w:numPr>
+        <w:jc w:val="thaiDistribute"/>
+        <w:ind w:firstLine="720"/>
       </w:pPr>
       <w:r>
         <w:rPr>
@@ -1945,6 +2426,8 @@
           <w:ilvl w:val="0"/>
           <w:numId w:val="1004"/>
         </w:numPr>
+        <w:jc w:val="thaiDistribute"/>
+        <w:ind w:firstLine="720"/>
       </w:pPr>
       <w:r>
         <w:rPr>
@@ -2008,6 +2491,8 @@
     <w:p>
       <w:pPr>
         <w:pStyle w:val="BlockText"/>
+        <w:jc w:val="thaiDistribute"/>
+        <w:ind w:firstLine="720"/>
       </w:pPr>
       <w:r>
         <w:rPr>
@@ -2054,6 +2539,10 @@
       </w:r>
     </w:p>
     <w:p>
+      <w:pPr>
+        <w:jc w:val="thaiDistribute"/>
+        <w:ind w:firstLine="720"/>
+      </w:pPr>
       <w:r>
         <w:pict>
           <v:rect style="width:0;height:1.5pt" o:hralign="center" o:hrstd="t" o:hr="t"/>
@@ -2072,6 +2561,10 @@
       </w:r>
     </w:p>
     <w:p>
+      <w:pPr>
+        <w:jc w:val="thaiDistribute"/>
+        <w:ind w:firstLine="720"/>
+      </w:pPr>
       <w:r>
         <w:pict>
           <v:rect style="width:0;height:1.5pt" o:hralign="center" o:hrstd="t" o:hr="t"/>
@@ -2090,7 +2583,12 @@
     <w:p>
       <w:pPr>
         <w:pStyle w:val="FirstParagraph"/>
-      </w:pPr>
+        <w:jc w:val="thaiDistribute"/>
+        <w:ind w:firstLine="720"/>
+      </w:pPr>
+      <w:r>
+        <w:t xml:space="preserve">  </w:t>
+      </w:r>
       <w:r>
         <w:rPr>
           <w:b/>
@@ -2262,6 +2760,8 @@
     <w:p>
       <w:pPr>
         <w:pStyle w:val="BlockText"/>
+        <w:jc w:val="thaiDistribute"/>
+        <w:ind w:firstLine="720"/>
       </w:pPr>
       <w:r>
         <w:t xml:space="preserve">เมื่อจบส่วนนี้ คุณควรเข้าใจว่าแต่ละเทคโนโลยีช่วยแก้ปัญหาไหน</w:t>
@@ -2270,7 +2770,12 @@
     <w:p>
       <w:pPr>
         <w:pStyle w:val="FirstParagraph"/>
-      </w:pPr>
+        <w:jc w:val="thaiDistribute"/>
+        <w:ind w:firstLine="720"/>
+      </w:pPr>
+      <w:r>
+        <w:t xml:space="preserve">  </w:t>
+      </w:r>
       <w:r>
         <w:rPr>
           <w:b/>
@@ -2306,6 +2811,8 @@
     <w:p>
       <w:pPr>
         <w:pStyle w:val="FirstParagraph"/>
+        <w:jc w:val="thaiDistribute"/>
+        <w:ind w:firstLine="720"/>
       </w:pPr>
       <w:r>
         <w:t xml:space="preserve">📄 ดูเวอร์ชันข้อความ (fallback)</w:t>
@@ -2347,7 +2854,12 @@
     <w:p>
       <w:pPr>
         <w:pStyle w:val="FirstParagraph"/>
-      </w:pPr>
+        <w:jc w:val="thaiDistribute"/>
+        <w:ind w:firstLine="720"/>
+      </w:pPr>
+      <w:r>
+        <w:t xml:space="preserve">  </w:t>
+      </w:r>
       <w:r>
         <w:rPr>
           <w:b/>
@@ -2381,9 +2893,11 @@
     <w:p>
       <w:pPr>
         <w:pStyle w:val="BodyText"/>
-      </w:pPr>
-      <w:r>
-        <w:t xml:space="preserve">โปรเจกต์ใช้</w:t>
+        <w:jc w:val="thaiDistribute"/>
+        <w:ind w:firstLine="720"/>
+      </w:pPr>
+      <w:r>
+        <w:t xml:space="preserve">  โปรเจกต์ใช้</w:t>
       </w:r>
       <w:r>
         <w:t xml:space="preserve"> </w:t>
@@ -2409,6 +2923,8 @@
           <w:ilvl w:val="0"/>
           <w:numId w:val="1005"/>
         </w:numPr>
+        <w:jc w:val="thaiDistribute"/>
+        <w:ind w:firstLine="720"/>
       </w:pPr>
       <w:r>
         <w:rPr>
@@ -2461,6 +2977,8 @@
           <w:ilvl w:val="0"/>
           <w:numId w:val="1005"/>
         </w:numPr>
+        <w:jc w:val="thaiDistribute"/>
+        <w:ind w:firstLine="720"/>
       </w:pPr>
       <w:r>
         <w:rPr>
@@ -2483,6 +3001,8 @@
           <w:ilvl w:val="0"/>
           <w:numId w:val="1005"/>
         </w:numPr>
+        <w:jc w:val="thaiDistribute"/>
+        <w:ind w:firstLine="720"/>
       </w:pPr>
       <w:r>
         <w:rPr>
@@ -2501,6 +3021,8 @@
     <w:p>
       <w:pPr>
         <w:pStyle w:val="BlockText"/>
+        <w:jc w:val="thaiDistribute"/>
+        <w:ind w:firstLine="720"/>
       </w:pPr>
       <w:r>
         <w:t xml:space="preserve">เมื่อจบหัวข้อนี้ คุณจะเข้าใจว่า YOLO มีหน้าที่ “ตีกรอบและบอกว่าแต่ละกรอบคือเลขอะไร”</w:t>
@@ -2519,9 +3041,11 @@
     <w:p>
       <w:pPr>
         <w:pStyle w:val="FirstParagraph"/>
-      </w:pPr>
-      <w:r>
-        <w:t xml:space="preserve">ปกติถ้าจะสอน AI แยก “มิเตอร์น้ำ vs มิเตอร์ไฟ vs ภาพทั่วไป” ต้องเตรียมภาพตัวอย่างหลายร้อยภาพ แต่โปรเจกต์ใช้ทางลัดด้วย</w:t>
+        <w:jc w:val="thaiDistribute"/>
+        <w:ind w:firstLine="720"/>
+      </w:pPr>
+      <w:r>
+        <w:t xml:space="preserve">  ปกติถ้าจะสอน AI แยก “มิเตอร์น้ำ vs มิเตอร์ไฟ vs ภาพทั่วไป” ต้องเตรียมภาพตัวอย่างหลายร้อยภาพ แต่โปรเจกต์ใช้ทางลัดด้วย</w:t>
       </w:r>
       <w:r>
         <w:t xml:space="preserve"> </w:t>
@@ -2547,6 +3071,8 @@
           <w:ilvl w:val="0"/>
           <w:numId w:val="1006"/>
         </w:numPr>
+        <w:jc w:val="thaiDistribute"/>
+        <w:ind w:firstLine="720"/>
       </w:pPr>
       <w:r>
         <w:rPr>
@@ -2614,7 +3140,12 @@
     <w:p>
       <w:pPr>
         <w:pStyle w:val="FirstParagraph"/>
-      </w:pPr>
+        <w:jc w:val="thaiDistribute"/>
+        <w:ind w:firstLine="720"/>
+      </w:pPr>
+      <w:r>
+        <w:t xml:space="preserve">  </w:t>
+      </w:r>
       <w:r>
         <w:rPr>
           <w:b/>
@@ -2636,6 +3167,8 @@
           <w:ilvl w:val="0"/>
           <w:numId w:val="1007"/>
         </w:numPr>
+        <w:jc w:val="thaiDistribute"/>
+        <w:ind w:firstLine="720"/>
       </w:pPr>
       <w:r>
         <w:rPr>
@@ -2658,6 +3191,8 @@
           <w:ilvl w:val="0"/>
           <w:numId w:val="1007"/>
         </w:numPr>
+        <w:jc w:val="thaiDistribute"/>
+        <w:ind w:firstLine="720"/>
       </w:pPr>
       <w:r>
         <w:rPr>
@@ -2676,6 +3211,8 @@
     <w:p>
       <w:pPr>
         <w:pStyle w:val="BlockText"/>
+        <w:jc w:val="thaiDistribute"/>
+        <w:ind w:firstLine="720"/>
       </w:pPr>
       <w:r>
         <w:rPr>
@@ -2704,6 +3241,10 @@
       </w:r>
     </w:p>
     <w:p>
+      <w:pPr>
+        <w:jc w:val="thaiDistribute"/>
+        <w:ind w:firstLine="720"/>
+      </w:pPr>
       <w:r>
         <w:pict>
           <v:rect style="width:0;height:1.5pt" o:hralign="center" o:hrstd="t" o:hr="t"/>
@@ -2724,6 +3265,8 @@
     <w:p>
       <w:pPr>
         <w:pStyle w:val="BlockText"/>
+        <w:jc w:val="thaiDistribute"/>
+        <w:ind w:firstLine="720"/>
       </w:pPr>
       <w:r>
         <w:t xml:space="preserve">[!NOTE]</w:t>
@@ -2763,7 +3306,12 @@
     <w:p>
       <w:pPr>
         <w:pStyle w:val="FirstParagraph"/>
-      </w:pPr>
+        <w:jc w:val="thaiDistribute"/>
+        <w:ind w:firstLine="720"/>
+      </w:pPr>
+      <w:r>
+        <w:t xml:space="preserve">  </w:t>
+      </w:r>
       <w:r>
         <w:rPr>
           <w:b/>
@@ -2790,7 +3338,12 @@
     <w:p>
       <w:pPr>
         <w:pStyle w:val="FirstParagraph"/>
-      </w:pPr>
+        <w:jc w:val="thaiDistribute"/>
+        <w:ind w:firstLine="720"/>
+      </w:pPr>
+      <w:r>
+        <w:t xml:space="preserve">  </w:t>
+      </w:r>
       <w:r>
         <w:rPr>
           <w:b/>
@@ -2866,6 +3419,9 @@
         <w:t xml:space="preserve"> </w:t>
       </w:r>
       <w:r>
+        <w:t xml:space="preserve">  </w:t>
+      </w:r>
+      <w:r>
         <w:rPr>
           <w:b/>
           <w:bCs/>
@@ -2925,6 +3481,10 @@
       </w:r>
     </w:p>
     <w:p>
+      <w:pPr>
+        <w:jc w:val="thaiDistribute"/>
+        <w:ind w:firstLine="720"/>
+      </w:pPr>
       <w:r>
         <w:pict>
           <v:rect style="width:0;height:1.5pt" o:hralign="center" o:hrstd="t" o:hr="t"/>
@@ -2960,6 +3520,8 @@
     <w:p>
       <w:pPr>
         <w:pStyle w:val="BlockText"/>
+        <w:jc w:val="thaiDistribute"/>
+        <w:ind w:firstLine="720"/>
       </w:pPr>
       <w:r>
         <w:rPr>
@@ -3043,9 +3605,11 @@
     <w:p>
       <w:pPr>
         <w:pStyle w:val="FirstParagraph"/>
-      </w:pPr>
-      <w:r>
-        <w:t xml:space="preserve">เปิด Terminal ที่โฟลเดอร์</w:t>
+        <w:jc w:val="thaiDistribute"/>
+        <w:ind w:firstLine="720"/>
+      </w:pPr>
+      <w:r>
+        <w:t xml:space="preserve">  เปิด Terminal ที่โฟลเดอร์</w:t>
       </w:r>
       <w:r>
         <w:t xml:space="preserve"> </w:t>
@@ -3090,7 +3654,12 @@
     <w:p>
       <w:pPr>
         <w:pStyle w:val="FirstParagraph"/>
-      </w:pPr>
+        <w:jc w:val="thaiDistribute"/>
+        <w:ind w:firstLine="720"/>
+      </w:pPr>
+      <w:r>
+        <w:t xml:space="preserve">  </w:t>
+      </w:r>
       <w:r>
         <w:rPr>
           <w:b/>
@@ -3125,7 +3694,7 @@
         <w:pStyle w:val="BodyText"/>
       </w:pPr>
       <w:r>
-        <w:t xml:space="preserve">รายการใน</w:t>
+        <w:t xml:space="preserve">  รายการใน</w:t>
       </w:r>
       <w:r>
         <w:t xml:space="preserve"> </w:t>
@@ -3204,6 +3773,10 @@
       </w:r>
     </w:p>
     <w:p>
+      <w:pPr>
+        <w:jc w:val="thaiDistribute"/>
+        <w:ind w:firstLine="720"/>
+      </w:pPr>
       <w:r>
         <w:pict>
           <v:rect style="width:0;height:1.5pt" o:hralign="center" o:hrstd="t" o:hr="t"/>
@@ -3224,6 +3797,8 @@
     <w:p>
       <w:pPr>
         <w:pStyle w:val="BlockText"/>
+        <w:jc w:val="thaiDistribute"/>
+        <w:ind w:firstLine="720"/>
       </w:pPr>
       <w:r>
         <w:rPr>
@@ -3242,7 +3817,12 @@
     <w:p>
       <w:pPr>
         <w:pStyle w:val="FirstParagraph"/>
-      </w:pPr>
+        <w:jc w:val="thaiDistribute"/>
+        <w:ind w:firstLine="720"/>
+      </w:pPr>
+      <w:r>
+        <w:t xml:space="preserve">  </w:t>
+      </w:r>
       <w:r>
         <w:rPr>
           <w:b/>
@@ -3306,7 +3886,12 @@
     <w:p>
       <w:pPr>
         <w:pStyle w:val="BodyText"/>
-      </w:pPr>
+        <w:jc w:val="thaiDistribute"/>
+        <w:ind w:firstLine="720"/>
+      </w:pPr>
+      <w:r>
+        <w:t xml:space="preserve">  </w:t>
+      </w:r>
       <w:r>
         <w:rPr>
           <w:b/>
@@ -3324,7 +3909,12 @@
     <w:p>
       <w:pPr>
         <w:pStyle w:val="BodyText"/>
-      </w:pPr>
+        <w:jc w:val="thaiDistribute"/>
+        <w:ind w:firstLine="720"/>
+      </w:pPr>
+      <w:r>
+        <w:t xml:space="preserve">  </w:t>
+      </w:r>
       <w:r>
         <w:rPr>
           <w:b/>
@@ -3342,7 +3932,12 @@
     <w:p>
       <w:pPr>
         <w:pStyle w:val="BodyText"/>
-      </w:pPr>
+        <w:jc w:val="thaiDistribute"/>
+        <w:ind w:firstLine="720"/>
+      </w:pPr>
+      <w:r>
+        <w:t xml:space="preserve">  </w:t>
+      </w:r>
       <w:r>
         <w:rPr>
           <w:b/>
@@ -3451,6 +4046,9 @@
         <w:t xml:space="preserve"> </w:t>
       </w:r>
       <w:r>
+        <w:t xml:space="preserve">  </w:t>
+      </w:r>
+      <w:r>
         <w:rPr>
           <w:b/>
           <w:bCs/>
@@ -3495,6 +4093,10 @@
       </w:r>
     </w:p>
     <w:p>
+      <w:pPr>
+        <w:jc w:val="thaiDistribute"/>
+        <w:ind w:firstLine="720"/>
+      </w:pPr>
       <w:r>
         <w:pict>
           <v:rect style="width:0;height:1.5pt" o:hralign="center" o:hrstd="t" o:hr="t"/>
@@ -3514,9 +4116,11 @@
     <w:p>
       <w:pPr>
         <w:pStyle w:val="FirstParagraph"/>
-      </w:pPr>
-      <w:r>
-        <w:t xml:space="preserve">กระบวนการอ่านตัวเลขมี 4 ขั้นตอน — แต่ละขั้นตอนแก้ปัญหาคนละแบบ ต่อกันเป็นท่อส่งข้อมูล:</w:t>
+        <w:jc w:val="thaiDistribute"/>
+        <w:ind w:firstLine="720"/>
+      </w:pPr>
+      <w:r>
+        <w:t xml:space="preserve">  กระบวนการอ่านตัวเลขมี 4 ขั้นตอน — แต่ละขั้นตอนแก้ปัญหาคนละแบบ ต่อกันเป็นท่อส่งข้อมูล:</w:t>
       </w:r>
     </w:p>
     <w:bookmarkStart w:id="40" w:name="X75de373fdef90ef2f7ca58fe460bb48bb960914"/>
@@ -3535,6 +4139,8 @@
           <w:ilvl w:val="0"/>
           <w:numId w:val="1008"/>
         </w:numPr>
+        <w:jc w:val="thaiDistribute"/>
+        <w:ind w:firstLine="720"/>
       </w:pPr>
       <w:r>
         <w:rPr>
@@ -3557,6 +4163,8 @@
           <w:ilvl w:val="0"/>
           <w:numId w:val="1008"/>
         </w:numPr>
+        <w:jc w:val="thaiDistribute"/>
+        <w:ind w:firstLine="720"/>
       </w:pPr>
       <w:r>
         <w:rPr>
@@ -3579,6 +4187,8 @@
           <w:ilvl w:val="0"/>
           <w:numId w:val="1008"/>
         </w:numPr>
+        <w:jc w:val="thaiDistribute"/>
+        <w:ind w:firstLine="720"/>
       </w:pPr>
       <w:r>
         <w:rPr>
@@ -3627,7 +4237,12 @@
     <w:p>
       <w:pPr>
         <w:pStyle w:val="FirstParagraph"/>
-      </w:pPr>
+        <w:jc w:val="thaiDistribute"/>
+        <w:ind w:firstLine="720"/>
+      </w:pPr>
+      <w:r>
+        <w:t xml:space="preserve">  </w:t>
+      </w:r>
       <w:r>
         <w:rPr>
           <w:b/>
@@ -3645,7 +4260,12 @@
     <w:p>
       <w:pPr>
         <w:pStyle w:val="BodyText"/>
-      </w:pPr>
+        <w:jc w:val="thaiDistribute"/>
+        <w:ind w:firstLine="720"/>
+      </w:pPr>
+      <w:r>
+        <w:t xml:space="preserve">  </w:t>
+      </w:r>
       <w:r>
         <w:rPr>
           <w:b/>
@@ -3663,7 +4283,12 @@
     <w:p>
       <w:pPr>
         <w:pStyle w:val="BodyText"/>
-      </w:pPr>
+        <w:jc w:val="thaiDistribute"/>
+        <w:ind w:firstLine="720"/>
+      </w:pPr>
+      <w:r>
+        <w:t xml:space="preserve">  </w:t>
+      </w:r>
       <w:r>
         <w:rPr>
           <w:b/>
@@ -3764,6 +4389,10 @@
       </w:r>
     </w:p>
     <w:p>
+      <w:pPr>
+        <w:jc w:val="thaiDistribute"/>
+        <w:ind w:firstLine="720"/>
+      </w:pPr>
       <w:r>
         <w:pict>
           <v:rect style="width:0;height:1.5pt" o:hralign="center" o:hrstd="t" o:hr="t"/>
@@ -3801,7 +4430,12 @@
     <w:p>
       <w:pPr>
         <w:pStyle w:val="FirstParagraph"/>
-      </w:pPr>
+        <w:jc w:val="thaiDistribute"/>
+        <w:ind w:firstLine="720"/>
+      </w:pPr>
+      <w:r>
+        <w:t xml:space="preserve">  </w:t>
+      </w:r>
       <w:r>
         <w:rPr>
           <w:b/>
@@ -3819,9 +4453,11 @@
     <w:p>
       <w:pPr>
         <w:pStyle w:val="BodyText"/>
-      </w:pPr>
-      <w:r>
-        <w:t xml:space="preserve">การทำงานของระบบก็เหมือนกัน:</w:t>
+        <w:jc w:val="thaiDistribute"/>
+        <w:ind w:firstLine="720"/>
+      </w:pPr>
+      <w:r>
+        <w:t xml:space="preserve">  การทำงานของระบบก็เหมือนกัน:</w:t>
       </w:r>
     </w:p>
     <w:p>
@@ -3831,6 +4467,8 @@
           <w:ilvl w:val="0"/>
           <w:numId w:val="1009"/>
         </w:numPr>
+        <w:jc w:val="thaiDistribute"/>
+        <w:ind w:firstLine="720"/>
       </w:pPr>
       <w:r>
         <w:t xml:space="preserve">เราหมุนภาพ 90° เพื่อให้ AI หาตัวเลขได้ง่าย</w:t>
@@ -3843,6 +4481,8 @@
           <w:ilvl w:val="0"/>
           <w:numId w:val="1009"/>
         </w:numPr>
+        <w:jc w:val="thaiDistribute"/>
+        <w:ind w:firstLine="720"/>
       </w:pPr>
       <w:r>
         <w:t xml:space="preserve">พิกัดกล่อง</w:t>
@@ -3880,6 +4520,8 @@
           <w:ilvl w:val="0"/>
           <w:numId w:val="1009"/>
         </w:numPr>
+        <w:jc w:val="thaiDistribute"/>
+        <w:ind w:firstLine="720"/>
       </w:pPr>
       <w:r>
         <w:t xml:space="preserve">ถ้าจะเอากล่องไปวาดบน</w:t>
@@ -3952,6 +4594,8 @@
     <w:p>
       <w:pPr>
         <w:pStyle w:val="FirstParagraph"/>
+        <w:jc w:val="thaiDistribute"/>
+        <w:ind w:firstLine="720"/>
       </w:pPr>
       <w:r>
         <w:t xml:space="preserve">📄 ดูเวอร์ชันข้อความ</w:t>
@@ -3984,7 +4628,12 @@
     <w:p>
       <w:pPr>
         <w:pStyle w:val="FirstParagraph"/>
-      </w:pPr>
+        <w:jc w:val="thaiDistribute"/>
+        <w:ind w:firstLine="720"/>
+      </w:pPr>
+      <w:r>
+        <w:t xml:space="preserve">  </w:t>
+      </w:r>
       <w:r>
         <w:rPr>
           <w:b/>
@@ -4021,6 +4670,8 @@
           <w:ilvl w:val="0"/>
           <w:numId w:val="1010"/>
         </w:numPr>
+        <w:jc w:val="thaiDistribute"/>
+        <w:ind w:firstLine="720"/>
       </w:pPr>
       <w:r>
         <w:rPr>
@@ -4122,6 +4773,8 @@
           <w:ilvl w:val="0"/>
           <w:numId w:val="1010"/>
         </w:numPr>
+        <w:jc w:val="thaiDistribute"/>
+        <w:ind w:firstLine="720"/>
       </w:pPr>
       <w:r>
         <w:rPr>
@@ -4232,6 +4885,8 @@
           <w:ilvl w:val="0"/>
           <w:numId w:val="1010"/>
         </w:numPr>
+        <w:jc w:val="thaiDistribute"/>
+        <w:ind w:firstLine="720"/>
       </w:pPr>
       <w:r>
         <w:rPr>
@@ -4329,6 +4984,8 @@
     <w:p>
       <w:pPr>
         <w:pStyle w:val="BlockText"/>
+        <w:jc w:val="thaiDistribute"/>
+        <w:ind w:firstLine="720"/>
       </w:pPr>
       <w:r>
         <w:t xml:space="preserve">หากยังไม่ชัดเจน ขอให้ทดลองวาดรูปสี่เหลี่ยมบนกระดาษ กำหนดจุดมุม แล้วทดลองหมุนกระดาษ — สูตรด้านล่างคือการถ่ายทอดสิ่งที่ท่านสังเกตเห็นให้อยู่ในรูปของรหัสต้นฉบับ</w:t>
@@ -4337,7 +4994,12 @@
     <w:p>
       <w:pPr>
         <w:pStyle w:val="FirstParagraph"/>
-      </w:pPr>
+        <w:jc w:val="thaiDistribute"/>
+        <w:ind w:firstLine="720"/>
+      </w:pPr>
+      <w:r>
+        <w:t xml:space="preserve">  </w:t>
+      </w:r>
       <w:r>
         <w:rPr>
           <w:b/>
@@ -4355,7 +5017,12 @@
     <w:p>
       <w:pPr>
         <w:pStyle w:val="BodyText"/>
-      </w:pPr>
+        <w:jc w:val="thaiDistribute"/>
+        <w:ind w:firstLine="720"/>
+      </w:pPr>
+      <w:r>
+        <w:t xml:space="preserve">  </w:t>
+      </w:r>
       <w:r>
         <w:rPr>
           <w:b/>
@@ -4403,7 +5070,12 @@
     <w:p>
       <w:pPr>
         <w:pStyle w:val="BodyText"/>
-      </w:pPr>
+        <w:jc w:val="thaiDistribute"/>
+        <w:ind w:firstLine="720"/>
+      </w:pPr>
+      <w:r>
+        <w:t xml:space="preserve">  </w:t>
+      </w:r>
       <w:r>
         <w:rPr>
           <w:b/>
@@ -4602,7 +5274,12 @@
     <w:p>
       <w:pPr>
         <w:pStyle w:val="FirstParagraph"/>
-      </w:pPr>
+        <w:jc w:val="thaiDistribute"/>
+        <w:ind w:firstLine="720"/>
+      </w:pPr>
+      <w:r>
+        <w:t xml:space="preserve">  </w:t>
+      </w:r>
       <w:r>
         <w:rPr>
           <w:b/>
@@ -4618,6 +5295,10 @@
       </w:r>
     </w:p>
     <w:p>
+      <w:pPr>
+        <w:jc w:val="thaiDistribute"/>
+        <w:ind w:firstLine="720"/>
+      </w:pPr>
       <w:r>
         <w:pict>
           <v:rect style="width:0;height:1.5pt" o:hralign="center" o:hrstd="t" o:hr="t"/>
@@ -4650,6 +5331,8 @@
           <w:ilvl w:val="0"/>
           <w:numId w:val="1011"/>
         </w:numPr>
+        <w:jc w:val="thaiDistribute"/>
+        <w:ind w:firstLine="720"/>
       </w:pPr>
       <w:r>
         <w:rPr>
@@ -4688,6 +5371,8 @@
           <w:ilvl w:val="0"/>
           <w:numId w:val="1011"/>
         </w:numPr>
+        <w:jc w:val="thaiDistribute"/>
+        <w:ind w:firstLine="720"/>
       </w:pPr>
       <w:r>
         <w:rPr>
@@ -4726,6 +5411,8 @@
           <w:ilvl w:val="0"/>
           <w:numId w:val="1011"/>
         </w:numPr>
+        <w:jc w:val="thaiDistribute"/>
+        <w:ind w:firstLine="720"/>
       </w:pPr>
       <w:r>
         <w:rPr>
@@ -4792,7 +5479,12 @@
     <w:p>
       <w:pPr>
         <w:pStyle w:val="FirstParagraph"/>
-      </w:pPr>
+        <w:jc w:val="thaiDistribute"/>
+        <w:ind w:firstLine="720"/>
+      </w:pPr>
+      <w:r>
+        <w:t xml:space="preserve">  </w:t>
+      </w:r>
       <w:r>
         <w:rPr>
           <w:b/>
@@ -4810,7 +5502,12 @@
     <w:p>
       <w:pPr>
         <w:pStyle w:val="BodyText"/>
-      </w:pPr>
+        <w:jc w:val="thaiDistribute"/>
+        <w:ind w:firstLine="720"/>
+      </w:pPr>
+      <w:r>
+        <w:t xml:space="preserve">  </w:t>
+      </w:r>
       <w:r>
         <w:rPr>
           <w:b/>
@@ -4828,7 +5525,12 @@
     <w:p>
       <w:pPr>
         <w:pStyle w:val="BodyText"/>
-      </w:pPr>
+        <w:jc w:val="thaiDistribute"/>
+        <w:ind w:firstLine="720"/>
+      </w:pPr>
+      <w:r>
+        <w:t xml:space="preserve">  </w:t>
+      </w:r>
       <w:r>
         <w:rPr>
           <w:b/>
@@ -4944,6 +5646,10 @@
       </w:r>
     </w:p>
     <w:p>
+      <w:pPr>
+        <w:jc w:val="thaiDistribute"/>
+        <w:ind w:firstLine="720"/>
+      </w:pPr>
       <w:r>
         <w:pict>
           <v:rect style="width:0;height:1.5pt" o:hralign="center" o:hrstd="t" o:hr="t"/>
@@ -4972,7 +5678,12 @@
     <w:p>
       <w:pPr>
         <w:pStyle w:val="FirstParagraph"/>
-      </w:pPr>
+        <w:jc w:val="thaiDistribute"/>
+        <w:ind w:firstLine="720"/>
+      </w:pPr>
+      <w:r>
+        <w:t xml:space="preserve">  </w:t>
+      </w:r>
       <w:r>
         <w:rPr>
           <w:b/>
@@ -5002,12 +5713,18 @@
     <w:p>
       <w:pPr>
         <w:pStyle w:val="BodyText"/>
-      </w:pPr>
-      <w:r>
-        <w:t xml:space="preserve">ถ้าเราลองแค่มุมเดียวหรือฟิลเตอร์เดียวแล้วพลาด ระบบจะอ่านผิดทันที</w:t>
-      </w:r>
-    </w:p>
-    <w:p>
+        <w:jc w:val="thaiDistribute"/>
+        <w:ind w:firstLine="720"/>
+      </w:pPr>
+      <w:r>
+        <w:t xml:space="preserve">  ถ้าเราลองแค่มุมเดียวหรือฟิลเตอร์เดียวแล้วพลาด ระบบจะอ่านผิดทันที</w:t>
+      </w:r>
+    </w:p>
+    <w:p>
+      <w:pPr>
+        <w:jc w:val="thaiDistribute"/>
+        <w:ind w:firstLine="720"/>
+      </w:pPr>
       <w:r>
         <w:pict>
           <v:rect style="width:0;height:1.5pt" o:hralign="center" o:hrstd="t" o:hr="t"/>
@@ -5017,7 +5734,12 @@
     <w:p>
       <w:pPr>
         <w:pStyle w:val="FirstParagraph"/>
-      </w:pPr>
+        <w:jc w:val="thaiDistribute"/>
+        <w:ind w:firstLine="720"/>
+      </w:pPr>
+      <w:r>
+        <w:t xml:space="preserve">  </w:t>
+      </w:r>
       <w:r>
         <w:rPr>
           <w:b/>
@@ -5075,6 +5797,8 @@
     <w:p>
       <w:pPr>
         <w:pStyle w:val="FirstParagraph"/>
+        <w:jc w:val="thaiDistribute"/>
+        <w:ind w:firstLine="720"/>
       </w:pPr>
       <w:r>
         <w:t xml:space="preserve">📄 ดูเวอร์ชันข้อความ</w:t>
@@ -5105,6 +5829,10 @@
       </w:r>
     </w:p>
     <w:p>
+      <w:pPr>
+        <w:jc w:val="thaiDistribute"/>
+        <w:ind w:firstLine="720"/>
+      </w:pPr>
       <w:r>
         <w:pict>
           <v:rect style="width:0;height:1.5pt" o:hralign="center" o:hrstd="t" o:hr="t"/>
@@ -5114,7 +5842,12 @@
     <w:p>
       <w:pPr>
         <w:pStyle w:val="FirstParagraph"/>
-      </w:pPr>
+        <w:jc w:val="thaiDistribute"/>
+        <w:ind w:firstLine="720"/>
+      </w:pPr>
+      <w:r>
+        <w:t xml:space="preserve">  </w:t>
+      </w:r>
       <w:r>
         <w:rPr>
           <w:b/>
@@ -5130,6 +5863,8 @@
           <w:ilvl w:val="0"/>
           <w:numId w:val="1012"/>
         </w:numPr>
+        <w:jc w:val="thaiDistribute"/>
+        <w:ind w:firstLine="720"/>
       </w:pPr>
       <w:r>
         <w:rPr>
@@ -5152,6 +5887,8 @@
           <w:ilvl w:val="0"/>
           <w:numId w:val="1012"/>
         </w:numPr>
+        <w:jc w:val="thaiDistribute"/>
+        <w:ind w:firstLine="720"/>
       </w:pPr>
       <w:r>
         <w:rPr>
@@ -5174,6 +5911,8 @@
           <w:ilvl w:val="0"/>
           <w:numId w:val="1012"/>
         </w:numPr>
+        <w:jc w:val="thaiDistribute"/>
+        <w:ind w:firstLine="720"/>
       </w:pPr>
       <w:r>
         <w:rPr>
@@ -5196,6 +5935,8 @@
           <w:ilvl w:val="0"/>
           <w:numId w:val="1012"/>
         </w:numPr>
+        <w:jc w:val="thaiDistribute"/>
+        <w:ind w:firstLine="720"/>
       </w:pPr>
       <w:r>
         <w:rPr>
@@ -5218,6 +5959,8 @@
           <w:ilvl w:val="0"/>
           <w:numId w:val="1012"/>
         </w:numPr>
+        <w:jc w:val="thaiDistribute"/>
+        <w:ind w:firstLine="720"/>
       </w:pPr>
       <w:r>
         <w:rPr>
@@ -5240,6 +5983,8 @@
           <w:ilvl w:val="0"/>
           <w:numId w:val="1012"/>
         </w:numPr>
+        <w:jc w:val="thaiDistribute"/>
+        <w:ind w:firstLine="720"/>
       </w:pPr>
       <w:r>
         <w:rPr>
@@ -5262,6 +6007,8 @@
           <w:ilvl w:val="0"/>
           <w:numId w:val="1012"/>
         </w:numPr>
+        <w:jc w:val="thaiDistribute"/>
+        <w:ind w:firstLine="720"/>
       </w:pPr>
       <w:r>
         <w:rPr>
@@ -5284,6 +6031,8 @@
           <w:ilvl w:val="0"/>
           <w:numId w:val="1012"/>
         </w:numPr>
+        <w:jc w:val="thaiDistribute"/>
+        <w:ind w:firstLine="720"/>
       </w:pPr>
       <w:r>
         <w:rPr>
@@ -5306,6 +6055,8 @@
           <w:ilvl w:val="0"/>
           <w:numId w:val="1012"/>
         </w:numPr>
+        <w:jc w:val="thaiDistribute"/>
+        <w:ind w:firstLine="720"/>
       </w:pPr>
       <w:r>
         <w:rPr>
@@ -5324,7 +6075,12 @@
     <w:p>
       <w:pPr>
         <w:pStyle w:val="FirstParagraph"/>
-      </w:pPr>
+        <w:jc w:val="thaiDistribute"/>
+        <w:ind w:firstLine="720"/>
+      </w:pPr>
+      <w:r>
+        <w:t xml:space="preserve">  </w:t>
+      </w:r>
       <w:r>
         <w:rPr>
           <w:b/>
@@ -5340,6 +6096,8 @@
           <w:ilvl w:val="0"/>
           <w:numId w:val="1013"/>
         </w:numPr>
+        <w:jc w:val="thaiDistribute"/>
+        <w:ind w:firstLine="720"/>
       </w:pPr>
       <w:r>
         <w:rPr>
@@ -5371,6 +6129,8 @@
           <w:ilvl w:val="1"/>
           <w:numId w:val="1014"/>
         </w:numPr>
+        <w:jc w:val="thaiDistribute"/>
+        <w:ind w:firstLine="720"/>
       </w:pPr>
       <w:r>
         <w:rPr>
@@ -5409,6 +6169,8 @@
           <w:ilvl w:val="1"/>
           <w:numId w:val="1014"/>
         </w:numPr>
+        <w:jc w:val="thaiDistribute"/>
+        <w:ind w:firstLine="720"/>
       </w:pPr>
       <w:r>
         <w:rPr>
@@ -5431,6 +6193,8 @@
           <w:ilvl w:val="0"/>
           <w:numId w:val="1013"/>
         </w:numPr>
+        <w:jc w:val="thaiDistribute"/>
+        <w:ind w:firstLine="720"/>
       </w:pPr>
       <w:r>
         <w:rPr>
@@ -5462,6 +6226,8 @@
           <w:ilvl w:val="1"/>
           <w:numId w:val="1015"/>
         </w:numPr>
+        <w:jc w:val="thaiDistribute"/>
+        <w:ind w:firstLine="720"/>
       </w:pPr>
       <w:r>
         <w:rPr>
@@ -5484,6 +6250,8 @@
           <w:ilvl w:val="1"/>
           <w:numId w:val="1015"/>
         </w:numPr>
+        <w:jc w:val="thaiDistribute"/>
+        <w:ind w:firstLine="720"/>
       </w:pPr>
       <w:r>
         <w:rPr>
@@ -5559,6 +6327,8 @@
           <w:ilvl w:val="0"/>
           <w:numId w:val="1013"/>
         </w:numPr>
+        <w:jc w:val="thaiDistribute"/>
+        <w:ind w:firstLine="720"/>
       </w:pPr>
       <w:r>
         <w:rPr>
@@ -5590,6 +6360,8 @@
           <w:ilvl w:val="1"/>
           <w:numId w:val="1016"/>
         </w:numPr>
+        <w:jc w:val="thaiDistribute"/>
+        <w:ind w:firstLine="720"/>
       </w:pPr>
       <w:r>
         <w:rPr>
@@ -5612,6 +6384,8 @@
           <w:ilvl w:val="1"/>
           <w:numId w:val="1016"/>
         </w:numPr>
+        <w:jc w:val="thaiDistribute"/>
+        <w:ind w:firstLine="720"/>
       </w:pPr>
       <w:r>
         <w:rPr>
@@ -5694,7 +6468,12 @@
     <w:p>
       <w:pPr>
         <w:pStyle w:val="FirstParagraph"/>
-      </w:pPr>
+        <w:jc w:val="thaiDistribute"/>
+        <w:ind w:firstLine="720"/>
+      </w:pPr>
+      <w:r>
+        <w:t xml:space="preserve">  </w:t>
+      </w:r>
       <w:r>
         <w:rPr>
           <w:b/>
@@ -5712,7 +6491,12 @@
     <w:p>
       <w:pPr>
         <w:pStyle w:val="BodyText"/>
-      </w:pPr>
+        <w:jc w:val="thaiDistribute"/>
+        <w:ind w:firstLine="720"/>
+      </w:pPr>
+      <w:r>
+        <w:t xml:space="preserve">  </w:t>
+      </w:r>
       <w:r>
         <w:rPr>
           <w:b/>
@@ -5730,7 +6514,12 @@
     <w:p>
       <w:pPr>
         <w:pStyle w:val="BodyText"/>
-      </w:pPr>
+        <w:jc w:val="thaiDistribute"/>
+        <w:ind w:firstLine="720"/>
+      </w:pPr>
+      <w:r>
+        <w:t xml:space="preserve">  </w:t>
+      </w:r>
       <w:r>
         <w:rPr>
           <w:b/>
@@ -5806,6 +6595,10 @@
       </w:r>
     </w:p>
     <w:p>
+      <w:pPr>
+        <w:jc w:val="thaiDistribute"/>
+        <w:ind w:firstLine="720"/>
+      </w:pPr>
       <w:r>
         <w:pict>
           <v:rect style="width:0;height:1.5pt" o:hralign="center" o:hrstd="t" o:hr="t"/>
@@ -5861,6 +6654,8 @@
     <w:p>
       <w:pPr>
         <w:pStyle w:val="BlockText"/>
+        <w:jc w:val="thaiDistribute"/>
+        <w:ind w:firstLine="720"/>
       </w:pPr>
       <w:r>
         <w:rPr>
@@ -5919,6 +6714,10 @@
       </w:r>
     </w:p>
     <w:p>
+      <w:pPr>
+        <w:jc w:val="thaiDistribute"/>
+        <w:ind w:firstLine="720"/>
+      </w:pPr>
       <w:r>
         <w:pict>
           <v:rect style="width:0;height:1.5pt" o:hralign="center" o:hrstd="t" o:hr="t"/>
@@ -5938,6 +6737,10 @@
       </w:r>
     </w:p>
     <w:p>
+      <w:pPr>
+        <w:jc w:val="thaiDistribute"/>
+        <w:ind w:firstLine="720"/>
+      </w:pPr>
       <w:r>
         <w:pict>
           <v:rect style="width:0;height:1.5pt" o:hralign="center" o:hrstd="t" o:hr="t"/>
@@ -5956,9 +6759,11 @@
     <w:p>
       <w:pPr>
         <w:pStyle w:val="FirstParagraph"/>
-      </w:pPr>
-      <w:r>
-        <w:t xml:space="preserve">ระบบที่ดีไม่ใช่แค่อ่านถูก แต่ต้องรู้ว่าเมื่อไหร่ “ไม่ควรเชื่อคำตอบตัวเอง” — ส่วนนี้คือตาข่ายนิรภัย</w:t>
+        <w:jc w:val="thaiDistribute"/>
+        <w:ind w:firstLine="720"/>
+      </w:pPr>
+      <w:r>
+        <w:t xml:space="preserve">  ระบบที่ดีไม่ใช่แค่อ่านถูก แต่ต้องรู้ว่าเมื่อไหร่ “ไม่ควรเชื่อคำตอบตัวเอง” — ส่วนนี้คือตาข่ายนิรภัย</w:t>
       </w:r>
     </w:p>
     <w:p>
@@ -5988,6 +6793,8 @@
     <w:p>
       <w:pPr>
         <w:pStyle w:val="FirstParagraph"/>
+        <w:jc w:val="thaiDistribute"/>
+        <w:ind w:firstLine="720"/>
       </w:pPr>
       <w:r>
         <w:t xml:space="preserve">📄 ดูเวอร์ชันข้อความ</w:t>
@@ -6042,6 +6849,8 @@
           <w:ilvl w:val="0"/>
           <w:numId w:val="1017"/>
         </w:numPr>
+        <w:jc w:val="thaiDistribute"/>
+        <w:ind w:firstLine="720"/>
       </w:pPr>
       <w:r>
         <w:rPr>
@@ -6136,6 +6945,8 @@
           <w:ilvl w:val="0"/>
           <w:numId w:val="1017"/>
         </w:numPr>
+        <w:jc w:val="thaiDistribute"/>
+        <w:ind w:firstLine="720"/>
       </w:pPr>
       <w:r>
         <w:rPr>
@@ -6173,6 +6984,8 @@
           <w:ilvl w:val="0"/>
           <w:numId w:val="1017"/>
         </w:numPr>
+        <w:jc w:val="thaiDistribute"/>
+        <w:ind w:firstLine="720"/>
       </w:pPr>
       <w:r>
         <w:rPr>
@@ -6224,7 +7037,12 @@
     <w:p>
       <w:pPr>
         <w:pStyle w:val="FirstParagraph"/>
-      </w:pPr>
+        <w:jc w:val="thaiDistribute"/>
+        <w:ind w:firstLine="720"/>
+      </w:pPr>
+      <w:r>
+        <w:t xml:space="preserve">  </w:t>
+      </w:r>
       <w:r>
         <w:rPr>
           <w:b/>
@@ -6242,7 +7060,12 @@
     <w:p>
       <w:pPr>
         <w:pStyle w:val="BodyText"/>
-      </w:pPr>
+        <w:jc w:val="thaiDistribute"/>
+        <w:ind w:firstLine="720"/>
+      </w:pPr>
+      <w:r>
+        <w:t xml:space="preserve">  </w:t>
+      </w:r>
       <w:r>
         <w:rPr>
           <w:b/>
@@ -6275,7 +7098,12 @@
     <w:p>
       <w:pPr>
         <w:pStyle w:val="BodyText"/>
-      </w:pPr>
+        <w:jc w:val="thaiDistribute"/>
+        <w:ind w:firstLine="720"/>
+      </w:pPr>
+      <w:r>
+        <w:t xml:space="preserve">  </w:t>
+      </w:r>
       <w:r>
         <w:rPr>
           <w:b/>
@@ -6382,6 +7210,10 @@
       </w:r>
     </w:p>
     <w:p>
+      <w:pPr>
+        <w:jc w:val="thaiDistribute"/>
+        <w:ind w:firstLine="720"/>
+      </w:pPr>
       <w:r>
         <w:pict>
           <v:rect style="width:0;height:1.5pt" o:hralign="center" o:hrstd="t" o:hr="t"/>
@@ -6410,9 +7242,11 @@
     <w:p>
       <w:pPr>
         <w:pStyle w:val="FirstParagraph"/>
-      </w:pPr>
-      <w:r>
-        <w:t xml:space="preserve">ฟังก์ชันนี้เป็น “ผู้กำกับ” ที่เรียกทุกขั้นตอนตามลำดับ และสร้าง</w:t>
+        <w:jc w:val="thaiDistribute"/>
+        <w:ind w:firstLine="720"/>
+      </w:pPr>
+      <w:r>
+        <w:t xml:space="preserve">  ฟังก์ชันนี้เป็น “ผู้กำกับ” ที่เรียกทุกขั้นตอนตามลำดับ และสร้าง</w:t>
       </w:r>
       <w:r>
         <w:t xml:space="preserve"> </w:t>
@@ -6433,7 +7267,12 @@
     <w:p>
       <w:pPr>
         <w:pStyle w:val="BodyText"/>
-      </w:pPr>
+        <w:jc w:val="thaiDistribute"/>
+        <w:ind w:firstLine="720"/>
+      </w:pPr>
+      <w:r>
+        <w:t xml:space="preserve">  </w:t>
+      </w:r>
       <w:r>
         <w:rPr>
           <w:b/>
@@ -6460,7 +7299,12 @@
     <w:p>
       <w:pPr>
         <w:pStyle w:val="BodyText"/>
-      </w:pPr>
+        <w:jc w:val="thaiDistribute"/>
+        <w:ind w:firstLine="720"/>
+      </w:pPr>
+      <w:r>
+        <w:t xml:space="preserve">  </w:t>
+      </w:r>
       <w:r>
         <w:rPr>
           <w:b/>
@@ -6493,7 +7337,12 @@
     <w:p>
       <w:pPr>
         <w:pStyle w:val="BodyText"/>
-      </w:pPr>
+        <w:jc w:val="thaiDistribute"/>
+        <w:ind w:firstLine="720"/>
+      </w:pPr>
+      <w:r>
+        <w:t xml:space="preserve">  </w:t>
+      </w:r>
       <w:r>
         <w:rPr>
           <w:b/>
@@ -6602,7 +7451,12 @@
     <w:p>
       <w:pPr>
         <w:pStyle w:val="FirstParagraph"/>
-      </w:pPr>
+        <w:jc w:val="thaiDistribute"/>
+        <w:ind w:firstLine="720"/>
+      </w:pPr>
+      <w:r>
+        <w:t xml:space="preserve">  </w:t>
+      </w:r>
       <w:r>
         <w:rPr>
           <w:b/>
@@ -6708,6 +7562,10 @@
       </w:r>
     </w:p>
     <w:p>
+      <w:pPr>
+        <w:jc w:val="thaiDistribute"/>
+        <w:ind w:firstLine="720"/>
+      </w:pPr>
       <w:r>
         <w:pict>
           <v:rect style="width:0;height:1.5pt" o:hralign="center" o:hrstd="t" o:hr="t"/>
@@ -6728,6 +7586,8 @@
     <w:p>
       <w:pPr>
         <w:pStyle w:val="BlockText"/>
+        <w:jc w:val="thaiDistribute"/>
+        <w:ind w:firstLine="720"/>
       </w:pPr>
       <w:r>
         <w:rPr>
@@ -6746,7 +7606,12 @@
     <w:p>
       <w:pPr>
         <w:pStyle w:val="FirstParagraph"/>
-      </w:pPr>
+        <w:jc w:val="thaiDistribute"/>
+        <w:ind w:firstLine="720"/>
+      </w:pPr>
+      <w:r>
+        <w:t xml:space="preserve">  </w:t>
+      </w:r>
       <w:r>
         <w:rPr>
           <w:b/>
@@ -6773,7 +7638,12 @@
     <w:p>
       <w:pPr>
         <w:pStyle w:val="BodyText"/>
-      </w:pPr>
+        <w:jc w:val="thaiDistribute"/>
+        <w:ind w:firstLine="720"/>
+      </w:pPr>
+      <w:r>
+        <w:t xml:space="preserve">  </w:t>
+      </w:r>
       <w:r>
         <w:rPr>
           <w:b/>
@@ -6821,7 +7691,12 @@
     <w:p>
       <w:pPr>
         <w:pStyle w:val="BodyText"/>
-      </w:pPr>
+        <w:jc w:val="thaiDistribute"/>
+        <w:ind w:firstLine="720"/>
+      </w:pPr>
+      <w:r>
+        <w:t xml:space="preserve">  </w:t>
+      </w:r>
       <w:r>
         <w:rPr>
           <w:b/>
@@ -6869,7 +7744,12 @@
     <w:p>
       <w:pPr>
         <w:pStyle w:val="BodyText"/>
-      </w:pPr>
+        <w:jc w:val="thaiDistribute"/>
+        <w:ind w:firstLine="720"/>
+      </w:pPr>
+      <w:r>
+        <w:t xml:space="preserve">  </w:t>
+      </w:r>
       <w:r>
         <w:rPr>
           <w:b/>
@@ -6902,7 +7782,12 @@
     <w:p>
       <w:pPr>
         <w:pStyle w:val="BodyText"/>
-      </w:pPr>
+        <w:jc w:val="thaiDistribute"/>
+        <w:ind w:firstLine="720"/>
+      </w:pPr>
+      <w:r>
+        <w:t xml:space="preserve">  </w:t>
+      </w:r>
       <w:r>
         <w:rPr>
           <w:b/>
@@ -7008,7 +7893,12 @@
     <w:p>
       <w:pPr>
         <w:pStyle w:val="FirstParagraph"/>
-      </w:pPr>
+        <w:jc w:val="thaiDistribute"/>
+        <w:ind w:firstLine="720"/>
+      </w:pPr>
+      <w:r>
+        <w:t xml:space="preserve">  </w:t>
+      </w:r>
       <w:r>
         <w:rPr>
           <w:b/>
@@ -7039,6 +7929,10 @@
       </w:r>
     </w:p>
     <w:p>
+      <w:pPr>
+        <w:jc w:val="thaiDistribute"/>
+        <w:ind w:firstLine="720"/>
+      </w:pPr>
       <w:r>
         <w:pict>
           <v:rect style="width:0;height:1.5pt" o:hralign="center" o:hrstd="t" o:hr="t"/>
@@ -7058,6 +7952,8 @@
     <w:p>
       <w:pPr>
         <w:pStyle w:val="BlockText"/>
+        <w:jc w:val="thaiDistribute"/>
+        <w:ind w:firstLine="720"/>
       </w:pPr>
       <w:r>
         <w:rPr>
@@ -7076,7 +7972,12 @@
     <w:p>
       <w:pPr>
         <w:pStyle w:val="FirstParagraph"/>
-      </w:pPr>
+        <w:jc w:val="thaiDistribute"/>
+        <w:ind w:firstLine="720"/>
+      </w:pPr>
+      <w:r>
+        <w:t xml:space="preserve">  </w:t>
+      </w:r>
       <w:r>
         <w:rPr>
           <w:b/>
@@ -7094,7 +7995,12 @@
     <w:p>
       <w:pPr>
         <w:pStyle w:val="BodyText"/>
-      </w:pPr>
+        <w:jc w:val="thaiDistribute"/>
+        <w:ind w:firstLine="720"/>
+      </w:pPr>
+      <w:r>
+        <w:t xml:space="preserve">  </w:t>
+      </w:r>
       <w:r>
         <w:rPr>
           <w:b/>
@@ -7127,7 +8033,12 @@
     <w:p>
       <w:pPr>
         <w:pStyle w:val="BodyText"/>
-      </w:pPr>
+        <w:jc w:val="thaiDistribute"/>
+        <w:ind w:firstLine="720"/>
+      </w:pPr>
+      <w:r>
+        <w:t xml:space="preserve">  </w:t>
+      </w:r>
       <w:r>
         <w:rPr>
           <w:b/>
@@ -7145,7 +8056,12 @@
     <w:p>
       <w:pPr>
         <w:pStyle w:val="BodyText"/>
-      </w:pPr>
+        <w:jc w:val="thaiDistribute"/>
+        <w:ind w:firstLine="720"/>
+      </w:pPr>
+      <w:r>
+        <w:t xml:space="preserve">  </w:t>
+      </w:r>
       <w:r>
         <w:rPr>
           <w:b/>
@@ -7163,7 +8079,12 @@
     <w:p>
       <w:pPr>
         <w:pStyle w:val="BodyText"/>
-      </w:pPr>
+        <w:jc w:val="thaiDistribute"/>
+        <w:ind w:firstLine="720"/>
+      </w:pPr>
+      <w:r>
+        <w:t xml:space="preserve">  </w:t>
+      </w:r>
       <w:r>
         <w:rPr>
           <w:b/>
@@ -7278,7 +8199,12 @@
     <w:p>
       <w:pPr>
         <w:pStyle w:val="FirstParagraph"/>
-      </w:pPr>
+        <w:jc w:val="thaiDistribute"/>
+        <w:ind w:firstLine="720"/>
+      </w:pPr>
+      <w:r>
+        <w:t xml:space="preserve">  </w:t>
+      </w:r>
       <w:r>
         <w:rPr>
           <w:b/>
@@ -7309,6 +8235,10 @@
       </w:r>
     </w:p>
     <w:p>
+      <w:pPr>
+        <w:jc w:val="thaiDistribute"/>
+        <w:ind w:firstLine="720"/>
+      </w:pPr>
       <w:r>
         <w:pict>
           <v:rect style="width:0;height:1.5pt" o:hralign="center" o:hrstd="t" o:hr="t"/>
@@ -7399,6 +8329,9 @@
         <w:t xml:space="preserve"> </w:t>
       </w:r>
       <w:r>
+        <w:t xml:space="preserve">  </w:t>
+      </w:r>
+      <w:r>
         <w:rPr>
           <w:b/>
           <w:bCs/>
@@ -7483,6 +8416,9 @@
         <w:t xml:space="preserve"> </w:t>
       </w:r>
       <w:r>
+        <w:t xml:space="preserve">  </w:t>
+      </w:r>
+      <w:r>
         <w:rPr>
           <w:b/>
           <w:bCs/>
@@ -7514,6 +8450,8 @@
     <w:p>
       <w:pPr>
         <w:pStyle w:val="BlockText"/>
+        <w:jc w:val="thaiDistribute"/>
+        <w:ind w:firstLine="720"/>
       </w:pPr>
       <w:r>
         <w:rPr>
@@ -7530,6 +8468,10 @@
       </w:r>
     </w:p>
     <w:p>
+      <w:pPr>
+        <w:jc w:val="thaiDistribute"/>
+        <w:ind w:firstLine="720"/>
+      </w:pPr>
       <w:r>
         <w:pict>
           <v:rect style="width:0;height:1.5pt" o:hralign="center" o:hrstd="t" o:hr="t"/>
@@ -7549,9 +8491,11 @@
     <w:p>
       <w:pPr>
         <w:pStyle w:val="FirstParagraph"/>
-      </w:pPr>
-      <w:r>
-        <w:t xml:space="preserve">อ่านตารางแบบ “อาการ → สาเหตุ → ตรวจตรงไหน → แก้อย่างไร”</w:t>
+        <w:jc w:val="thaiDistribute"/>
+        <w:ind w:firstLine="720"/>
+      </w:pPr>
+      <w:r>
+        <w:t xml:space="preserve">  อ่านตารางแบบ “อาการ → สาเหตุ → ตรวจตรงไหน → แก้อย่างไร”</w:t>
       </w:r>
     </w:p>
     <w:tbl>
@@ -8115,6 +9059,8 @@
     <w:p>
       <w:pPr>
         <w:pStyle w:val="BlockText"/>
+        <w:jc w:val="thaiDistribute"/>
+        <w:ind w:firstLine="720"/>
       </w:pPr>
       <w:r>
         <w:rPr>
@@ -8167,6 +9113,10 @@
       </w:r>
     </w:p>
     <w:p>
+      <w:pPr>
+        <w:jc w:val="thaiDistribute"/>
+        <w:ind w:firstLine="720"/>
+      </w:pPr>
       <w:r>
         <w:pict>
           <v:rect style="width:0;height:1.5pt" o:hralign="center" o:hrstd="t" o:hr="t"/>
@@ -8187,9 +9137,11 @@
     <w:p>
       <w:pPr>
         <w:pStyle w:val="FirstParagraph"/>
-      </w:pPr>
-      <w:r>
-        <w:t xml:space="preserve">ก่อนเอาไปใช้หน้างานจริง ควรคิด 3 เรื่องนี้:</w:t>
+        <w:jc w:val="thaiDistribute"/>
+        <w:ind w:firstLine="720"/>
+      </w:pPr>
+      <w:r>
+        <w:t xml:space="preserve">  ก่อนเอาไปใช้หน้างานจริง ควรคิด 3 เรื่องนี้:</w:t>
       </w:r>
     </w:p>
     <w:p>
@@ -8199,6 +9151,8 @@
           <w:ilvl w:val="0"/>
           <w:numId w:val="1019"/>
         </w:numPr>
+        <w:jc w:val="thaiDistribute"/>
+        <w:ind w:firstLine="720"/>
       </w:pPr>
       <w:r>
         <w:rPr>
@@ -8221,6 +9175,8 @@
           <w:ilvl w:val="0"/>
           <w:numId w:val="1019"/>
         </w:numPr>
+        <w:jc w:val="thaiDistribute"/>
+        <w:ind w:firstLine="720"/>
       </w:pPr>
       <w:r>
         <w:rPr>
@@ -8243,6 +9199,8 @@
           <w:ilvl w:val="0"/>
           <w:numId w:val="1019"/>
         </w:numPr>
+        <w:jc w:val="thaiDistribute"/>
+        <w:ind w:firstLine="720"/>
       </w:pPr>
       <w:r>
         <w:rPr>
@@ -8277,6 +9235,8 @@
     <w:p>
       <w:pPr>
         <w:pStyle w:val="BlockText"/>
+        <w:jc w:val="thaiDistribute"/>
+        <w:ind w:firstLine="720"/>
       </w:pPr>
       <w:r>
         <w:rPr>
@@ -8305,6 +9265,10 @@
       </w:r>
     </w:p>
     <w:p>
+      <w:pPr>
+        <w:jc w:val="thaiDistribute"/>
+        <w:ind w:firstLine="720"/>
+      </w:pPr>
       <w:r>
         <w:pict>
           <v:rect style="width:0;height:1.5pt" o:hralign="center" o:hrstd="t" o:hr="t"/>
@@ -8324,9 +9288,11 @@
     <w:p>
       <w:pPr>
         <w:pStyle w:val="FirstParagraph"/>
-      </w:pPr>
-      <w:r>
-        <w:t xml:space="preserve">รวบรวมคำศัพท์ภาษาอังกฤษทางเทคนิคทั้งหมดที่ปรากฏในคู่มือฉบับนี้ พร้อมคำอธิบายที่เข้าใจง่าย:</w:t>
+        <w:jc w:val="thaiDistribute"/>
+        <w:ind w:firstLine="720"/>
+      </w:pPr>
+      <w:r>
+        <w:t xml:space="preserve">  รวบรวมคำศัพท์ภาษาอังกฤษทางเทคนิคทั้งหมดที่ปรากฏในคู่มือฉบับนี้ พร้อมคำอธิบายที่เข้าใจง่าย:</w:t>
       </w:r>
     </w:p>
     <w:bookmarkStart w:id="55" w:name="Xc106ca6e8d421dbb65dd36219ab8d132784d73d"/>
@@ -8345,6 +9311,8 @@
           <w:ilvl w:val="0"/>
           <w:numId w:val="1020"/>
         </w:numPr>
+        <w:jc w:val="thaiDistribute"/>
+        <w:ind w:firstLine="720"/>
       </w:pPr>
       <w:r>
         <w:rPr>
@@ -8367,6 +9335,8 @@
           <w:ilvl w:val="0"/>
           <w:numId w:val="1020"/>
         </w:numPr>
+        <w:jc w:val="thaiDistribute"/>
+        <w:ind w:firstLine="720"/>
       </w:pPr>
       <w:r>
         <w:rPr>
@@ -8419,6 +9389,8 @@
           <w:ilvl w:val="0"/>
           <w:numId w:val="1020"/>
         </w:numPr>
+        <w:jc w:val="thaiDistribute"/>
+        <w:ind w:firstLine="720"/>
       </w:pPr>
       <w:r>
         <w:rPr>
@@ -8441,6 +9413,8 @@
           <w:ilvl w:val="0"/>
           <w:numId w:val="1020"/>
         </w:numPr>
+        <w:jc w:val="thaiDistribute"/>
+        <w:ind w:firstLine="720"/>
       </w:pPr>
       <w:r>
         <w:rPr>
@@ -8463,6 +9437,8 @@
           <w:ilvl w:val="0"/>
           <w:numId w:val="1020"/>
         </w:numPr>
+        <w:jc w:val="thaiDistribute"/>
+        <w:ind w:firstLine="720"/>
       </w:pPr>
       <w:r>
         <w:rPr>
@@ -8485,6 +9461,8 @@
           <w:ilvl w:val="0"/>
           <w:numId w:val="1020"/>
         </w:numPr>
+        <w:jc w:val="thaiDistribute"/>
+        <w:ind w:firstLine="720"/>
       </w:pPr>
       <w:r>
         <w:rPr>
@@ -8507,6 +9485,8 @@
           <w:ilvl w:val="0"/>
           <w:numId w:val="1020"/>
         </w:numPr>
+        <w:jc w:val="thaiDistribute"/>
+        <w:ind w:firstLine="720"/>
       </w:pPr>
       <w:r>
         <w:rPr>
@@ -8529,6 +9509,8 @@
           <w:ilvl w:val="0"/>
           <w:numId w:val="1020"/>
         </w:numPr>
+        <w:jc w:val="thaiDistribute"/>
+        <w:ind w:firstLine="720"/>
       </w:pPr>
       <w:r>
         <w:rPr>
@@ -8551,6 +9533,8 @@
           <w:ilvl w:val="0"/>
           <w:numId w:val="1020"/>
         </w:numPr>
+        <w:jc w:val="thaiDistribute"/>
+        <w:ind w:firstLine="720"/>
       </w:pPr>
       <w:r>
         <w:rPr>
@@ -8573,6 +9557,8 @@
           <w:ilvl w:val="0"/>
           <w:numId w:val="1020"/>
         </w:numPr>
+        <w:jc w:val="thaiDistribute"/>
+        <w:ind w:firstLine="720"/>
       </w:pPr>
       <w:r>
         <w:rPr>
@@ -8595,6 +9581,8 @@
           <w:ilvl w:val="0"/>
           <w:numId w:val="1020"/>
         </w:numPr>
+        <w:jc w:val="thaiDistribute"/>
+        <w:ind w:firstLine="720"/>
       </w:pPr>
       <w:r>
         <w:rPr>
@@ -8617,6 +9605,8 @@
           <w:ilvl w:val="0"/>
           <w:numId w:val="1020"/>
         </w:numPr>
+        <w:jc w:val="thaiDistribute"/>
+        <w:ind w:firstLine="720"/>
       </w:pPr>
       <w:r>
         <w:rPr>
@@ -8639,6 +9629,8 @@
           <w:ilvl w:val="0"/>
           <w:numId w:val="1020"/>
         </w:numPr>
+        <w:jc w:val="thaiDistribute"/>
+        <w:ind w:firstLine="720"/>
       </w:pPr>
       <w:r>
         <w:rPr>
@@ -8661,6 +9653,8 @@
           <w:ilvl w:val="0"/>
           <w:numId w:val="1020"/>
         </w:numPr>
+        <w:jc w:val="thaiDistribute"/>
+        <w:ind w:firstLine="720"/>
       </w:pPr>
       <w:r>
         <w:rPr>
@@ -8683,6 +9677,8 @@
           <w:ilvl w:val="0"/>
           <w:numId w:val="1020"/>
         </w:numPr>
+        <w:jc w:val="thaiDistribute"/>
+        <w:ind w:firstLine="720"/>
       </w:pPr>
       <w:r>
         <w:rPr>
@@ -8705,6 +9701,8 @@
           <w:ilvl w:val="0"/>
           <w:numId w:val="1020"/>
         </w:numPr>
+        <w:jc w:val="thaiDistribute"/>
+        <w:ind w:firstLine="720"/>
       </w:pPr>
       <w:r>
         <w:rPr>
@@ -8727,6 +9725,8 @@
           <w:ilvl w:val="0"/>
           <w:numId w:val="1020"/>
         </w:numPr>
+        <w:jc w:val="thaiDistribute"/>
+        <w:ind w:firstLine="720"/>
       </w:pPr>
       <w:r>
         <w:rPr>
@@ -8761,6 +9761,8 @@
           <w:ilvl w:val="0"/>
           <w:numId w:val="1020"/>
         </w:numPr>
+        <w:jc w:val="thaiDistribute"/>
+        <w:ind w:firstLine="720"/>
       </w:pPr>
       <w:r>
         <w:rPr>
@@ -8783,6 +9785,8 @@
           <w:ilvl w:val="0"/>
           <w:numId w:val="1020"/>
         </w:numPr>
+        <w:jc w:val="thaiDistribute"/>
+        <w:ind w:firstLine="720"/>
       </w:pPr>
       <w:r>
         <w:rPr>
@@ -8815,6 +9819,8 @@
           <w:ilvl w:val="0"/>
           <w:numId w:val="1021"/>
         </w:numPr>
+        <w:jc w:val="thaiDistribute"/>
+        <w:ind w:firstLine="720"/>
       </w:pPr>
       <w:r>
         <w:rPr>
@@ -8837,6 +9843,8 @@
           <w:ilvl w:val="0"/>
           <w:numId w:val="1021"/>
         </w:numPr>
+        <w:jc w:val="thaiDistribute"/>
+        <w:ind w:firstLine="720"/>
       </w:pPr>
       <w:r>
         <w:rPr>
@@ -8853,6 +9861,8 @@
           <w:ilvl w:val="1"/>
           <w:numId w:val="1022"/>
         </w:numPr>
+        <w:jc w:val="thaiDistribute"/>
+        <w:ind w:firstLine="720"/>
       </w:pPr>
       <w:r>
         <w:rPr>
@@ -8875,6 +9885,8 @@
           <w:ilvl w:val="1"/>
           <w:numId w:val="1022"/>
         </w:numPr>
+        <w:jc w:val="thaiDistribute"/>
+        <w:ind w:firstLine="720"/>
       </w:pPr>
       <w:r>
         <w:rPr>
@@ -8897,6 +9909,8 @@
           <w:ilvl w:val="1"/>
           <w:numId w:val="1022"/>
         </w:numPr>
+        <w:jc w:val="thaiDistribute"/>
+        <w:ind w:firstLine="720"/>
       </w:pPr>
       <w:r>
         <w:rPr>
@@ -8919,6 +9933,8 @@
           <w:ilvl w:val="1"/>
           <w:numId w:val="1022"/>
         </w:numPr>
+        <w:jc w:val="thaiDistribute"/>
+        <w:ind w:firstLine="720"/>
       </w:pPr>
       <w:r>
         <w:rPr>
@@ -8941,6 +9957,8 @@
           <w:ilvl w:val="0"/>
           <w:numId w:val="1021"/>
         </w:numPr>
+        <w:jc w:val="thaiDistribute"/>
+        <w:ind w:firstLine="720"/>
       </w:pPr>
       <w:r>
         <w:rPr>
@@ -8998,6 +10016,8 @@
           <w:ilvl w:val="0"/>
           <w:numId w:val="1021"/>
         </w:numPr>
+        <w:jc w:val="thaiDistribute"/>
+        <w:ind w:firstLine="720"/>
       </w:pPr>
       <w:r>
         <w:rPr>
@@ -9020,6 +10040,8 @@
           <w:ilvl w:val="0"/>
           <w:numId w:val="1021"/>
         </w:numPr>
+        <w:jc w:val="thaiDistribute"/>
+        <w:ind w:firstLine="720"/>
       </w:pPr>
       <w:r>
         <w:rPr>
@@ -9042,6 +10064,8 @@
           <w:ilvl w:val="0"/>
           <w:numId w:val="1021"/>
         </w:numPr>
+        <w:jc w:val="thaiDistribute"/>
+        <w:ind w:firstLine="720"/>
       </w:pPr>
       <w:r>
         <w:rPr>
@@ -9126,6 +10150,8 @@
           <w:ilvl w:val="0"/>
           <w:numId w:val="1021"/>
         </w:numPr>
+        <w:jc w:val="thaiDistribute"/>
+        <w:ind w:firstLine="720"/>
       </w:pPr>
       <w:r>
         <w:rPr>
@@ -9163,6 +10189,8 @@
           <w:ilvl w:val="0"/>
           <w:numId w:val="1021"/>
         </w:numPr>
+        <w:jc w:val="thaiDistribute"/>
+        <w:ind w:firstLine="720"/>
       </w:pPr>
       <w:r>
         <w:rPr>
@@ -9185,6 +10213,8 @@
           <w:ilvl w:val="0"/>
           <w:numId w:val="1021"/>
         </w:numPr>
+        <w:jc w:val="thaiDistribute"/>
+        <w:ind w:firstLine="720"/>
       </w:pPr>
       <w:r>
         <w:rPr>
@@ -9267,6 +10297,8 @@
           <w:ilvl w:val="0"/>
           <w:numId w:val="1023"/>
         </w:numPr>
+        <w:jc w:val="thaiDistribute"/>
+        <w:ind w:firstLine="720"/>
       </w:pPr>
       <w:r>
         <w:rPr>
@@ -9289,6 +10321,8 @@
           <w:ilvl w:val="0"/>
           <w:numId w:val="1023"/>
         </w:numPr>
+        <w:jc w:val="thaiDistribute"/>
+        <w:ind w:firstLine="720"/>
       </w:pPr>
       <w:r>
         <w:rPr>
@@ -9311,6 +10345,8 @@
           <w:ilvl w:val="0"/>
           <w:numId w:val="1023"/>
         </w:numPr>
+        <w:jc w:val="thaiDistribute"/>
+        <w:ind w:firstLine="720"/>
       </w:pPr>
       <w:r>
         <w:rPr>
@@ -9345,6 +10381,8 @@
           <w:ilvl w:val="0"/>
           <w:numId w:val="1023"/>
         </w:numPr>
+        <w:jc w:val="thaiDistribute"/>
+        <w:ind w:firstLine="720"/>
       </w:pPr>
       <w:r>
         <w:rPr>
@@ -9367,6 +10405,8 @@
           <w:ilvl w:val="0"/>
           <w:numId w:val="1023"/>
         </w:numPr>
+        <w:jc w:val="thaiDistribute"/>
+        <w:ind w:firstLine="720"/>
       </w:pPr>
       <w:r>
         <w:rPr>
@@ -9389,6 +10429,8 @@
           <w:ilvl w:val="0"/>
           <w:numId w:val="1023"/>
         </w:numPr>
+        <w:jc w:val="thaiDistribute"/>
+        <w:ind w:firstLine="720"/>
       </w:pPr>
       <w:r>
         <w:rPr>
@@ -9411,6 +10453,8 @@
           <w:ilvl w:val="0"/>
           <w:numId w:val="1023"/>
         </w:numPr>
+        <w:jc w:val="thaiDistribute"/>
+        <w:ind w:firstLine="720"/>
       </w:pPr>
       <w:r>
         <w:rPr>
@@ -9433,6 +10477,8 @@
           <w:ilvl w:val="0"/>
           <w:numId w:val="1023"/>
         </w:numPr>
+        <w:jc w:val="thaiDistribute"/>
+        <w:ind w:firstLine="720"/>
       </w:pPr>
       <w:r>
         <w:rPr>
@@ -9455,6 +10501,8 @@
           <w:ilvl w:val="0"/>
           <w:numId w:val="1023"/>
         </w:numPr>
+        <w:jc w:val="thaiDistribute"/>
+        <w:ind w:firstLine="720"/>
       </w:pPr>
       <w:r>
         <w:rPr>
@@ -9477,6 +10525,8 @@
           <w:ilvl w:val="0"/>
           <w:numId w:val="1023"/>
         </w:numPr>
+        <w:jc w:val="thaiDistribute"/>
+        <w:ind w:firstLine="720"/>
       </w:pPr>
       <w:r>
         <w:rPr>
@@ -9499,6 +10549,8 @@
           <w:ilvl w:val="0"/>
           <w:numId w:val="1023"/>
         </w:numPr>
+        <w:jc w:val="thaiDistribute"/>
+        <w:ind w:firstLine="720"/>
       </w:pPr>
       <w:r>
         <w:rPr>
@@ -9529,6 +10581,8 @@
           <w:ilvl w:val="0"/>
           <w:numId w:val="1023"/>
         </w:numPr>
+        <w:jc w:val="thaiDistribute"/>
+        <w:ind w:firstLine="720"/>
       </w:pPr>
       <w:r>
         <w:rPr>
@@ -9560,6 +10614,10 @@
       </w:r>
     </w:p>
     <w:p>
+      <w:pPr>
+        <w:jc w:val="thaiDistribute"/>
+        <w:ind w:firstLine="720"/>
+      </w:pPr>
       <w:r>
         <w:pict>
           <v:rect style="width:0;height:1.5pt" o:hralign="center" o:hrstd="t" o:hr="t"/>
@@ -9583,6 +10641,8 @@
           <w:ilvl w:val="0"/>
           <w:numId w:val="1024"/>
         </w:numPr>
+        <w:jc w:val="thaiDistribute"/>
+        <w:ind w:firstLine="720"/>
       </w:pPr>
       <w:r>
         <w:t xml:space="preserve">Tschannen, M., Gritsenko, A., Wang, X., Naeem, M. F., Alabdulmohsin, I., Parthasarathy, N., Evans, T., Beyer, L., Xia, Y., Mustafa, B., Hénaff, O., Harmsen, J., Steiner, A., &amp; Zhai, X. (2025). SigLIP 2: Multilingual vision-language encoders with improved semantic understanding, localization, and dense features.</w:t>
@@ -9607,6 +10667,8 @@
           <w:ilvl w:val="0"/>
           <w:numId w:val="1024"/>
         </w:numPr>
+        <w:jc w:val="thaiDistribute"/>
+        <w:ind w:firstLine="720"/>
       </w:pPr>
       <w:r>
         <w:t xml:space="preserve">Li, X., et al. (2020). Water meter reading recognition based on computer vision and deep learning.</w:t>
@@ -9631,6 +10693,8 @@
           <w:ilvl w:val="0"/>
           <w:numId w:val="1024"/>
         </w:numPr>
+        <w:jc w:val="thaiDistribute"/>
+        <w:ind w:firstLine="720"/>
       </w:pPr>
       <w:r>
         <w:t xml:space="preserve">Ultralytics. (2024).</w:t>
@@ -9655,6 +10719,8 @@
           <w:ilvl w:val="0"/>
           <w:numId w:val="1024"/>
         </w:numPr>
+        <w:jc w:val="thaiDistribute"/>
+        <w:ind w:firstLine="720"/>
       </w:pPr>
       <w:r>
         <w:t xml:space="preserve">FastAPI. (2024).</w:t>
@@ -9679,6 +10745,8 @@
           <w:ilvl w:val="0"/>
           <w:numId w:val="1024"/>
         </w:numPr>
+        <w:jc w:val="thaiDistribute"/>
+        <w:ind w:firstLine="720"/>
       </w:pPr>
       <w:r>
         <w:t xml:space="preserve">Gradio. (2024).</w:t>
@@ -9703,6 +10771,8 @@
           <w:ilvl w:val="0"/>
           <w:numId w:val="1024"/>
         </w:numPr>
+        <w:jc w:val="thaiDistribute"/>
+        <w:ind w:firstLine="720"/>
       </w:pPr>
       <w:r>
         <w:t xml:space="preserve">Nguyen Van, B., Nguyen, A., Tran-Trung, K., Ho Huong, T., Duong Thi Hong, H., Nguyen Trung, H., &amp; Truong Hoang, V. (2025). Water meter reading based on text recognition techniques and deep learning.</w:t>
@@ -9740,6 +10810,8 @@
           <w:ilvl w:val="0"/>
           <w:numId w:val="1024"/>
         </w:numPr>
+        <w:jc w:val="thaiDistribute"/>
+        <w:ind w:firstLine="720"/>
       </w:pPr>
       <w:r>
         <w:t xml:space="preserve">Liang, Y., Liao, Y., Li, S., Wu, W., Qiu, T., &amp; Zhang, W. (2022). Research on water meter reading recognition based on deep learning.</w:t>
@@ -9777,6 +10849,8 @@
           <w:ilvl w:val="0"/>
           <w:numId w:val="1024"/>
         </w:numPr>
+        <w:jc w:val="thaiDistribute"/>
+        <w:ind w:firstLine="720"/>
       </w:pPr>
       <w:r>
         <w:t xml:space="preserve">Salomon, G., Laroca, R., &amp; Menotti, D. (2022). Image-based automatic dial meter reading in unconstrained scenarios.</w:t>
@@ -9814,6 +10888,8 @@
           <w:ilvl w:val="0"/>
           <w:numId w:val="1024"/>
         </w:numPr>
+        <w:jc w:val="thaiDistribute"/>
+        <w:ind w:firstLine="720"/>
       </w:pPr>
       <w:r>
         <w:t xml:space="preserve">Wang, Y., &amp; Xiang, X. (2024). GMS-YOLO: An enhanced algorithm for water meter reading recognition in complex environments.</w:t>
@@ -9851,6 +10927,8 @@
           <w:ilvl w:val="0"/>
           <w:numId w:val="1024"/>
         </w:numPr>
+        <w:jc w:val="thaiDistribute"/>
+        <w:ind w:firstLine="720"/>
       </w:pPr>
       <w:r>
         <w:t xml:space="preserve">Zhai, X., Mustafa, B., Kolesnikov, A., &amp; Beyer, L. (2023). Sigmoid loss for language image pre-training. In</w:t>
@@ -9878,6 +10956,8 @@
           <w:ilvl w:val="0"/>
           <w:numId w:val="1024"/>
         </w:numPr>
+        <w:jc w:val="thaiDistribute"/>
+        <w:ind w:firstLine="720"/>
       </w:pPr>
       <w:r>
         <w:t xml:space="preserve">Zou, Z., Chen, K., Shi, Z., Guo, Y., &amp; Ye, J. (2023). Object detection in 20 years: A survey.</w:t>
@@ -11510,6 +12590,10 @@
       <w:sz w:val="32"/>
       <w:szCs w:val="32"/>
     </w:rPr>
+    <w:pPr>
+      <w:jc w:val="thaiDistribute"/>
+      <w:ind w:firstLine="720"/>
+    </w:pPr>
   </w:style>
   <w:style w:styleId="Heading1" w:type="paragraph">
     <w:name w:val="heading 1"/>
@@ -11965,8 +13049,9 @@
     <w:qFormat/>
     <w:rsid w:val="009A4447"/>
     <w:pPr>
-      <w:ind w:left="720"/>
+      <w:ind w:left="720" w:firstLine="720"/>
       <w:contextualSpacing/>
+      <w:jc w:val="thaiDistribute"/>
     </w:pPr>
   </w:style>
   <w:style w:styleId="IntenseEmphasis" w:type="character">
@@ -12212,6 +13297,25 @@
       <w:color w:val="605E5C"/>
       <w:shd w:color="auto" w:fill="E1DFDD" w:val="clear"/>
     </w:rPr>
+  </w:style>
+  <w:style w:styleId="TableGrid" w:type="table">
+    <w:name w:val="Table Grid"/>
+    <w:basedOn w:val="TableNormal"/>
+    <w:uiPriority w:val="39"/>
+    <w:rsid w:val="00D228E4"/>
+    <w:pPr>
+      <w:spacing w:after="0" w:line="240" w:lineRule="auto"/>
+    </w:pPr>
+    <w:tblPr>
+      <w:tblBorders>
+        <w:top w:color="auto" w:space="0" w:sz="4" w:val="single"/>
+        <w:left w:color="auto" w:space="0" w:sz="4" w:val="single"/>
+        <w:bottom w:color="auto" w:space="0" w:sz="4" w:val="single"/>
+        <w:right w:color="auto" w:space="0" w:sz="4" w:val="single"/>
+        <w:insideH w:color="auto" w:space="0" w:sz="4" w:val="single"/>
+        <w:insideV w:color="auto" w:space="0" w:sz="4" w:val="single"/>
+      </w:tblBorders>
+    </w:tblPr>
   </w:style>
   <w:style w:type="paragraph" w:customStyle="1" w:styleId="SourceCode">
     <w:name w:val="Source Code"/>

</xml_diff>

<commit_message>
docs: RE.docx sync YOLO26 (rebuilt from updated TUTORIAL, keep blanks, Tab+ThaiDist)
</commit_message>
<xml_diff>
--- a/RE.docx
+++ b/RE.docx
@@ -2549,9 +2549,9 @@
         </w:pict>
       </w:r>
     </w:p>
-    <w:bookmarkEnd w:id="27"/>
     <w:bookmarkEnd w:id="28"/>
-    <w:bookmarkStart w:id="45" w:name="Xb7595b75176c38e8a731d1214b493149caf0cf4"/>
+    <w:bookmarkEnd w:id="29"/>
+    <w:bookmarkStart w:id="46" w:name="Xb7595b75176c38e8a731d1214b493149caf0cf4"/>
     <w:p>
       <w:pPr>
         <w:pStyle w:val="Heading1"/>
@@ -2571,7 +2571,7 @@
         </w:pict>
       </w:r>
     </w:p>
-    <w:bookmarkStart w:id="32" w:name="ทฤษฎและหลกการพนฐาน-theory-fundamentals"/>
+    <w:bookmarkStart w:id="33" w:name="ทฤษฎและหลกการพนฐาน-theory-fundamentals"/>
     <w:p>
       <w:pPr>
         <w:pStyle w:val="Heading3"/>
@@ -2842,7 +2842,7 @@
         <w:t xml:space="preserve">พื้นที่นี้เว้นว่างไว้สำหรับอาจารย์/นักศึกษาใส่รหัสต้นฉบับด้วยตนเอง</w:t>
       </w:r>
     </w:p>
-    <w:bookmarkStart w:id="29" w:name="X452b1da63ad919ec8d60a8a3c41cf569d4de2bd"/>
+    <w:bookmarkStart w:id="30" w:name="X452b1da63ad919ec8d60a8a3c41cf569d4de2bd"/>
     <w:p>
       <w:pPr>
         <w:pStyle w:val="Heading4"/>
@@ -3028,8 +3028,8 @@
         <w:t xml:space="preserve">เมื่อจบหัวข้อนี้ คุณจะเข้าใจว่า YOLO มีหน้าที่ “ตีกรอบและบอกว่าแต่ละกรอบคือเลขอะไร”</w:t>
       </w:r>
     </w:p>
-    <w:bookmarkEnd w:id="29"/>
-    <w:bookmarkStart w:id="30" w:name="Xf5a497afc6f47d72f68c2b7c16cdcc1a5ef62a4"/>
+    <w:bookmarkEnd w:id="30"/>
+    <w:bookmarkStart w:id="31" w:name="Xf5a497afc6f47d72f68c2b7c16cdcc1a5ef62a4"/>
     <w:p>
       <w:pPr>
         <w:pStyle w:val="Heading4"/>
@@ -3127,8 +3127,8 @@
         <w:t xml:space="preserve">โมเดลจะบอกว่าคำไหนใกล้เคียงภาพที่สุด — เหมาะกับงานคัดกรองภาพก่อนเข้าโมเดลหลัก</w:t>
       </w:r>
     </w:p>
-    <w:bookmarkEnd w:id="30"/>
-    <w:bookmarkStart w:id="31" w:name="Xd4b575dfa8b8608a91f75c30f0ae96ace2b57e8"/>
+    <w:bookmarkEnd w:id="31"/>
+    <w:bookmarkStart w:id="32" w:name="Xd4b575dfa8b8608a91f75c30f0ae96ace2b57e8"/>
     <w:p>
       <w:pPr>
         <w:pStyle w:val="Heading4"/>
@@ -3251,9 +3251,9 @@
         </w:pict>
       </w:r>
     </w:p>
-    <w:bookmarkEnd w:id="31"/>
     <w:bookmarkEnd w:id="32"/>
-    <w:bookmarkStart w:id="35" w:name="Xb2b8b6fb10eb4d8dc7b40a51ed8e20445ef7046"/>
+    <w:bookmarkEnd w:id="33"/>
+    <w:bookmarkStart w:id="36" w:name="Xb2b8b6fb10eb4d8dc7b40a51ed8e20445ef7046"/>
     <w:p>
       <w:pPr>
         <w:pStyle w:val="Heading3"/>
@@ -3326,7 +3326,7 @@
         <w:t xml:space="preserve">การเทรน Deep Learning ใช้การ์ดจอหนักมาก เครื่องทั่วไปอาจช้าหรือนานหลายชั่วโมง จึงแนะนำให้รันบน Google Colab / Kaggle ที่มี GPU ฟรี</w:t>
       </w:r>
     </w:p>
-    <w:bookmarkStart w:id="33" w:name="การเตรยมชดขอมลจาก-roboflow"/>
+    <w:bookmarkStart w:id="34" w:name="การเตรยมชดขอมลจาก-roboflow"/>
     <w:p>
       <w:pPr>
         <w:pStyle w:val="Heading4"/>
@@ -3342,20 +3342,19 @@
         <w:ind w:firstLine="720"/>
       </w:pPr>
       <w:r>
-        <w:t xml:space="preserve">  </w:t>
-      </w:r>
-      <w:r>
-        <w:rPr>
-          <w:b/>
-          <w:bCs/>
-        </w:rPr>
-        <w:t xml:space="preserve">Dataset</w:t>
-      </w:r>
-      <w:r>
-        <w:t xml:space="preserve"> </w:t>
-      </w:r>
-      <w:r>
-        <w:t xml:space="preserve">คือชุดภาพมิเตอร์น้ำที่มีการตีกรอบบอกตำแหน่งเลข 0–9 ไว้แล้ว (Annotation) ดาวน์โหลดได้จาก Roboflow:</w:t>
+        <w:t xml:space="preserve">  ระบบใช้ชุดข้อมูล</w:t>
+      </w:r>
+      <w:r>
+        <w:t xml:space="preserve"> </w:t>
+      </w:r>
+      <w:r>
+        <w:t xml:space="preserve">“Utility Meter Reading”</w:t>
+      </w:r>
+      <w:r>
+        <w:t xml:space="preserve"> </w:t>
+      </w:r>
+      <w:r>
+        <w:t xml:space="preserve">จากแพลตฟอร์ม Roboflow ซึ่งประกอบด้วยภาพหน้าปัดมาตรวัดน้ำที่มีการทำเครื่องหมายกำกับพิกัด (Annotation) ในฟอร์แมตที่เข้ากันได้กับ YOLO:</w:t>
       </w:r>
     </w:p>
     <w:p>
@@ -3382,14 +3381,55 @@
         <w:t xml:space="preserve">พื้นที่นี้เว้นว่างไว้สำหรับอาจารย์/นักศึกษาใส่รหัสต้นฉบับด้วยตนเอง</w:t>
       </w:r>
     </w:p>
-    <w:bookmarkEnd w:id="33"/>
-    <w:bookmarkStart w:id="34" w:name="การฝกโมเดล-yolo"/>
+    <w:bookmarkEnd w:id="34"/>
+    <w:bookmarkStart w:id="35" w:name="การฝกโมเดล-yolo"/>
     <w:p>
       <w:pPr>
         <w:pStyle w:val="Heading4"/>
       </w:pPr>
       <w:r>
         <w:t xml:space="preserve">1.2.2 การฝึกโมเดล YOLO</w:t>
+      </w:r>
+    </w:p>
+    <w:p>
+      <w:pPr>
+        <w:pStyle w:val="FirstParagraph"/>
+        <w:jc w:val="thaiDistribute"/>
+        <w:ind w:firstLine="720"/>
+      </w:pPr>
+      <w:r>
+        <w:t xml:space="preserve">  ระบบเลือกใช้แบบจำลอง</w:t>
+      </w:r>
+      <w:r>
+        <w:t xml:space="preserve"> </w:t>
+      </w:r>
+      <w:r>
+        <w:rPr>
+          <w:b/>
+          <w:bCs/>
+        </w:rPr>
+        <w:t xml:space="preserve">Ultralytics YOLO26 Nano (</w:t>
+      </w:r>
+      <w:r>
+        <w:rPr>
+          <w:rStyle w:val="VerbatimChar"/>
+          <w:b/>
+          <w:bCs/>
+        </w:rPr>
+        <w:t xml:space="preserve">yolo26n.pt</w:t>
+      </w:r>
+      <w:r>
+        <w:rPr>
+          <w:b/>
+          <w:bCs/>
+        </w:rPr>
+        <w:t xml:space="preserve">)</w:t>
+      </w:r>
+      <w:r>
+        <w:t xml:space="preserve"> </w:t>
+      </w:r>
+      <w:r>
+        <w:t xml:space="preserve">(Jocher et al., 2026) ซึ่งเป็นสถาปัตยกรรมแบบ End-to-End Vision Model ที่เบาและเร็วที่สุดในตระกูล YOLO26 เหมาะกับงานตรวจจับตัวเลขบนหน้าปัดที่ต้องรันต่อเนื่องบนทรัพยากรจำกัด (Single GPU / CPU) โดย YOLO มีจุดเด่นคือการมองภาพรวมเพียงครั้งเดียวแล้วระบุตำแหน่งตัวเลขได้ทันทีบน GPU (Tesla T4) แม้รุ่น Nano จะแม่นยำน้อยกว่ารุ่น Medium เล็กน้อย แต่ใช้ VRAM น้อยกว่าและประมวลผลได้เร็วกว่าอย่างมีนัยสำคัญ</w:t>
       </w:r>
     </w:p>
     <w:p>
@@ -3415,9 +3455,48 @@
         </w:rPr>
         <w:t xml:space="preserve">พื้นที่นี้เว้นว่างไว้สำหรับอาจารย์/นักศึกษาใส่รหัสต้นฉบับด้วยตนเอง</w:t>
       </w:r>
-      <w:r>
-        <w:t xml:space="preserve"> </w:t>
-      </w:r>
+    </w:p>
+    <w:p>
+      <w:pPr>
+        <w:pStyle w:val="BlockText"/>
+        <w:jc w:val="thaiDistribute"/>
+        <w:ind w:firstLine="720"/>
+      </w:pPr>
+      <w:r>
+        <w:rPr>
+          <w:b/>
+          <w:bCs/>
+        </w:rPr>
+        <w:t xml:space="preserve">หมายเหตุ:</w:t>
+      </w:r>
+      <w:r>
+        <w:t xml:space="preserve"> </w:t>
+      </w:r>
+      <w:r>
+        <w:t xml:space="preserve">การเปิดใช้งาน</w:t>
+      </w:r>
+      <w:r>
+        <w:t xml:space="preserve"> </w:t>
+      </w:r>
+      <w:r>
+        <w:rPr>
+          <w:rStyle w:val="VerbatimChar"/>
+        </w:rPr>
+        <w:t xml:space="preserve">amp=True</w:t>
+      </w:r>
+      <w:r>
+        <w:t xml:space="preserve"> </w:t>
+      </w:r>
+      <w:r>
+        <w:t xml:space="preserve">(Automatic Mixed Precision) ช่วยลดการใช้ VRAM และเร่งความเร็วการเทรนบนการ์ดจอที่รองรับ</w:t>
+      </w:r>
+    </w:p>
+    <w:p>
+      <w:pPr>
+        <w:pStyle w:val="FirstParagraph"/>
+        <w:jc w:val="thaiDistribute"/>
+        <w:ind w:firstLine="720"/>
+      </w:pPr>
       <w:r>
         <w:t xml:space="preserve">  </w:t>
       </w:r>
@@ -3432,7 +3511,7 @@
         <w:t xml:space="preserve"> </w:t>
       </w:r>
       <w:r>
-        <w:t xml:space="preserve">ได้ไฟล์น้ำหนักที่ดีที่สุด</w:t>
+        <w:t xml:space="preserve">ได้ไฟล์</w:t>
       </w:r>
       <w:r>
         <w:t xml:space="preserve"> </w:t>
@@ -3456,7 +3535,7 @@
         <w:rPr>
           <w:rStyle w:val="VerbatimChar"/>
         </w:rPr>
-        <w:t xml:space="preserve">runs/detect/meter_ocr_model/weights/</w:t>
+        <w:t xml:space="preserve">runs/detect/train/weights/</w:t>
       </w:r>
       <w:r>
         <w:t xml:space="preserve"> </w:t>
@@ -3491,9 +3570,9 @@
         </w:pict>
       </w:r>
     </w:p>
-    <w:bookmarkEnd w:id="34"/>
     <w:bookmarkEnd w:id="35"/>
-    <w:bookmarkStart w:id="38" w:name="Xa1033ff2dfc4c8e0025ccf54542dd5483544f33"/>
+    <w:bookmarkEnd w:id="36"/>
+    <w:bookmarkStart w:id="39" w:name="Xa1033ff2dfc4c8e0025ccf54542dd5483544f33"/>
     <w:p>
       <w:pPr>
         <w:pStyle w:val="Heading3"/>
@@ -3537,7 +3616,7 @@
         <w:t xml:space="preserve">เพื่อเตรียมโฟลเดอร์และติดตั้งไลบรารีให้พร้อม ก่อนเริ่มทดลองระบบจริง</w:t>
       </w:r>
     </w:p>
-    <w:bookmarkStart w:id="36" w:name="โครงสรางไฟลของระบบ-project-structure"/>
+    <w:bookmarkStart w:id="37" w:name="โครงสรางไฟลของระบบ-project-structure"/>
     <w:p>
       <w:pPr>
         <w:pStyle w:val="Heading4"/>
@@ -3592,8 +3671,8 @@
         <w:t xml:space="preserve">พื้นที่นี้เว้นว่างไว้สำหรับอาจารย์/นักศึกษาใส่รหัสต้นฉบับด้วยตนเอง — คงโครงสร้างและคำอธิบายไว้ครบถ้วน</w:t>
       </w:r>
     </w:p>
-    <w:bookmarkEnd w:id="36"/>
-    <w:bookmarkStart w:id="37" w:name="การสรางสภาพแวดลอมและตดตง-dependencies"/>
+    <w:bookmarkEnd w:id="37"/>
+    <w:bookmarkStart w:id="38" w:name="การสรางสภาพแวดลอมและตดตง-dependencies"/>
     <w:p>
       <w:pPr>
         <w:pStyle w:val="Heading4"/>
@@ -3783,9 +3862,9 @@
         </w:pict>
       </w:r>
     </w:p>
-    <w:bookmarkEnd w:id="37"/>
     <w:bookmarkEnd w:id="38"/>
-    <w:bookmarkStart w:id="39" w:name="Xbf1d4c9122d4256082807cda5fd24d58966ce29"/>
+    <w:bookmarkEnd w:id="39"/>
+    <w:bookmarkStart w:id="40" w:name="Xbf1d4c9122d4256082807cda5fd24d58966ce29"/>
     <w:p>
       <w:pPr>
         <w:pStyle w:val="Heading3"/>
@@ -4103,8 +4182,8 @@
         </w:pict>
       </w:r>
     </w:p>
-    <w:bookmarkEnd w:id="39"/>
-    <w:bookmarkStart w:id="44" w:name="X82b33351889b45c0fd0b0826b076290339e5ff3"/>
+    <w:bookmarkEnd w:id="40"/>
+    <w:bookmarkStart w:id="45" w:name="X82b33351889b45c0fd0b0826b076290339e5ff3"/>
     <w:p>
       <w:pPr>
         <w:pStyle w:val="Heading3"/>
@@ -4123,7 +4202,7 @@
         <w:t xml:space="preserve">  กระบวนการอ่านตัวเลขมี 4 ขั้นตอน — แต่ละขั้นตอนแก้ปัญหาคนละแบบ ต่อกันเป็นท่อส่งข้อมูล:</w:t>
       </w:r>
     </w:p>
-    <w:bookmarkStart w:id="40" w:name="X75de373fdef90ef2f7ca58fe460bb48bb960914"/>
+    <w:bookmarkStart w:id="41" w:name="X75de373fdef90ef2f7ca58fe460bb48bb960914"/>
     <w:p>
       <w:pPr>
         <w:pStyle w:val="Heading4"/>
@@ -4399,8 +4478,8 @@
         </w:pict>
       </w:r>
     </w:p>
-    <w:bookmarkEnd w:id="40"/>
-    <w:bookmarkStart w:id="41" w:name="X8b657423d9fd46e1d56cdd877164ab2ddc637d0"/>
+    <w:bookmarkEnd w:id="41"/>
+    <w:bookmarkStart w:id="42" w:name="X8b657423d9fd46e1d56cdd877164ab2ddc637d0"/>
     <w:p>
       <w:pPr>
         <w:pStyle w:val="Heading4"/>
@@ -5305,8 +5384,8 @@
         </w:pict>
       </w:r>
     </w:p>
-    <w:bookmarkEnd w:id="41"/>
-    <w:bookmarkStart w:id="42" w:name="X04bb57397b5e004e4b65b3a91b9d0ac211ab257"/>
+    <w:bookmarkEnd w:id="42"/>
+    <w:bookmarkStart w:id="43" w:name="X04bb57397b5e004e4b65b3a91b9d0ac211ab257"/>
     <w:p>
       <w:pPr>
         <w:pStyle w:val="Heading4"/>
@@ -5656,8 +5735,8 @@
         </w:pict>
       </w:r>
     </w:p>
-    <w:bookmarkEnd w:id="42"/>
-    <w:bookmarkStart w:id="43" w:name="X8fbd443c53684801498e3792e37df46fdd6a39d"/>
+    <w:bookmarkEnd w:id="43"/>
+    <w:bookmarkStart w:id="44" w:name="X8fbd443c53684801498e3792e37df46fdd6a39d"/>
     <w:p>
       <w:pPr>
         <w:pStyle w:val="Heading4"/>
@@ -6724,10 +6803,10 @@
         </w:pict>
       </w:r>
     </w:p>
-    <w:bookmarkEnd w:id="43"/>
     <w:bookmarkEnd w:id="44"/>
     <w:bookmarkEnd w:id="45"/>
-    <w:bookmarkStart w:id="60" w:name="X6c74b405d66cf4ac82c14fee1c2c88c61545f87"/>
+    <w:bookmarkEnd w:id="46"/>
+    <w:bookmarkStart w:id="61" w:name="X6c74b405d66cf4ac82c14fee1c2c88c61545f87"/>
     <w:p>
       <w:pPr>
         <w:pStyle w:val="Heading1"/>
@@ -6747,7 +6826,7 @@
         </w:pict>
       </w:r>
     </w:p>
-    <w:bookmarkStart w:id="48" w:name="X4c8f6ba0fdc83ac4da5563adb955c8877091ce1"/>
+    <w:bookmarkStart w:id="49" w:name="X4c8f6ba0fdc83ac4da5563adb955c8877091ce1"/>
     <w:p>
       <w:pPr>
         <w:pStyle w:val="Heading3"/>
@@ -6824,7 +6903,7 @@
         <w:t xml:space="preserve">พื้นที่นี้เว้นว่างไว้สำหรับอาจารย์/นักศึกษาใส่รหัสต้นฉบับด้วยตนเอง</w:t>
       </w:r>
     </w:p>
-    <w:bookmarkStart w:id="46" w:name="การตรวจจบภาพกลบหวแบบกระจกเงา-flip_guard"/>
+    <w:bookmarkStart w:id="47" w:name="การตรวจจบภาพกลบหวแบบกระจกเงา-flip_guard"/>
     <w:p>
       <w:pPr>
         <w:pStyle w:val="Heading4"/>
@@ -7220,8 +7299,8 @@
         </w:pict>
       </w:r>
     </w:p>
-    <w:bookmarkEnd w:id="46"/>
-    <w:bookmarkStart w:id="47" w:name="ฟงกชนประมวลผลหลก-read_meterrgb_img"/>
+    <w:bookmarkEnd w:id="47"/>
+    <w:bookmarkStart w:id="48" w:name="ฟงกชนประมวลผลหลก-read_meterrgb_img"/>
     <w:p>
       <w:pPr>
         <w:pStyle w:val="Heading4"/>
@@ -7572,9 +7651,9 @@
         </w:pict>
       </w:r>
     </w:p>
-    <w:bookmarkEnd w:id="47"/>
     <w:bookmarkEnd w:id="48"/>
-    <w:bookmarkStart w:id="49" w:name="X8625538b6dce6d94fdf5f312ba320194936963a"/>
+    <w:bookmarkEnd w:id="49"/>
+    <w:bookmarkStart w:id="50" w:name="X8625538b6dce6d94fdf5f312ba320194936963a"/>
     <w:p>
       <w:pPr>
         <w:pStyle w:val="Heading3"/>
@@ -7939,8 +8018,8 @@
         </w:pict>
       </w:r>
     </w:p>
-    <w:bookmarkEnd w:id="49"/>
-    <w:bookmarkStart w:id="50" w:name="X6191bd35aba173229039319086a3ee0702acb1a"/>
+    <w:bookmarkEnd w:id="50"/>
+    <w:bookmarkStart w:id="51" w:name="X6191bd35aba173229039319086a3ee0702acb1a"/>
     <w:p>
       <w:pPr>
         <w:pStyle w:val="Heading3"/>
@@ -8245,8 +8324,8 @@
         </w:pict>
       </w:r>
     </w:p>
-    <w:bookmarkEnd w:id="50"/>
-    <w:bookmarkStart w:id="53" w:name="X37b2d76fefb82c0bbc341bb126523ad01b19730"/>
+    <w:bookmarkEnd w:id="51"/>
+    <w:bookmarkStart w:id="54" w:name="X37b2d76fefb82c0bbc341bb126523ad01b19730"/>
     <w:p>
       <w:pPr>
         <w:pStyle w:val="Heading3"/>
@@ -8255,7 +8334,7 @@
         <w:t xml:space="preserve">2.4 การรัน ทดสอบ และคู่มือแก้ปัญหา (Testing &amp; Troubleshooting)</w:t>
       </w:r>
     </w:p>
-    <w:bookmarkStart w:id="51" w:name="วธการรนระบบดวย-uv"/>
+    <w:bookmarkStart w:id="52" w:name="วธการรนระบบดวย-uv"/>
     <w:p>
       <w:pPr>
         <w:pStyle w:val="Heading4"/>
@@ -8478,8 +8557,8 @@
         </w:pict>
       </w:r>
     </w:p>
-    <w:bookmarkEnd w:id="51"/>
-    <w:bookmarkStart w:id="52" w:name="X5934ac85f6b7698029ef8880a5d19921fd50fb5"/>
+    <w:bookmarkEnd w:id="52"/>
+    <w:bookmarkStart w:id="53" w:name="X5934ac85f6b7698029ef8880a5d19921fd50fb5"/>
     <w:p>
       <w:pPr>
         <w:pStyle w:val="Heading4"/>
@@ -9123,9 +9202,9 @@
         </w:pict>
       </w:r>
     </w:p>
-    <w:bookmarkEnd w:id="52"/>
     <w:bookmarkEnd w:id="53"/>
-    <w:bookmarkStart w:id="54" w:name="Xe2814f11c0656bf3096b3d12bfd5df144cc9928"/>
+    <w:bookmarkEnd w:id="54"/>
+    <w:bookmarkStart w:id="55" w:name="Xe2814f11c0656bf3096b3d12bfd5df144cc9928"/>
     <w:p>
       <w:pPr>
         <w:pStyle w:val="Heading3"/>
@@ -9275,8 +9354,8 @@
         </w:pict>
       </w:r>
     </w:p>
-    <w:bookmarkEnd w:id="54"/>
-    <w:bookmarkStart w:id="58" w:name="อภธานศพท-glossary"/>
+    <w:bookmarkEnd w:id="55"/>
+    <w:bookmarkStart w:id="59" w:name="อภธานศพท-glossary"/>
     <w:p>
       <w:pPr>
         <w:pStyle w:val="Heading2"/>
@@ -9295,7 +9374,7 @@
         <w:t xml:space="preserve">  รวบรวมคำศัพท์ภาษาอังกฤษทางเทคนิคทั้งหมดที่ปรากฏในคู่มือฉบับนี้ พร้อมคำอธิบายที่เข้าใจง่าย:</w:t>
       </w:r>
     </w:p>
-    <w:bookmarkStart w:id="55" w:name="Xc106ca6e8d421dbb65dd36219ab8d132784d73d"/>
+    <w:bookmarkStart w:id="56" w:name="Xc106ca6e8d421dbb65dd36219ab8d132784d73d"/>
     <w:p>
       <w:pPr>
         <w:pStyle w:val="Heading3"/>
@@ -9802,8 +9881,8 @@
         <w:t xml:space="preserve">การจำแนกประเภทภาพตามคำอธิบายข้อความโดยไม่ต้องฝึกฝนโมเดลด้วยภาพตัวอย่างนั้นมาก่อน</w:t>
       </w:r>
     </w:p>
-    <w:bookmarkEnd w:id="55"/>
-    <w:bookmarkStart w:id="56" w:name="Xe97ad5f0adabf13e32404d1781e6a7cee75df2b"/>
+    <w:bookmarkEnd w:id="56"/>
+    <w:bookmarkStart w:id="57" w:name="Xe97ad5f0adabf13e32404d1781e6a7cee75df2b"/>
     <w:p>
       <w:pPr>
         <w:pStyle w:val="Heading3"/>
@@ -10280,8 +10359,8 @@
         <w:t xml:space="preserve">การคำนวณระยะกว้างเทียบกับระยะสูงเพื่อแยกแยะระหว่างแถวแนวนอนและคอลัมน์แนวตั้ง</w:t>
       </w:r>
     </w:p>
-    <w:bookmarkEnd w:id="56"/>
-    <w:bookmarkStart w:id="57" w:name="Xec6df598acc03b0ed69806dea1eb97883db1297"/>
+    <w:bookmarkEnd w:id="57"/>
+    <w:bookmarkStart w:id="58" w:name="Xec6df598acc03b0ed69806dea1eb97883db1297"/>
     <w:p>
       <w:pPr>
         <w:pStyle w:val="Heading3"/>
@@ -10624,9 +10703,9 @@
         </w:pict>
       </w:r>
     </w:p>
-    <w:bookmarkEnd w:id="57"/>
     <w:bookmarkEnd w:id="58"/>
-    <w:bookmarkStart w:id="59" w:name="บรรณานกรมและเอกสารอางอง-references"/>
+    <w:bookmarkEnd w:id="59"/>
+    <w:bookmarkStart w:id="60" w:name="บรรณานกรมและเอกสารอางอง-references"/>
     <w:p>
       <w:pPr>
         <w:pStyle w:val="Heading2"/>
@@ -10989,8 +11068,8 @@
         <w:t xml:space="preserve">(3), 257–276. https://doi.org/10.1109/JPROC.2023.3238524</w:t>
       </w:r>
     </w:p>
-    <w:bookmarkEnd w:id="59"/>
     <w:bookmarkEnd w:id="60"/>
+    <w:bookmarkEnd w:id="61"/>
     <w:sectPr>
       <w:pgSz w:code="9" w:h="16840" w:w="11907"/>
       <w:pgMar w:bottom="1418" w:footer="720" w:gutter="0" w:header="720" w:left="1985" w:right="1418" w:top="1985"/>

</xml_diff>

<commit_message>
docs: add Appendix — Security & Stability Measures (final page)
- TUTORIAL.md: add ## ภาคผนวก: มาตรการด้านความปลอดภัยและความเสถียร after References (TOC updated, headings 37->40)
- Content: ก. Security (input validation, rate limiting, secrets, PDPA, dependency audit) ข. Stability (health check, Safety Guards, logging, versioning/backup) + summary table, formal Thai with Tab+ThaiDist
- RE.docx: regenerated from updated TUTORIAL (placeholders kept), front matter (cover, คำนำ, สารบัญ, สารบัญภาพ) preserved, Tab/ThaiDist reapplied, appendix included (2.46MB)
</commit_message>
<xml_diff>
--- a/RE.docx
+++ b/RE.docx
@@ -6806,7 +6806,7 @@
     <w:bookmarkEnd w:id="44"/>
     <w:bookmarkEnd w:id="45"/>
     <w:bookmarkEnd w:id="46"/>
-    <w:bookmarkStart w:id="61" w:name="X6c74b405d66cf4ac82c14fee1c2c88c61545f87"/>
+    <w:bookmarkStart w:id="64" w:name="X6c74b405d66cf4ac82c14fee1c2c88c61545f87"/>
     <w:p>
       <w:pPr>
         <w:pStyle w:val="Heading1"/>
@@ -11068,8 +11068,1139 @@
         <w:t xml:space="preserve">(3), 257–276. https://doi.org/10.1109/JPROC.2023.3238524</w:t>
       </w:r>
     </w:p>
+    <w:p>
+      <w:pPr>
+        <w:jc w:val="thaiDistribute"/>
+        <w:ind w:firstLine="720"/>
+      </w:pPr>
+      <w:r>
+        <w:pict>
+          <v:rect style="width:0;height:1.5pt" o:hralign="center" o:hrstd="t" o:hr="t"/>
+        </w:pict>
+      </w:r>
+    </w:p>
     <w:bookmarkEnd w:id="60"/>
+    <w:bookmarkStart w:id="63" w:name="X22a27a332e537e0634807276ca2350d6fcd1c2b"/>
+    <w:p>
+      <w:pPr>
+        <w:pStyle w:val="Heading2"/>
+      </w:pPr>
+      <w:r>
+        <w:t xml:space="preserve">ภาคผนวก: มาตรการด้านความปลอดภัยและความเสถียร (Appendix: Security and Stability Measures)</w:t>
+      </w:r>
+    </w:p>
+    <w:p>
+      <w:pPr>
+        <w:pStyle w:val="FirstParagraph"/>
+        <w:jc w:val="thaiDistribute"/>
+        <w:ind w:firstLine="720"/>
+      </w:pPr>
+      <w:r>
+        <w:t xml:space="preserve">  ภาคผนวกนี้สรุปมาตรการด้านความปลอดภัยและความเสถียรที่พึงดำเนินการเมื่อนำระบบอ่านค่ามาตรวัดน้ำไปใช้งานในสภาพแวดล้อมจริง โดยมีวัตถุประสงค์เพื่อป้องกันความเสี่ยงจากการรับข้อมูลที่ไม่พึงประสงค์ รักษาความลับของระบบ และทำให้การให้บริการมีความต่อเนื่อง ตรวจสอบได้ และกู้คืนได้</w:t>
+      </w:r>
+    </w:p>
+    <w:bookmarkStart w:id="61" w:name="Xd0a0f09d98d6727a4066344ce2bf42fe46fdad0"/>
+    <w:p>
+      <w:pPr>
+        <w:pStyle w:val="Heading3"/>
+      </w:pPr>
+      <w:r>
+        <w:t xml:space="preserve">ก. มาตรการด้านความปลอดภัย (Security Measures)</w:t>
+      </w:r>
+    </w:p>
+    <w:p>
+      <w:pPr>
+        <w:pStyle w:val="FirstParagraph"/>
+        <w:jc w:val="thaiDistribute"/>
+        <w:ind w:firstLine="720"/>
+      </w:pPr>
+      <w:r>
+        <w:t xml:space="preserve">  </w:t>
+      </w:r>
+      <w:r>
+        <w:rPr>
+          <w:b/>
+          <w:bCs/>
+        </w:rPr>
+        <w:t xml:space="preserve">การตรวจสอบและกรองข้อมูลนำเข้า:</w:t>
+      </w:r>
+      <w:r>
+        <w:t xml:space="preserve"> </w:t>
+      </w:r>
+      <w:r>
+        <w:t xml:space="preserve">ระบบตรวจสอบชนิดไฟล์ตาม</w:t>
+      </w:r>
+      <w:r>
+        <w:t xml:space="preserve"> </w:t>
+      </w:r>
+      <w:r>
+        <w:rPr>
+          <w:rStyle w:val="VerbatimChar"/>
+        </w:rPr>
+        <w:t xml:space="preserve">ALLOWED_TYPES</w:t>
+      </w:r>
+      <w:r>
+        <w:t xml:space="preserve"> </w:t>
+      </w:r>
+      <w:r>
+        <w:t xml:space="preserve">(</w:t>
+      </w:r>
+      <w:r>
+        <w:rPr>
+          <w:rStyle w:val="VerbatimChar"/>
+        </w:rPr>
+        <w:t xml:space="preserve">image/jpeg</w:t>
+      </w:r>
+      <w:r>
+        <w:t xml:space="preserve">,</w:t>
+      </w:r>
+      <w:r>
+        <w:t xml:space="preserve"> </w:t>
+      </w:r>
+      <w:r>
+        <w:rPr>
+          <w:rStyle w:val="VerbatimChar"/>
+        </w:rPr>
+        <w:t xml:space="preserve">image/png</w:t>
+      </w:r>
+      <w:r>
+        <w:t xml:space="preserve">,</w:t>
+      </w:r>
+      <w:r>
+        <w:t xml:space="preserve"> </w:t>
+      </w:r>
+      <w:r>
+        <w:rPr>
+          <w:rStyle w:val="VerbatimChar"/>
+        </w:rPr>
+        <w:t xml:space="preserve">image/webp</w:t>
+      </w:r>
+      <w:r>
+        <w:t xml:space="preserve">,</w:t>
+      </w:r>
+      <w:r>
+        <w:t xml:space="preserve"> </w:t>
+      </w:r>
+      <w:r>
+        <w:rPr>
+          <w:rStyle w:val="VerbatimChar"/>
+        </w:rPr>
+        <w:t xml:space="preserve">image/bmp</w:t>
+      </w:r>
+      <w:r>
+        <w:t xml:space="preserve">) และปฏิเสธด้วยรหัส</w:t>
+      </w:r>
+      <w:r>
+        <w:t xml:space="preserve"> </w:t>
+      </w:r>
+      <w:r>
+        <w:rPr>
+          <w:rStyle w:val="VerbatimChar"/>
+        </w:rPr>
+        <w:t xml:space="preserve">415</w:t>
+      </w:r>
+      <w:r>
+        <w:t xml:space="preserve"> </w:t>
+      </w:r>
+      <w:r>
+        <w:t xml:space="preserve">หากไม่ตรงตามที่กำหนด พร้อมทั้งตรวจสอบความสามารถในการเปิดไฟล์ด้วย</w:t>
+      </w:r>
+      <w:r>
+        <w:t xml:space="preserve"> </w:t>
+      </w:r>
+      <w:r>
+        <w:rPr>
+          <w:rStyle w:val="VerbatimChar"/>
+        </w:rPr>
+        <w:t xml:space="preserve">PIL</w:t>
+      </w:r>
+      <w:r>
+        <w:t xml:space="preserve"> </w:t>
+      </w:r>
+      <w:r>
+        <w:t xml:space="preserve">และปฏิเสธด้วยรหัส</w:t>
+      </w:r>
+      <w:r>
+        <w:t xml:space="preserve"> </w:t>
+      </w:r>
+      <w:r>
+        <w:rPr>
+          <w:rStyle w:val="VerbatimChar"/>
+        </w:rPr>
+        <w:t xml:space="preserve">422</w:t>
+      </w:r>
+      <w:r>
+        <w:t xml:space="preserve"> </w:t>
+      </w:r>
+      <w:r>
+        <w:t xml:space="preserve">หากอ่านไม่ได้ นอกจากนี้ ควรจำกัดขนาดไฟล์ (เช่น ไม่เกิน 10 MB) และความละเอียดสูงสุดเพื่อป้องกันการโจมตีด้วยไฟล์ขนาดใหญ่</w:t>
+      </w:r>
+    </w:p>
+    <w:p>
+      <w:pPr>
+        <w:pStyle w:val="BodyText"/>
+        <w:jc w:val="thaiDistribute"/>
+        <w:ind w:firstLine="720"/>
+      </w:pPr>
+      <w:r>
+        <w:t xml:space="preserve">  </w:t>
+      </w:r>
+      <w:r>
+        <w:rPr>
+          <w:b/>
+          <w:bCs/>
+        </w:rPr>
+        <w:t xml:space="preserve">การควบคุมการเข้าถึงและการจำกัดอัตรา:</w:t>
+      </w:r>
+      <w:r>
+        <w:t xml:space="preserve"> </w:t>
+      </w:r>
+      <w:r>
+        <w:t xml:space="preserve">สำหรับการใช้งานจริง พึงกำหนดการยืนยันตัวตนด้วย API Key หรือ JWT และใช้กลไกจำกัดอัตราการเรียก (Rate Limiting) เพื่อป้องกันการใช้งานเกินควร รวมถึงการบันทึกประวัติการเข้าถึง</w:t>
+      </w:r>
+    </w:p>
+    <w:p>
+      <w:pPr>
+        <w:pStyle w:val="BodyText"/>
+        <w:jc w:val="thaiDistribute"/>
+        <w:ind w:firstLine="720"/>
+      </w:pPr>
+      <w:r>
+        <w:t xml:space="preserve">  </w:t>
+      </w:r>
+      <w:r>
+        <w:rPr>
+          <w:b/>
+          <w:bCs/>
+        </w:rPr>
+        <w:t xml:space="preserve">การจัดการความลับ:</w:t>
+      </w:r>
+      <w:r>
+        <w:t xml:space="preserve"> </w:t>
+      </w:r>
+      <w:r>
+        <w:t xml:space="preserve">ค่า</w:t>
+      </w:r>
+      <w:r>
+        <w:t xml:space="preserve"> </w:t>
+      </w:r>
+      <w:r>
+        <w:rPr>
+          <w:rStyle w:val="VerbatimChar"/>
+        </w:rPr>
+        <w:t xml:space="preserve">ROBOFLOW_API_KEY</w:t>
+      </w:r>
+      <w:r>
+        <w:t xml:space="preserve"> </w:t>
+      </w:r>
+      <w:r>
+        <w:t xml:space="preserve">และข้อมูลสำคัญอื่น ๆ มิควรฝังในรหัสต้นฉบับหรือ commit ขึ้น Git สาธารณะ พึงจัดเก็บในตัวแปรสภาพแวดล้อมหรือ</w:t>
+      </w:r>
+      <w:r>
+        <w:t xml:space="preserve"> </w:t>
+      </w:r>
+      <w:r>
+        <w:rPr>
+          <w:rStyle w:val="VerbatimChar"/>
+        </w:rPr>
+        <w:t xml:space="preserve">Secrets</w:t>
+      </w:r>
+      <w:r>
+        <w:t xml:space="preserve"> </w:t>
+      </w:r>
+      <w:r>
+        <w:t xml:space="preserve">ของ Colab/Kaggle และเรียกใช้ผ่าน</w:t>
+      </w:r>
+      <w:r>
+        <w:t xml:space="preserve"> </w:t>
+      </w:r>
+      <w:r>
+        <w:rPr>
+          <w:rStyle w:val="VerbatimChar"/>
+        </w:rPr>
+        <w:t xml:space="preserve">userdata.get()</w:t>
+      </w:r>
+      <w:r>
+        <w:t xml:space="preserve"> </w:t>
+      </w:r>
+      <w:r>
+        <w:t xml:space="preserve">ตามที่ระบุในหัวข้อ 1.2.1</w:t>
+      </w:r>
+    </w:p>
+    <w:p>
+      <w:pPr>
+        <w:pStyle w:val="BodyText"/>
+        <w:jc w:val="thaiDistribute"/>
+        <w:ind w:firstLine="720"/>
+      </w:pPr>
+      <w:r>
+        <w:t xml:space="preserve">  </w:t>
+      </w:r>
+      <w:r>
+        <w:rPr>
+          <w:b/>
+          <w:bCs/>
+        </w:rPr>
+        <w:t xml:space="preserve">การคุ้มครองข้อมูลส่วนบุคคล (PDPA):</w:t>
+      </w:r>
+      <w:r>
+        <w:t xml:space="preserve"> </w:t>
+      </w:r>
+      <w:r>
+        <w:t xml:space="preserve">ภาพมาตรวัดน้ำอาจติดข้อมูลระบุตัวตนของครัวเรือน พึงกำหนดนโยบายลบภาพชั่วคราวทันทีหลังประมวลผลเสร็จสิ้น จำกัดการเก็บ log ที่มีภาพ และเข้ารหัสการสื่อสารผ่าน HTTPS</w:t>
+      </w:r>
+    </w:p>
+    <w:p>
+      <w:pPr>
+        <w:pStyle w:val="BodyText"/>
+        <w:jc w:val="thaiDistribute"/>
+        <w:ind w:firstLine="720"/>
+      </w:pPr>
+      <w:r>
+        <w:t xml:space="preserve">  </w:t>
+      </w:r>
+      <w:r>
+        <w:rPr>
+          <w:b/>
+          <w:bCs/>
+        </w:rPr>
+        <w:t xml:space="preserve">การจัดการช่องโหว่ของไลบรารี:</w:t>
+      </w:r>
+      <w:r>
+        <w:t xml:space="preserve"> </w:t>
+      </w:r>
+      <w:r>
+        <w:t xml:space="preserve">พึงตรวจสอบไลบรารีตาม</w:t>
+      </w:r>
+      <w:r>
+        <w:t xml:space="preserve"> </w:t>
+      </w:r>
+      <w:r>
+        <w:rPr>
+          <w:rStyle w:val="VerbatimChar"/>
+        </w:rPr>
+        <w:t xml:space="preserve">requirements.txt</w:t>
+      </w:r>
+      <w:r>
+        <w:t xml:space="preserve"> </w:t>
+      </w:r>
+      <w:r>
+        <w:t xml:space="preserve">อย่างสม่ำเสมอด้วยเครื่องมือ</w:t>
+      </w:r>
+      <w:r>
+        <w:t xml:space="preserve"> </w:t>
+      </w:r>
+      <w:r>
+        <w:rPr>
+          <w:rStyle w:val="VerbatimChar"/>
+        </w:rPr>
+        <w:t xml:space="preserve">pip-audit</w:t>
+      </w:r>
+      <w:r>
+        <w:t xml:space="preserve"> </w:t>
+      </w:r>
+      <w:r>
+        <w:t xml:space="preserve">หรือ</w:t>
+      </w:r>
+      <w:r>
+        <w:t xml:space="preserve"> </w:t>
+      </w:r>
+      <w:r>
+        <w:rPr>
+          <w:rStyle w:val="VerbatimChar"/>
+        </w:rPr>
+        <w:t xml:space="preserve">dependabot</w:t>
+      </w:r>
+      <w:r>
+        <w:t xml:space="preserve"> </w:t>
+      </w:r>
+      <w:r>
+        <w:t xml:space="preserve">และปรับรุ่นเมื่อพบช่องโหว่ โดยเฉพาะ</w:t>
+      </w:r>
+      <w:r>
+        <w:t xml:space="preserve"> </w:t>
+      </w:r>
+      <w:r>
+        <w:rPr>
+          <w:rStyle w:val="VerbatimChar"/>
+        </w:rPr>
+        <w:t xml:space="preserve">torch</w:t>
+      </w:r>
+      <w:r>
+        <w:t xml:space="preserve">,</w:t>
+      </w:r>
+      <w:r>
+        <w:t xml:space="preserve"> </w:t>
+      </w:r>
+      <w:r>
+        <w:rPr>
+          <w:rStyle w:val="VerbatimChar"/>
+        </w:rPr>
+        <w:t xml:space="preserve">transformers</w:t>
+      </w:r>
+      <w:r>
+        <w:t xml:space="preserve">,</w:t>
+      </w:r>
+      <w:r>
+        <w:t xml:space="preserve"> </w:t>
+      </w:r>
+      <w:r>
+        <w:rPr>
+          <w:rStyle w:val="VerbatimChar"/>
+        </w:rPr>
+        <w:t xml:space="preserve">ultralytics</w:t>
+      </w:r>
+      <w:r>
+        <w:t xml:space="preserve">,</w:t>
+      </w:r>
+      <w:r>
+        <w:t xml:space="preserve"> </w:t>
+      </w:r>
+      <w:r>
+        <w:rPr>
+          <w:rStyle w:val="VerbatimChar"/>
+        </w:rPr>
+        <w:t xml:space="preserve">fastapi</w:t>
+      </w:r>
+    </w:p>
     <w:bookmarkEnd w:id="61"/>
+    <w:bookmarkStart w:id="62" w:name="Xbd02c70816efe69f911715cf27dcee005bd5a81"/>
+    <w:p>
+      <w:pPr>
+        <w:pStyle w:val="Heading3"/>
+      </w:pPr>
+      <w:r>
+        <w:t xml:space="preserve">ข. มาตรการด้านความเสถียรและความน่าเชื่อถือ (Stability and Reliability Measures)</w:t>
+      </w:r>
+    </w:p>
+    <w:p>
+      <w:pPr>
+        <w:pStyle w:val="FirstParagraph"/>
+        <w:jc w:val="thaiDistribute"/>
+        <w:ind w:firstLine="720"/>
+      </w:pPr>
+      <w:r>
+        <w:t xml:space="preserve">  </w:t>
+      </w:r>
+      <w:r>
+        <w:rPr>
+          <w:b/>
+          <w:bCs/>
+        </w:rPr>
+        <w:t xml:space="preserve">การจัดการข้อผิดพลาดและการตรวจสอบสถานะ:</w:t>
+      </w:r>
+      <w:r>
+        <w:t xml:space="preserve"> </w:t>
+      </w:r>
+      <w:r>
+        <w:t xml:space="preserve">Endpoint</w:t>
+      </w:r>
+      <w:r>
+        <w:t xml:space="preserve"> </w:t>
+      </w:r>
+      <w:r>
+        <w:rPr>
+          <w:rStyle w:val="VerbatimChar"/>
+        </w:rPr>
+        <w:t xml:space="preserve">GET /api/health</w:t>
+      </w:r>
+      <w:r>
+        <w:t xml:space="preserve"> </w:t>
+      </w:r>
+      <w:r>
+        <w:t xml:space="preserve">รายงาน</w:t>
+      </w:r>
+      <w:r>
+        <w:t xml:space="preserve"> </w:t>
+      </w:r>
+      <w:r>
+        <w:rPr>
+          <w:rStyle w:val="VerbatimChar"/>
+        </w:rPr>
+        <w:t xml:space="preserve">device</w:t>
+      </w:r>
+      <w:r>
+        <w:t xml:space="preserve">,</w:t>
+      </w:r>
+      <w:r>
+        <w:t xml:space="preserve"> </w:t>
+      </w:r>
+      <w:r>
+        <w:rPr>
+          <w:rStyle w:val="VerbatimChar"/>
+        </w:rPr>
+        <w:t xml:space="preserve">yolo_loaded</w:t>
+      </w:r>
+      <w:r>
+        <w:t xml:space="preserve">,</w:t>
+      </w:r>
+      <w:r>
+        <w:t xml:space="preserve"> </w:t>
+      </w:r>
+      <w:r>
+        <w:rPr>
+          <w:rStyle w:val="VerbatimChar"/>
+        </w:rPr>
+        <w:t xml:space="preserve">siglip_loaded</w:t>
+      </w:r>
+      <w:r>
+        <w:t xml:space="preserve"> </w:t>
+      </w:r>
+      <w:r>
+        <w:t xml:space="preserve">เพื่อตรวจสอบความพร้อมก่อนรับงานจริง ส่วน</w:t>
+      </w:r>
+      <w:r>
+        <w:t xml:space="preserve"> </w:t>
+      </w:r>
+      <w:r>
+        <w:rPr>
+          <w:rStyle w:val="VerbatimChar"/>
+        </w:rPr>
+        <w:t xml:space="preserve">POST /api/read-meter</w:t>
+      </w:r>
+      <w:r>
+        <w:t xml:space="preserve"> </w:t>
+      </w:r>
+      <w:r>
+        <w:t xml:space="preserve">ใช้</w:t>
+      </w:r>
+      <w:r>
+        <w:t xml:space="preserve"> </w:t>
+      </w:r>
+      <w:r>
+        <w:rPr>
+          <w:rStyle w:val="VerbatimChar"/>
+        </w:rPr>
+        <w:t xml:space="preserve">run_in_threadpool</w:t>
+      </w:r>
+      <w:r>
+        <w:t xml:space="preserve"> </w:t>
+      </w:r>
+      <w:r>
+        <w:t xml:space="preserve">เพื่อป้องกันการบล็อก Event Loop และคืนข้อความผิดพลาดที่ชัดเจน</w:t>
+      </w:r>
+    </w:p>
+    <w:p>
+      <w:pPr>
+        <w:pStyle w:val="BodyText"/>
+        <w:jc w:val="thaiDistribute"/>
+        <w:ind w:firstLine="720"/>
+      </w:pPr>
+      <w:r>
+        <w:t xml:space="preserve">  </w:t>
+      </w:r>
+      <w:r>
+        <w:rPr>
+          <w:b/>
+          <w:bCs/>
+        </w:rPr>
+        <w:t xml:space="preserve">กลไก Safety Guards และการแจ้งเตือน:</w:t>
+      </w:r>
+      <w:r>
+        <w:t xml:space="preserve"> </w:t>
+      </w:r>
+      <w:r>
+        <w:t xml:space="preserve">ระบบมี</w:t>
+      </w:r>
+      <w:r>
+        <w:t xml:space="preserve"> </w:t>
+      </w:r>
+      <w:r>
+        <w:rPr>
+          <w:rStyle w:val="VerbatimChar"/>
+        </w:rPr>
+        <w:t xml:space="preserve">is_vertical</w:t>
+      </w:r>
+      <w:r>
+        <w:t xml:space="preserve">,</w:t>
+      </w:r>
+      <w:r>
+        <w:t xml:space="preserve"> </w:t>
+      </w:r>
+      <w:r>
+        <w:rPr>
+          <w:rStyle w:val="VerbatimChar"/>
+        </w:rPr>
+        <w:t xml:space="preserve">red_ratio</w:t>
+      </w:r>
+      <w:r>
+        <w:t xml:space="preserve">,</w:t>
+      </w:r>
+      <w:r>
+        <w:t xml:space="preserve"> </w:t>
+      </w:r>
+      <w:r>
+        <w:rPr>
+          <w:rStyle w:val="VerbatimChar"/>
+        </w:rPr>
+        <w:t xml:space="preserve">flip_guard</w:t>
+      </w:r>
+      <w:r>
+        <w:t xml:space="preserve">,</w:t>
+      </w:r>
+      <w:r>
+        <w:t xml:space="preserve"> </w:t>
+      </w:r>
+      <w:r>
+        <w:rPr>
+          <w:rStyle w:val="VerbatimChar"/>
+        </w:rPr>
+        <w:t xml:space="preserve">cross_check_digits</w:t>
+      </w:r>
+      <w:r>
+        <w:t xml:space="preserve"> </w:t>
+      </w:r>
+      <w:r>
+        <w:t xml:space="preserve">และ</w:t>
+      </w:r>
+      <w:r>
+        <w:t xml:space="preserve"> </w:t>
+      </w:r>
+      <w:r>
+        <w:rPr>
+          <w:rStyle w:val="VerbatimChar"/>
+        </w:rPr>
+        <w:t xml:space="preserve">warnings</w:t>
+      </w:r>
+      <w:r>
+        <w:t xml:space="preserve"> </w:t>
+      </w:r>
+      <w:r>
+        <w:t xml:space="preserve">หลายระดับ (จำนวนหลักนอกช่วง 4–9, หลักแรกเป็น 0,</w:t>
+      </w:r>
+      <w:r>
+        <w:t xml:space="preserve"> </w:t>
+      </w:r>
+      <w:r>
+        <w:rPr>
+          <w:rStyle w:val="VerbatimChar"/>
+        </w:rPr>
+        <w:t xml:space="preserve">mean_conf &lt; 0.60</w:t>
+      </w:r>
+      <w:r>
+        <w:t xml:space="preserve">, กล่องไม่เรียงแนว) เพื่อให้ผู้ปฏิบัติงานตรวจสอบด้วยสายตาก่อนบันทึก</w:t>
+      </w:r>
+    </w:p>
+    <w:p>
+      <w:pPr>
+        <w:pStyle w:val="BodyText"/>
+        <w:jc w:val="thaiDistribute"/>
+        <w:ind w:firstLine="720"/>
+      </w:pPr>
+      <w:r>
+        <w:t xml:space="preserve">  </w:t>
+      </w:r>
+      <w:r>
+        <w:rPr>
+          <w:b/>
+          <w:bCs/>
+        </w:rPr>
+        <w:t xml:space="preserve">การบันทึก การตรวจสอบ และการเฝ้าระวัง:</w:t>
+      </w:r>
+      <w:r>
+        <w:t xml:space="preserve"> </w:t>
+      </w:r>
+      <w:r>
+        <w:t xml:space="preserve">พึงบันทึก</w:t>
+      </w:r>
+      <w:r>
+        <w:t xml:space="preserve"> </w:t>
+      </w:r>
+      <w:r>
+        <w:rPr>
+          <w:rStyle w:val="VerbatimChar"/>
+        </w:rPr>
+        <w:t xml:space="preserve">elapsed_ms</w:t>
+      </w:r>
+      <w:r>
+        <w:t xml:space="preserve">,</w:t>
+      </w:r>
+      <w:r>
+        <w:t xml:space="preserve"> </w:t>
+      </w:r>
+      <w:r>
+        <w:rPr>
+          <w:rStyle w:val="VerbatimChar"/>
+        </w:rPr>
+        <w:t xml:space="preserve">processing.best</w:t>
+      </w:r>
+      <w:r>
+        <w:t xml:space="preserve"> </w:t>
+      </w:r>
+      <w:r>
+        <w:t xml:space="preserve">(มุม/ฟิลเตอร์ที่ชนะ),</w:t>
+      </w:r>
+      <w:r>
+        <w:t xml:space="preserve"> </w:t>
+      </w:r>
+      <w:r>
+        <w:rPr>
+          <w:rStyle w:val="VerbatimChar"/>
+        </w:rPr>
+        <w:t xml:space="preserve">meter_check.confidence</w:t>
+      </w:r>
+      <w:r>
+        <w:t xml:space="preserve"> </w:t>
+      </w:r>
+      <w:r>
+        <w:t xml:space="preserve">และ</w:t>
+      </w:r>
+      <w:r>
+        <w:t xml:space="preserve"> </w:t>
+      </w:r>
+      <w:r>
+        <w:rPr>
+          <w:rStyle w:val="VerbatimChar"/>
+        </w:rPr>
+        <w:t xml:space="preserve">warnings</w:t>
+      </w:r>
+      <w:r>
+        <w:t xml:space="preserve"> </w:t>
+      </w:r>
+      <w:r>
+        <w:t xml:space="preserve">ทุกคำขอ เพื่อให้สามารถตรวจสอบย้อนหลังและวิเคราะห์สาเหตุเมื่อเกิดความคลาดเคลื่อน</w:t>
+      </w:r>
+    </w:p>
+    <w:p>
+      <w:pPr>
+        <w:pStyle w:val="BodyText"/>
+        <w:jc w:val="thaiDistribute"/>
+        <w:ind w:firstLine="720"/>
+      </w:pPr>
+      <w:r>
+        <w:t xml:space="preserve">  </w:t>
+      </w:r>
+      <w:r>
+        <w:rPr>
+          <w:b/>
+          <w:bCs/>
+        </w:rPr>
+        <w:t xml:space="preserve">การกำหนดรุ่นและการกู้คืน:</w:t>
+      </w:r>
+      <w:r>
+        <w:t xml:space="preserve"> </w:t>
+      </w:r>
+      <w:r>
+        <w:t xml:space="preserve">ไฟล์น้ำหนัก</w:t>
+      </w:r>
+      <w:r>
+        <w:t xml:space="preserve"> </w:t>
+      </w:r>
+      <w:r>
+        <w:rPr>
+          <w:rStyle w:val="VerbatimChar"/>
+        </w:rPr>
+        <w:t xml:space="preserve">weights/MeterOCR.pt</w:t>
+      </w:r>
+      <w:r>
+        <w:t xml:space="preserve"> </w:t>
+      </w:r>
+      <w:r>
+        <w:t xml:space="preserve">พึงควบคุมรุ่นด้วย Git LFS หรือ Hugging Face พร้อมทั้งสำรอง</w:t>
+      </w:r>
+      <w:r>
+        <w:t xml:space="preserve"> </w:t>
+      </w:r>
+      <w:r>
+        <w:rPr>
+          <w:rStyle w:val="VerbatimChar"/>
+        </w:rPr>
+        <w:t xml:space="preserve">best.pt</w:t>
+      </w:r>
+      <w:r>
+        <w:t xml:space="preserve"> </w:t>
+      </w:r>
+      <w:r>
+        <w:t xml:space="preserve">จาก</w:t>
+      </w:r>
+      <w:r>
+        <w:t xml:space="preserve"> </w:t>
+      </w:r>
+      <w:r>
+        <w:rPr>
+          <w:rStyle w:val="VerbatimChar"/>
+        </w:rPr>
+        <w:t xml:space="preserve">runs/detect/train/weights/</w:t>
+      </w:r>
+      <w:r>
+        <w:t xml:space="preserve"> </w:t>
+      </w:r>
+      <w:r>
+        <w:t xml:space="preserve">ไปยัง Google Drive ตามหัวข้อ 1.2.4 เพื่อป้องกันการสูญหายเมื่อเซสชัน Colab สิ้นสุด</w:t>
+      </w:r>
+    </w:p>
+    <w:p>
+      <w:pPr>
+        <w:pStyle w:val="BodyText"/>
+        <w:jc w:val="thaiDistribute"/>
+        <w:ind w:firstLine="720"/>
+      </w:pPr>
+      <w:r>
+        <w:t xml:space="preserve">  </w:t>
+      </w:r>
+      <w:r>
+        <w:rPr>
+          <w:b/>
+          <w:bCs/>
+        </w:rPr>
+        <w:t xml:space="preserve">ตารางสรุปมาตรการ:</w:t>
+      </w:r>
+    </w:p>
+    <w:tbl>
+      <w:tblPr>
+        <w:tblStyle w:val="Table"/>
+        <w:tblW w:type="pct" w:w="5000"/>
+        <w:tblLayout w:type="fixed"/>
+        <w:tblLook w:firstRow="1" w:lastRow="0" w:firstColumn="0" w:lastColumn="0" w:noHBand="0" w:noVBand="0" w:val="0020"/>
+      </w:tblPr>
+      <w:tblGrid>
+        <w:gridCol w:w="2640"/>
+        <w:gridCol w:w="2640"/>
+        <w:gridCol w:w="2640"/>
+      </w:tblGrid>
+      <w:tr>
+        <w:trPr>
+          <w:tblHeader w:val="on"/>
+        </w:trPr>
+        <w:tc>
+          <w:tcPr/>
+          <w:p>
+            <w:pPr>
+              <w:pStyle w:val="Compact"/>
+            </w:pPr>
+            <w:r>
+              <w:t xml:space="preserve">ด้าน</w:t>
+            </w:r>
+          </w:p>
+        </w:tc>
+        <w:tc>
+          <w:tcPr/>
+          <w:p>
+            <w:pPr>
+              <w:pStyle w:val="Compact"/>
+            </w:pPr>
+            <w:r>
+              <w:t xml:space="preserve">มาตรการ</w:t>
+            </w:r>
+          </w:p>
+        </w:tc>
+        <w:tc>
+          <w:tcPr/>
+          <w:p>
+            <w:pPr>
+              <w:pStyle w:val="Compact"/>
+            </w:pPr>
+            <w:r>
+              <w:t xml:space="preserve">การดำเนินการในระบบนี้</w:t>
+            </w:r>
+          </w:p>
+        </w:tc>
+      </w:tr>
+      <w:tr>
+        <w:tc>
+          <w:tcPr/>
+          <w:p>
+            <w:pPr>
+              <w:pStyle w:val="Compact"/>
+            </w:pPr>
+            <w:r>
+              <w:t xml:space="preserve">ความปลอดภัย</w:t>
+            </w:r>
+          </w:p>
+        </w:tc>
+        <w:tc>
+          <w:tcPr/>
+          <w:p>
+            <w:pPr>
+              <w:pStyle w:val="Compact"/>
+            </w:pPr>
+            <w:r>
+              <w:t xml:space="preserve">กรองไฟล์</w:t>
+            </w:r>
+          </w:p>
+        </w:tc>
+        <w:tc>
+          <w:tcPr/>
+          <w:p>
+            <w:pPr>
+              <w:pStyle w:val="Compact"/>
+            </w:pPr>
+            <w:r>
+              <w:rPr>
+                <w:rStyle w:val="VerbatimChar"/>
+              </w:rPr>
+              <w:t xml:space="preserve">ALLOWED_TYPES</w:t>
+            </w:r>
+            <w:r>
+              <w:t xml:space="preserve"> </w:t>
+            </w:r>
+            <w:r>
+              <w:t xml:space="preserve">+ ตรวจ</w:t>
+            </w:r>
+            <w:r>
+              <w:t xml:space="preserve"> </w:t>
+            </w:r>
+            <w:r>
+              <w:rPr>
+                <w:rStyle w:val="VerbatimChar"/>
+              </w:rPr>
+              <w:t xml:space="preserve">PIL</w:t>
+            </w:r>
+            <w:r>
+              <w:t xml:space="preserve"> </w:t>
+            </w:r>
+            <w:r>
+              <w:t xml:space="preserve">+ จำกัดขนาด</w:t>
+            </w:r>
+          </w:p>
+        </w:tc>
+      </w:tr>
+      <w:tr>
+        <w:tc>
+          <w:tcPr/>
+          <w:p>
+            <w:pPr>
+              <w:pStyle w:val="Compact"/>
+            </w:pPr>
+            <w:r>
+              <w:t xml:space="preserve">ความปลอดภัย</w:t>
+            </w:r>
+          </w:p>
+        </w:tc>
+        <w:tc>
+          <w:tcPr/>
+          <w:p>
+            <w:pPr>
+              <w:pStyle w:val="Compact"/>
+            </w:pPr>
+            <w:r>
+              <w:t xml:space="preserve">ความลับ</w:t>
+            </w:r>
+          </w:p>
+        </w:tc>
+        <w:tc>
+          <w:tcPr/>
+          <w:p>
+            <w:pPr>
+              <w:pStyle w:val="Compact"/>
+            </w:pPr>
+            <w:r>
+              <w:rPr>
+                <w:rStyle w:val="VerbatimChar"/>
+              </w:rPr>
+              <w:t xml:space="preserve">ROBOFLOW_API_KEY</w:t>
+            </w:r>
+            <w:r>
+              <w:t xml:space="preserve"> </w:t>
+            </w:r>
+            <w:r>
+              <w:t xml:space="preserve">ใน Secrets/ENV</w:t>
+            </w:r>
+          </w:p>
+        </w:tc>
+      </w:tr>
+      <w:tr>
+        <w:tc>
+          <w:tcPr/>
+          <w:p>
+            <w:pPr>
+              <w:pStyle w:val="Compact"/>
+            </w:pPr>
+            <w:r>
+              <w:t xml:space="preserve">ความปลอดภัย</w:t>
+            </w:r>
+          </w:p>
+        </w:tc>
+        <w:tc>
+          <w:tcPr/>
+          <w:p>
+            <w:pPr>
+              <w:pStyle w:val="Compact"/>
+            </w:pPr>
+            <w:r>
+              <w:t xml:space="preserve">PDPA</w:t>
+            </w:r>
+          </w:p>
+        </w:tc>
+        <w:tc>
+          <w:tcPr/>
+          <w:p>
+            <w:pPr>
+              <w:pStyle w:val="Compact"/>
+            </w:pPr>
+            <w:r>
+              <w:t xml:space="preserve">ลบภาพหลังประมวลผล, HTTPS</w:t>
+            </w:r>
+          </w:p>
+        </w:tc>
+      </w:tr>
+      <w:tr>
+        <w:tc>
+          <w:tcPr/>
+          <w:p>
+            <w:pPr>
+              <w:pStyle w:val="Compact"/>
+            </w:pPr>
+            <w:r>
+              <w:t xml:space="preserve">ความเสถียร</w:t>
+            </w:r>
+          </w:p>
+        </w:tc>
+        <w:tc>
+          <w:tcPr/>
+          <w:p>
+            <w:pPr>
+              <w:pStyle w:val="Compact"/>
+            </w:pPr>
+            <w:r>
+              <w:t xml:space="preserve">ตรวจสอบสถานะ</w:t>
+            </w:r>
+          </w:p>
+        </w:tc>
+        <w:tc>
+          <w:tcPr/>
+          <w:p>
+            <w:pPr>
+              <w:pStyle w:val="Compact"/>
+            </w:pPr>
+            <w:r>
+              <w:rPr>
+                <w:rStyle w:val="VerbatimChar"/>
+              </w:rPr>
+              <w:t xml:space="preserve">GET /api/health</w:t>
+            </w:r>
+          </w:p>
+        </w:tc>
+      </w:tr>
+      <w:tr>
+        <w:tc>
+          <w:tcPr/>
+          <w:p>
+            <w:pPr>
+              <w:pStyle w:val="Compact"/>
+            </w:pPr>
+            <w:r>
+              <w:t xml:space="preserve">ความเสถียร</w:t>
+            </w:r>
+          </w:p>
+        </w:tc>
+        <w:tc>
+          <w:tcPr/>
+          <w:p>
+            <w:pPr>
+              <w:pStyle w:val="Compact"/>
+            </w:pPr>
+            <w:r>
+              <w:t xml:space="preserve">กันอ่านผิด</w:t>
+            </w:r>
+          </w:p>
+        </w:tc>
+        <w:tc>
+          <w:tcPr/>
+          <w:p>
+            <w:pPr>
+              <w:pStyle w:val="Compact"/>
+            </w:pPr>
+            <w:r>
+              <w:rPr>
+                <w:rStyle w:val="VerbatimChar"/>
+              </w:rPr>
+              <w:t xml:space="preserve">is_vertical</w:t>
+            </w:r>
+            <w:r>
+              <w:t xml:space="preserve">/</w:t>
+            </w:r>
+            <w:r>
+              <w:rPr>
+                <w:rStyle w:val="VerbatimChar"/>
+              </w:rPr>
+              <w:t xml:space="preserve">red_ratio</w:t>
+            </w:r>
+            <w:r>
+              <w:t xml:space="preserve">/</w:t>
+            </w:r>
+            <w:r>
+              <w:rPr>
+                <w:rStyle w:val="VerbatimChar"/>
+              </w:rPr>
+              <w:t xml:space="preserve">flip_guard</w:t>
+            </w:r>
+            <w:r>
+              <w:t xml:space="preserve">/</w:t>
+            </w:r>
+            <w:r>
+              <w:rPr>
+                <w:rStyle w:val="VerbatimChar"/>
+              </w:rPr>
+              <w:t xml:space="preserve">cross_check</w:t>
+            </w:r>
+          </w:p>
+        </w:tc>
+      </w:tr>
+      <w:tr>
+        <w:tc>
+          <w:tcPr/>
+          <w:p>
+            <w:pPr>
+              <w:pStyle w:val="Compact"/>
+            </w:pPr>
+            <w:r>
+              <w:t xml:space="preserve">ความเสถียร</w:t>
+            </w:r>
+          </w:p>
+        </w:tc>
+        <w:tc>
+          <w:tcPr/>
+          <w:p>
+            <w:pPr>
+              <w:pStyle w:val="Compact"/>
+            </w:pPr>
+            <w:r>
+              <w:t xml:space="preserve">กู้คืน</w:t>
+            </w:r>
+          </w:p>
+        </w:tc>
+        <w:tc>
+          <w:tcPr/>
+          <w:p>
+            <w:pPr>
+              <w:pStyle w:val="Compact"/>
+            </w:pPr>
+            <w:r>
+              <w:t xml:space="preserve">สำรอง</w:t>
+            </w:r>
+            <w:r>
+              <w:t xml:space="preserve"> </w:t>
+            </w:r>
+            <w:r>
+              <w:rPr>
+                <w:rStyle w:val="VerbatimChar"/>
+              </w:rPr>
+              <w:t xml:space="preserve">best.pt</w:t>
+            </w:r>
+            <w:r>
+              <w:t xml:space="preserve"> </w:t>
+            </w:r>
+            <w:r>
+              <w:t xml:space="preserve">→ Drive/Hugging Face</w:t>
+            </w:r>
+          </w:p>
+        </w:tc>
+      </w:tr>
+    </w:tbl>
+    <w:p>
+      <w:pPr>
+        <w:pStyle w:val="BodyText"/>
+        <w:jc w:val="thaiDistribute"/>
+        <w:ind w:firstLine="720"/>
+      </w:pPr>
+      <w:r>
+        <w:t xml:space="preserve">  การดำเนินการตามมาตรการข้างต้นอย่างครบถ้วนจะช่วยให้ระบบสามารถให้บริการได้อย่างปลอดภัย มีเสถียรภาพ และตรวจสอบได้ในสภาพแวดล้อมการใช้งานจริง</w:t>
+      </w:r>
+    </w:p>
+    <w:bookmarkEnd w:id="62"/>
+    <w:bookmarkEnd w:id="63"/>
+    <w:bookmarkEnd w:id="64"/>
     <w:sectPr>
       <w:pgSz w:code="9" w:h="16840" w:w="11907"/>
       <w:pgMar w:bottom="1418" w:footer="720" w:gutter="0" w:header="720" w:left="1985" w:right="1418" w:top="1985"/>

</xml_diff>

<commit_message>
docs: expand 1.3.1 project structure with Guidebook reference (layered src/meter)
- Keep simple meter-reader/ tree for learning
- Add reference layered structure from Guidebook/docs/Water_Meter_OCR_Guidebook-Draft.md Appendix (src/utils/storage, src/meter/ocr,validator,service,controller etc., Water-Meter-Digit.pt -> MeterOCR.pt)
- Formal Thai note on when to use each
</commit_message>
<xml_diff>
--- a/RE.docx
+++ b/RE.docx
@@ -3627,6 +3627,31 @@
     </w:p>
     <w:p>
       <w:pPr>
+        <w:pStyle w:val="FirstParagraph"/>
+        <w:jc w:val="thaiDistribute"/>
+        <w:ind w:firstLine="720"/>
+      </w:pPr>
+      <w:r>
+        <w:t xml:space="preserve">โครงสร้างปัจจุบันของ</w:t>
+      </w:r>
+      <w:r>
+        <w:t xml:space="preserve"> </w:t>
+      </w:r>
+      <w:r>
+        <w:rPr>
+          <w:rStyle w:val="VerbatimChar"/>
+        </w:rPr>
+        <w:t xml:space="preserve">meter-reader/</w:t>
+      </w:r>
+      <w:r>
+        <w:t xml:space="preserve"> </w:t>
+      </w:r>
+      <w:r>
+        <w:t xml:space="preserve">(แบบเรียบง่ายสำหรับการเรียนรู้):</w:t>
+      </w:r>
+    </w:p>
+    <w:p>
+      <w:pPr>
         <w:pStyle w:val="BlockText"/>
       </w:pPr>
       <w:r>
@@ -3669,6 +3694,87 @@
           <w:iCs/>
         </w:rPr>
         <w:t xml:space="preserve">พื้นที่นี้เว้นว่างไว้สำหรับอาจารย์/นักศึกษาใส่รหัสต้นฉบับด้วยตนเอง — คงโครงสร้างและคำอธิบายไว้ครบถ้วน</w:t>
+      </w:r>
+    </w:p>
+    <w:p>
+      <w:pPr>
+        <w:pStyle w:val="FirstParagraph"/>
+        <w:jc w:val="thaiDistribute"/>
+        <w:ind w:firstLine="720"/>
+      </w:pPr>
+      <w:r>
+        <w:t xml:space="preserve">โครงสร้างอ้างอิงแบบแยกเลเยอร์ตาม</w:t>
+      </w:r>
+      <w:r>
+        <w:t xml:space="preserve"> </w:t>
+      </w:r>
+      <w:r>
+        <w:rPr>
+          <w:rStyle w:val="VerbatimChar"/>
+        </w:rPr>
+        <w:t xml:space="preserve">Guidebook/docs/Water_Meter_OCR_Guidebook-Draft.md</w:t>
+      </w:r>
+      <w:r>
+        <w:t xml:space="preserve"> </w:t>
+      </w:r>
+      <w:r>
+        <w:t xml:space="preserve">(ภาคผนวก — โครงสร้างระบบไฟล์อ้างอิง) สำหรับระบบที่ต้องการแยกหน้าที่ชัดเจน:</w:t>
+      </w:r>
+    </w:p>
+    <w:p>
+      <w:pPr>
+        <w:pStyle w:val="BlockText"/>
+      </w:pPr>
+      <w:r>
+        <w:rPr>
+          <w:b/>
+          <w:bCs/>
+        </w:rPr>
+        <w:t xml:space="preserve">【เว้นว่างสำหรับโค้ด — กรุณาใส่รหัสต้นฉบับที่นี่:</w:t>
+      </w:r>
+      <w:r>
+        <w:rPr>
+          <w:b/>
+          <w:bCs/>
+        </w:rPr>
+        <w:t xml:space="preserve"> </w:t>
+      </w:r>
+      <w:r>
+        <w:rPr>
+          <w:rStyle w:val="VerbatimChar"/>
+          <w:b/>
+          <w:bCs/>
+        </w:rPr>
+        <w:t xml:space="preserve">Requirements</w:t>
+      </w:r>
+      <w:r>
+        <w:rPr>
+          <w:b/>
+          <w:bCs/>
+        </w:rPr>
+        <w:t xml:space="preserve">】</w:t>
+      </w:r>
+    </w:p>
+    <w:p>
+      <w:pPr>
+        <w:pStyle w:val="BlockText"/>
+      </w:pPr>
+      <w:r>
+        <w:rPr>
+          <w:i/>
+          <w:iCs/>
+        </w:rPr>
+        <w:t xml:space="preserve">พื้นที่นี้เว้นว่างไว้สำหรับอาจารย์/นักศึกษาใส่รหัสต้นฉบับด้วยตนเอง — คงโครงสร้างและคำอธิบายไว้ครบถ้วน</w:t>
+      </w:r>
+    </w:p>
+    <w:p>
+      <w:pPr>
+        <w:pStyle w:val="FirstParagraph"/>
+        <w:jc w:val="thaiDistribute"/>
+        <w:ind w:firstLine="720"/>
+      </w:pPr>
+      <w:r>
+        <w:t xml:space="preserve">  ในการศึกษาเบื้องต้นใช้โครงสร้างเรียบง่ายด้านบนก็เพียงพอ ส่วนโครงสร้างแยกเลเยอร์ด้านล่างเป็นแนวทางเมื่อต้องการขยายระบบให้ดูแลรักษาง่ายและทดสอบแยกส่วนได้</w:t>
       </w:r>
     </w:p>
     <w:bookmarkEnd w:id="37"/>

</xml_diff>

<commit_message>
docs: move Project Structure (layered src/meter) to Appendix C
- 1.3.1 now keeps only simple meter-reader/ tree + note pointing to Appendix C
- Appendix now has ก. Security, ข. Stability, ค. Project Structure Reference (layered Guidebook structure with Water-Meter-Digit.pt -> MeterOCR.pt)
- Headings 40->41, preserve cover/preface/TOC/LOF from Guidebook, keep placeholders, Tab+ThaiDist
</commit_message>
<xml_diff>
--- a/RE.docx
+++ b/RE.docx
@@ -3627,31 +3627,6 @@
     </w:p>
     <w:p>
       <w:pPr>
-        <w:pStyle w:val="FirstParagraph"/>
-        <w:jc w:val="thaiDistribute"/>
-        <w:ind w:firstLine="720"/>
-      </w:pPr>
-      <w:r>
-        <w:t xml:space="preserve">โครงสร้างปัจจุบันของ</w:t>
-      </w:r>
-      <w:r>
-        <w:t xml:space="preserve"> </w:t>
-      </w:r>
-      <w:r>
-        <w:rPr>
-          <w:rStyle w:val="VerbatimChar"/>
-        </w:rPr>
-        <w:t xml:space="preserve">meter-reader/</w:t>
-      </w:r>
-      <w:r>
-        <w:t xml:space="preserve"> </w:t>
-      </w:r>
-      <w:r>
-        <w:t xml:space="preserve">(แบบเรียบง่ายสำหรับการเรียนรู้):</w:t>
-      </w:r>
-    </w:p>
-    <w:p>
-      <w:pPr>
         <w:pStyle w:val="BlockText"/>
       </w:pPr>
       <w:r>
@@ -3703,78 +3678,17 @@
         <w:ind w:firstLine="720"/>
       </w:pPr>
       <w:r>
-        <w:t xml:space="preserve">โครงสร้างอ้างอิงแบบแยกเลเยอร์ตาม</w:t>
-      </w:r>
-      <w:r>
-        <w:t xml:space="preserve"> </w:t>
-      </w:r>
-      <w:r>
-        <w:rPr>
-          <w:rStyle w:val="VerbatimChar"/>
-        </w:rPr>
-        <w:t xml:space="preserve">Guidebook/docs/Water_Meter_OCR_Guidebook-Draft.md</w:t>
-      </w:r>
-      <w:r>
-        <w:t xml:space="preserve"> </w:t>
-      </w:r>
-      <w:r>
-        <w:t xml:space="preserve">(ภาคผนวก — โครงสร้างระบบไฟล์อ้างอิง) สำหรับระบบที่ต้องการแยกหน้าที่ชัดเจน:</w:t>
-      </w:r>
-    </w:p>
-    <w:p>
-      <w:pPr>
-        <w:pStyle w:val="BlockText"/>
-      </w:pPr>
-      <w:r>
-        <w:rPr>
-          <w:b/>
-          <w:bCs/>
-        </w:rPr>
-        <w:t xml:space="preserve">【เว้นว่างสำหรับโค้ด — กรุณาใส่รหัสต้นฉบับที่นี่:</w:t>
-      </w:r>
-      <w:r>
-        <w:rPr>
-          <w:b/>
-          <w:bCs/>
-        </w:rPr>
-        <w:t xml:space="preserve"> </w:t>
-      </w:r>
-      <w:r>
-        <w:rPr>
-          <w:rStyle w:val="VerbatimChar"/>
-          <w:b/>
-          <w:bCs/>
-        </w:rPr>
-        <w:t xml:space="preserve">Requirements</w:t>
-      </w:r>
-      <w:r>
-        <w:rPr>
-          <w:b/>
-          <w:bCs/>
-        </w:rPr>
-        <w:t xml:space="preserve">】</w:t>
-      </w:r>
-    </w:p>
-    <w:p>
-      <w:pPr>
-        <w:pStyle w:val="BlockText"/>
-      </w:pPr>
-      <w:r>
-        <w:rPr>
-          <w:i/>
-          <w:iCs/>
-        </w:rPr>
-        <w:t xml:space="preserve">พื้นที่นี้เว้นว่างไว้สำหรับอาจารย์/นักศึกษาใส่รหัสต้นฉบับด้วยตนเอง — คงโครงสร้างและคำอธิบายไว้ครบถ้วน</w:t>
-      </w:r>
-    </w:p>
-    <w:p>
-      <w:pPr>
-        <w:pStyle w:val="FirstParagraph"/>
-        <w:jc w:val="thaiDistribute"/>
-        <w:ind w:firstLine="720"/>
-      </w:pPr>
-      <w:r>
-        <w:t xml:space="preserve">  ในการศึกษาเบื้องต้นใช้โครงสร้างเรียบง่ายด้านบนก็เพียงพอ ส่วนโครงสร้างแยกเลเยอร์ด้านล่างเป็นแนวทางเมื่อต้องการขยายระบบให้ดูแลรักษาง่ายและทดสอบแยกส่วนได้</w:t>
+        <w:t xml:space="preserve">  โครงสร้างข้างต้นเป็นแบบเรียบง่ายสำหรับการเรียนรู้ สำหรับโครงสร้างแบบแยกเลเยอร์ที่เหมาะกับการขยายระบบ โปรดดู</w:t>
+      </w:r>
+      <w:r>
+        <w:t xml:space="preserve"> </w:t>
+      </w:r>
+      <w:r>
+        <w:rPr>
+          <w:b/>
+          <w:bCs/>
+        </w:rPr>
+        <w:t xml:space="preserve">ภาคผนวก ค. โครงสร้างระบบไฟล์อ้างอิง</w:t>
       </w:r>
     </w:p>
     <w:bookmarkEnd w:id="37"/>
@@ -6912,7 +6826,7 @@
     <w:bookmarkEnd w:id="44"/>
     <w:bookmarkEnd w:id="45"/>
     <w:bookmarkEnd w:id="46"/>
-    <w:bookmarkStart w:id="64" w:name="X6c74b405d66cf4ac82c14fee1c2c88c61545f87"/>
+    <w:bookmarkStart w:id="65" w:name="X6c74b405d66cf4ac82c14fee1c2c88c61545f87"/>
     <w:p>
       <w:pPr>
         <w:pStyle w:val="Heading1"/>
@@ -11186,7 +11100,7 @@
       </w:r>
     </w:p>
     <w:bookmarkEnd w:id="60"/>
-    <w:bookmarkStart w:id="63" w:name="X22a27a332e537e0634807276ca2350d6fcd1c2b"/>
+    <w:bookmarkStart w:id="64" w:name="X22a27a332e537e0634807276ca2350d6fcd1c2b"/>
     <w:p>
       <w:pPr>
         <w:pStyle w:val="Heading2"/>
@@ -12305,8 +12219,99 @@
       </w:r>
     </w:p>
     <w:bookmarkEnd w:id="62"/>
+    <w:bookmarkStart w:id="63" w:name="Xa1a6ebf7e8f8f177632784d6a930fe4aa002216"/>
+    <w:p>
+      <w:pPr>
+        <w:pStyle w:val="Heading3"/>
+      </w:pPr>
+      <w:r>
+        <w:t xml:space="preserve">ค. โครงสร้างระบบไฟล์อ้างอิง (Project Structure Reference)</w:t>
+      </w:r>
+    </w:p>
+    <w:p>
+      <w:pPr>
+        <w:pStyle w:val="FirstParagraph"/>
+        <w:jc w:val="thaiDistribute"/>
+        <w:ind w:firstLine="720"/>
+      </w:pPr>
+      <w:r>
+        <w:t xml:space="preserve">  โครงสร้างอ้างอิงแบบแยกเลเยอร์ตาม</w:t>
+      </w:r>
+      <w:r>
+        <w:t xml:space="preserve"> </w:t>
+      </w:r>
+      <w:r>
+        <w:rPr>
+          <w:rStyle w:val="VerbatimChar"/>
+        </w:rPr>
+        <w:t xml:space="preserve">Guidebook/docs/Water_Meter_OCR_Guidebook-Draft.md</w:t>
+      </w:r>
+      <w:r>
+        <w:t xml:space="preserve"> </w:t>
+      </w:r>
+      <w:r>
+        <w:t xml:space="preserve">(ภาคผนวก — โครงสร้างระบบไฟล์อ้างอิง) สำหรับระบบที่ต้องการแยกหน้าที่ชัดเจนและทดสอบแยกส่วนได้:</w:t>
+      </w:r>
+    </w:p>
+    <w:p>
+      <w:pPr>
+        <w:pStyle w:val="BlockText"/>
+      </w:pPr>
+      <w:r>
+        <w:rPr>
+          <w:b/>
+          <w:bCs/>
+        </w:rPr>
+        <w:t xml:space="preserve">【เว้นว่างสำหรับโค้ด — กรุณาใส่รหัสต้นฉบับที่นี่:</w:t>
+      </w:r>
+      <w:r>
+        <w:rPr>
+          <w:b/>
+          <w:bCs/>
+        </w:rPr>
+        <w:t xml:space="preserve"> </w:t>
+      </w:r>
+      <w:r>
+        <w:rPr>
+          <w:rStyle w:val="VerbatimChar"/>
+          <w:b/>
+          <w:bCs/>
+        </w:rPr>
+        <w:t xml:space="preserve">Requirements</w:t>
+      </w:r>
+      <w:r>
+        <w:rPr>
+          <w:b/>
+          <w:bCs/>
+        </w:rPr>
+        <w:t xml:space="preserve">】</w:t>
+      </w:r>
+    </w:p>
+    <w:p>
+      <w:pPr>
+        <w:pStyle w:val="BlockText"/>
+      </w:pPr>
+      <w:r>
+        <w:rPr>
+          <w:i/>
+          <w:iCs/>
+        </w:rPr>
+        <w:t xml:space="preserve">พื้นที่นี้เว้นว่างไว้สำหรับอาจารย์/นักศึกษาใส่รหัสต้นฉบับด้วยตนเอง — คงโครงสร้างและคำอธิบายไว้ครบถ้วน</w:t>
+      </w:r>
+    </w:p>
+    <w:p>
+      <w:pPr>
+        <w:pStyle w:val="FirstParagraph"/>
+        <w:jc w:val="thaiDistribute"/>
+        <w:ind w:firstLine="720"/>
+      </w:pPr>
+      <w:r>
+        <w:t xml:space="preserve">  ในการศึกษาเบื้องต้นใช้โครงสร้างเรียบง่ายในหัวข้อ 1.3.1 ก็เพียงพอ ส่วนโครงสร้างแยกเลเยอร์ข้างต้นเป็นแนวทางเมื่อต้องการขยายระบบให้ดูแลรักษาง่ายและทดสอบแยกส่วนได้</w:t>
+      </w:r>
+    </w:p>
     <w:bookmarkEnd w:id="63"/>
     <w:bookmarkEnd w:id="64"/>
+    <w:bookmarkEnd w:id="65"/>
     <w:sectPr>
       <w:pgSz w:code="9" w:h="16840" w:w="11907"/>
       <w:pgMar w:bottom="1418" w:footer="720" w:gutter="0" w:header="720" w:left="1985" w:right="1418" w:top="1985"/>

</xml_diff>

<commit_message>
docs: make Appendix C show current project structure (meter-reader)
- 1.3.1 keeps simple tree + points to Appendix C for full current project tree
- Appendix C now shows actual meter-reader/ layout (main.py, gradio_app.py, TUTORIAL/thai/README/RE.docx, media/image1.png, meter_img 7, weights/MeterOCR.pt+yolo26n.pt, training/data.yaml, scripts/label_data.py) instead of Guidebook layered example
- Keep formal Thai, Tab+ThaiDist, placeholders, cover/preface/TOC/LOF
</commit_message>
<xml_diff>
--- a/RE.docx
+++ b/RE.docx
@@ -3678,17 +3678,68 @@
         <w:ind w:firstLine="720"/>
       </w:pPr>
       <w:r>
-        <w:t xml:space="preserve">  โครงสร้างข้างต้นเป็นแบบเรียบง่ายสำหรับการเรียนรู้ สำหรับโครงสร้างแบบแยกเลเยอร์ที่เหมาะกับการขยายระบบ โปรดดู</w:t>
-      </w:r>
-      <w:r>
-        <w:t xml:space="preserve"> </w:t>
-      </w:r>
-      <w:r>
-        <w:rPr>
-          <w:b/>
-          <w:bCs/>
-        </w:rPr>
-        <w:t xml:space="preserve">ภาคผนวก ค. โครงสร้างระบบไฟล์อ้างอิง</w:t>
+        <w:t xml:space="preserve">  โครงสร้างข้างต้นเป็นแบบเรียบง่ายสำหรับการเรียนรู้ สำหรับโครงสร้างไฟล์แบบเต็มของโปรเจกต์ปัจจุบัน (รวม</w:t>
+      </w:r>
+      <w:r>
+        <w:t xml:space="preserve"> </w:t>
+      </w:r>
+      <w:r>
+        <w:rPr>
+          <w:rStyle w:val="VerbatimChar"/>
+        </w:rPr>
+        <w:t xml:space="preserve">training/</w:t>
+      </w:r>
+      <w:r>
+        <w:t xml:space="preserve">,</w:t>
+      </w:r>
+      <w:r>
+        <w:t xml:space="preserve"> </w:t>
+      </w:r>
+      <w:r>
+        <w:rPr>
+          <w:rStyle w:val="VerbatimChar"/>
+        </w:rPr>
+        <w:t xml:space="preserve">scripts/</w:t>
+      </w:r>
+      <w:r>
+        <w:t xml:space="preserve">,</w:t>
+      </w:r>
+      <w:r>
+        <w:t xml:space="preserve"> </w:t>
+      </w:r>
+      <w:r>
+        <w:rPr>
+          <w:rStyle w:val="VerbatimChar"/>
+        </w:rPr>
+        <w:t xml:space="preserve">media/</w:t>
+      </w:r>
+      <w:r>
+        <w:t xml:space="preserve">,</w:t>
+      </w:r>
+      <w:r>
+        <w:t xml:space="preserve"> </w:t>
+      </w:r>
+      <w:r>
+        <w:rPr>
+          <w:rStyle w:val="VerbatimChar"/>
+        </w:rPr>
+        <w:t xml:space="preserve">weights/</w:t>
+      </w:r>
+      <w:r>
+        <w:t xml:space="preserve"> </w:t>
+      </w:r>
+      <w:r>
+        <w:t xml:space="preserve">ทั้งหมด) โปรดดู</w:t>
+      </w:r>
+      <w:r>
+        <w:t xml:space="preserve"> </w:t>
+      </w:r>
+      <w:r>
+        <w:rPr>
+          <w:b/>
+          <w:bCs/>
+        </w:rPr>
+        <w:t xml:space="preserve">ภาคผนวก ค. โครงสร้างระบบไฟล์ของโปรเจกต์ปัจจุบัน</w:t>
       </w:r>
     </w:p>
     <w:bookmarkEnd w:id="37"/>
@@ -12219,13 +12270,13 @@
       </w:r>
     </w:p>
     <w:bookmarkEnd w:id="62"/>
-    <w:bookmarkStart w:id="63" w:name="Xa1a6ebf7e8f8f177632784d6a930fe4aa002216"/>
+    <w:bookmarkStart w:id="63" w:name="X4c6dd3384288aad8cc7c4ed38c476fc5b7b13cb"/>
     <w:p>
       <w:pPr>
         <w:pStyle w:val="Heading3"/>
       </w:pPr>
       <w:r>
-        <w:t xml:space="preserve">ค. โครงสร้างระบบไฟล์อ้างอิง (Project Structure Reference)</w:t>
+        <w:t xml:space="preserve">ค. โครงสร้างระบบไฟล์ของโปรเจกต์ปัจจุบัน (Current Project Structure)</w:t>
       </w:r>
     </w:p>
     <w:p>
@@ -12235,22 +12286,52 @@
         <w:ind w:firstLine="720"/>
       </w:pPr>
       <w:r>
-        <w:t xml:space="preserve">  โครงสร้างอ้างอิงแบบแยกเลเยอร์ตาม</w:t>
-      </w:r>
-      <w:r>
-        <w:t xml:space="preserve"> </w:t>
-      </w:r>
-      <w:r>
-        <w:rPr>
-          <w:rStyle w:val="VerbatimChar"/>
-        </w:rPr>
-        <w:t xml:space="preserve">Guidebook/docs/Water_Meter_OCR_Guidebook-Draft.md</w:t>
-      </w:r>
-      <w:r>
-        <w:t xml:space="preserve"> </w:t>
-      </w:r>
-      <w:r>
-        <w:t xml:space="preserve">(ภาคผนวก — โครงสร้างระบบไฟล์อ้างอิง) สำหรับระบบที่ต้องการแยกหน้าที่ชัดเจนและทดสอบแยกส่วนได้:</w:t>
+        <w:t xml:space="preserve">  โครงสร้างไฟล์จริงของ</w:t>
+      </w:r>
+      <w:r>
+        <w:t xml:space="preserve"> </w:t>
+      </w:r>
+      <w:r>
+        <w:rPr>
+          <w:rStyle w:val="VerbatimChar"/>
+        </w:rPr>
+        <w:t xml:space="preserve">meter-reader/</w:t>
+      </w:r>
+      <w:r>
+        <w:t xml:space="preserve"> </w:t>
+      </w:r>
+      <w:r>
+        <w:t xml:space="preserve">ในปัจจุบัน (ตรงกับ</w:t>
+      </w:r>
+      <w:r>
+        <w:t xml:space="preserve"> </w:t>
+      </w:r>
+      <w:r>
+        <w:rPr>
+          <w:rStyle w:val="VerbatimChar"/>
+        </w:rPr>
+        <w:t xml:space="preserve">git</w:t>
+      </w:r>
+      <w:r>
+        <w:t xml:space="preserve"> </w:t>
+      </w:r>
+      <w:r>
+        <w:t xml:space="preserve">และ</w:t>
+      </w:r>
+      <w:r>
+        <w:t xml:space="preserve"> </w:t>
+      </w:r>
+      <w:r>
+        <w:rPr>
+          <w:rStyle w:val="VerbatimChar"/>
+        </w:rPr>
+        <w:t xml:space="preserve">weights/</w:t>
+      </w:r>
+      <w:r>
+        <w:t xml:space="preserve"> </w:t>
+      </w:r>
+      <w:r>
+        <w:t xml:space="preserve">ที่ใช้งานจริง) มีดังนี้:</w:t>
       </w:r>
     </w:p>
     <w:p>
@@ -12277,7 +12358,7 @@
           <w:b/>
           <w:bCs/>
         </w:rPr>
-        <w:t xml:space="preserve">Requirements</w:t>
+        <w:t xml:space="preserve">Project Structure</w:t>
       </w:r>
       <w:r>
         <w:rPr>
@@ -12306,7 +12387,46 @@
         <w:ind w:firstLine="720"/>
       </w:pPr>
       <w:r>
-        <w:t xml:space="preserve">  ในการศึกษาเบื้องต้นใช้โครงสร้างเรียบง่ายในหัวข้อ 1.3.1 ก็เพียงพอ ส่วนโครงสร้างแยกเลเยอร์ข้างต้นเป็นแนวทางเมื่อต้องการขยายระบบให้ดูแลรักษาง่ายและทดสอบแยกส่วนได้</w:t>
+        <w:t xml:space="preserve">  โฟลเดอร์</w:t>
+      </w:r>
+      <w:r>
+        <w:t xml:space="preserve"> </w:t>
+      </w:r>
+      <w:r>
+        <w:rPr>
+          <w:rStyle w:val="VerbatimChar"/>
+        </w:rPr>
+        <w:t xml:space="preserve">.venv/</w:t>
+      </w:r>
+      <w:r>
+        <w:t xml:space="preserve">,</w:t>
+      </w:r>
+      <w:r>
+        <w:t xml:space="preserve"> </w:t>
+      </w:r>
+      <w:r>
+        <w:rPr>
+          <w:rStyle w:val="VerbatimChar"/>
+        </w:rPr>
+        <w:t xml:space="preserve">__pycache__/</w:t>
+      </w:r>
+      <w:r>
+        <w:t xml:space="preserve">,</w:t>
+      </w:r>
+      <w:r>
+        <w:t xml:space="preserve"> </w:t>
+      </w:r>
+      <w:r>
+        <w:rPr>
+          <w:rStyle w:val="VerbatimChar"/>
+        </w:rPr>
+        <w:t xml:space="preserve">.git/</w:t>
+      </w:r>
+      <w:r>
+        <w:t xml:space="preserve"> </w:t>
+      </w:r>
+      <w:r>
+        <w:t xml:space="preserve">มิได้นำมาแสดงเนื่องจากเป็นไฟล์ชั่วคราวของระบบ</w:t>
       </w:r>
     </w:p>
     <w:bookmarkEnd w:id="63"/>

</xml_diff>

<commit_message>
chore: gitignore thai.md & remove scripts/ (per request)
- .gitignore: add thai.md and scripts/
- git rm --cached thai.md, scripts/label_data.py + delete scripts/ folder
- TUTORIAL.md Appendix C: remove thai.md and scripts/ from current project tree, update note to reflect .gitignore
- RE.docx rebuilt (2.46MB, keep cover/preface/TOC/LOF, placeholders, Tab+ThaiDist)
</commit_message>
<xml_diff>
--- a/RE.docx
+++ b/RE.docx
@@ -12396,6 +12396,30 @@
         <w:rPr>
           <w:rStyle w:val="VerbatimChar"/>
         </w:rPr>
+        <w:t xml:space="preserve">thai.md</w:t>
+      </w:r>
+      <w:r>
+        <w:t xml:space="preserve">,</w:t>
+      </w:r>
+      <w:r>
+        <w:t xml:space="preserve"> </w:t>
+      </w:r>
+      <w:r>
+        <w:rPr>
+          <w:rStyle w:val="VerbatimChar"/>
+        </w:rPr>
+        <w:t xml:space="preserve">scripts/</w:t>
+      </w:r>
+      <w:r>
+        <w:t xml:space="preserve">,</w:t>
+      </w:r>
+      <w:r>
+        <w:t xml:space="preserve"> </w:t>
+      </w:r>
+      <w:r>
+        <w:rPr>
+          <w:rStyle w:val="VerbatimChar"/>
+        </w:rPr>
         <w:t xml:space="preserve">.venv/</w:t>
       </w:r>
       <w:r>
@@ -12426,7 +12450,22 @@
         <w:t xml:space="preserve"> </w:t>
       </w:r>
       <w:r>
-        <w:t xml:space="preserve">มิได้นำมาแสดงเนื่องจากเป็นไฟล์ชั่วคราวของระบบ</w:t>
+        <w:t xml:space="preserve">มิได้นำมาแสดงเนื่องจากถูกละเว้นด้วย</w:t>
+      </w:r>
+      <w:r>
+        <w:t xml:space="preserve"> </w:t>
+      </w:r>
+      <w:r>
+        <w:rPr>
+          <w:rStyle w:val="VerbatimChar"/>
+        </w:rPr>
+        <w:t xml:space="preserve">.gitignore</w:t>
+      </w:r>
+      <w:r>
+        <w:t xml:space="preserve"> </w:t>
+      </w:r>
+      <w:r>
+        <w:t xml:space="preserve">หรือเป็นไฟล์ชั่วคราวของระบบ</w:t>
       </w:r>
     </w:p>
     <w:bookmarkEnd w:id="63"/>

</xml_diff>

<commit_message>
docs: Appendix C - keep only files taught in tutorial
- Simplify Current Project Structure to 6 items taught: main.py, gradio_app.py, TUTORIAL.md, requirements.txt, meter_img/ (7), weights/MeterOCR.pt
- Remove README, RE.docx, media, training, yolo26n.pt from appendix tree (not in teaching scope)
- Keep formal Thai, Tab+ThaiDist, placeholders, cover/preface/TOC/LOF
</commit_message>
<xml_diff>
--- a/RE.docx
+++ b/RE.docx
@@ -12286,52 +12286,7 @@
         <w:ind w:firstLine="720"/>
       </w:pPr>
       <w:r>
-        <w:t xml:space="preserve">  โครงสร้างไฟล์จริงของ</w:t>
-      </w:r>
-      <w:r>
-        <w:t xml:space="preserve"> </w:t>
-      </w:r>
-      <w:r>
-        <w:rPr>
-          <w:rStyle w:val="VerbatimChar"/>
-        </w:rPr>
-        <w:t xml:space="preserve">meter-reader/</w:t>
-      </w:r>
-      <w:r>
-        <w:t xml:space="preserve"> </w:t>
-      </w:r>
-      <w:r>
-        <w:t xml:space="preserve">ในปัจจุบัน (ตรงกับ</w:t>
-      </w:r>
-      <w:r>
-        <w:t xml:space="preserve"> </w:t>
-      </w:r>
-      <w:r>
-        <w:rPr>
-          <w:rStyle w:val="VerbatimChar"/>
-        </w:rPr>
-        <w:t xml:space="preserve">git</w:t>
-      </w:r>
-      <w:r>
-        <w:t xml:space="preserve"> </w:t>
-      </w:r>
-      <w:r>
-        <w:t xml:space="preserve">และ</w:t>
-      </w:r>
-      <w:r>
-        <w:t xml:space="preserve"> </w:t>
-      </w:r>
-      <w:r>
-        <w:rPr>
-          <w:rStyle w:val="VerbatimChar"/>
-        </w:rPr>
-        <w:t xml:space="preserve">weights/</w:t>
-      </w:r>
-      <w:r>
-        <w:t xml:space="preserve"> </w:t>
-      </w:r>
-      <w:r>
-        <w:t xml:space="preserve">ที่ใช้งานจริง) มีดังนี้:</w:t>
+        <w:t xml:space="preserve">  โครงสร้างไฟล์ที่ปรากฏและได้รับการสอนในคู่มือฉบับนี้ ประกอบด้วยเฉพาะไฟล์หลักที่จำเป็นต่อการเรียนรู้และการใช้งานระบบ:</w:t>
       </w:r>
     </w:p>
     <w:p>
@@ -12387,7 +12342,43 @@
         <w:ind w:firstLine="720"/>
       </w:pPr>
       <w:r>
-        <w:t xml:space="preserve">  โฟลเดอร์</w:t>
+        <w:t xml:space="preserve">  ไฟล์อื่น ๆ เช่น</w:t>
+      </w:r>
+      <w:r>
+        <w:t xml:space="preserve"> </w:t>
+      </w:r>
+      <w:r>
+        <w:rPr>
+          <w:rStyle w:val="VerbatimChar"/>
+        </w:rPr>
+        <w:t xml:space="preserve">README.md</w:t>
+      </w:r>
+      <w:r>
+        <w:t xml:space="preserve">,</w:t>
+      </w:r>
+      <w:r>
+        <w:t xml:space="preserve"> </w:t>
+      </w:r>
+      <w:r>
+        <w:rPr>
+          <w:rStyle w:val="VerbatimChar"/>
+        </w:rPr>
+        <w:t xml:space="preserve">RE.docx</w:t>
+      </w:r>
+      <w:r>
+        <w:t xml:space="preserve">,</w:t>
+      </w:r>
+      <w:r>
+        <w:t xml:space="preserve"> </w:t>
+      </w:r>
+      <w:r>
+        <w:rPr>
+          <w:rStyle w:val="VerbatimChar"/>
+        </w:rPr>
+        <w:t xml:space="preserve">media/</w:t>
+      </w:r>
+      <w:r>
+        <w:t xml:space="preserve">,</w:t>
       </w:r>
       <w:r>
         <w:t xml:space="preserve"> </w:t>
@@ -12420,6 +12411,18 @@
         <w:rPr>
           <w:rStyle w:val="VerbatimChar"/>
         </w:rPr>
+        <w:t xml:space="preserve">training/</w:t>
+      </w:r>
+      <w:r>
+        <w:t xml:space="preserve">,</w:t>
+      </w:r>
+      <w:r>
+        <w:t xml:space="preserve"> </w:t>
+      </w:r>
+      <w:r>
+        <w:rPr>
+          <w:rStyle w:val="VerbatimChar"/>
+        </w:rPr>
         <w:t xml:space="preserve">.venv/</w:t>
       </w:r>
       <w:r>
@@ -12435,37 +12438,10 @@
         <w:t xml:space="preserve">__pycache__/</w:t>
       </w:r>
       <w:r>
-        <w:t xml:space="preserve">,</w:t>
-      </w:r>
-      <w:r>
-        <w:t xml:space="preserve"> </w:t>
-      </w:r>
-      <w:r>
-        <w:rPr>
-          <w:rStyle w:val="VerbatimChar"/>
-        </w:rPr>
-        <w:t xml:space="preserve">.git/</w:t>
-      </w:r>
-      <w:r>
-        <w:t xml:space="preserve"> </w:t>
-      </w:r>
-      <w:r>
-        <w:t xml:space="preserve">มิได้นำมาแสดงเนื่องจากถูกละเว้นด้วย</w:t>
-      </w:r>
-      <w:r>
-        <w:t xml:space="preserve"> </w:t>
-      </w:r>
-      <w:r>
-        <w:rPr>
-          <w:rStyle w:val="VerbatimChar"/>
-        </w:rPr>
-        <w:t xml:space="preserve">.gitignore</w:t>
-      </w:r>
-      <w:r>
-        <w:t xml:space="preserve"> </w:t>
-      </w:r>
-      <w:r>
-        <w:t xml:space="preserve">หรือเป็นไฟล์ชั่วคราวของระบบ</w:t>
+        <w:t xml:space="preserve"> </w:t>
+      </w:r>
+      <w:r>
+        <w:t xml:space="preserve">มิได้นำมาแสดง เนื่องจากมิได้อยู่ในขอบเขตการสอนของคู่มือฉบับนี้</w:t>
       </w:r>
     </w:p>
     <w:bookmarkEnd w:id="63"/>

</xml_diff>

<commit_message>
docs: remove TUTORIAL.md & meter_img/ from Project Structure (per request)
- 1.3.1 and Appendix C now show only core runtime files: main.py, gradio_app.py, requirements.txt, weights/MeterOCR.pt
- Keep formal Thai, Tab+ThaiDist, placeholders, cover/preface/TOC/LOF
</commit_message>
<xml_diff>
--- a/RE.docx
+++ b/RE.docx
@@ -3678,58 +3678,7 @@
         <w:ind w:firstLine="720"/>
       </w:pPr>
       <w:r>
-        <w:t xml:space="preserve">  โครงสร้างข้างต้นเป็นแบบเรียบง่ายสำหรับการเรียนรู้ สำหรับโครงสร้างไฟล์แบบเต็มของโปรเจกต์ปัจจุบัน (รวม</w:t>
-      </w:r>
-      <w:r>
-        <w:t xml:space="preserve"> </w:t>
-      </w:r>
-      <w:r>
-        <w:rPr>
-          <w:rStyle w:val="VerbatimChar"/>
-        </w:rPr>
-        <w:t xml:space="preserve">training/</w:t>
-      </w:r>
-      <w:r>
-        <w:t xml:space="preserve">,</w:t>
-      </w:r>
-      <w:r>
-        <w:t xml:space="preserve"> </w:t>
-      </w:r>
-      <w:r>
-        <w:rPr>
-          <w:rStyle w:val="VerbatimChar"/>
-        </w:rPr>
-        <w:t xml:space="preserve">scripts/</w:t>
-      </w:r>
-      <w:r>
-        <w:t xml:space="preserve">,</w:t>
-      </w:r>
-      <w:r>
-        <w:t xml:space="preserve"> </w:t>
-      </w:r>
-      <w:r>
-        <w:rPr>
-          <w:rStyle w:val="VerbatimChar"/>
-        </w:rPr>
-        <w:t xml:space="preserve">media/</w:t>
-      </w:r>
-      <w:r>
-        <w:t xml:space="preserve">,</w:t>
-      </w:r>
-      <w:r>
-        <w:t xml:space="preserve"> </w:t>
-      </w:r>
-      <w:r>
-        <w:rPr>
-          <w:rStyle w:val="VerbatimChar"/>
-        </w:rPr>
-        <w:t xml:space="preserve">weights/</w:t>
-      </w:r>
-      <w:r>
-        <w:t xml:space="preserve"> </w:t>
-      </w:r>
-      <w:r>
-        <w:t xml:space="preserve">ทั้งหมด) โปรดดู</w:t>
+        <w:t xml:space="preserve">  โครงสร้างข้างต้นเป็นแบบเรียบง่ายสำหรับการเรียนรู้ สำหรับโครงสร้างไฟล์แบบเต็มของโปรเจกต์ปัจจุบัน โปรดดู</w:t>
       </w:r>
       <w:r>
         <w:t xml:space="preserve"> </w:t>
@@ -12343,6 +12292,30 @@
       </w:pPr>
       <w:r>
         <w:t xml:space="preserve">  ไฟล์อื่น ๆ เช่น</w:t>
+      </w:r>
+      <w:r>
+        <w:t xml:space="preserve"> </w:t>
+      </w:r>
+      <w:r>
+        <w:rPr>
+          <w:rStyle w:val="VerbatimChar"/>
+        </w:rPr>
+        <w:t xml:space="preserve">TUTORIAL.md</w:t>
+      </w:r>
+      <w:r>
+        <w:t xml:space="preserve">,</w:t>
+      </w:r>
+      <w:r>
+        <w:t xml:space="preserve"> </w:t>
+      </w:r>
+      <w:r>
+        <w:rPr>
+          <w:rStyle w:val="VerbatimChar"/>
+        </w:rPr>
+        <w:t xml:space="preserve">meter_img/</w:t>
+      </w:r>
+      <w:r>
+        <w:t xml:space="preserve">,</w:t>
       </w:r>
       <w:r>
         <w:t xml:space="preserve"> </w:t>

</xml_diff>

<commit_message>
docs: remove explanatory note after Project Structure (per request)
- Appendix C now ends at code block, no trailing 'ไฟล์อื่น ๆ เช่น...' paragraph
</commit_message>
<xml_diff>
--- a/RE.docx
+++ b/RE.docx
@@ -12282,139 +12282,6 @@
           <w:iCs/>
         </w:rPr>
         <w:t xml:space="preserve">พื้นที่นี้เว้นว่างไว้สำหรับอาจารย์/นักศึกษาใส่รหัสต้นฉบับด้วยตนเอง — คงโครงสร้างและคำอธิบายไว้ครบถ้วน</w:t>
-      </w:r>
-    </w:p>
-    <w:p>
-      <w:pPr>
-        <w:pStyle w:val="FirstParagraph"/>
-        <w:jc w:val="thaiDistribute"/>
-        <w:ind w:firstLine="720"/>
-      </w:pPr>
-      <w:r>
-        <w:t xml:space="preserve">  ไฟล์อื่น ๆ เช่น</w:t>
-      </w:r>
-      <w:r>
-        <w:t xml:space="preserve"> </w:t>
-      </w:r>
-      <w:r>
-        <w:rPr>
-          <w:rStyle w:val="VerbatimChar"/>
-        </w:rPr>
-        <w:t xml:space="preserve">TUTORIAL.md</w:t>
-      </w:r>
-      <w:r>
-        <w:t xml:space="preserve">,</w:t>
-      </w:r>
-      <w:r>
-        <w:t xml:space="preserve"> </w:t>
-      </w:r>
-      <w:r>
-        <w:rPr>
-          <w:rStyle w:val="VerbatimChar"/>
-        </w:rPr>
-        <w:t xml:space="preserve">meter_img/</w:t>
-      </w:r>
-      <w:r>
-        <w:t xml:space="preserve">,</w:t>
-      </w:r>
-      <w:r>
-        <w:t xml:space="preserve"> </w:t>
-      </w:r>
-      <w:r>
-        <w:rPr>
-          <w:rStyle w:val="VerbatimChar"/>
-        </w:rPr>
-        <w:t xml:space="preserve">README.md</w:t>
-      </w:r>
-      <w:r>
-        <w:t xml:space="preserve">,</w:t>
-      </w:r>
-      <w:r>
-        <w:t xml:space="preserve"> </w:t>
-      </w:r>
-      <w:r>
-        <w:rPr>
-          <w:rStyle w:val="VerbatimChar"/>
-        </w:rPr>
-        <w:t xml:space="preserve">RE.docx</w:t>
-      </w:r>
-      <w:r>
-        <w:t xml:space="preserve">,</w:t>
-      </w:r>
-      <w:r>
-        <w:t xml:space="preserve"> </w:t>
-      </w:r>
-      <w:r>
-        <w:rPr>
-          <w:rStyle w:val="VerbatimChar"/>
-        </w:rPr>
-        <w:t xml:space="preserve">media/</w:t>
-      </w:r>
-      <w:r>
-        <w:t xml:space="preserve">,</w:t>
-      </w:r>
-      <w:r>
-        <w:t xml:space="preserve"> </w:t>
-      </w:r>
-      <w:r>
-        <w:rPr>
-          <w:rStyle w:val="VerbatimChar"/>
-        </w:rPr>
-        <w:t xml:space="preserve">thai.md</w:t>
-      </w:r>
-      <w:r>
-        <w:t xml:space="preserve">,</w:t>
-      </w:r>
-      <w:r>
-        <w:t xml:space="preserve"> </w:t>
-      </w:r>
-      <w:r>
-        <w:rPr>
-          <w:rStyle w:val="VerbatimChar"/>
-        </w:rPr>
-        <w:t xml:space="preserve">scripts/</w:t>
-      </w:r>
-      <w:r>
-        <w:t xml:space="preserve">,</w:t>
-      </w:r>
-      <w:r>
-        <w:t xml:space="preserve"> </w:t>
-      </w:r>
-      <w:r>
-        <w:rPr>
-          <w:rStyle w:val="VerbatimChar"/>
-        </w:rPr>
-        <w:t xml:space="preserve">training/</w:t>
-      </w:r>
-      <w:r>
-        <w:t xml:space="preserve">,</w:t>
-      </w:r>
-      <w:r>
-        <w:t xml:space="preserve"> </w:t>
-      </w:r>
-      <w:r>
-        <w:rPr>
-          <w:rStyle w:val="VerbatimChar"/>
-        </w:rPr>
-        <w:t xml:space="preserve">.venv/</w:t>
-      </w:r>
-      <w:r>
-        <w:t xml:space="preserve">,</w:t>
-      </w:r>
-      <w:r>
-        <w:t xml:space="preserve"> </w:t>
-      </w:r>
-      <w:r>
-        <w:rPr>
-          <w:rStyle w:val="VerbatimChar"/>
-        </w:rPr>
-        <w:t xml:space="preserve">__pycache__/</w:t>
-      </w:r>
-      <w:r>
-        <w:t xml:space="preserve"> </w:t>
-      </w:r>
-      <w:r>
-        <w:t xml:space="preserve">มิได้นำมาแสดง เนื่องจากมิได้อยู่ในขอบเขตการสอนของคู่มือฉบับนี้</w:t>
       </w:r>
     </w:p>
     <w:bookmarkEnd w:id="63"/>

</xml_diff>

<commit_message>
docs: add Roboflow Sign-in steps in 1.2.1 (like Guidebook PDF)
- Add ##### ขั้นตอนสมัคร Roboflow และรับ API Key (4 steps + warning + Secrets userdata.get)
- Keep YOLO26 params, formal Thai, Tab+ThaiDist, placeholders
</commit_message>
<xml_diff>
--- a/RE.docx
+++ b/RE.docx
@@ -2551,7 +2551,7 @@
     </w:p>
     <w:bookmarkEnd w:id="28"/>
     <w:bookmarkEnd w:id="29"/>
-    <w:bookmarkStart w:id="46" w:name="Xb7595b75176c38e8a731d1214b493149caf0cf4"/>
+    <w:bookmarkStart w:id="49" w:name="Xb7595b75176c38e8a731d1214b493149caf0cf4"/>
     <w:p>
       <w:pPr>
         <w:pStyle w:val="Heading1"/>
@@ -3253,7 +3253,7 @@
     </w:p>
     <w:bookmarkEnd w:id="32"/>
     <w:bookmarkEnd w:id="33"/>
-    <w:bookmarkStart w:id="36" w:name="Xb2b8b6fb10eb4d8dc7b40a51ed8e20445ef7046"/>
+    <w:bookmarkStart w:id="39" w:name="Xb2b8b6fb10eb4d8dc7b40a51ed8e20445ef7046"/>
     <w:p>
       <w:pPr>
         <w:pStyle w:val="Heading3"/>
@@ -3326,7 +3326,7 @@
         <w:t xml:space="preserve">การเทรน Deep Learning ใช้การ์ดจอหนักมาก เครื่องทั่วไปอาจช้าหรือนานหลายชั่วโมง จึงแนะนำให้รันบน Google Colab / Kaggle ที่มี GPU ฟรี</w:t>
       </w:r>
     </w:p>
-    <w:bookmarkStart w:id="34" w:name="การเตรยมชดขอมลจาก-roboflow"/>
+    <w:bookmarkStart w:id="37" w:name="การเตรยมชดขอมลจาก-roboflow"/>
     <w:p>
       <w:pPr>
         <w:pStyle w:val="Heading4"/>
@@ -3357,10 +3357,194 @@
         <w:t xml:space="preserve">จากแพลตฟอร์ม Roboflow ซึ่งประกอบด้วยภาพหน้าปัดมาตรวัดน้ำที่มีการทำเครื่องหมายกำกับพิกัด (Annotation) ในฟอร์แมตที่เข้ากันได้กับ YOLO:</w:t>
       </w:r>
     </w:p>
+    <w:bookmarkStart w:id="36" w:name="ขนตอนสมคร-roboflow-และรบ-api-key"/>
+    <w:p>
+      <w:pPr>
+        <w:pStyle w:val="Heading5"/>
+        <w:jc w:val="thaiDistribute"/>
+        <w:ind w:firstLine="720"/>
+      </w:pPr>
+      <w:r>
+        <w:t xml:space="preserve">ขั้นตอนสมัคร Roboflow และรับ API Key</w:t>
+      </w:r>
+    </w:p>
+    <w:p>
+      <w:pPr>
+        <w:pStyle w:val="FirstParagraph"/>
+        <w:jc w:val="thaiDistribute"/>
+        <w:ind w:firstLine="720"/>
+      </w:pPr>
+      <w:r>
+        <w:t xml:space="preserve">  1. เปิด</w:t>
+      </w:r>
+      <w:r>
+        <w:t xml:space="preserve"> </w:t>
+      </w:r>
+      <w:hyperlink r:id="rId34">
+        <w:r>
+          <w:rPr>
+            <w:rStyle w:val="Hyperlink"/>
+          </w:rPr>
+          <w:t xml:space="preserve">Roboflow</w:t>
+        </w:r>
+      </w:hyperlink>
+      <w:r>
+        <w:t xml:space="preserve"> </w:t>
+      </w:r>
+      <w:r>
+        <w:t xml:space="preserve">แล้วกด</w:t>
+      </w:r>
+      <w:r>
+        <w:t xml:space="preserve"> </w:t>
+      </w:r>
+      <w:r>
+        <w:rPr>
+          <w:b/>
+          <w:bCs/>
+        </w:rPr>
+        <w:t xml:space="preserve">Sign up</w:t>
+      </w:r>
+      <w:r>
+        <w:t xml:space="preserve"> </w:t>
+      </w:r>
+      <w:r>
+        <w:t xml:space="preserve">สมัครด้วยบัญชี Google, GitHub หรืออีเมล (บัญชีฟรี ไม่ต้องใช้บัตรเครดิต)</w:t>
+      </w:r>
+      <w:r>
+        <w:t xml:space="preserve"> </w:t>
+      </w:r>
+      <w:r>
+        <w:t xml:space="preserve">  2. หลังเข้าสู่ระบบ คลิกที่รูปโปรไฟล์ (มุมขวาบน) แล้วเลือก</w:t>
+      </w:r>
+      <w:r>
+        <w:t xml:space="preserve"> </w:t>
+      </w:r>
+      <w:r>
+        <w:rPr>
+          <w:b/>
+          <w:bCs/>
+        </w:rPr>
+        <w:t xml:space="preserve">Settings</w:t>
+      </w:r>
+      <w:r>
+        <w:t xml:space="preserve"> </w:t>
+      </w:r>
+      <w:r>
+        <w:t xml:space="preserve">หรือเข้าโดยตรงที่</w:t>
+      </w:r>
+      <w:r>
+        <w:t xml:space="preserve"> </w:t>
+      </w:r>
+      <w:hyperlink r:id="rId35">
+        <w:r>
+          <w:rPr>
+            <w:rStyle w:val="Hyperlink"/>
+          </w:rPr>
+          <w:t xml:space="preserve">app.roboflow.com/settings/api</w:t>
+        </w:r>
+      </w:hyperlink>
+      <w:r>
+        <w:t xml:space="preserve"> </w:t>
+      </w:r>
+      <w:r>
+        <w:t xml:space="preserve">  3. ในหน้า Settings เลื่อนไปที่หัวข้อ</w:t>
+      </w:r>
+      <w:r>
+        <w:t xml:space="preserve"> </w:t>
+      </w:r>
+      <w:r>
+        <w:rPr>
+          <w:b/>
+          <w:bCs/>
+        </w:rPr>
+        <w:t xml:space="preserve">API Key</w:t>
+      </w:r>
+      <w:r>
+        <w:t xml:space="preserve"> </w:t>
+      </w:r>
+      <w:r>
+        <w:t xml:space="preserve">กดปุ่ม</w:t>
+      </w:r>
+      <w:r>
+        <w:t xml:space="preserve"> </w:t>
+      </w:r>
+      <w:r>
+        <w:rPr>
+          <w:b/>
+          <w:bCs/>
+        </w:rPr>
+        <w:t xml:space="preserve">Copy</w:t>
+      </w:r>
+      <w:r>
+        <w:t xml:space="preserve"> </w:t>
+      </w:r>
+      <w:r>
+        <w:t xml:space="preserve">เพื่อคัดลอก Key (เป็นตัวอักษรและตัวเลขปนกัน ประมาณ 30–40 หลัก)</w:t>
+      </w:r>
+      <w:r>
+        <w:t xml:space="preserve"> </w:t>
+      </w:r>
+      <w:r>
+        <w:t xml:space="preserve">  4. นำ Key ไปวางแทน</w:t>
+      </w:r>
+      <w:r>
+        <w:t xml:space="preserve"> </w:t>
+      </w:r>
+      <w:r>
+        <w:rPr>
+          <w:rStyle w:val="VerbatimChar"/>
+        </w:rPr>
+        <w:t xml:space="preserve">YOUR_API_KEY</w:t>
+      </w:r>
+      <w:r>
+        <w:t xml:space="preserve"> </w:t>
+      </w:r>
+      <w:r>
+        <w:t xml:space="preserve">ในโค้ดด้านล่าง</w:t>
+      </w:r>
+    </w:p>
     <w:p>
       <w:pPr>
         <w:pStyle w:val="BlockText"/>
       </w:pPr>
+      <w:r>
+        <w:rPr>
+          <w:b/>
+          <w:bCs/>
+        </w:rPr>
+        <w:t xml:space="preserve">คำเตือน:</w:t>
+      </w:r>
+      <w:r>
+        <w:t xml:space="preserve"> </w:t>
+      </w:r>
+      <w:r>
+        <w:t xml:space="preserve">API Key เป็นความลับส่วนตัว ห้ามแชร์หรือเผลอ commit ขึ้น Git สาธารณะ สำหรับ Google Colab แนะนำให้เก็บ Key ไว้ใน</w:t>
+      </w:r>
+      <w:r>
+        <w:t xml:space="preserve"> </w:t>
+      </w:r>
+      <w:r>
+        <w:rPr>
+          <w:b/>
+          <w:bCs/>
+        </w:rPr>
+        <w:t xml:space="preserve">Secrets</w:t>
+      </w:r>
+      <w:r>
+        <w:t xml:space="preserve"> </w:t>
+      </w:r>
+      <w:r>
+        <w:t xml:space="preserve">(ปุ่มรูปกุญแจที่แถบซ้ายของ Colab) แล้วเรียกใช้ด้วยโค้ดต่อไปนี้แทนการพิมพ์ Key ลงใน Notebook โดยตรง:</w:t>
+      </w:r>
+      <w:r>
+        <w:t xml:space="preserve"> </w:t>
+      </w:r>
+      <w:r>
+        <w:t xml:space="preserve">&gt;</w:t>
+      </w:r>
+      <w:r>
+        <w:t xml:space="preserve"> </w:t>
+      </w:r>
       <w:r>
         <w:rPr>
           <w:b/>
@@ -3381,8 +3565,33 @@
         <w:t xml:space="preserve">พื้นที่นี้เว้นว่างไว้สำหรับอาจารย์/นักศึกษาใส่รหัสต้นฉบับด้วยตนเอง</w:t>
       </w:r>
     </w:p>
-    <w:bookmarkEnd w:id="34"/>
-    <w:bookmarkStart w:id="35" w:name="การฝกโมเดล-yolo"/>
+    <w:p>
+      <w:pPr>
+        <w:pStyle w:val="BlockText"/>
+      </w:pPr>
+      <w:r>
+        <w:rPr>
+          <w:b/>
+          <w:bCs/>
+        </w:rPr>
+        <w:t xml:space="preserve">【เว้นว่างสำหรับโค้ด — กรุณาใส่รหัสต้นฉบับที่นี่】</w:t>
+      </w:r>
+    </w:p>
+    <w:p>
+      <w:pPr>
+        <w:pStyle w:val="BlockText"/>
+      </w:pPr>
+      <w:r>
+        <w:rPr>
+          <w:i/>
+          <w:iCs/>
+        </w:rPr>
+        <w:t xml:space="preserve">พื้นที่นี้เว้นว่างไว้สำหรับอาจารย์/นักศึกษาใส่รหัสต้นฉบับด้วยตนเอง</w:t>
+      </w:r>
+    </w:p>
+    <w:bookmarkEnd w:id="36"/>
+    <w:bookmarkEnd w:id="37"/>
+    <w:bookmarkStart w:id="38" w:name="การฝกโมเดล-yolo"/>
     <w:p>
       <w:pPr>
         <w:pStyle w:val="Heading4"/>
@@ -3570,9 +3779,9 @@
         </w:pict>
       </w:r>
     </w:p>
-    <w:bookmarkEnd w:id="35"/>
-    <w:bookmarkEnd w:id="36"/>
-    <w:bookmarkStart w:id="39" w:name="Xa1033ff2dfc4c8e0025ccf54542dd5483544f33"/>
+    <w:bookmarkEnd w:id="38"/>
+    <w:bookmarkEnd w:id="39"/>
+    <w:bookmarkStart w:id="42" w:name="Xa1033ff2dfc4c8e0025ccf54542dd5483544f33"/>
     <w:p>
       <w:pPr>
         <w:pStyle w:val="Heading3"/>
@@ -3616,7 +3825,7 @@
         <w:t xml:space="preserve">เพื่อเตรียมโฟลเดอร์และติดตั้งไลบรารีให้พร้อม ก่อนเริ่มทดลองระบบจริง</w:t>
       </w:r>
     </w:p>
-    <w:bookmarkStart w:id="37" w:name="โครงสรางไฟลของระบบ-project-structure"/>
+    <w:bookmarkStart w:id="40" w:name="โครงสรางไฟลของระบบ-project-structure"/>
     <w:p>
       <w:pPr>
         <w:pStyle w:val="Heading4"/>
@@ -3691,8 +3900,8 @@
         <w:t xml:space="preserve">ภาคผนวก ค. โครงสร้างระบบไฟล์ของโปรเจกต์ปัจจุบัน</w:t>
       </w:r>
     </w:p>
-    <w:bookmarkEnd w:id="37"/>
-    <w:bookmarkStart w:id="38" w:name="การสรางสภาพแวดลอมและตดตง-dependencies"/>
+    <w:bookmarkEnd w:id="40"/>
+    <w:bookmarkStart w:id="41" w:name="การสรางสภาพแวดลอมและตดตง-dependencies"/>
     <w:p>
       <w:pPr>
         <w:pStyle w:val="Heading4"/>
@@ -3882,9 +4091,9 @@
         </w:pict>
       </w:r>
     </w:p>
-    <w:bookmarkEnd w:id="38"/>
-    <w:bookmarkEnd w:id="39"/>
-    <w:bookmarkStart w:id="40" w:name="Xbf1d4c9122d4256082807cda5fd24d58966ce29"/>
+    <w:bookmarkEnd w:id="41"/>
+    <w:bookmarkEnd w:id="42"/>
+    <w:bookmarkStart w:id="43" w:name="Xbf1d4c9122d4256082807cda5fd24d58966ce29"/>
     <w:p>
       <w:pPr>
         <w:pStyle w:val="Heading3"/>
@@ -4202,8 +4411,8 @@
         </w:pict>
       </w:r>
     </w:p>
-    <w:bookmarkEnd w:id="40"/>
-    <w:bookmarkStart w:id="45" w:name="X82b33351889b45c0fd0b0826b076290339e5ff3"/>
+    <w:bookmarkEnd w:id="43"/>
+    <w:bookmarkStart w:id="48" w:name="X82b33351889b45c0fd0b0826b076290339e5ff3"/>
     <w:p>
       <w:pPr>
         <w:pStyle w:val="Heading3"/>
@@ -4222,7 +4431,7 @@
         <w:t xml:space="preserve">  กระบวนการอ่านตัวเลขมี 4 ขั้นตอน — แต่ละขั้นตอนแก้ปัญหาคนละแบบ ต่อกันเป็นท่อส่งข้อมูล:</w:t>
       </w:r>
     </w:p>
-    <w:bookmarkStart w:id="41" w:name="X75de373fdef90ef2f7ca58fe460bb48bb960914"/>
+    <w:bookmarkStart w:id="44" w:name="X75de373fdef90ef2f7ca58fe460bb48bb960914"/>
     <w:p>
       <w:pPr>
         <w:pStyle w:val="Heading4"/>
@@ -4498,8 +4707,8 @@
         </w:pict>
       </w:r>
     </w:p>
-    <w:bookmarkEnd w:id="41"/>
-    <w:bookmarkStart w:id="42" w:name="X8b657423d9fd46e1d56cdd877164ab2ddc637d0"/>
+    <w:bookmarkEnd w:id="44"/>
+    <w:bookmarkStart w:id="45" w:name="X8b657423d9fd46e1d56cdd877164ab2ddc637d0"/>
     <w:p>
       <w:pPr>
         <w:pStyle w:val="Heading4"/>
@@ -5404,8 +5613,8 @@
         </w:pict>
       </w:r>
     </w:p>
-    <w:bookmarkEnd w:id="42"/>
-    <w:bookmarkStart w:id="43" w:name="X04bb57397b5e004e4b65b3a91b9d0ac211ab257"/>
+    <w:bookmarkEnd w:id="45"/>
+    <w:bookmarkStart w:id="46" w:name="X04bb57397b5e004e4b65b3a91b9d0ac211ab257"/>
     <w:p>
       <w:pPr>
         <w:pStyle w:val="Heading4"/>
@@ -5755,8 +5964,8 @@
         </w:pict>
       </w:r>
     </w:p>
-    <w:bookmarkEnd w:id="43"/>
-    <w:bookmarkStart w:id="44" w:name="X8fbd443c53684801498e3792e37df46fdd6a39d"/>
+    <w:bookmarkEnd w:id="46"/>
+    <w:bookmarkStart w:id="47" w:name="X8fbd443c53684801498e3792e37df46fdd6a39d"/>
     <w:p>
       <w:pPr>
         <w:pStyle w:val="Heading4"/>
@@ -6823,10 +7032,10 @@
         </w:pict>
       </w:r>
     </w:p>
-    <w:bookmarkEnd w:id="44"/>
-    <w:bookmarkEnd w:id="45"/>
-    <w:bookmarkEnd w:id="46"/>
-    <w:bookmarkStart w:id="65" w:name="X6c74b405d66cf4ac82c14fee1c2c88c61545f87"/>
+    <w:bookmarkEnd w:id="47"/>
+    <w:bookmarkEnd w:id="48"/>
+    <w:bookmarkEnd w:id="49"/>
+    <w:bookmarkStart w:id="68" w:name="X6c74b405d66cf4ac82c14fee1c2c88c61545f87"/>
     <w:p>
       <w:pPr>
         <w:pStyle w:val="Heading1"/>
@@ -6846,7 +7055,7 @@
         </w:pict>
       </w:r>
     </w:p>
-    <w:bookmarkStart w:id="49" w:name="X4c8f6ba0fdc83ac4da5563adb955c8877091ce1"/>
+    <w:bookmarkStart w:id="52" w:name="X4c8f6ba0fdc83ac4da5563adb955c8877091ce1"/>
     <w:p>
       <w:pPr>
         <w:pStyle w:val="Heading3"/>
@@ -6923,7 +7132,7 @@
         <w:t xml:space="preserve">พื้นที่นี้เว้นว่างไว้สำหรับอาจารย์/นักศึกษาใส่รหัสต้นฉบับด้วยตนเอง</w:t>
       </w:r>
     </w:p>
-    <w:bookmarkStart w:id="47" w:name="การตรวจจบภาพกลบหวแบบกระจกเงา-flip_guard"/>
+    <w:bookmarkStart w:id="50" w:name="การตรวจจบภาพกลบหวแบบกระจกเงา-flip_guard"/>
     <w:p>
       <w:pPr>
         <w:pStyle w:val="Heading4"/>
@@ -7319,8 +7528,8 @@
         </w:pict>
       </w:r>
     </w:p>
-    <w:bookmarkEnd w:id="47"/>
-    <w:bookmarkStart w:id="48" w:name="ฟงกชนประมวลผลหลก-read_meterrgb_img"/>
+    <w:bookmarkEnd w:id="50"/>
+    <w:bookmarkStart w:id="51" w:name="ฟงกชนประมวลผลหลก-read_meterrgb_img"/>
     <w:p>
       <w:pPr>
         <w:pStyle w:val="Heading4"/>
@@ -7671,9 +7880,9 @@
         </w:pict>
       </w:r>
     </w:p>
-    <w:bookmarkEnd w:id="48"/>
-    <w:bookmarkEnd w:id="49"/>
-    <w:bookmarkStart w:id="50" w:name="X8625538b6dce6d94fdf5f312ba320194936963a"/>
+    <w:bookmarkEnd w:id="51"/>
+    <w:bookmarkEnd w:id="52"/>
+    <w:bookmarkStart w:id="53" w:name="X8625538b6dce6d94fdf5f312ba320194936963a"/>
     <w:p>
       <w:pPr>
         <w:pStyle w:val="Heading3"/>
@@ -8038,8 +8247,8 @@
         </w:pict>
       </w:r>
     </w:p>
-    <w:bookmarkEnd w:id="50"/>
-    <w:bookmarkStart w:id="51" w:name="X6191bd35aba173229039319086a3ee0702acb1a"/>
+    <w:bookmarkEnd w:id="53"/>
+    <w:bookmarkStart w:id="54" w:name="X6191bd35aba173229039319086a3ee0702acb1a"/>
     <w:p>
       <w:pPr>
         <w:pStyle w:val="Heading3"/>
@@ -8344,8 +8553,8 @@
         </w:pict>
       </w:r>
     </w:p>
-    <w:bookmarkEnd w:id="51"/>
-    <w:bookmarkStart w:id="54" w:name="X37b2d76fefb82c0bbc341bb126523ad01b19730"/>
+    <w:bookmarkEnd w:id="54"/>
+    <w:bookmarkStart w:id="57" w:name="X37b2d76fefb82c0bbc341bb126523ad01b19730"/>
     <w:p>
       <w:pPr>
         <w:pStyle w:val="Heading3"/>
@@ -8354,7 +8563,7 @@
         <w:t xml:space="preserve">2.4 การรัน ทดสอบ และคู่มือแก้ปัญหา (Testing &amp; Troubleshooting)</w:t>
       </w:r>
     </w:p>
-    <w:bookmarkStart w:id="52" w:name="วธการรนระบบดวย-uv"/>
+    <w:bookmarkStart w:id="55" w:name="วธการรนระบบดวย-uv"/>
     <w:p>
       <w:pPr>
         <w:pStyle w:val="Heading4"/>
@@ -8577,8 +8786,8 @@
         </w:pict>
       </w:r>
     </w:p>
-    <w:bookmarkEnd w:id="52"/>
-    <w:bookmarkStart w:id="53" w:name="X5934ac85f6b7698029ef8880a5d19921fd50fb5"/>
+    <w:bookmarkEnd w:id="55"/>
+    <w:bookmarkStart w:id="56" w:name="X5934ac85f6b7698029ef8880a5d19921fd50fb5"/>
     <w:p>
       <w:pPr>
         <w:pStyle w:val="Heading4"/>
@@ -9222,9 +9431,9 @@
         </w:pict>
       </w:r>
     </w:p>
-    <w:bookmarkEnd w:id="53"/>
-    <w:bookmarkEnd w:id="54"/>
-    <w:bookmarkStart w:id="55" w:name="Xe2814f11c0656bf3096b3d12bfd5df144cc9928"/>
+    <w:bookmarkEnd w:id="56"/>
+    <w:bookmarkEnd w:id="57"/>
+    <w:bookmarkStart w:id="58" w:name="Xe2814f11c0656bf3096b3d12bfd5df144cc9928"/>
     <w:p>
       <w:pPr>
         <w:pStyle w:val="Heading3"/>
@@ -9374,8 +9583,8 @@
         </w:pict>
       </w:r>
     </w:p>
-    <w:bookmarkEnd w:id="55"/>
-    <w:bookmarkStart w:id="59" w:name="อภธานศพท-glossary"/>
+    <w:bookmarkEnd w:id="58"/>
+    <w:bookmarkStart w:id="62" w:name="อภธานศพท-glossary"/>
     <w:p>
       <w:pPr>
         <w:pStyle w:val="Heading2"/>
@@ -9394,7 +9603,7 @@
         <w:t xml:space="preserve">  รวบรวมคำศัพท์ภาษาอังกฤษทางเทคนิคทั้งหมดที่ปรากฏในคู่มือฉบับนี้ พร้อมคำอธิบายที่เข้าใจง่าย:</w:t>
       </w:r>
     </w:p>
-    <w:bookmarkStart w:id="56" w:name="Xc106ca6e8d421dbb65dd36219ab8d132784d73d"/>
+    <w:bookmarkStart w:id="59" w:name="Xc106ca6e8d421dbb65dd36219ab8d132784d73d"/>
     <w:p>
       <w:pPr>
         <w:pStyle w:val="Heading3"/>
@@ -9901,8 +10110,8 @@
         <w:t xml:space="preserve">การจำแนกประเภทภาพตามคำอธิบายข้อความโดยไม่ต้องฝึกฝนโมเดลด้วยภาพตัวอย่างนั้นมาก่อน</w:t>
       </w:r>
     </w:p>
-    <w:bookmarkEnd w:id="56"/>
-    <w:bookmarkStart w:id="57" w:name="Xe97ad5f0adabf13e32404d1781e6a7cee75df2b"/>
+    <w:bookmarkEnd w:id="59"/>
+    <w:bookmarkStart w:id="60" w:name="Xe97ad5f0adabf13e32404d1781e6a7cee75df2b"/>
     <w:p>
       <w:pPr>
         <w:pStyle w:val="Heading3"/>
@@ -10379,8 +10588,8 @@
         <w:t xml:space="preserve">การคำนวณระยะกว้างเทียบกับระยะสูงเพื่อแยกแยะระหว่างแถวแนวนอนและคอลัมน์แนวตั้ง</w:t>
       </w:r>
     </w:p>
-    <w:bookmarkEnd w:id="57"/>
-    <w:bookmarkStart w:id="58" w:name="Xec6df598acc03b0ed69806dea1eb97883db1297"/>
+    <w:bookmarkEnd w:id="60"/>
+    <w:bookmarkStart w:id="61" w:name="Xec6df598acc03b0ed69806dea1eb97883db1297"/>
     <w:p>
       <w:pPr>
         <w:pStyle w:val="Heading3"/>
@@ -10723,9 +10932,9 @@
         </w:pict>
       </w:r>
     </w:p>
-    <w:bookmarkEnd w:id="58"/>
-    <w:bookmarkEnd w:id="59"/>
-    <w:bookmarkStart w:id="60" w:name="บรรณานกรมและเอกสารอางอง-references"/>
+    <w:bookmarkEnd w:id="61"/>
+    <w:bookmarkEnd w:id="62"/>
+    <w:bookmarkStart w:id="63" w:name="บรรณานกรมและเอกสารอางอง-references"/>
     <w:p>
       <w:pPr>
         <w:pStyle w:val="Heading2"/>
@@ -11099,8 +11308,8 @@
         </w:pict>
       </w:r>
     </w:p>
-    <w:bookmarkEnd w:id="60"/>
-    <w:bookmarkStart w:id="64" w:name="X22a27a332e537e0634807276ca2350d6fcd1c2b"/>
+    <w:bookmarkEnd w:id="63"/>
+    <w:bookmarkStart w:id="67" w:name="X22a27a332e537e0634807276ca2350d6fcd1c2b"/>
     <w:p>
       <w:pPr>
         <w:pStyle w:val="Heading2"/>
@@ -11119,7 +11328,7 @@
         <w:t xml:space="preserve">  ภาคผนวกนี้สรุปมาตรการด้านความปลอดภัยและความเสถียรที่พึงดำเนินการเมื่อนำระบบอ่านค่ามาตรวัดน้ำไปใช้งานในสภาพแวดล้อมจริง โดยมีวัตถุประสงค์เพื่อป้องกันความเสี่ยงจากการรับข้อมูลที่ไม่พึงประสงค์ รักษาความลับของระบบ และทำให้การให้บริการมีความต่อเนื่อง ตรวจสอบได้ และกู้คืนได้</w:t>
       </w:r>
     </w:p>
-    <w:bookmarkStart w:id="61" w:name="Xd0a0f09d98d6727a4066344ce2bf42fe46fdad0"/>
+    <w:bookmarkStart w:id="64" w:name="Xd0a0f09d98d6727a4066344ce2bf42fe46fdad0"/>
     <w:p>
       <w:pPr>
         <w:pStyle w:val="Heading3"/>
@@ -11483,8 +11692,8 @@
         <w:t xml:space="preserve">fastapi</w:t>
       </w:r>
     </w:p>
-    <w:bookmarkEnd w:id="61"/>
-    <w:bookmarkStart w:id="62" w:name="Xbd02c70816efe69f911715cf27dcee005bd5a81"/>
+    <w:bookmarkEnd w:id="64"/>
+    <w:bookmarkStart w:id="65" w:name="Xbd02c70816efe69f911715cf27dcee005bd5a81"/>
     <w:p>
       <w:pPr>
         <w:pStyle w:val="Heading3"/>
@@ -12218,8 +12427,8 @@
         <w:t xml:space="preserve">  การดำเนินการตามมาตรการข้างต้นอย่างครบถ้วนจะช่วยให้ระบบสามารถให้บริการได้อย่างปลอดภัย มีเสถียรภาพ และตรวจสอบได้ในสภาพแวดล้อมการใช้งานจริง</w:t>
       </w:r>
     </w:p>
-    <w:bookmarkEnd w:id="62"/>
-    <w:bookmarkStart w:id="63" w:name="X4c6dd3384288aad8cc7c4ed38c476fc5b7b13cb"/>
+    <w:bookmarkEnd w:id="65"/>
+    <w:bookmarkStart w:id="66" w:name="X4c6dd3384288aad8cc7c4ed38c476fc5b7b13cb"/>
     <w:p>
       <w:pPr>
         <w:pStyle w:val="Heading3"/>
@@ -12284,9 +12493,9 @@
         <w:t xml:space="preserve">พื้นที่นี้เว้นว่างไว้สำหรับอาจารย์/นักศึกษาใส่รหัสต้นฉบับด้วยตนเอง — คงโครงสร้างและคำอธิบายไว้ครบถ้วน</w:t>
       </w:r>
     </w:p>
-    <w:bookmarkEnd w:id="63"/>
-    <w:bookmarkEnd w:id="64"/>
-    <w:bookmarkEnd w:id="65"/>
+    <w:bookmarkEnd w:id="66"/>
+    <w:bookmarkEnd w:id="67"/>
+    <w:bookmarkEnd w:id="68"/>
     <w:sectPr>
       <w:pgSz w:code="9" w:h="16840" w:w="11907"/>
       <w:pgMar w:bottom="1418" w:footer="720" w:gutter="0" w:header="720" w:left="1985" w:right="1418" w:top="1985"/>

</xml_diff>

<commit_message>
docs: Pipeline not long line — 4:3 compact 3-row layout for A4
- Change mermaid from single chain to 3 subgraphs (Row1: Input->SigLIP2->Preprocessing, Row2: YOLO->Filtering->Vertical, Row3: Red->Remap->Safety->Output) with B->B1 branch, not long vertical/horizontal
- Keep 4:3 for A4, fallback text unchanged
</commit_message>
<xml_diff>
--- a/RE.docx
+++ b/RE.docx
@@ -7,7 +7,6 @@
         <w:spacing w:before="160" w:after="320" w:line="240" w:lineRule="auto"/>
         <w:jc w:val="center"/>
         <w:rPr>
-          <w:rFonts w:hint="cs"/>
           <w:cs/>
         </w:rPr>
       </w:pPr>
@@ -555,9 +554,6 @@
         <w:spacing w:after="0" w:line="240" w:lineRule="auto"/>
         <w:ind w:firstLine="720"/>
         <w:jc w:val="thaiDistribute"/>
-        <w:rPr>
-          <w:rFonts w:hint="cs"/>
-        </w:rPr>
       </w:pPr>
       <w:r>
         <w:rPr>
@@ -2201,7 +2197,6 @@
       <w:pPr>
         <w:pStyle w:val="NoSpacing"/>
         <w:rPr>
-          <w:rFonts w:hint="cs"/>
           <w:cs/>
         </w:rPr>
         <w:sectPr>
@@ -12578,7 +12573,6 @@
     <w:pPr>
       <w:pStyle w:val="Header"/>
       <w:rPr>
-        <w:rFonts w:hint="cs"/>
         <w:cs/>
       </w:rPr>
     </w:pPr>
@@ -12877,6 +12871,268 @@
     </w:lvl>
   </w:abstractNum>
   <w:abstractNum w15:restartNumberingAfterBreak="0" w:abstractNumId="3">
+    <w:nsid w:val="408D155B"/>
+    <w:multiLevelType w:val="multilevel"/>
+    <w:tmpl w:val="15AE1C84"/>
+    <w:lvl w:ilvl="0">
+      <w:start w:val="1"/>
+      <w:numFmt w:val="bullet"/>
+      <w:lvlText w:val=""/>
+      <w:lvlJc w:val="left"/>
+      <w:pPr>
+        <w:tabs>
+          <w:tab w:pos="720" w:val="num"/>
+        </w:tabs>
+        <w:ind w:hanging="360" w:left="720"/>
+      </w:pPr>
+      <w:rPr>
+        <w:rFonts w:ascii="Symbol" w:hAnsi="Symbol" w:hint="default"/>
+        <w:sz w:val="20"/>
+      </w:rPr>
+    </w:lvl>
+    <w:lvl w:ilvl="1" w:tentative="1">
+      <w:start w:val="1"/>
+      <w:numFmt w:val="bullet"/>
+      <w:lvlText w:val="o"/>
+      <w:lvlJc w:val="left"/>
+      <w:pPr>
+        <w:tabs>
+          <w:tab w:pos="1440" w:val="num"/>
+        </w:tabs>
+        <w:ind w:hanging="360" w:left="1440"/>
+      </w:pPr>
+      <w:rPr>
+        <w:rFonts w:ascii="Courier New" w:hAnsi="Courier New" w:hint="default"/>
+        <w:sz w:val="20"/>
+      </w:rPr>
+    </w:lvl>
+    <w:lvl w:ilvl="2" w:tentative="1">
+      <w:start w:val="1"/>
+      <w:numFmt w:val="bullet"/>
+      <w:lvlText w:val=""/>
+      <w:lvlJc w:val="left"/>
+      <w:pPr>
+        <w:tabs>
+          <w:tab w:pos="2160" w:val="num"/>
+        </w:tabs>
+        <w:ind w:hanging="360" w:left="2160"/>
+      </w:pPr>
+      <w:rPr>
+        <w:rFonts w:ascii="Wingdings" w:hAnsi="Wingdings" w:hint="default"/>
+        <w:sz w:val="20"/>
+      </w:rPr>
+    </w:lvl>
+    <w:lvl w:ilvl="3" w:tentative="1">
+      <w:start w:val="1"/>
+      <w:numFmt w:val="bullet"/>
+      <w:lvlText w:val=""/>
+      <w:lvlJc w:val="left"/>
+      <w:pPr>
+        <w:tabs>
+          <w:tab w:pos="2880" w:val="num"/>
+        </w:tabs>
+        <w:ind w:hanging="360" w:left="2880"/>
+      </w:pPr>
+      <w:rPr>
+        <w:rFonts w:ascii="Wingdings" w:hAnsi="Wingdings" w:hint="default"/>
+        <w:sz w:val="20"/>
+      </w:rPr>
+    </w:lvl>
+    <w:lvl w:ilvl="4" w:tentative="1">
+      <w:start w:val="1"/>
+      <w:numFmt w:val="bullet"/>
+      <w:lvlText w:val=""/>
+      <w:lvlJc w:val="left"/>
+      <w:pPr>
+        <w:tabs>
+          <w:tab w:pos="3600" w:val="num"/>
+        </w:tabs>
+        <w:ind w:hanging="360" w:left="3600"/>
+      </w:pPr>
+      <w:rPr>
+        <w:rFonts w:ascii="Wingdings" w:hAnsi="Wingdings" w:hint="default"/>
+        <w:sz w:val="20"/>
+      </w:rPr>
+    </w:lvl>
+    <w:lvl w:ilvl="5" w:tentative="1">
+      <w:start w:val="1"/>
+      <w:numFmt w:val="bullet"/>
+      <w:lvlText w:val=""/>
+      <w:lvlJc w:val="left"/>
+      <w:pPr>
+        <w:tabs>
+          <w:tab w:pos="4320" w:val="num"/>
+        </w:tabs>
+        <w:ind w:hanging="360" w:left="4320"/>
+      </w:pPr>
+      <w:rPr>
+        <w:rFonts w:ascii="Wingdings" w:hAnsi="Wingdings" w:hint="default"/>
+        <w:sz w:val="20"/>
+      </w:rPr>
+    </w:lvl>
+    <w:lvl w:ilvl="6" w:tentative="1">
+      <w:start w:val="1"/>
+      <w:numFmt w:val="bullet"/>
+      <w:lvlText w:val=""/>
+      <w:lvlJc w:val="left"/>
+      <w:pPr>
+        <w:tabs>
+          <w:tab w:pos="5040" w:val="num"/>
+        </w:tabs>
+        <w:ind w:hanging="360" w:left="5040"/>
+      </w:pPr>
+      <w:rPr>
+        <w:rFonts w:ascii="Wingdings" w:hAnsi="Wingdings" w:hint="default"/>
+        <w:sz w:val="20"/>
+      </w:rPr>
+    </w:lvl>
+    <w:lvl w:ilvl="7" w:tentative="1">
+      <w:start w:val="1"/>
+      <w:numFmt w:val="bullet"/>
+      <w:lvlText w:val=""/>
+      <w:lvlJc w:val="left"/>
+      <w:pPr>
+        <w:tabs>
+          <w:tab w:pos="5760" w:val="num"/>
+        </w:tabs>
+        <w:ind w:hanging="360" w:left="5760"/>
+      </w:pPr>
+      <w:rPr>
+        <w:rFonts w:ascii="Wingdings" w:hAnsi="Wingdings" w:hint="default"/>
+        <w:sz w:val="20"/>
+      </w:rPr>
+    </w:lvl>
+    <w:lvl w:ilvl="8" w:tentative="1">
+      <w:start w:val="1"/>
+      <w:numFmt w:val="bullet"/>
+      <w:lvlText w:val=""/>
+      <w:lvlJc w:val="left"/>
+      <w:pPr>
+        <w:tabs>
+          <w:tab w:pos="6480" w:val="num"/>
+        </w:tabs>
+        <w:ind w:hanging="360" w:left="6480"/>
+      </w:pPr>
+      <w:rPr>
+        <w:rFonts w:ascii="Wingdings" w:hAnsi="Wingdings" w:hint="default"/>
+        <w:sz w:val="20"/>
+      </w:rPr>
+    </w:lvl>
+  </w:abstractNum>
+  <w:abstractNum w15:restartNumberingAfterBreak="0" w:abstractNumId="4">
+    <w:nsid w:val="70606344"/>
+    <w:multiLevelType w:val="multilevel"/>
+    <w:tmpl w:val="DE16A702"/>
+    <w:lvl w:ilvl="0">
+      <w:start w:val="1"/>
+      <w:numFmt w:val="decimal"/>
+      <w:lvlText w:val="%1."/>
+      <w:lvlJc w:val="left"/>
+      <w:pPr>
+        <w:tabs>
+          <w:tab w:pos="720" w:val="num"/>
+        </w:tabs>
+        <w:ind w:hanging="360" w:left="720"/>
+      </w:pPr>
+    </w:lvl>
+    <w:lvl w:ilvl="1" w:tentative="1">
+      <w:start w:val="1"/>
+      <w:numFmt w:val="decimal"/>
+      <w:lvlText w:val="%2."/>
+      <w:lvlJc w:val="left"/>
+      <w:pPr>
+        <w:tabs>
+          <w:tab w:pos="1440" w:val="num"/>
+        </w:tabs>
+        <w:ind w:hanging="360" w:left="1440"/>
+      </w:pPr>
+    </w:lvl>
+    <w:lvl w:ilvl="2" w:tentative="1">
+      <w:start w:val="1"/>
+      <w:numFmt w:val="decimal"/>
+      <w:lvlText w:val="%3."/>
+      <w:lvlJc w:val="left"/>
+      <w:pPr>
+        <w:tabs>
+          <w:tab w:pos="2160" w:val="num"/>
+        </w:tabs>
+        <w:ind w:hanging="360" w:left="2160"/>
+      </w:pPr>
+    </w:lvl>
+    <w:lvl w:ilvl="3" w:tentative="1">
+      <w:start w:val="1"/>
+      <w:numFmt w:val="decimal"/>
+      <w:lvlText w:val="%4."/>
+      <w:lvlJc w:val="left"/>
+      <w:pPr>
+        <w:tabs>
+          <w:tab w:pos="2880" w:val="num"/>
+        </w:tabs>
+        <w:ind w:hanging="360" w:left="2880"/>
+      </w:pPr>
+    </w:lvl>
+    <w:lvl w:ilvl="4" w:tentative="1">
+      <w:start w:val="1"/>
+      <w:numFmt w:val="decimal"/>
+      <w:lvlText w:val="%5."/>
+      <w:lvlJc w:val="left"/>
+      <w:pPr>
+        <w:tabs>
+          <w:tab w:pos="3600" w:val="num"/>
+        </w:tabs>
+        <w:ind w:hanging="360" w:left="3600"/>
+      </w:pPr>
+    </w:lvl>
+    <w:lvl w:ilvl="5" w:tentative="1">
+      <w:start w:val="1"/>
+      <w:numFmt w:val="decimal"/>
+      <w:lvlText w:val="%6."/>
+      <w:lvlJc w:val="left"/>
+      <w:pPr>
+        <w:tabs>
+          <w:tab w:pos="4320" w:val="num"/>
+        </w:tabs>
+        <w:ind w:hanging="360" w:left="4320"/>
+      </w:pPr>
+    </w:lvl>
+    <w:lvl w:ilvl="6" w:tentative="1">
+      <w:start w:val="1"/>
+      <w:numFmt w:val="decimal"/>
+      <w:lvlText w:val="%7."/>
+      <w:lvlJc w:val="left"/>
+      <w:pPr>
+        <w:tabs>
+          <w:tab w:pos="5040" w:val="num"/>
+        </w:tabs>
+        <w:ind w:hanging="360" w:left="5040"/>
+      </w:pPr>
+    </w:lvl>
+    <w:lvl w:ilvl="7" w:tentative="1">
+      <w:start w:val="1"/>
+      <w:numFmt w:val="decimal"/>
+      <w:lvlText w:val="%8."/>
+      <w:lvlJc w:val="left"/>
+      <w:pPr>
+        <w:tabs>
+          <w:tab w:pos="5760" w:val="num"/>
+        </w:tabs>
+        <w:ind w:hanging="360" w:left="5760"/>
+      </w:pPr>
+    </w:lvl>
+    <w:lvl w:ilvl="8" w:tentative="1">
+      <w:start w:val="1"/>
+      <w:numFmt w:val="decimal"/>
+      <w:lvlText w:val="%9."/>
+      <w:lvlJc w:val="left"/>
+      <w:pPr>
+        <w:tabs>
+          <w:tab w:pos="6480" w:val="num"/>
+        </w:tabs>
+        <w:ind w:hanging="360" w:left="6480"/>
+      </w:pPr>
+    </w:lvl>
+  </w:abstractNum>
+  <w:abstractNum w15:restartNumberingAfterBreak="0" w:abstractNumId="5">
     <w:nsid w:val="74702CC5"/>
     <w:multiLevelType w:val="hybridMultilevel"/>
     <w:tmpl w:val="9FA6191C"/>
@@ -12965,7 +13221,7 @@
       </w:pPr>
     </w:lvl>
   </w:abstractNum>
-  <w:abstractNum w15:restartNumberingAfterBreak="0" w:abstractNumId="4">
+  <w:abstractNum w15:restartNumberingAfterBreak="0" w:abstractNumId="6">
     <w:nsid w:val="74F64276"/>
     <w:multiLevelType w:val="multilevel"/>
     <w:tmpl w:val="BA2007D4"/>
@@ -13078,7 +13334,7 @@
       </w:rPr>
     </w:lvl>
   </w:abstractNum>
-  <w:abstractNum w15:restartNumberingAfterBreak="0" w:abstractNumId="5">
+  <w:abstractNum w15:restartNumberingAfterBreak="0" w:abstractNumId="7">
     <w:nsid w:val="783F5857"/>
     <w:multiLevelType w:val="hybridMultilevel"/>
     <w:tmpl w:val="B61E427A"/>
@@ -13435,19 +13691,25 @@
     <w:abstractNumId w:val="2"/>
   </w:num>
   <w:num w16cid:durableId="1620062631" w:numId="2">
-    <w:abstractNumId w:val="4"/>
+    <w:abstractNumId w:val="6"/>
   </w:num>
   <w:num w16cid:durableId="1699042416" w:numId="3">
     <w:abstractNumId w:val="0"/>
   </w:num>
   <w:num w16cid:durableId="1115446428" w:numId="4">
-    <w:abstractNumId w:val="3"/>
+    <w:abstractNumId w:val="5"/>
   </w:num>
   <w:num w16cid:durableId="1306082360" w:numId="5">
-    <w:abstractNumId w:val="5"/>
+    <w:abstractNumId w:val="7"/>
   </w:num>
   <w:num w16cid:durableId="1290090757" w:numId="6">
     <w:abstractNumId w:val="1"/>
+  </w:num>
+  <w:num w16cid:durableId="1300110274" w:numId="7">
+    <w:abstractNumId w:val="4"/>
+  </w:num>
+  <w:num w16cid:durableId="813521378" w:numId="8">
+    <w:abstractNumId w:val="3"/>
   </w:num>
   <w:num w:numId="1000">
     <w:abstractNumId w:val="990"/>

</xml_diff>

<commit_message>
docs: formalize headings & remove all 'คุณ' and emojis (keep Step-by-Step)
- Headings: keep structure (42), remove emojis, change blockquote titles WHY/WHAT/HOW to หลักการและเหตุผล/ภาพรวม/หลักการทำงาน
- Replace remaining 'คุณ' outside code with ผู้อ่าน/ผู้ศึกษา (e.g. เมื่อจบส่วนนี้ ผู้อ่านควรเข้าใจ)
- Keep Step-by-Step format as is (strong point)
- RE.docx rebuilt (placeholder, Tab+ThaiDist, cover/preface)
</commit_message>
<xml_diff>
--- a/RE.docx
+++ b/RE.docx
@@ -1749,7 +1749,7 @@
         <w:pStyle w:val="Compact"/>
         <w:numPr>
           <w:ilvl w:val="0"/>
-          <w:numId w:val="1013"/>
+          <w:numId w:val="1002"/>
         </w:numPr>
         <w:jc w:val="thaiDistribute"/>
         <w:ind w:firstLine="720"/>
@@ -1788,7 +1788,7 @@
         <w:pStyle w:val="Compact"/>
         <w:numPr>
           <w:ilvl w:val="0"/>
-          <w:numId w:val="1013"/>
+          <w:numId w:val="1002"/>
         </w:numPr>
         <w:jc w:val="thaiDistribute"/>
         <w:ind w:firstLine="720"/>
@@ -1858,7 +1858,7 @@
         <w:pStyle w:val="Compact"/>
         <w:numPr>
           <w:ilvl w:val="0"/>
-          <w:numId w:val="1013"/>
+          <w:numId w:val="1002"/>
         </w:numPr>
         <w:jc w:val="thaiDistribute"/>
         <w:ind w:firstLine="720"/>
@@ -1906,7 +1906,7 @@
         <w:pStyle w:val="Compact"/>
         <w:numPr>
           <w:ilvl w:val="0"/>
-          <w:numId w:val="1013"/>
+          <w:numId w:val="1002"/>
         </w:numPr>
         <w:jc w:val="thaiDistribute"/>
         <w:ind w:firstLine="720"/>
@@ -1930,7 +1930,7 @@
         <w:pStyle w:val="Compact"/>
         <w:numPr>
           <w:ilvl w:val="0"/>
-          <w:numId w:val="1013"/>
+          <w:numId w:val="1002"/>
         </w:numPr>
         <w:jc w:val="thaiDistribute"/>
         <w:ind w:firstLine="720"/>
@@ -2001,17 +2001,7 @@
         <w:ind w:firstLine="720"/>
       </w:pPr>
       <w:r>
-        <w:rPr>
-          <w:b/>
-          <w:bCs/>
-        </w:rPr>
-        <w:t xml:space="preserve">💡 เคล็ดลับการเรียนรู้:</w:t>
-      </w:r>
-      <w:r>
-        <w:t xml:space="preserve"> </w:t>
-      </w:r>
-      <w:r>
-        <w:t xml:space="preserve">ลองรันระบบจริงด้วยโมเดลสำเร็จรูปก่อนอ่านโค้ดทั้งหมด เปิด Terminal 2 หน้าต่าง — หน้าต่างที่ 1 รัน</w:t>
+        <w:t xml:space="preserve">** เคล็ดลับการเรียนรู้:** ทดทดลองรันระบบจริงด้วยโมเดลสำเร็จรูปก่อนอ่านโค้ดทั้งหมด เปิด Terminal 2 หน้าต่าง — หน้าต่างที่ 1 รัน</w:t>
       </w:r>
       <w:r>
         <w:t xml:space="preserve"> </w:t>
@@ -2041,7 +2031,7 @@
         <w:t xml:space="preserve"> </w:t>
       </w:r>
       <w:r>
-        <w:t xml:space="preserve">แล้วเปิดเบราว์เซอร์ที่ http://127.0.0.1:7860 คุณจะเห็นภาพรวมก่อนลงรายละเอียด</w:t>
+        <w:t xml:space="preserve">แล้วเปิดเบราว์เซอร์ที่ http://127.0.0.1:7860 ผู้ศึกษาจะเห็นภาพรวมก่อนลงรายละเอียด</w:t>
       </w:r>
     </w:p>
     <w:p>
@@ -2103,7 +2093,7 @@
         <w:t xml:space="preserve">ปัญหาจริงที่ระบบนี้แก้ (The Real-world Problem):</w:t>
       </w:r>
       <w:r>
-        <w:br/>
+        <w:t xml:space="preserve"> </w:t>
       </w:r>
       <w:r>
         <w:t xml:space="preserve">ภาพมิเตอร์น้ำจากหน้างานไม่สวยเหมือนในห้องแลป มักเจอ 4 อย่างนี้:</w:t>
@@ -2270,7 +2260,7 @@
         <w:ind w:firstLine="720"/>
       </w:pPr>
       <w:r>
-        <w:t xml:space="preserve">เมื่อจบส่วนนี้ คุณควรเข้าใจว่าแต่ละเทคโนโลยีช่วยแก้ปัญหาไหน</w:t>
+        <w:t xml:space="preserve">เมื่อจบส่วนนี้ ผู้อ่านควรเข้าใจว่าแต่ละเทคโนโลยีช่วยแก้ปัญหาไหน</w:t>
       </w:r>
     </w:p>
     <w:p>
@@ -2321,7 +2311,7 @@
         <w:ind w:firstLine="720"/>
       </w:pPr>
       <w:r>
-        <w:t xml:space="preserve">📄 ดูเวอร์ชันข้อความ (fallback)</w:t>
+        <w:t xml:space="preserve">ดูเวอร์ชันข้อความ (fallback)</w:t>
       </w:r>
     </w:p>
     <w:p>
@@ -2427,7 +2417,7 @@
         <w:pStyle w:val="Compact"/>
         <w:numPr>
           <w:ilvl w:val="0"/>
-          <w:numId w:val="1014"/>
+          <w:numId w:val="1003"/>
         </w:numPr>
         <w:jc w:val="thaiDistribute"/>
         <w:ind w:firstLine="720"/>
@@ -2481,7 +2471,7 @@
         <w:pStyle w:val="Compact"/>
         <w:numPr>
           <w:ilvl w:val="0"/>
-          <w:numId w:val="1014"/>
+          <w:numId w:val="1003"/>
         </w:numPr>
         <w:jc w:val="thaiDistribute"/>
         <w:ind w:firstLine="720"/>
@@ -2505,7 +2495,7 @@
         <w:pStyle w:val="Compact"/>
         <w:numPr>
           <w:ilvl w:val="0"/>
-          <w:numId w:val="1014"/>
+          <w:numId w:val="1003"/>
         </w:numPr>
         <w:jc w:val="thaiDistribute"/>
         <w:ind w:firstLine="720"/>
@@ -2531,7 +2521,7 @@
         <w:ind w:firstLine="720"/>
       </w:pPr>
       <w:r>
-        <w:t xml:space="preserve">เมื่อจบหัวข้อนี้ คุณจะเข้าใจว่า YOLO มีหน้าที่ “ตีกรอบและบอกว่าแต่ละกรอบคือเลขอะไร”</w:t>
+        <w:t xml:space="preserve">เมื่อจบหัวข้อนี้ ผู้อ่านจะเข้าใจว่า YOLO มีหน้าที่ “ตีกรอบและบอกว่าแต่ละกรอบคือเลขอะไร”</w:t>
       </w:r>
     </w:p>
     <w:bookmarkEnd w:id="33"/>
@@ -2575,7 +2565,7 @@
         <w:pStyle w:val="Compact"/>
         <w:numPr>
           <w:ilvl w:val="0"/>
-          <w:numId w:val="1015"/>
+          <w:numId w:val="1004"/>
         </w:numPr>
         <w:jc w:val="thaiDistribute"/>
         <w:ind w:firstLine="720"/>
@@ -2671,7 +2661,7 @@
         <w:pStyle w:val="Compact"/>
         <w:numPr>
           <w:ilvl w:val="0"/>
-          <w:numId w:val="1016"/>
+          <w:numId w:val="1005"/>
         </w:numPr>
         <w:jc w:val="thaiDistribute"/>
         <w:ind w:firstLine="720"/>
@@ -2695,7 +2685,7 @@
         <w:pStyle w:val="Compact"/>
         <w:numPr>
           <w:ilvl w:val="0"/>
-          <w:numId w:val="1016"/>
+          <w:numId w:val="1005"/>
         </w:numPr>
         <w:jc w:val="thaiDistribute"/>
         <w:ind w:firstLine="720"/>
@@ -2721,11 +2711,7 @@
         <w:ind w:firstLine="720"/>
       </w:pPr>
       <w:r>
-        <w:rPr>
-          <w:b/>
-          <w:bCs/>
-        </w:rPr>
-        <w:t xml:space="preserve">📌 สรุปความเข้าใจส่วนที่ 1.1:</w:t>
+        <w:t xml:space="preserve">** สรุปความเข้าใจส่วนที่ 1.1:**</w:t>
       </w:r>
       <w:r>
         <w:t xml:space="preserve"> </w:t>
@@ -2781,14 +2767,10 @@
         <w:t xml:space="preserve"> </w:t>
       </w:r>
       <w:r>
-        <w:rPr>
-          <w:b/>
-          <w:bCs/>
-        </w:rPr>
-        <w:t xml:space="preserve">⚡ ข้ามส่วนนี้ได้ทันที — มีโมเดลพร้อมใช้งานแล้ว:</w:t>
-      </w:r>
-      <w:r>
-        <w:br/>
+        <w:t xml:space="preserve">** ข้ามส่วนนี้ได้ทันที — มีโมเดลพร้อมใช้งานแล้ว:**</w:t>
+      </w:r>
+      <w:r>
+        <w:t xml:space="preserve"> </w:t>
       </w:r>
       <w:r>
         <w:t xml:space="preserve">โปรเจกต์มีไฟล์</w:t>
@@ -2806,7 +2788,7 @@
         <w:t xml:space="preserve"> </w:t>
       </w:r>
       <w:r>
-        <w:t xml:space="preserve">ที่ฝึกเสร็จแล้วให้ลองรันได้เลย คุณไม่ต้องเทรนใหม่ก่อนเริ่มเรียน ข้ามไปหัวข้อ 1.3 ได้ทันที ส่วนนี้มีไว้สำหรับคนที่อยากเข้าใจหรืออยากฝึกโมเดลของตัวเองต่อ</w:t>
+        <w:t xml:space="preserve">ที่ฝึกเสร็จแล้วให้ลองรันได้เลย ผู้ศึกษาไม่ต้องฝึกแบบจำลองใหม่ก่อนเริ่มเรียน ข้ามไปหัวข้อ 1.3 ได้ทันที ส่วนนี้มีไว้สำหรับคนที่อยากเข้าใจหรืออยากฝึกโมเดลของตัวเองต่อ</w:t>
       </w:r>
     </w:p>
     <w:p>
@@ -3322,7 +3304,7 @@
           <w:b/>
           <w:bCs/>
         </w:rPr>
-        <w:t xml:space="preserve">ทำไมต้องทำ (WHY)?:</w:t>
+        <w:t xml:space="preserve">หลักการและเหตุผล:</w:t>
       </w:r>
       <w:r>
         <w:t xml:space="preserve"> </w:t>
@@ -3619,7 +3601,7 @@
           <w:b/>
           <w:bCs/>
         </w:rPr>
-        <w:t xml:space="preserve">ทำไมต้องทำ (WHY)?:</w:t>
+        <w:t xml:space="preserve">หลักการและเหตุผล:</w:t>
       </w:r>
       <w:r>
         <w:t xml:space="preserve"> </w:t>
@@ -3645,7 +3627,7 @@
         <w:t xml:space="preserve">แนวคิดการทำงาน:</w:t>
       </w:r>
       <w:r>
-        <w:br/>
+        <w:t xml:space="preserve"> </w:t>
       </w:r>
       <w:r>
         <w:t xml:space="preserve">ให้</w:t>
@@ -3951,7 +3933,7 @@
         <w:pStyle w:val="Compact"/>
         <w:numPr>
           <w:ilvl w:val="0"/>
-          <w:numId w:val="1017"/>
+          <w:numId w:val="1006"/>
         </w:numPr>
         <w:jc w:val="thaiDistribute"/>
         <w:ind w:firstLine="720"/>
@@ -3975,7 +3957,7 @@
         <w:pStyle w:val="Compact"/>
         <w:numPr>
           <w:ilvl w:val="0"/>
-          <w:numId w:val="1017"/>
+          <w:numId w:val="1006"/>
         </w:numPr>
         <w:jc w:val="thaiDistribute"/>
         <w:ind w:firstLine="720"/>
@@ -3999,7 +3981,7 @@
         <w:pStyle w:val="Compact"/>
         <w:numPr>
           <w:ilvl w:val="0"/>
-          <w:numId w:val="1017"/>
+          <w:numId w:val="1006"/>
         </w:numPr>
         <w:jc w:val="thaiDistribute"/>
         <w:ind w:firstLine="720"/>
@@ -4258,7 +4240,7 @@
         <w:t xml:space="preserve">ทำไมต้องแปลงพิกัดย้อนกลับ? (WHY):</w:t>
       </w:r>
       <w:r>
-        <w:br/>
+        <w:t xml:space="preserve"> </w:t>
       </w:r>
       <w:r>
         <w:t xml:space="preserve">โปรดพิจารณาสถานการณ์ที่ผู้อ่านเอียงศีรษะ 90 องศาเพื่ออ่านหนังสือ แล้วใช้ปากกาเน้นข้อความ — เมื่อกลับมาตั้งศีรษะตรง รอยเน้นข้อความจะอยู่ผิดตำแหน่ง</w:t>
@@ -4279,7 +4261,7 @@
         <w:pStyle w:val="Compact"/>
         <w:numPr>
           <w:ilvl w:val="0"/>
-          <w:numId w:val="1018"/>
+          <w:numId w:val="1007"/>
         </w:numPr>
         <w:jc w:val="thaiDistribute"/>
         <w:ind w:firstLine="720"/>
@@ -4293,7 +4275,7 @@
         <w:pStyle w:val="Compact"/>
         <w:numPr>
           <w:ilvl w:val="0"/>
-          <w:numId w:val="1018"/>
+          <w:numId w:val="1007"/>
         </w:numPr>
         <w:jc w:val="thaiDistribute"/>
         <w:ind w:firstLine="720"/>
@@ -4332,7 +4314,7 @@
         <w:pStyle w:val="Compact"/>
         <w:numPr>
           <w:ilvl w:val="0"/>
-          <w:numId w:val="1018"/>
+          <w:numId w:val="1007"/>
         </w:numPr>
         <w:jc w:val="thaiDistribute"/>
         <w:ind w:firstLine="720"/>
@@ -4412,7 +4394,7 @@
         <w:ind w:firstLine="720"/>
       </w:pPr>
       <w:r>
-        <w:t xml:space="preserve">📄 ดูเวอร์ชันข้อความ</w:t>
+        <w:t xml:space="preserve">ดูเวอร์ชันข้อความ</w:t>
       </w:r>
     </w:p>
     <w:p>
@@ -4482,7 +4464,7 @@
         <w:pStyle w:val="Compact"/>
         <w:numPr>
           <w:ilvl w:val="0"/>
-          <w:numId w:val="1019"/>
+          <w:numId w:val="1008"/>
         </w:numPr>
         <w:jc w:val="thaiDistribute"/>
         <w:ind w:firstLine="720"/>
@@ -4585,7 +4567,7 @@
         <w:pStyle w:val="Compact"/>
         <w:numPr>
           <w:ilvl w:val="0"/>
-          <w:numId w:val="1019"/>
+          <w:numId w:val="1008"/>
         </w:numPr>
         <w:jc w:val="thaiDistribute"/>
         <w:ind w:firstLine="720"/>
@@ -4697,7 +4679,7 @@
         <w:pStyle w:val="Compact"/>
         <w:numPr>
           <w:ilvl w:val="0"/>
-          <w:numId w:val="1019"/>
+          <w:numId w:val="1008"/>
         </w:numPr>
         <w:jc w:val="thaiDistribute"/>
         <w:ind w:firstLine="720"/>
@@ -5143,7 +5125,7 @@
         <w:pStyle w:val="Compact"/>
         <w:numPr>
           <w:ilvl w:val="0"/>
-          <w:numId w:val="1020"/>
+          <w:numId w:val="1009"/>
         </w:numPr>
         <w:jc w:val="thaiDistribute"/>
         <w:ind w:firstLine="720"/>
@@ -5183,7 +5165,7 @@
         <w:pStyle w:val="Compact"/>
         <w:numPr>
           <w:ilvl w:val="0"/>
-          <w:numId w:val="1020"/>
+          <w:numId w:val="1009"/>
         </w:numPr>
         <w:jc w:val="thaiDistribute"/>
         <w:ind w:firstLine="720"/>
@@ -5223,7 +5205,7 @@
         <w:pStyle w:val="Compact"/>
         <w:numPr>
           <w:ilvl w:val="0"/>
-          <w:numId w:val="1020"/>
+          <w:numId w:val="1009"/>
         </w:numPr>
         <w:jc w:val="thaiDistribute"/>
         <w:ind w:firstLine="720"/>
@@ -5506,7 +5488,7 @@
         <w:t xml:space="preserve">ทำความเข้าใจปัญหาก่อนเริ่มเขียนโค้ด (The Problem):</w:t>
       </w:r>
       <w:r>
-        <w:br/>
+        <w:t xml:space="preserve"> </w:t>
       </w:r>
       <w:r>
         <w:t xml:space="preserve">ภาพจากผู้ใช้มีความไม่แน่นอนสูง:</w:t>
@@ -5562,7 +5544,7 @@
         <w:t xml:space="preserve">แนวคิดการแก้ปัญหา (Solution Idea):</w:t>
       </w:r>
       <w:r>
-        <w:br/>
+        <w:t xml:space="preserve"> </w:t>
       </w:r>
       <w:r>
         <w:t xml:space="preserve">แทนที่จะเดา ให้ลอง</w:t>
@@ -5615,7 +5597,7 @@
         <w:ind w:firstLine="720"/>
       </w:pPr>
       <w:r>
-        <w:t xml:space="preserve">📄 ดูเวอร์ชันข้อความ</w:t>
+        <w:t xml:space="preserve">ดูเวอร์ชันข้อความ</w:t>
       </w:r>
     </w:p>
     <w:p>
@@ -5675,7 +5657,7 @@
         <w:pStyle w:val="Compact"/>
         <w:numPr>
           <w:ilvl w:val="0"/>
-          <w:numId w:val="1021"/>
+          <w:numId w:val="1010"/>
         </w:numPr>
         <w:jc w:val="thaiDistribute"/>
         <w:ind w:firstLine="720"/>
@@ -5699,7 +5681,7 @@
         <w:pStyle w:val="Compact"/>
         <w:numPr>
           <w:ilvl w:val="0"/>
-          <w:numId w:val="1021"/>
+          <w:numId w:val="1010"/>
         </w:numPr>
         <w:jc w:val="thaiDistribute"/>
         <w:ind w:firstLine="720"/>
@@ -5723,7 +5705,7 @@
         <w:pStyle w:val="Compact"/>
         <w:numPr>
           <w:ilvl w:val="0"/>
-          <w:numId w:val="1021"/>
+          <w:numId w:val="1010"/>
         </w:numPr>
         <w:jc w:val="thaiDistribute"/>
         <w:ind w:firstLine="720"/>
@@ -5747,7 +5729,7 @@
         <w:pStyle w:val="Compact"/>
         <w:numPr>
           <w:ilvl w:val="0"/>
-          <w:numId w:val="1021"/>
+          <w:numId w:val="1010"/>
         </w:numPr>
         <w:jc w:val="thaiDistribute"/>
         <w:ind w:firstLine="720"/>
@@ -5771,7 +5753,7 @@
         <w:pStyle w:val="Compact"/>
         <w:numPr>
           <w:ilvl w:val="0"/>
-          <w:numId w:val="1021"/>
+          <w:numId w:val="1010"/>
         </w:numPr>
         <w:jc w:val="thaiDistribute"/>
         <w:ind w:firstLine="720"/>
@@ -5795,7 +5777,7 @@
         <w:pStyle w:val="Compact"/>
         <w:numPr>
           <w:ilvl w:val="0"/>
-          <w:numId w:val="1021"/>
+          <w:numId w:val="1010"/>
         </w:numPr>
         <w:jc w:val="thaiDistribute"/>
         <w:ind w:firstLine="720"/>
@@ -5819,7 +5801,7 @@
         <w:pStyle w:val="Compact"/>
         <w:numPr>
           <w:ilvl w:val="0"/>
-          <w:numId w:val="1021"/>
+          <w:numId w:val="1010"/>
         </w:numPr>
         <w:jc w:val="thaiDistribute"/>
         <w:ind w:firstLine="720"/>
@@ -5843,7 +5825,7 @@
         <w:pStyle w:val="Compact"/>
         <w:numPr>
           <w:ilvl w:val="0"/>
-          <w:numId w:val="1021"/>
+          <w:numId w:val="1010"/>
         </w:numPr>
         <w:jc w:val="thaiDistribute"/>
         <w:ind w:firstLine="720"/>
@@ -5867,7 +5849,7 @@
         <w:pStyle w:val="Compact"/>
         <w:numPr>
           <w:ilvl w:val="0"/>
-          <w:numId w:val="1021"/>
+          <w:numId w:val="1010"/>
         </w:numPr>
         <w:jc w:val="thaiDistribute"/>
         <w:ind w:firstLine="720"/>
@@ -5908,7 +5890,7 @@
         <w:pStyle w:val="Compact"/>
         <w:numPr>
           <w:ilvl w:val="0"/>
-          <w:numId w:val="1022"/>
+          <w:numId w:val="1011"/>
         </w:numPr>
         <w:jc w:val="thaiDistribute"/>
         <w:ind w:firstLine="720"/>
@@ -5934,70 +5916,6 @@
           <w:bCs/>
         </w:rPr>
         <w:t xml:space="preserve">— ตรวจสีแดงของหลักทศนิยม:</w:t>
-      </w:r>
-    </w:p>
-    <w:p>
-      <w:pPr>
-        <w:pStyle w:val="Compact"/>
-        <w:numPr>
-          <w:ilvl w:val="1"/>
-          <w:numId w:val="1023"/>
-        </w:numPr>
-        <w:jc w:val="thaiDistribute"/>
-        <w:ind w:firstLine="720"/>
-      </w:pPr>
-      <w:r>
-        <w:rPr>
-          <w:b/>
-          <w:bCs/>
-        </w:rPr>
-        <w:t xml:space="preserve">แก้ปัญหาอะไร:</w:t>
-      </w:r>
-      <w:r>
-        <w:t xml:space="preserve"> </w:t>
-      </w:r>
-      <w:r>
-        <w:t xml:space="preserve">รู้ว่าภาพกลับหัวหรือไม่ — มิเตอร์น้ำจริงมีเลขทศนิยม</w:t>
-      </w:r>
-      <w:r>
-        <w:t xml:space="preserve"> </w:t>
-      </w:r>
-      <w:r>
-        <w:rPr>
-          <w:b/>
-          <w:bCs/>
-        </w:rPr>
-        <w:t xml:space="preserve">สีแดงอยู่ขวาสุด</w:t>
-      </w:r>
-      <w:r>
-        <w:t xml:space="preserve"> </w:t>
-      </w:r>
-      <w:r>
-        <w:t xml:space="preserve">เสมอ ถ้าแดงไปอยู่ซ้ายสุด แสดงว่าภาพน่าจะกลับหัว</w:t>
-      </w:r>
-    </w:p>
-    <w:p>
-      <w:pPr>
-        <w:pStyle w:val="Compact"/>
-        <w:numPr>
-          <w:ilvl w:val="1"/>
-          <w:numId w:val="1023"/>
-        </w:numPr>
-        <w:jc w:val="thaiDistribute"/>
-        <w:ind w:firstLine="720"/>
-      </w:pPr>
-      <w:r>
-        <w:rPr>
-          <w:b/>
-          <w:bCs/>
-        </w:rPr>
-        <w:t xml:space="preserve">ทำอย่างไร:</w:t>
-      </w:r>
-      <w:r>
-        <w:t xml:space="preserve"> </w:t>
-      </w:r>
-      <w:r>
-        <w:t xml:space="preserve">ครอปเฉพาะในกรอบ แปลงเป็น HSV แล้วนับสัดส่วนพิกเซลสีแดง</w:t>
       </w:r>
     </w:p>
     <w:p>
@@ -6005,40 +5923,47 @@
         <w:pStyle w:val="Compact"/>
         <w:numPr>
           <w:ilvl w:val="0"/>
-          <w:numId w:val="1022"/>
+          <w:numId w:val="1012"/>
         </w:numPr>
         <w:jc w:val="thaiDistribute"/>
         <w:ind w:firstLine="720"/>
       </w:pPr>
       <w:r>
         <w:rPr>
-          <w:rStyle w:val="VerbatimChar"/>
-          <w:b/>
-          <w:bCs/>
-        </w:rPr>
-        <w:t xml:space="preserve">eval_orientation(bgr_img, angle, prep)</w:t>
-      </w:r>
-      <w:r>
-        <w:rPr>
-          <w:b/>
-          <w:bCs/>
-        </w:rPr>
-        <w:t xml:space="preserve"> </w:t>
-      </w:r>
-      <w:r>
-        <w:rPr>
-          <w:b/>
-          <w:bCs/>
-        </w:rPr>
-        <w:t xml:space="preserve">— ให้คะแนนแต่ละผู้ท้าชิง:</w:t>
+          <w:b/>
+          <w:bCs/>
+        </w:rPr>
+        <w:t xml:space="preserve">แก้ปัญหาอะไร:</w:t>
+      </w:r>
+      <w:r>
+        <w:t xml:space="preserve"> </w:t>
+      </w:r>
+      <w:r>
+        <w:t xml:space="preserve">รู้ว่าภาพกลับหัวหรือไม่ — มิเตอร์น้ำจริงมีเลขทศนิยม</w:t>
+      </w:r>
+      <w:r>
+        <w:t xml:space="preserve"> </w:t>
+      </w:r>
+      <w:r>
+        <w:rPr>
+          <w:b/>
+          <w:bCs/>
+        </w:rPr>
+        <w:t xml:space="preserve">สีแดงอยู่ขวาสุด</w:t>
+      </w:r>
+      <w:r>
+        <w:t xml:space="preserve"> </w:t>
+      </w:r>
+      <w:r>
+        <w:t xml:space="preserve">เสมอ ถ้าแดงไปอยู่ซ้ายสุด แสดงว่าภาพน่าจะกลับหัว</w:t>
       </w:r>
     </w:p>
     <w:p>
       <w:pPr>
         <w:pStyle w:val="Compact"/>
         <w:numPr>
-          <w:ilvl w:val="1"/>
-          <w:numId w:val="1024"/>
+          <w:ilvl w:val="0"/>
+          <w:numId w:val="1012"/>
         </w:numPr>
         <w:jc w:val="thaiDistribute"/>
         <w:ind w:firstLine="720"/>
@@ -6048,21 +5973,78 @@
           <w:b/>
           <w:bCs/>
         </w:rPr>
-        <w:t xml:space="preserve">แก้ปัญหาอะไร:</w:t>
-      </w:r>
-      <w:r>
-        <w:t xml:space="preserve"> </w:t>
-      </w:r>
-      <w:r>
-        <w:t xml:space="preserve">ตัดสินว่า “มุม+แสง” ไหนน่าเชื่อถือสุด และกรองผลลวง — ต้องเป็นแนวนอนและมี 4–9 หลักถึงจะให้คะแนน</w:t>
+        <w:t xml:space="preserve">ทำอย่างไร:</w:t>
+      </w:r>
+      <w:r>
+        <w:t xml:space="preserve"> </w:t>
+      </w:r>
+      <w:r>
+        <w:t xml:space="preserve">ครอปเฉพาะในกรอบ แปลงเป็น HSV แล้วนับสัดส่วนพิกเซลสีแดง</w:t>
       </w:r>
     </w:p>
     <w:p>
       <w:pPr>
         <w:pStyle w:val="Compact"/>
         <w:numPr>
-          <w:ilvl w:val="1"/>
-          <w:numId w:val="1024"/>
+          <w:ilvl w:val="0"/>
+          <w:numId w:val="1013"/>
+        </w:numPr>
+        <w:jc w:val="thaiDistribute"/>
+        <w:ind w:firstLine="720"/>
+      </w:pPr>
+      <w:r>
+        <w:rPr>
+          <w:rStyle w:val="VerbatimChar"/>
+          <w:b/>
+          <w:bCs/>
+        </w:rPr>
+        <w:t xml:space="preserve">eval_orientation(bgr_img, angle, prep)</w:t>
+      </w:r>
+      <w:r>
+        <w:rPr>
+          <w:b/>
+          <w:bCs/>
+        </w:rPr>
+        <w:t xml:space="preserve"> </w:t>
+      </w:r>
+      <w:r>
+        <w:rPr>
+          <w:b/>
+          <w:bCs/>
+        </w:rPr>
+        <w:t xml:space="preserve">— ให้คะแนนแต่ละผู้ท้าชิง:</w:t>
+      </w:r>
+    </w:p>
+    <w:p>
+      <w:pPr>
+        <w:pStyle w:val="Compact"/>
+        <w:numPr>
+          <w:ilvl w:val="0"/>
+          <w:numId w:val="1014"/>
+        </w:numPr>
+        <w:jc w:val="thaiDistribute"/>
+        <w:ind w:firstLine="720"/>
+      </w:pPr>
+      <w:r>
+        <w:rPr>
+          <w:b/>
+          <w:bCs/>
+        </w:rPr>
+        <w:t xml:space="preserve">แก้ปัญหาอะไร:</w:t>
+      </w:r>
+      <w:r>
+        <w:t xml:space="preserve"> </w:t>
+      </w:r>
+      <w:r>
+        <w:t xml:space="preserve">ตัดสินว่า “มุม+แสง” ไหนน่าเชื่อถือสุด และกรองผลลวง — ต้องเป็นแนวนอนและมี 4–9 หลักถึงจะให้คะแนน</w:t>
+      </w:r>
+    </w:p>
+    <w:p>
+      <w:pPr>
+        <w:pStyle w:val="Compact"/>
+        <w:numPr>
+          <w:ilvl w:val="0"/>
+          <w:numId w:val="1014"/>
         </w:numPr>
         <w:jc w:val="thaiDistribute"/>
         <w:ind w:firstLine="720"/>
@@ -6139,7 +6121,7 @@
         <w:pStyle w:val="Compact"/>
         <w:numPr>
           <w:ilvl w:val="0"/>
-          <w:numId w:val="1022"/>
+          <w:numId w:val="1015"/>
         </w:numPr>
         <w:jc w:val="thaiDistribute"/>
         <w:ind w:firstLine="720"/>
@@ -6171,8 +6153,8 @@
       <w:pPr>
         <w:pStyle w:val="Compact"/>
         <w:numPr>
-          <w:ilvl w:val="1"/>
-          <w:numId w:val="1025"/>
+          <w:ilvl w:val="0"/>
+          <w:numId w:val="1016"/>
         </w:numPr>
         <w:jc w:val="thaiDistribute"/>
         <w:ind w:firstLine="720"/>
@@ -6195,8 +6177,8 @@
       <w:pPr>
         <w:pStyle w:val="Compact"/>
         <w:numPr>
-          <w:ilvl w:val="1"/>
-          <w:numId w:val="1025"/>
+          <w:ilvl w:val="0"/>
+          <w:numId w:val="1016"/>
         </w:numPr>
         <w:jc w:val="thaiDistribute"/>
         <w:ind w:firstLine="720"/>
@@ -6472,11 +6454,7 @@
         <w:ind w:firstLine="720"/>
       </w:pPr>
       <w:r>
-        <w:rPr>
-          <w:b/>
-          <w:bCs/>
-        </w:rPr>
-        <w:t xml:space="preserve">📌 สรุปความเข้าใจส่วนที่ 1.5:</w:t>
+        <w:t xml:space="preserve">** สรุปความเข้าใจส่วนที่ 1.5:**</w:t>
       </w:r>
       <w:r>
         <w:t xml:space="preserve"> </w:t>
@@ -6524,7 +6502,7 @@
         <w:t xml:space="preserve"> </w:t>
       </w:r>
       <w:r>
-        <w:t xml:space="preserve">* เมื่อจบส่วนนี้ คุณควรอธิบายได้ว่าทำไมต้องลอง 12 แบบ และคะแนนมาจากไหน</w:t>
+        <w:t xml:space="preserve">* เมื่อจบส่วนนี้ ผู้อ่านควรอธิบายได้ว่าทำไมต้องลอง 12 แบบ และคะแนนมาจากไหน</w:t>
       </w:r>
     </w:p>
     <w:p>
@@ -6611,7 +6589,7 @@
         <w:ind w:firstLine="720"/>
       </w:pPr>
       <w:r>
-        <w:t xml:space="preserve">📄 ดูเวอร์ชันข้อความ</w:t>
+        <w:t xml:space="preserve">ดูเวอร์ชันข้อความ</w:t>
       </w:r>
     </w:p>
     <w:p>
@@ -6661,7 +6639,7 @@
         <w:pStyle w:val="Compact"/>
         <w:numPr>
           <w:ilvl w:val="0"/>
-          <w:numId w:val="1026"/>
+          <w:numId w:val="1017"/>
         </w:numPr>
         <w:jc w:val="thaiDistribute"/>
         <w:ind w:firstLine="720"/>
@@ -6757,7 +6735,7 @@
         <w:pStyle w:val="Compact"/>
         <w:numPr>
           <w:ilvl w:val="0"/>
-          <w:numId w:val="1026"/>
+          <w:numId w:val="1017"/>
         </w:numPr>
         <w:jc w:val="thaiDistribute"/>
         <w:ind w:firstLine="720"/>
@@ -6796,7 +6774,7 @@
         <w:pStyle w:val="Compact"/>
         <w:numPr>
           <w:ilvl w:val="0"/>
-          <w:numId w:val="1026"/>
+          <w:numId w:val="1017"/>
         </w:numPr>
         <w:jc w:val="thaiDistribute"/>
         <w:ind w:firstLine="720"/>
@@ -7408,7 +7386,7 @@
           <w:b/>
           <w:bCs/>
         </w:rPr>
-        <w:t xml:space="preserve">ทำไมต้องทำ (WHY)?:</w:t>
+        <w:t xml:space="preserve">หลักการและเหตุผล:</w:t>
       </w:r>
       <w:r>
         <w:t xml:space="preserve"> </w:t>
@@ -7431,7 +7409,7 @@
           <w:b/>
           <w:bCs/>
         </w:rPr>
-        <w:t xml:space="preserve">คืออะไร (WHAT):</w:t>
+        <w:t xml:space="preserve">ภาพรวมของระบบ:</w:t>
       </w:r>
       <w:r>
         <w:t xml:space="preserve"> </w:t>
@@ -7463,7 +7441,7 @@
           <w:b/>
           <w:bCs/>
         </w:rPr>
-        <w:t xml:space="preserve">ทำอย่างไร (HOW) → ได้อะไร (RESULT):</w:t>
+        <w:t xml:space="preserve">หลักการทำงานของระบบ:</w:t>
       </w:r>
       <w:r>
         <w:t xml:space="preserve"> </w:t>
@@ -7774,7 +7752,7 @@
           <w:b/>
           <w:bCs/>
         </w:rPr>
-        <w:t xml:space="preserve">ทำไมต้องทำ (WHY)?:</w:t>
+        <w:t xml:space="preserve">หลักการและเหตุผล:</w:t>
       </w:r>
       <w:r>
         <w:t xml:space="preserve"> </w:t>
@@ -7797,7 +7775,7 @@
           <w:b/>
           <w:bCs/>
         </w:rPr>
-        <w:t xml:space="preserve">คืออะไร (WHAT):</w:t>
+        <w:t xml:space="preserve">ภาพรวมของระบบ:</w:t>
       </w:r>
       <w:r>
         <w:t xml:space="preserve"> </w:t>
@@ -7820,7 +7798,7 @@
           <w:b/>
           <w:bCs/>
         </w:rPr>
-        <w:t xml:space="preserve">ทำอย่างไร (HOW) → ได้อะไร (RESULT):</w:t>
+        <w:t xml:space="preserve">หลักการทำงานของระบบ:</w:t>
       </w:r>
       <w:r>
         <w:t xml:space="preserve"> </w:t>
@@ -8075,7 +8053,7 @@
         <w:pStyle w:val="Heading4"/>
       </w:pPr>
       <w:r>
-        <w:t xml:space="preserve">🚀 วิธีการรันระบบด้วย</w:t>
+        <w:t xml:space="preserve">วิธีการรันระบบด้วย</w:t>
       </w:r>
       <w:r>
         <w:t xml:space="preserve"> </w:t>
@@ -8091,7 +8069,7 @@
       <w:pPr>
         <w:numPr>
           <w:ilvl w:val="0"/>
-          <w:numId w:val="1027"/>
+          <w:numId w:val="1018"/>
         </w:numPr>
       </w:pPr>
       <w:r>
@@ -8178,7 +8156,7 @@
       <w:pPr>
         <w:numPr>
           <w:ilvl w:val="0"/>
-          <w:numId w:val="1027"/>
+          <w:numId w:val="1018"/>
         </w:numPr>
       </w:pPr>
       <w:r>
@@ -8299,7 +8277,7 @@
         <w:pStyle w:val="Heading4"/>
       </w:pPr>
       <w:r>
-        <w:t xml:space="preserve">🛠️ คู่มือวิเคราะห์และแก้ปัญหาเมื่อ AI อ่านผิด (Debugging Matrix)</w:t>
+        <w:t xml:space="preserve">คู่มือวิเคราะห์และแก้ปัญหาเมื่อ AI อ่านผิด (Debugging Matrix)</w:t>
       </w:r>
     </w:p>
     <w:p>
@@ -8642,7 +8620,7 @@
               <w:rPr>
                 <w:rStyle w:val="VerbatimChar"/>
               </w:rPr>
-              <w:t xml:space="preserve">⚠️ อาจกลับหัว</w:t>
+              <w:t xml:space="preserve">️ อาจกลับหัว</w:t>
             </w:r>
             <w:r>
               <w:t xml:space="preserve"> </w:t>
@@ -8963,7 +8941,7 @@
         <w:pStyle w:val="Compact"/>
         <w:numPr>
           <w:ilvl w:val="0"/>
-          <w:numId w:val="1028"/>
+          <w:numId w:val="1019"/>
         </w:numPr>
         <w:jc w:val="thaiDistribute"/>
         <w:ind w:firstLine="720"/>
@@ -8987,7 +8965,7 @@
         <w:pStyle w:val="Compact"/>
         <w:numPr>
           <w:ilvl w:val="0"/>
-          <w:numId w:val="1028"/>
+          <w:numId w:val="1019"/>
         </w:numPr>
         <w:jc w:val="thaiDistribute"/>
         <w:ind w:firstLine="720"/>
@@ -9011,7 +8989,7 @@
         <w:pStyle w:val="Compact"/>
         <w:numPr>
           <w:ilvl w:val="0"/>
-          <w:numId w:val="1028"/>
+          <w:numId w:val="1019"/>
         </w:numPr>
         <w:jc w:val="thaiDistribute"/>
         <w:ind w:firstLine="720"/>
@@ -9053,11 +9031,7 @@
         <w:ind w:firstLine="720"/>
       </w:pPr>
       <w:r>
-        <w:rPr>
-          <w:b/>
-          <w:bCs/>
-        </w:rPr>
-        <w:t xml:space="preserve">📌 สรุปความเข้าใจส่วนที่ 2:</w:t>
+        <w:t xml:space="preserve">** สรุปความเข้าใจส่วนที่ 2:**</w:t>
       </w:r>
       <w:r>
         <w:t xml:space="preserve"> </w:t>
@@ -9123,7 +9097,7 @@
         <w:pStyle w:val="Compact"/>
         <w:numPr>
           <w:ilvl w:val="0"/>
-          <w:numId w:val="1029"/>
+          <w:numId w:val="1020"/>
         </w:numPr>
         <w:jc w:val="thaiDistribute"/>
         <w:ind w:firstLine="720"/>
@@ -9147,7 +9121,7 @@
         <w:pStyle w:val="Compact"/>
         <w:numPr>
           <w:ilvl w:val="0"/>
-          <w:numId w:val="1029"/>
+          <w:numId w:val="1020"/>
         </w:numPr>
         <w:jc w:val="thaiDistribute"/>
         <w:ind w:firstLine="720"/>
@@ -9201,7 +9175,7 @@
         <w:pStyle w:val="Compact"/>
         <w:numPr>
           <w:ilvl w:val="0"/>
-          <w:numId w:val="1029"/>
+          <w:numId w:val="1020"/>
         </w:numPr>
         <w:jc w:val="thaiDistribute"/>
         <w:ind w:firstLine="720"/>
@@ -9217,7 +9191,7 @@
         <w:t xml:space="preserve"> </w:t>
       </w:r>
       <w:r>
-        <w:t xml:space="preserve">โครงข่ายประสาทเทียมแบบคอนโวลูชันที่ออกแบบมาเพื่อดึงคุณลักษณะและวิเคราะห์ภาพถ่าย</w:t>
+        <w:t xml:space="preserve">โครงข่ายประสาทเทียมแบบคอนโวลูชันที่ออกแบบมาเพื่อดึงผู้อ่านลักษณะและวิเคราะห์ภาพถ่าย</w:t>
       </w:r>
     </w:p>
     <w:p>
@@ -9225,7 +9199,7 @@
         <w:pStyle w:val="Compact"/>
         <w:numPr>
           <w:ilvl w:val="0"/>
-          <w:numId w:val="1029"/>
+          <w:numId w:val="1020"/>
         </w:numPr>
         <w:jc w:val="thaiDistribute"/>
         <w:ind w:firstLine="720"/>
@@ -9249,7 +9223,7 @@
         <w:pStyle w:val="Compact"/>
         <w:numPr>
           <w:ilvl w:val="0"/>
-          <w:numId w:val="1029"/>
+          <w:numId w:val="1020"/>
         </w:numPr>
         <w:jc w:val="thaiDistribute"/>
         <w:ind w:firstLine="720"/>
@@ -9273,7 +9247,7 @@
         <w:pStyle w:val="Compact"/>
         <w:numPr>
           <w:ilvl w:val="0"/>
-          <w:numId w:val="1029"/>
+          <w:numId w:val="1020"/>
         </w:numPr>
         <w:jc w:val="thaiDistribute"/>
         <w:ind w:firstLine="720"/>
@@ -9297,7 +9271,7 @@
         <w:pStyle w:val="Compact"/>
         <w:numPr>
           <w:ilvl w:val="0"/>
-          <w:numId w:val="1029"/>
+          <w:numId w:val="1020"/>
         </w:numPr>
         <w:jc w:val="thaiDistribute"/>
         <w:ind w:firstLine="720"/>
@@ -9321,7 +9295,7 @@
         <w:pStyle w:val="Compact"/>
         <w:numPr>
           <w:ilvl w:val="0"/>
-          <w:numId w:val="1029"/>
+          <w:numId w:val="1020"/>
         </w:numPr>
         <w:jc w:val="thaiDistribute"/>
         <w:ind w:firstLine="720"/>
@@ -9345,7 +9319,7 @@
         <w:pStyle w:val="Compact"/>
         <w:numPr>
           <w:ilvl w:val="0"/>
-          <w:numId w:val="1029"/>
+          <w:numId w:val="1020"/>
         </w:numPr>
         <w:jc w:val="thaiDistribute"/>
         <w:ind w:firstLine="720"/>
@@ -9369,7 +9343,7 @@
         <w:pStyle w:val="Compact"/>
         <w:numPr>
           <w:ilvl w:val="0"/>
-          <w:numId w:val="1029"/>
+          <w:numId w:val="1020"/>
         </w:numPr>
         <w:jc w:val="thaiDistribute"/>
         <w:ind w:firstLine="720"/>
@@ -9393,7 +9367,7 @@
         <w:pStyle w:val="Compact"/>
         <w:numPr>
           <w:ilvl w:val="0"/>
-          <w:numId w:val="1029"/>
+          <w:numId w:val="1020"/>
         </w:numPr>
         <w:jc w:val="thaiDistribute"/>
         <w:ind w:firstLine="720"/>
@@ -9417,7 +9391,7 @@
         <w:pStyle w:val="Compact"/>
         <w:numPr>
           <w:ilvl w:val="0"/>
-          <w:numId w:val="1029"/>
+          <w:numId w:val="1020"/>
         </w:numPr>
         <w:jc w:val="thaiDistribute"/>
         <w:ind w:firstLine="720"/>
@@ -9441,7 +9415,7 @@
         <w:pStyle w:val="Compact"/>
         <w:numPr>
           <w:ilvl w:val="0"/>
-          <w:numId w:val="1029"/>
+          <w:numId w:val="1020"/>
         </w:numPr>
         <w:jc w:val="thaiDistribute"/>
         <w:ind w:firstLine="720"/>
@@ -9465,7 +9439,7 @@
         <w:pStyle w:val="Compact"/>
         <w:numPr>
           <w:ilvl w:val="0"/>
-          <w:numId w:val="1029"/>
+          <w:numId w:val="1020"/>
         </w:numPr>
         <w:jc w:val="thaiDistribute"/>
         <w:ind w:firstLine="720"/>
@@ -9489,7 +9463,7 @@
         <w:pStyle w:val="Compact"/>
         <w:numPr>
           <w:ilvl w:val="0"/>
-          <w:numId w:val="1029"/>
+          <w:numId w:val="1020"/>
         </w:numPr>
         <w:jc w:val="thaiDistribute"/>
         <w:ind w:firstLine="720"/>
@@ -9513,7 +9487,7 @@
         <w:pStyle w:val="Compact"/>
         <w:numPr>
           <w:ilvl w:val="0"/>
-          <w:numId w:val="1029"/>
+          <w:numId w:val="1020"/>
         </w:numPr>
         <w:jc w:val="thaiDistribute"/>
         <w:ind w:firstLine="720"/>
@@ -9537,7 +9511,7 @@
         <w:pStyle w:val="Compact"/>
         <w:numPr>
           <w:ilvl w:val="0"/>
-          <w:numId w:val="1029"/>
+          <w:numId w:val="1020"/>
         </w:numPr>
         <w:jc w:val="thaiDistribute"/>
         <w:ind w:firstLine="720"/>
@@ -9573,7 +9547,7 @@
         <w:pStyle w:val="Compact"/>
         <w:numPr>
           <w:ilvl w:val="0"/>
-          <w:numId w:val="1029"/>
+          <w:numId w:val="1020"/>
         </w:numPr>
         <w:jc w:val="thaiDistribute"/>
         <w:ind w:firstLine="720"/>
@@ -9597,7 +9571,7 @@
         <w:pStyle w:val="Compact"/>
         <w:numPr>
           <w:ilvl w:val="0"/>
-          <w:numId w:val="1029"/>
+          <w:numId w:val="1020"/>
         </w:numPr>
         <w:jc w:val="thaiDistribute"/>
         <w:ind w:firstLine="720"/>
@@ -9631,7 +9605,7 @@
         <w:pStyle w:val="Compact"/>
         <w:numPr>
           <w:ilvl w:val="0"/>
-          <w:numId w:val="1030"/>
+          <w:numId w:val="1021"/>
         </w:numPr>
         <w:jc w:val="thaiDistribute"/>
         <w:ind w:firstLine="720"/>
@@ -9655,7 +9629,7 @@
         <w:pStyle w:val="Compact"/>
         <w:numPr>
           <w:ilvl w:val="0"/>
-          <w:numId w:val="1030"/>
+          <w:numId w:val="1021"/>
         </w:numPr>
         <w:jc w:val="thaiDistribute"/>
         <w:ind w:firstLine="720"/>
@@ -9666,102 +9640,6 @@
           <w:bCs/>
         </w:rPr>
         <w:t xml:space="preserve">Color Spaces (ระบบสี):</w:t>
-      </w:r>
-    </w:p>
-    <w:p>
-      <w:pPr>
-        <w:pStyle w:val="Compact"/>
-        <w:numPr>
-          <w:ilvl w:val="1"/>
-          <w:numId w:val="1031"/>
-        </w:numPr>
-        <w:jc w:val="thaiDistribute"/>
-        <w:ind w:firstLine="720"/>
-      </w:pPr>
-      <w:r>
-        <w:rPr>
-          <w:b/>
-          <w:bCs/>
-        </w:rPr>
-        <w:t xml:space="preserve">RGB / BGR:</w:t>
-      </w:r>
-      <w:r>
-        <w:t xml:space="preserve"> </w:t>
-      </w:r>
-      <w:r>
-        <w:t xml:space="preserve">แดง-เขียว-น้ำเงิน (OpenCV เรียงลำดับช่องสีเป็น BGR เป็นค่าเริ่มต้น)</w:t>
-      </w:r>
-    </w:p>
-    <w:p>
-      <w:pPr>
-        <w:pStyle w:val="Compact"/>
-        <w:numPr>
-          <w:ilvl w:val="1"/>
-          <w:numId w:val="1031"/>
-        </w:numPr>
-        <w:jc w:val="thaiDistribute"/>
-        <w:ind w:firstLine="720"/>
-      </w:pPr>
-      <w:r>
-        <w:rPr>
-          <w:b/>
-          <w:bCs/>
-        </w:rPr>
-        <w:t xml:space="preserve">LAB:</w:t>
-      </w:r>
-      <w:r>
-        <w:t xml:space="preserve"> </w:t>
-      </w:r>
-      <w:r>
-        <w:t xml:space="preserve">แยกช่องความสว่าง (L) ออกจากช่องสี (A, B) เหมาะสำหรับการปรับคอนทราสต์ด้วย CLAHE</w:t>
-      </w:r>
-    </w:p>
-    <w:p>
-      <w:pPr>
-        <w:pStyle w:val="Compact"/>
-        <w:numPr>
-          <w:ilvl w:val="1"/>
-          <w:numId w:val="1031"/>
-        </w:numPr>
-        <w:jc w:val="thaiDistribute"/>
-        <w:ind w:firstLine="720"/>
-      </w:pPr>
-      <w:r>
-        <w:rPr>
-          <w:b/>
-          <w:bCs/>
-        </w:rPr>
-        <w:t xml:space="preserve">YCrCb:</w:t>
-      </w:r>
-      <w:r>
-        <w:t xml:space="preserve"> </w:t>
-      </w:r>
-      <w:r>
-        <w:t xml:space="preserve">แยกช่องสัญญาณความสว่าง (Y) ออกจากช่องสัญญาณสี (Cr, Cb) เหมาะสำหรับการทำ Histogram Equalization</w:t>
-      </w:r>
-    </w:p>
-    <w:p>
-      <w:pPr>
-        <w:pStyle w:val="Compact"/>
-        <w:numPr>
-          <w:ilvl w:val="1"/>
-          <w:numId w:val="1031"/>
-        </w:numPr>
-        <w:jc w:val="thaiDistribute"/>
-        <w:ind w:firstLine="720"/>
-      </w:pPr>
-      <w:r>
-        <w:rPr>
-          <w:b/>
-          <w:bCs/>
-        </w:rPr>
-        <w:t xml:space="preserve">HSV:</w:t>
-      </w:r>
-      <w:r>
-        <w:t xml:space="preserve"> </w:t>
-      </w:r>
-      <w:r>
-        <w:t xml:space="preserve">ระบบสี Hue-Saturation-Value เหมาะสำหรับการตรวจจับเฉดสีเฉพาะ เช่น การตรวจหาสีแดงของหลักทศนิยม</w:t>
       </w:r>
     </w:p>
     <w:p>
@@ -9769,7 +9647,103 @@
         <w:pStyle w:val="Compact"/>
         <w:numPr>
           <w:ilvl w:val="0"/>
-          <w:numId w:val="1030"/>
+          <w:numId w:val="1021"/>
+        </w:numPr>
+        <w:jc w:val="thaiDistribute"/>
+        <w:ind w:firstLine="720"/>
+      </w:pPr>
+      <w:r>
+        <w:rPr>
+          <w:b/>
+          <w:bCs/>
+        </w:rPr>
+        <w:t xml:space="preserve">RGB / BGR:</w:t>
+      </w:r>
+      <w:r>
+        <w:t xml:space="preserve"> </w:t>
+      </w:r>
+      <w:r>
+        <w:t xml:space="preserve">แดง-เขียว-น้ำเงิน (OpenCV เรียงลำดับช่องสีเป็น BGR เป็นค่าเริ่มต้น)</w:t>
+      </w:r>
+    </w:p>
+    <w:p>
+      <w:pPr>
+        <w:pStyle w:val="Compact"/>
+        <w:numPr>
+          <w:ilvl w:val="0"/>
+          <w:numId w:val="1021"/>
+        </w:numPr>
+        <w:jc w:val="thaiDistribute"/>
+        <w:ind w:firstLine="720"/>
+      </w:pPr>
+      <w:r>
+        <w:rPr>
+          <w:b/>
+          <w:bCs/>
+        </w:rPr>
+        <w:t xml:space="preserve">LAB:</w:t>
+      </w:r>
+      <w:r>
+        <w:t xml:space="preserve"> </w:t>
+      </w:r>
+      <w:r>
+        <w:t xml:space="preserve">แยกช่องความสว่าง (L) ออกจากช่องสี (A, B) เหมาะสำหรับการปรับคอนทราสต์ด้วย CLAHE</w:t>
+      </w:r>
+    </w:p>
+    <w:p>
+      <w:pPr>
+        <w:pStyle w:val="Compact"/>
+        <w:numPr>
+          <w:ilvl w:val="0"/>
+          <w:numId w:val="1021"/>
+        </w:numPr>
+        <w:jc w:val="thaiDistribute"/>
+        <w:ind w:firstLine="720"/>
+      </w:pPr>
+      <w:r>
+        <w:rPr>
+          <w:b/>
+          <w:bCs/>
+        </w:rPr>
+        <w:t xml:space="preserve">YCrCb:</w:t>
+      </w:r>
+      <w:r>
+        <w:t xml:space="preserve"> </w:t>
+      </w:r>
+      <w:r>
+        <w:t xml:space="preserve">แยกช่องสัญญาณความสว่าง (Y) ออกจากช่องสัญญาณสี (Cr, Cb) เหมาะสำหรับการทำ Histogram Equalization</w:t>
+      </w:r>
+    </w:p>
+    <w:p>
+      <w:pPr>
+        <w:pStyle w:val="Compact"/>
+        <w:numPr>
+          <w:ilvl w:val="0"/>
+          <w:numId w:val="1021"/>
+        </w:numPr>
+        <w:jc w:val="thaiDistribute"/>
+        <w:ind w:firstLine="720"/>
+      </w:pPr>
+      <w:r>
+        <w:rPr>
+          <w:b/>
+          <w:bCs/>
+        </w:rPr>
+        <w:t xml:space="preserve">HSV:</w:t>
+      </w:r>
+      <w:r>
+        <w:t xml:space="preserve"> </w:t>
+      </w:r>
+      <w:r>
+        <w:t xml:space="preserve">ระบบสี Hue-Saturation-Value เหมาะสำหรับการตรวจจับเฉดสีเฉพาะ เช่น การตรวจหาสีแดงของหลักทศนิยม</w:t>
+      </w:r>
+    </w:p>
+    <w:p>
+      <w:pPr>
+        <w:pStyle w:val="Compact"/>
+        <w:numPr>
+          <w:ilvl w:val="0"/>
+          <w:numId w:val="1021"/>
         </w:numPr>
         <w:jc w:val="thaiDistribute"/>
         <w:ind w:firstLine="720"/>
@@ -9828,7 +9802,7 @@
         <w:pStyle w:val="Compact"/>
         <w:numPr>
           <w:ilvl w:val="0"/>
-          <w:numId w:val="1030"/>
+          <w:numId w:val="1021"/>
         </w:numPr>
         <w:jc w:val="thaiDistribute"/>
         <w:ind w:firstLine="720"/>
@@ -9852,7 +9826,7 @@
         <w:pStyle w:val="Compact"/>
         <w:numPr>
           <w:ilvl w:val="0"/>
-          <w:numId w:val="1030"/>
+          <w:numId w:val="1021"/>
         </w:numPr>
         <w:jc w:val="thaiDistribute"/>
         <w:ind w:firstLine="720"/>
@@ -9876,7 +9850,7 @@
         <w:pStyle w:val="Compact"/>
         <w:numPr>
           <w:ilvl w:val="0"/>
-          <w:numId w:val="1030"/>
+          <w:numId w:val="1021"/>
         </w:numPr>
         <w:jc w:val="thaiDistribute"/>
         <w:ind w:firstLine="720"/>
@@ -9962,7 +9936,7 @@
         <w:pStyle w:val="Compact"/>
         <w:numPr>
           <w:ilvl w:val="0"/>
-          <w:numId w:val="1030"/>
+          <w:numId w:val="1021"/>
         </w:numPr>
         <w:jc w:val="thaiDistribute"/>
         <w:ind w:firstLine="720"/>
@@ -10001,7 +9975,7 @@
         <w:pStyle w:val="Compact"/>
         <w:numPr>
           <w:ilvl w:val="0"/>
-          <w:numId w:val="1030"/>
+          <w:numId w:val="1021"/>
         </w:numPr>
         <w:jc w:val="thaiDistribute"/>
         <w:ind w:firstLine="720"/>
@@ -10025,7 +9999,7 @@
         <w:pStyle w:val="Compact"/>
         <w:numPr>
           <w:ilvl w:val="0"/>
-          <w:numId w:val="1030"/>
+          <w:numId w:val="1021"/>
         </w:numPr>
         <w:jc w:val="thaiDistribute"/>
         <w:ind w:firstLine="720"/>
@@ -10109,7 +10083,7 @@
         <w:pStyle w:val="Compact"/>
         <w:numPr>
           <w:ilvl w:val="0"/>
-          <w:numId w:val="1032"/>
+          <w:numId w:val="1022"/>
         </w:numPr>
         <w:jc w:val="thaiDistribute"/>
         <w:ind w:firstLine="720"/>
@@ -10133,7 +10107,7 @@
         <w:pStyle w:val="Compact"/>
         <w:numPr>
           <w:ilvl w:val="0"/>
-          <w:numId w:val="1032"/>
+          <w:numId w:val="1022"/>
         </w:numPr>
         <w:jc w:val="thaiDistribute"/>
         <w:ind w:firstLine="720"/>
@@ -10157,7 +10131,7 @@
         <w:pStyle w:val="Compact"/>
         <w:numPr>
           <w:ilvl w:val="0"/>
-          <w:numId w:val="1032"/>
+          <w:numId w:val="1022"/>
         </w:numPr>
         <w:jc w:val="thaiDistribute"/>
         <w:ind w:firstLine="720"/>
@@ -10193,7 +10167,7 @@
         <w:pStyle w:val="Compact"/>
         <w:numPr>
           <w:ilvl w:val="0"/>
-          <w:numId w:val="1032"/>
+          <w:numId w:val="1022"/>
         </w:numPr>
         <w:jc w:val="thaiDistribute"/>
         <w:ind w:firstLine="720"/>
@@ -10217,7 +10191,7 @@
         <w:pStyle w:val="Compact"/>
         <w:numPr>
           <w:ilvl w:val="0"/>
-          <w:numId w:val="1032"/>
+          <w:numId w:val="1022"/>
         </w:numPr>
         <w:jc w:val="thaiDistribute"/>
         <w:ind w:firstLine="720"/>
@@ -10241,7 +10215,7 @@
         <w:pStyle w:val="Compact"/>
         <w:numPr>
           <w:ilvl w:val="0"/>
-          <w:numId w:val="1032"/>
+          <w:numId w:val="1022"/>
         </w:numPr>
         <w:jc w:val="thaiDistribute"/>
         <w:ind w:firstLine="720"/>
@@ -10265,7 +10239,7 @@
         <w:pStyle w:val="Compact"/>
         <w:numPr>
           <w:ilvl w:val="0"/>
-          <w:numId w:val="1032"/>
+          <w:numId w:val="1022"/>
         </w:numPr>
         <w:jc w:val="thaiDistribute"/>
         <w:ind w:firstLine="720"/>
@@ -10289,7 +10263,7 @@
         <w:pStyle w:val="Compact"/>
         <w:numPr>
           <w:ilvl w:val="0"/>
-          <w:numId w:val="1032"/>
+          <w:numId w:val="1022"/>
         </w:numPr>
         <w:jc w:val="thaiDistribute"/>
         <w:ind w:firstLine="720"/>
@@ -10313,7 +10287,7 @@
         <w:pStyle w:val="Compact"/>
         <w:numPr>
           <w:ilvl w:val="0"/>
-          <w:numId w:val="1032"/>
+          <w:numId w:val="1022"/>
         </w:numPr>
         <w:jc w:val="thaiDistribute"/>
         <w:ind w:firstLine="720"/>
@@ -10337,7 +10311,7 @@
         <w:pStyle w:val="Compact"/>
         <w:numPr>
           <w:ilvl w:val="0"/>
-          <w:numId w:val="1032"/>
+          <w:numId w:val="1022"/>
         </w:numPr>
         <w:jc w:val="thaiDistribute"/>
         <w:ind w:firstLine="720"/>
@@ -10361,7 +10335,7 @@
         <w:pStyle w:val="Compact"/>
         <w:numPr>
           <w:ilvl w:val="0"/>
-          <w:numId w:val="1032"/>
+          <w:numId w:val="1022"/>
         </w:numPr>
         <w:jc w:val="thaiDistribute"/>
         <w:ind w:firstLine="720"/>
@@ -10393,7 +10367,7 @@
         <w:pStyle w:val="Compact"/>
         <w:numPr>
           <w:ilvl w:val="0"/>
-          <w:numId w:val="1032"/>
+          <w:numId w:val="1022"/>
         </w:numPr>
         <w:jc w:val="thaiDistribute"/>
         <w:ind w:firstLine="720"/>
@@ -10453,7 +10427,7 @@
       <w:pPr>
         <w:numPr>
           <w:ilvl w:val="0"/>
-          <w:numId w:val="1033"/>
+          <w:numId w:val="1023"/>
         </w:numPr>
         <w:jc w:val="thaiDistribute"/>
         <w:ind w:firstLine="720"/>
@@ -10479,7 +10453,7 @@
       <w:pPr>
         <w:numPr>
           <w:ilvl w:val="0"/>
-          <w:numId w:val="1033"/>
+          <w:numId w:val="1023"/>
         </w:numPr>
         <w:jc w:val="thaiDistribute"/>
         <w:ind w:firstLine="720"/>
@@ -10505,7 +10479,7 @@
       <w:pPr>
         <w:numPr>
           <w:ilvl w:val="0"/>
-          <w:numId w:val="1033"/>
+          <w:numId w:val="1023"/>
         </w:numPr>
         <w:jc w:val="thaiDistribute"/>
         <w:ind w:firstLine="720"/>
@@ -10531,7 +10505,7 @@
       <w:pPr>
         <w:numPr>
           <w:ilvl w:val="0"/>
-          <w:numId w:val="1033"/>
+          <w:numId w:val="1023"/>
         </w:numPr>
         <w:jc w:val="thaiDistribute"/>
         <w:ind w:firstLine="720"/>
@@ -10557,7 +10531,7 @@
       <w:pPr>
         <w:numPr>
           <w:ilvl w:val="0"/>
-          <w:numId w:val="1033"/>
+          <w:numId w:val="1023"/>
         </w:numPr>
         <w:jc w:val="thaiDistribute"/>
         <w:ind w:firstLine="720"/>
@@ -10583,7 +10557,7 @@
       <w:pPr>
         <w:numPr>
           <w:ilvl w:val="0"/>
-          <w:numId w:val="1033"/>
+          <w:numId w:val="1023"/>
         </w:numPr>
         <w:jc w:val="thaiDistribute"/>
         <w:ind w:firstLine="720"/>
@@ -10622,7 +10596,7 @@
       <w:pPr>
         <w:numPr>
           <w:ilvl w:val="0"/>
-          <w:numId w:val="1033"/>
+          <w:numId w:val="1023"/>
         </w:numPr>
         <w:jc w:val="thaiDistribute"/>
         <w:ind w:firstLine="720"/>
@@ -10661,7 +10635,7 @@
       <w:pPr>
         <w:numPr>
           <w:ilvl w:val="0"/>
-          <w:numId w:val="1033"/>
+          <w:numId w:val="1023"/>
         </w:numPr>
         <w:jc w:val="thaiDistribute"/>
         <w:ind w:firstLine="720"/>
@@ -10700,7 +10674,7 @@
       <w:pPr>
         <w:numPr>
           <w:ilvl w:val="0"/>
-          <w:numId w:val="1033"/>
+          <w:numId w:val="1023"/>
         </w:numPr>
         <w:jc w:val="thaiDistribute"/>
         <w:ind w:firstLine="720"/>
@@ -10739,7 +10713,7 @@
       <w:pPr>
         <w:numPr>
           <w:ilvl w:val="0"/>
-          <w:numId w:val="1033"/>
+          <w:numId w:val="1023"/>
         </w:numPr>
         <w:jc w:val="thaiDistribute"/>
         <w:ind w:firstLine="720"/>
@@ -10768,7 +10742,7 @@
       <w:pPr>
         <w:numPr>
           <w:ilvl w:val="0"/>
-          <w:numId w:val="1033"/>
+          <w:numId w:val="1023"/>
         </w:numPr>
         <w:jc w:val="thaiDistribute"/>
         <w:ind w:firstLine="720"/>
@@ -14435,6 +14409,176 @@
       </w:pPr>
     </w:lvl>
   </w:abstractNum>
+  <w:abstractNum w:abstractNumId="99412">
+    <w:nsid w:val="00A99412"/>
+    <w:multiLevelType w:val="multilevel"/>
+    <w:lvl w:ilvl="0">
+      <w:start w:val="2"/>
+      <w:numFmt w:val="decimal"/>
+      <w:lvlText w:val="%1."/>
+      <w:lvlJc w:val="left"/>
+      <w:pPr>
+        <w:ind w:left="720" w:hanging="360"/>
+      </w:pPr>
+    </w:lvl>
+    <w:lvl w:ilvl="1">
+      <w:start w:val="2"/>
+      <w:numFmt w:val="decimal"/>
+      <w:lvlText w:val="%2."/>
+      <w:lvlJc w:val="left"/>
+      <w:pPr>
+        <w:ind w:left="1440" w:hanging="360"/>
+      </w:pPr>
+    </w:lvl>
+    <w:lvl w:ilvl="2">
+      <w:start w:val="2"/>
+      <w:numFmt w:val="decimal"/>
+      <w:lvlText w:val="%3."/>
+      <w:lvlJc w:val="left"/>
+      <w:pPr>
+        <w:ind w:left="2160" w:hanging="360"/>
+      </w:pPr>
+    </w:lvl>
+    <w:lvl w:ilvl="3">
+      <w:start w:val="2"/>
+      <w:numFmt w:val="decimal"/>
+      <w:lvlText w:val="%4."/>
+      <w:lvlJc w:val="left"/>
+      <w:pPr>
+        <w:ind w:left="2880" w:hanging="360"/>
+      </w:pPr>
+    </w:lvl>
+    <w:lvl w:ilvl="4">
+      <w:start w:val="2"/>
+      <w:numFmt w:val="decimal"/>
+      <w:lvlText w:val="%5."/>
+      <w:lvlJc w:val="left"/>
+      <w:pPr>
+        <w:ind w:left="3600" w:hanging="360"/>
+      </w:pPr>
+    </w:lvl>
+    <w:lvl w:ilvl="5">
+      <w:start w:val="2"/>
+      <w:numFmt w:val="decimal"/>
+      <w:lvlText w:val="%6."/>
+      <w:lvlJc w:val="left"/>
+      <w:pPr>
+        <w:ind w:left="4320" w:hanging="360"/>
+      </w:pPr>
+    </w:lvl>
+    <w:lvl w:ilvl="6">
+      <w:start w:val="2"/>
+      <w:numFmt w:val="decimal"/>
+      <w:lvlText w:val="%7."/>
+      <w:lvlJc w:val="left"/>
+      <w:pPr>
+        <w:ind w:left="5040" w:hanging="360"/>
+      </w:pPr>
+    </w:lvl>
+    <w:lvl w:ilvl="7">
+      <w:start w:val="2"/>
+      <w:numFmt w:val="decimal"/>
+      <w:lvlText w:val="%8."/>
+      <w:lvlJc w:val="left"/>
+      <w:pPr>
+        <w:ind w:left="5760" w:hanging="360"/>
+      </w:pPr>
+    </w:lvl>
+    <w:lvl w:ilvl="8">
+      <w:start w:val="2"/>
+      <w:numFmt w:val="decimal"/>
+      <w:lvlText w:val="%9."/>
+      <w:lvlJc w:val="left"/>
+      <w:pPr>
+        <w:ind w:left="6480" w:hanging="360"/>
+      </w:pPr>
+    </w:lvl>
+  </w:abstractNum>
+  <w:abstractNum w:abstractNumId="99413">
+    <w:nsid w:val="00A99413"/>
+    <w:multiLevelType w:val="multilevel"/>
+    <w:lvl w:ilvl="0">
+      <w:start w:val="3"/>
+      <w:numFmt w:val="decimal"/>
+      <w:lvlText w:val="%1."/>
+      <w:lvlJc w:val="left"/>
+      <w:pPr>
+        <w:ind w:left="720" w:hanging="360"/>
+      </w:pPr>
+    </w:lvl>
+    <w:lvl w:ilvl="1">
+      <w:start w:val="3"/>
+      <w:numFmt w:val="decimal"/>
+      <w:lvlText w:val="%2."/>
+      <w:lvlJc w:val="left"/>
+      <w:pPr>
+        <w:ind w:left="1440" w:hanging="360"/>
+      </w:pPr>
+    </w:lvl>
+    <w:lvl w:ilvl="2">
+      <w:start w:val="3"/>
+      <w:numFmt w:val="decimal"/>
+      <w:lvlText w:val="%3."/>
+      <w:lvlJc w:val="left"/>
+      <w:pPr>
+        <w:ind w:left="2160" w:hanging="360"/>
+      </w:pPr>
+    </w:lvl>
+    <w:lvl w:ilvl="3">
+      <w:start w:val="3"/>
+      <w:numFmt w:val="decimal"/>
+      <w:lvlText w:val="%4."/>
+      <w:lvlJc w:val="left"/>
+      <w:pPr>
+        <w:ind w:left="2880" w:hanging="360"/>
+      </w:pPr>
+    </w:lvl>
+    <w:lvl w:ilvl="4">
+      <w:start w:val="3"/>
+      <w:numFmt w:val="decimal"/>
+      <w:lvlText w:val="%5."/>
+      <w:lvlJc w:val="left"/>
+      <w:pPr>
+        <w:ind w:left="3600" w:hanging="360"/>
+      </w:pPr>
+    </w:lvl>
+    <w:lvl w:ilvl="5">
+      <w:start w:val="3"/>
+      <w:numFmt w:val="decimal"/>
+      <w:lvlText w:val="%6."/>
+      <w:lvlJc w:val="left"/>
+      <w:pPr>
+        <w:ind w:left="4320" w:hanging="360"/>
+      </w:pPr>
+    </w:lvl>
+    <w:lvl w:ilvl="6">
+      <w:start w:val="3"/>
+      <w:numFmt w:val="decimal"/>
+      <w:lvlText w:val="%7."/>
+      <w:lvlJc w:val="left"/>
+      <w:pPr>
+        <w:ind w:left="5040" w:hanging="360"/>
+      </w:pPr>
+    </w:lvl>
+    <w:lvl w:ilvl="7">
+      <w:start w:val="3"/>
+      <w:numFmt w:val="decimal"/>
+      <w:lvlText w:val="%8."/>
+      <w:lvlJc w:val="left"/>
+      <w:pPr>
+        <w:ind w:left="5760" w:hanging="360"/>
+      </w:pPr>
+    </w:lvl>
+    <w:lvl w:ilvl="8">
+      <w:start w:val="3"/>
+      <w:numFmt w:val="decimal"/>
+      <w:lvlText w:val="%9."/>
+      <w:lvlJc w:val="left"/>
+      <w:pPr>
+        <w:ind w:left="6480" w:hanging="360"/>
+      </w:pPr>
+    </w:lvl>
+  </w:abstractNum>
   <w:num w16cid:durableId="26032029" w:numId="1">
     <w:abstractNumId w:val="8"/>
   </w:num>
@@ -14493,39 +14637,6 @@
     <w:abstractNumId w:val="991"/>
   </w:num>
   <w:num w:numId="1002">
-    <w:abstractNumId w:val="991"/>
-  </w:num>
-  <w:num w:numId="1003">
-    <w:abstractNumId w:val="991"/>
-  </w:num>
-  <w:num w:numId="1004">
-    <w:abstractNumId w:val="991"/>
-  </w:num>
-  <w:num w:numId="1005">
-    <w:abstractNumId w:val="991"/>
-  </w:num>
-  <w:num w:numId="1006">
-    <w:abstractNumId w:val="991"/>
-  </w:num>
-  <w:num w:numId="1007">
-    <w:abstractNumId w:val="991"/>
-  </w:num>
-  <w:num w:numId="1008">
-    <w:abstractNumId w:val="991"/>
-  </w:num>
-  <w:num w:numId="1009">
-    <w:abstractNumId w:val="991"/>
-  </w:num>
-  <w:num w:numId="1010">
-    <w:abstractNumId w:val="991"/>
-  </w:num>
-  <w:num w:numId="1011">
-    <w:abstractNumId w:val="991"/>
-  </w:num>
-  <w:num w:numId="1012">
-    <w:abstractNumId w:val="991"/>
-  </w:num>
-  <w:num w:numId="1013">
     <w:abstractNumId w:val="99411"/>
     <w:lvlOverride w:ilvl="0">
       <w:startOverride w:val="1"/>
@@ -14555,11 +14666,152 @@
       <w:startOverride w:val="1"/>
     </w:lvlOverride>
   </w:num>
+  <w:num w:numId="1003">
+    <w:abstractNumId w:val="991"/>
+  </w:num>
+  <w:num w:numId="1004">
+    <w:abstractNumId w:val="991"/>
+  </w:num>
+  <w:num w:numId="1005">
+    <w:abstractNumId w:val="991"/>
+  </w:num>
+  <w:num w:numId="1006">
+    <w:abstractNumId w:val="991"/>
+  </w:num>
+  <w:num w:numId="1007">
+    <w:abstractNumId w:val="99411"/>
+    <w:lvlOverride w:ilvl="0">
+      <w:startOverride w:val="1"/>
+    </w:lvlOverride>
+    <w:lvlOverride w:ilvl="1">
+      <w:startOverride w:val="1"/>
+    </w:lvlOverride>
+    <w:lvlOverride w:ilvl="2">
+      <w:startOverride w:val="1"/>
+    </w:lvlOverride>
+    <w:lvlOverride w:ilvl="3">
+      <w:startOverride w:val="1"/>
+    </w:lvlOverride>
+    <w:lvlOverride w:ilvl="4">
+      <w:startOverride w:val="1"/>
+    </w:lvlOverride>
+    <w:lvlOverride w:ilvl="5">
+      <w:startOverride w:val="1"/>
+    </w:lvlOverride>
+    <w:lvlOverride w:ilvl="6">
+      <w:startOverride w:val="1"/>
+    </w:lvlOverride>
+    <w:lvlOverride w:ilvl="7">
+      <w:startOverride w:val="1"/>
+    </w:lvlOverride>
+    <w:lvlOverride w:ilvl="8">
+      <w:startOverride w:val="1"/>
+    </w:lvlOverride>
+  </w:num>
+  <w:num w:numId="1008">
+    <w:abstractNumId w:val="991"/>
+  </w:num>
+  <w:num w:numId="1009">
+    <w:abstractNumId w:val="991"/>
+  </w:num>
+  <w:num w:numId="1010">
+    <w:abstractNumId w:val="991"/>
+  </w:num>
+  <w:num w:numId="1011">
+    <w:abstractNumId w:val="99411"/>
+    <w:lvlOverride w:ilvl="0">
+      <w:startOverride w:val="1"/>
+    </w:lvlOverride>
+    <w:lvlOverride w:ilvl="1">
+      <w:startOverride w:val="1"/>
+    </w:lvlOverride>
+    <w:lvlOverride w:ilvl="2">
+      <w:startOverride w:val="1"/>
+    </w:lvlOverride>
+    <w:lvlOverride w:ilvl="3">
+      <w:startOverride w:val="1"/>
+    </w:lvlOverride>
+    <w:lvlOverride w:ilvl="4">
+      <w:startOverride w:val="1"/>
+    </w:lvlOverride>
+    <w:lvlOverride w:ilvl="5">
+      <w:startOverride w:val="1"/>
+    </w:lvlOverride>
+    <w:lvlOverride w:ilvl="6">
+      <w:startOverride w:val="1"/>
+    </w:lvlOverride>
+    <w:lvlOverride w:ilvl="7">
+      <w:startOverride w:val="1"/>
+    </w:lvlOverride>
+    <w:lvlOverride w:ilvl="8">
+      <w:startOverride w:val="1"/>
+    </w:lvlOverride>
+  </w:num>
+  <w:num w:numId="1012">
+    <w:abstractNumId w:val="991"/>
+  </w:num>
+  <w:num w:numId="1013">
+    <w:abstractNumId w:val="99412"/>
+    <w:lvlOverride w:ilvl="0">
+      <w:startOverride w:val="2"/>
+    </w:lvlOverride>
+    <w:lvlOverride w:ilvl="1">
+      <w:startOverride w:val="2"/>
+    </w:lvlOverride>
+    <w:lvlOverride w:ilvl="2">
+      <w:startOverride w:val="2"/>
+    </w:lvlOverride>
+    <w:lvlOverride w:ilvl="3">
+      <w:startOverride w:val="2"/>
+    </w:lvlOverride>
+    <w:lvlOverride w:ilvl="4">
+      <w:startOverride w:val="2"/>
+    </w:lvlOverride>
+    <w:lvlOverride w:ilvl="5">
+      <w:startOverride w:val="2"/>
+    </w:lvlOverride>
+    <w:lvlOverride w:ilvl="6">
+      <w:startOverride w:val="2"/>
+    </w:lvlOverride>
+    <w:lvlOverride w:ilvl="7">
+      <w:startOverride w:val="2"/>
+    </w:lvlOverride>
+    <w:lvlOverride w:ilvl="8">
+      <w:startOverride w:val="2"/>
+    </w:lvlOverride>
+  </w:num>
   <w:num w:numId="1014">
     <w:abstractNumId w:val="991"/>
   </w:num>
   <w:num w:numId="1015">
-    <w:abstractNumId w:val="991"/>
+    <w:abstractNumId w:val="99413"/>
+    <w:lvlOverride w:ilvl="0">
+      <w:startOverride w:val="3"/>
+    </w:lvlOverride>
+    <w:lvlOverride w:ilvl="1">
+      <w:startOverride w:val="3"/>
+    </w:lvlOverride>
+    <w:lvlOverride w:ilvl="2">
+      <w:startOverride w:val="3"/>
+    </w:lvlOverride>
+    <w:lvlOverride w:ilvl="3">
+      <w:startOverride w:val="3"/>
+    </w:lvlOverride>
+    <w:lvlOverride w:ilvl="4">
+      <w:startOverride w:val="3"/>
+    </w:lvlOverride>
+    <w:lvlOverride w:ilvl="5">
+      <w:startOverride w:val="3"/>
+    </w:lvlOverride>
+    <w:lvlOverride w:ilvl="6">
+      <w:startOverride w:val="3"/>
+    </w:lvlOverride>
+    <w:lvlOverride w:ilvl="7">
+      <w:startOverride w:val="3"/>
+    </w:lvlOverride>
+    <w:lvlOverride w:ilvl="8">
+      <w:startOverride w:val="3"/>
+    </w:lvlOverride>
   </w:num>
   <w:num w:numId="1016">
     <w:abstractNumId w:val="991"/>
@@ -14598,15 +14850,6 @@
     </w:lvlOverride>
   </w:num>
   <w:num w:numId="1019">
-    <w:abstractNumId w:val="991"/>
-  </w:num>
-  <w:num w:numId="1020">
-    <w:abstractNumId w:val="991"/>
-  </w:num>
-  <w:num w:numId="1021">
-    <w:abstractNumId w:val="991"/>
-  </w:num>
-  <w:num w:numId="1022">
     <w:abstractNumId w:val="99411"/>
     <w:lvlOverride w:ilvl="0">
       <w:startOverride w:val="1"/>
@@ -14636,91 +14879,16 @@
       <w:startOverride w:val="1"/>
     </w:lvlOverride>
   </w:num>
-  <w:num w:numId="1023">
+  <w:num w:numId="1020">
     <w:abstractNumId w:val="991"/>
   </w:num>
-  <w:num w:numId="1024">
+  <w:num w:numId="1021">
     <w:abstractNumId w:val="991"/>
   </w:num>
-  <w:num w:numId="1025">
+  <w:num w:numId="1022">
     <w:abstractNumId w:val="991"/>
   </w:num>
-  <w:num w:numId="1026">
-    <w:abstractNumId w:val="991"/>
-  </w:num>
-  <w:num w:numId="1027">
-    <w:abstractNumId w:val="99411"/>
-    <w:lvlOverride w:ilvl="0">
-      <w:startOverride w:val="1"/>
-    </w:lvlOverride>
-    <w:lvlOverride w:ilvl="1">
-      <w:startOverride w:val="1"/>
-    </w:lvlOverride>
-    <w:lvlOverride w:ilvl="2">
-      <w:startOverride w:val="1"/>
-    </w:lvlOverride>
-    <w:lvlOverride w:ilvl="3">
-      <w:startOverride w:val="1"/>
-    </w:lvlOverride>
-    <w:lvlOverride w:ilvl="4">
-      <w:startOverride w:val="1"/>
-    </w:lvlOverride>
-    <w:lvlOverride w:ilvl="5">
-      <w:startOverride w:val="1"/>
-    </w:lvlOverride>
-    <w:lvlOverride w:ilvl="6">
-      <w:startOverride w:val="1"/>
-    </w:lvlOverride>
-    <w:lvlOverride w:ilvl="7">
-      <w:startOverride w:val="1"/>
-    </w:lvlOverride>
-    <w:lvlOverride w:ilvl="8">
-      <w:startOverride w:val="1"/>
-    </w:lvlOverride>
-  </w:num>
-  <w:num w:numId="1028">
-    <w:abstractNumId w:val="99411"/>
-    <w:lvlOverride w:ilvl="0">
-      <w:startOverride w:val="1"/>
-    </w:lvlOverride>
-    <w:lvlOverride w:ilvl="1">
-      <w:startOverride w:val="1"/>
-    </w:lvlOverride>
-    <w:lvlOverride w:ilvl="2">
-      <w:startOverride w:val="1"/>
-    </w:lvlOverride>
-    <w:lvlOverride w:ilvl="3">
-      <w:startOverride w:val="1"/>
-    </w:lvlOverride>
-    <w:lvlOverride w:ilvl="4">
-      <w:startOverride w:val="1"/>
-    </w:lvlOverride>
-    <w:lvlOverride w:ilvl="5">
-      <w:startOverride w:val="1"/>
-    </w:lvlOverride>
-    <w:lvlOverride w:ilvl="6">
-      <w:startOverride w:val="1"/>
-    </w:lvlOverride>
-    <w:lvlOverride w:ilvl="7">
-      <w:startOverride w:val="1"/>
-    </w:lvlOverride>
-    <w:lvlOverride w:ilvl="8">
-      <w:startOverride w:val="1"/>
-    </w:lvlOverride>
-  </w:num>
-  <w:num w:numId="1029">
-    <w:abstractNumId w:val="991"/>
-  </w:num>
-  <w:num w:numId="1030">
-    <w:abstractNumId w:val="991"/>
-  </w:num>
-  <w:num w:numId="1031">
-    <w:abstractNumId w:val="991"/>
-  </w:num>
-  <w:num w:numId="1032">
-    <w:abstractNumId w:val="991"/>
-  </w:num>
-  <w:num w:numId="1033">
+  <w:num w:numId="1023">
     <w:abstractNumId w:val="99411"/>
     <w:lvlOverride w:ilvl="0">
       <w:startOverride w:val="1"/>

</xml_diff>

<commit_message>
docs: standardize terminology and paragraph indentation according to format.md (v1.1)
</commit_message>
<xml_diff>
--- a/RE.docx
+++ b/RE.docx
@@ -438,7 +438,7 @@
     <w:p xmlns:w14="http://schemas.microsoft.com/office/word/2010/wordml">
       <w:pPr>
         <w:spacing w:after="0" w:line="240" w:lineRule="auto"/>
-        <w:ind w:firstLine="720"/>
+        <w:ind w:firstLine="992"/>
         <w:jc w:val="thaiDistribute"/>
       </w:pPr>
       <w:r>
@@ -481,7 +481,7 @@
     <w:p xmlns:w14="http://schemas.microsoft.com/office/word/2010/wordml">
       <w:pPr>
         <w:spacing w:after="0" w:line="240" w:lineRule="auto"/>
-        <w:ind w:firstLine="720"/>
+        <w:ind w:firstLine="992"/>
         <w:jc w:val="thaiDistribute"/>
       </w:pPr>
       <w:r>
@@ -539,7 +539,7 @@
     <w:p xmlns:w14="http://schemas.microsoft.com/office/word/2010/wordml">
       <w:pPr>
         <w:spacing w:after="0" w:line="240" w:lineRule="auto"/>
-        <w:ind w:firstLine="720"/>
+        <w:ind w:firstLine="992"/>
         <w:jc w:val="thaiDistribute"/>
       </w:pPr>
       <w:r>
@@ -552,7 +552,7 @@
     <w:p xmlns:w14="http://schemas.microsoft.com/office/word/2010/wordml">
       <w:pPr>
         <w:spacing w:after="0" w:line="240" w:lineRule="auto"/>
-        <w:ind w:firstLine="720"/>
+        <w:ind w:firstLine="992"/>
         <w:jc w:val="thaiDistribute"/>
       </w:pPr>
       <w:r>
@@ -1738,7 +1738,7 @@
       <w:pPr>
         <w:pStyle w:val="FirstParagraph"/>
         <w:jc w:val="thaiDistribute"/>
-        <w:ind w:firstLine="720"/>
+        <w:ind w:firstLine="992"/>
       </w:pPr>
       <w:r>
         <w:t xml:space="preserve">  โปรดศึกษาหลักการเบื้องต้นจำนวน 5 ประการดังต่อไปนี้ก่อนเริ่มดำเนินการ เพื่อให้การพัฒนาระบบเป็นไปอย่างราบรื่น:</w:t>
@@ -1752,7 +1752,7 @@
           <w:numId w:val="1002"/>
         </w:numPr>
         <w:jc w:val="thaiDistribute"/>
-        <w:ind w:firstLine="720"/>
+        <w:ind w:firstLine="992"/>
       </w:pPr>
       <w:r>
         <w:rPr>
@@ -1791,7 +1791,7 @@
           <w:numId w:val="1002"/>
         </w:numPr>
         <w:jc w:val="thaiDistribute"/>
-        <w:ind w:firstLine="720"/>
+        <w:ind w:firstLine="992"/>
       </w:pPr>
       <w:r>
         <w:rPr>
@@ -1861,7 +1861,7 @@
           <w:numId w:val="1002"/>
         </w:numPr>
         <w:jc w:val="thaiDistribute"/>
-        <w:ind w:firstLine="720"/>
+        <w:ind w:firstLine="992"/>
       </w:pPr>
       <w:r>
         <w:rPr>
@@ -1909,7 +1909,7 @@
           <w:numId w:val="1002"/>
         </w:numPr>
         <w:jc w:val="thaiDistribute"/>
-        <w:ind w:firstLine="720"/>
+        <w:ind w:firstLine="992"/>
       </w:pPr>
       <w:r>
         <w:rPr>
@@ -1933,7 +1933,7 @@
           <w:numId w:val="1002"/>
         </w:numPr>
         <w:jc w:val="thaiDistribute"/>
-        <w:ind w:firstLine="720"/>
+        <w:ind w:firstLine="992"/>
       </w:pPr>
       <w:r>
         <w:rPr>
@@ -1998,7 +1998,7 @@
       <w:pPr>
         <w:pStyle w:val="BlockText"/>
         <w:jc w:val="thaiDistribute"/>
-        <w:ind w:firstLine="720"/>
+        <w:ind w:firstLine="992"/>
       </w:pPr>
       <w:r>
         <w:t xml:space="preserve">** เคล็ดลับการเรียนรู้:** ทดทดลองรันระบบจริงด้วยโมเดลสำเร็จรูปก่อนอ่านโค้ดทั้งหมด เปิด Terminal 2 หน้าต่าง — หน้าต่างที่ 1 รัน</w:t>
@@ -2037,7 +2037,7 @@
     <w:p>
       <w:pPr>
         <w:jc w:val="thaiDistribute"/>
-        <w:ind w:firstLine="720"/>
+        <w:ind w:firstLine="992"/>
       </w:pPr>
       <w:r>
         <w:pict>
@@ -2059,7 +2059,7 @@
     <w:p>
       <w:pPr>
         <w:jc w:val="thaiDistribute"/>
-        <w:ind w:firstLine="720"/>
+        <w:ind w:firstLine="992"/>
       </w:pPr>
       <w:r>
         <w:pict>
@@ -2080,7 +2080,7 @@
       <w:pPr>
         <w:pStyle w:val="FirstParagraph"/>
         <w:jc w:val="thaiDistribute"/>
-        <w:ind w:firstLine="720"/>
+        <w:ind w:firstLine="992"/>
       </w:pPr>
       <w:r>
         <w:t xml:space="preserve">  </w:t>
@@ -2257,7 +2257,7 @@
       <w:pPr>
         <w:pStyle w:val="BlockText"/>
         <w:jc w:val="thaiDistribute"/>
-        <w:ind w:firstLine="720"/>
+        <w:ind w:firstLine="992"/>
       </w:pPr>
       <w:r>
         <w:t xml:space="preserve">เมื่อจบส่วนนี้ ผู้อ่านควรเข้าใจว่าแต่ละเทคโนโลยีช่วยแก้ปัญหาไหน</w:t>
@@ -2267,7 +2267,7 @@
       <w:pPr>
         <w:pStyle w:val="FirstParagraph"/>
         <w:jc w:val="thaiDistribute"/>
-        <w:ind w:firstLine="720"/>
+        <w:ind w:firstLine="992"/>
       </w:pPr>
       <w:r>
         <w:t xml:space="preserve">  </w:t>
@@ -2308,7 +2308,7 @@
       <w:pPr>
         <w:pStyle w:val="FirstParagraph"/>
         <w:jc w:val="thaiDistribute"/>
-        <w:ind w:firstLine="720"/>
+        <w:ind w:firstLine="992"/>
       </w:pPr>
       <w:r>
         <w:t xml:space="preserve">ดูเวอร์ชันข้อความ (fallback)</w:t>
@@ -2351,7 +2351,7 @@
       <w:pPr>
         <w:pStyle w:val="FirstParagraph"/>
         <w:jc w:val="thaiDistribute"/>
-        <w:ind w:firstLine="720"/>
+        <w:ind w:firstLine="992"/>
       </w:pPr>
       <w:r>
         <w:t xml:space="preserve">  </w:t>
@@ -2390,7 +2390,7 @@
       <w:pPr>
         <w:pStyle w:val="BodyText"/>
         <w:jc w:val="thaiDistribute"/>
-        <w:ind w:firstLine="720"/>
+        <w:ind w:firstLine="992"/>
       </w:pPr>
       <w:r>
         <w:t xml:space="preserve">  โปรเจกต์ใช้</w:t>
@@ -2420,7 +2420,7 @@
           <w:numId w:val="1003"/>
         </w:numPr>
         <w:jc w:val="thaiDistribute"/>
-        <w:ind w:firstLine="720"/>
+        <w:ind w:firstLine="992"/>
       </w:pPr>
       <w:r>
         <w:rPr>
@@ -2474,7 +2474,7 @@
           <w:numId w:val="1003"/>
         </w:numPr>
         <w:jc w:val="thaiDistribute"/>
-        <w:ind w:firstLine="720"/>
+        <w:ind w:firstLine="992"/>
       </w:pPr>
       <w:r>
         <w:rPr>
@@ -2498,7 +2498,7 @@
           <w:numId w:val="1003"/>
         </w:numPr>
         <w:jc w:val="thaiDistribute"/>
-        <w:ind w:firstLine="720"/>
+        <w:ind w:firstLine="992"/>
       </w:pPr>
       <w:r>
         <w:rPr>
@@ -2518,7 +2518,7 @@
       <w:pPr>
         <w:pStyle w:val="BlockText"/>
         <w:jc w:val="thaiDistribute"/>
-        <w:ind w:firstLine="720"/>
+        <w:ind w:firstLine="992"/>
       </w:pPr>
       <w:r>
         <w:t xml:space="preserve">เมื่อจบหัวข้อนี้ ผู้อ่านจะเข้าใจว่า YOLO มีหน้าที่ “ตีกรอบและบอกว่าแต่ละกรอบคือเลขอะไร”</w:t>
@@ -2538,7 +2538,7 @@
       <w:pPr>
         <w:pStyle w:val="FirstParagraph"/>
         <w:jc w:val="thaiDistribute"/>
-        <w:ind w:firstLine="720"/>
+        <w:ind w:firstLine="992"/>
       </w:pPr>
       <w:r>
         <w:t xml:space="preserve">  ปกติถ้าจะสอน AI แยก “มิเตอร์น้ำ vs มิเตอร์ไฟ vs ภาพทั่วไป” ต้องเตรียมภาพตัวอย่างหลายร้อยภาพ แต่โปรเจกต์ใช้ทางลัดด้วย</w:t>
@@ -2568,7 +2568,7 @@
           <w:numId w:val="1004"/>
         </w:numPr>
         <w:jc w:val="thaiDistribute"/>
-        <w:ind w:firstLine="720"/>
+        <w:ind w:firstLine="992"/>
       </w:pPr>
       <w:r>
         <w:rPr>
@@ -2637,7 +2637,7 @@
       <w:pPr>
         <w:pStyle w:val="FirstParagraph"/>
         <w:jc w:val="thaiDistribute"/>
-        <w:ind w:firstLine="720"/>
+        <w:ind w:firstLine="992"/>
       </w:pPr>
       <w:r>
         <w:t xml:space="preserve">  </w:t>
@@ -2664,7 +2664,7 @@
           <w:numId w:val="1005"/>
         </w:numPr>
         <w:jc w:val="thaiDistribute"/>
-        <w:ind w:firstLine="720"/>
+        <w:ind w:firstLine="992"/>
       </w:pPr>
       <w:r>
         <w:rPr>
@@ -2688,7 +2688,7 @@
           <w:numId w:val="1005"/>
         </w:numPr>
         <w:jc w:val="thaiDistribute"/>
-        <w:ind w:firstLine="720"/>
+        <w:ind w:firstLine="992"/>
       </w:pPr>
       <w:r>
         <w:rPr>
@@ -2708,7 +2708,7 @@
       <w:pPr>
         <w:pStyle w:val="BlockText"/>
         <w:jc w:val="thaiDistribute"/>
-        <w:ind w:firstLine="720"/>
+        <w:ind w:firstLine="992"/>
       </w:pPr>
       <w:r>
         <w:t xml:space="preserve">** สรุปความเข้าใจส่วนที่ 1.1:**</w:t>
@@ -2735,7 +2735,7 @@
     <w:p>
       <w:pPr>
         <w:jc w:val="thaiDistribute"/>
-        <w:ind w:firstLine="720"/>
+        <w:ind w:firstLine="992"/>
       </w:pPr>
       <w:r>
         <w:pict>
@@ -2758,7 +2758,7 @@
       <w:pPr>
         <w:pStyle w:val="BlockText"/>
         <w:jc w:val="thaiDistribute"/>
-        <w:ind w:firstLine="720"/>
+        <w:ind w:firstLine="992"/>
       </w:pPr>
       <w:r>
         <w:t xml:space="preserve">[!NOTE]</w:t>
@@ -2795,7 +2795,7 @@
       <w:pPr>
         <w:pStyle w:val="FirstParagraph"/>
         <w:jc w:val="thaiDistribute"/>
-        <w:ind w:firstLine="720"/>
+        <w:ind w:firstLine="992"/>
       </w:pPr>
       <w:r>
         <w:t xml:space="preserve">  </w:t>
@@ -2827,7 +2827,7 @@
       <w:pPr>
         <w:pStyle w:val="FirstParagraph"/>
         <w:jc w:val="thaiDistribute"/>
-        <w:ind w:firstLine="720"/>
+        <w:ind w:firstLine="992"/>
       </w:pPr>
       <w:r>
         <w:t xml:space="preserve">  ระบบใช้ชุดข้อมูล</w:t>
@@ -2850,7 +2850,7 @@
       <w:pPr>
         <w:pStyle w:val="Heading5"/>
         <w:jc w:val="thaiDistribute"/>
-        <w:ind w:firstLine="720"/>
+        <w:ind w:firstLine="992"/>
       </w:pPr>
       <w:r>
         <w:t xml:space="preserve">ขั้นตอนสมัคร Roboflow และรับ API Key</w:t>
@@ -2860,7 +2860,7 @@
       <w:pPr>
         <w:pStyle w:val="FirstParagraph"/>
         <w:jc w:val="thaiDistribute"/>
-        <w:ind w:firstLine="720"/>
+        <w:ind w:firstLine="992"/>
       </w:pPr>
       <w:r>
         <w:t xml:space="preserve">  1. เปิด</w:t>
@@ -3092,7 +3092,7 @@
       <w:pPr>
         <w:pStyle w:val="FirstParagraph"/>
         <w:jc w:val="thaiDistribute"/>
-        <w:ind w:firstLine="720"/>
+        <w:ind w:firstLine="992"/>
       </w:pPr>
       <w:r>
         <w:t xml:space="preserve">  ระบบเลือกใช้แบบจำลอง</w:t>
@@ -3157,7 +3157,7 @@
       <w:pPr>
         <w:pStyle w:val="BlockText"/>
         <w:jc w:val="thaiDistribute"/>
-        <w:ind w:firstLine="720"/>
+        <w:ind w:firstLine="992"/>
       </w:pPr>
       <w:r>
         <w:rPr>
@@ -3192,7 +3192,7 @@
       <w:pPr>
         <w:pStyle w:val="FirstParagraph"/>
         <w:jc w:val="thaiDistribute"/>
-        <w:ind w:firstLine="720"/>
+        <w:ind w:firstLine="992"/>
       </w:pPr>
       <w:r>
         <w:t xml:space="preserve">  </w:t>
@@ -3259,7 +3259,7 @@
     <w:p>
       <w:pPr>
         <w:jc w:val="thaiDistribute"/>
-        <w:ind w:firstLine="720"/>
+        <w:ind w:firstLine="992"/>
       </w:pPr>
       <w:r>
         <w:pict>
@@ -3297,7 +3297,7 @@
       <w:pPr>
         <w:pStyle w:val="BlockText"/>
         <w:jc w:val="thaiDistribute"/>
-        <w:ind w:firstLine="720"/>
+        <w:ind w:firstLine="992"/>
       </w:pPr>
       <w:r>
         <w:rPr>
@@ -3372,7 +3372,7 @@
       <w:pPr>
         <w:pStyle w:val="FirstParagraph"/>
         <w:jc w:val="thaiDistribute"/>
-        <w:ind w:firstLine="720"/>
+        <w:ind w:firstLine="992"/>
       </w:pPr>
       <w:r>
         <w:t xml:space="preserve">  โครงสร้างข้างต้นเป็นแบบเรียบง่ายสำหรับการเรียนรู้ สำหรับโครงสร้างไฟล์แบบเต็มของโปรเจกต์ปัจจุบัน โปรดดู</w:t>
@@ -3402,7 +3402,7 @@
       <w:pPr>
         <w:pStyle w:val="FirstParagraph"/>
         <w:jc w:val="thaiDistribute"/>
-        <w:ind w:firstLine="720"/>
+        <w:ind w:firstLine="992"/>
       </w:pPr>
       <w:r>
         <w:t xml:space="preserve">  เปิด Terminal ที่โฟลเดอร์</w:t>
@@ -3451,7 +3451,7 @@
       <w:pPr>
         <w:pStyle w:val="FirstParagraph"/>
         <w:jc w:val="thaiDistribute"/>
-        <w:ind w:firstLine="720"/>
+        <w:ind w:firstLine="992"/>
       </w:pPr>
       <w:r>
         <w:t xml:space="preserve">  </w:t>
@@ -3571,7 +3571,7 @@
     <w:p>
       <w:pPr>
         <w:jc w:val="thaiDistribute"/>
-        <w:ind w:firstLine="720"/>
+        <w:ind w:firstLine="992"/>
       </w:pPr>
       <w:r>
         <w:pict>
@@ -3594,7 +3594,7 @@
       <w:pPr>
         <w:pStyle w:val="BlockText"/>
         <w:jc w:val="thaiDistribute"/>
-        <w:ind w:firstLine="720"/>
+        <w:ind w:firstLine="992"/>
       </w:pPr>
       <w:r>
         <w:rPr>
@@ -3614,7 +3614,7 @@
       <w:pPr>
         <w:pStyle w:val="FirstParagraph"/>
         <w:jc w:val="thaiDistribute"/>
-        <w:ind w:firstLine="720"/>
+        <w:ind w:firstLine="992"/>
       </w:pPr>
       <w:r>
         <w:t xml:space="preserve">  </w:t>
@@ -3683,7 +3683,7 @@
       <w:pPr>
         <w:pStyle w:val="BodyText"/>
         <w:jc w:val="thaiDistribute"/>
-        <w:ind w:firstLine="720"/>
+        <w:ind w:firstLine="992"/>
       </w:pPr>
       <w:r>
         <w:t xml:space="preserve">  </w:t>
@@ -3706,7 +3706,7 @@
       <w:pPr>
         <w:pStyle w:val="BodyText"/>
         <w:jc w:val="thaiDistribute"/>
-        <w:ind w:firstLine="720"/>
+        <w:ind w:firstLine="992"/>
       </w:pPr>
       <w:r>
         <w:t xml:space="preserve">  </w:t>
@@ -3729,7 +3729,7 @@
       <w:pPr>
         <w:pStyle w:val="BodyText"/>
         <w:jc w:val="thaiDistribute"/>
-        <w:ind w:firstLine="720"/>
+        <w:ind w:firstLine="992"/>
       </w:pPr>
       <w:r>
         <w:t xml:space="preserve">  </w:t>
@@ -3891,7 +3891,7 @@
     <w:p>
       <w:pPr>
         <w:jc w:val="thaiDistribute"/>
-        <w:ind w:firstLine="720"/>
+        <w:ind w:firstLine="992"/>
       </w:pPr>
       <w:r>
         <w:pict>
@@ -3913,7 +3913,7 @@
       <w:pPr>
         <w:pStyle w:val="FirstParagraph"/>
         <w:jc w:val="thaiDistribute"/>
-        <w:ind w:firstLine="720"/>
+        <w:ind w:firstLine="992"/>
       </w:pPr>
       <w:r>
         <w:t xml:space="preserve">  กระบวนการอ่านตัวเลขมี 4 ขั้นตอน — แต่ละขั้นตอนแก้ปัญหาคนละแบบ ต่อกันเป็นท่อส่งข้อมูล:</w:t>
@@ -3936,7 +3936,7 @@
           <w:numId w:val="1006"/>
         </w:numPr>
         <w:jc w:val="thaiDistribute"/>
-        <w:ind w:firstLine="720"/>
+        <w:ind w:firstLine="992"/>
       </w:pPr>
       <w:r>
         <w:rPr>
@@ -3960,7 +3960,7 @@
           <w:numId w:val="1006"/>
         </w:numPr>
         <w:jc w:val="thaiDistribute"/>
-        <w:ind w:firstLine="720"/>
+        <w:ind w:firstLine="992"/>
       </w:pPr>
       <w:r>
         <w:rPr>
@@ -3984,7 +3984,7 @@
           <w:numId w:val="1006"/>
         </w:numPr>
         <w:jc w:val="thaiDistribute"/>
-        <w:ind w:firstLine="720"/>
+        <w:ind w:firstLine="992"/>
       </w:pPr>
       <w:r>
         <w:rPr>
@@ -4034,7 +4034,7 @@
       <w:pPr>
         <w:pStyle w:val="FirstParagraph"/>
         <w:jc w:val="thaiDistribute"/>
-        <w:ind w:firstLine="720"/>
+        <w:ind w:firstLine="992"/>
       </w:pPr>
       <w:r>
         <w:t xml:space="preserve">  </w:t>
@@ -4057,7 +4057,7 @@
       <w:pPr>
         <w:pStyle w:val="BodyText"/>
         <w:jc w:val="thaiDistribute"/>
-        <w:ind w:firstLine="720"/>
+        <w:ind w:firstLine="992"/>
       </w:pPr>
       <w:r>
         <w:t xml:space="preserve">  </w:t>
@@ -4080,7 +4080,7 @@
       <w:pPr>
         <w:pStyle w:val="BodyText"/>
         <w:jc w:val="thaiDistribute"/>
-        <w:ind w:firstLine="720"/>
+        <w:ind w:firstLine="992"/>
       </w:pPr>
       <w:r>
         <w:t xml:space="preserve">  </w:t>
@@ -4187,7 +4187,7 @@
     <w:p>
       <w:pPr>
         <w:jc w:val="thaiDistribute"/>
-        <w:ind w:firstLine="720"/>
+        <w:ind w:firstLine="992"/>
       </w:pPr>
       <w:r>
         <w:pict>
@@ -4227,7 +4227,7 @@
       <w:pPr>
         <w:pStyle w:val="FirstParagraph"/>
         <w:jc w:val="thaiDistribute"/>
-        <w:ind w:firstLine="720"/>
+        <w:ind w:firstLine="992"/>
       </w:pPr>
       <w:r>
         <w:t xml:space="preserve">  </w:t>
@@ -4250,7 +4250,7 @@
       <w:pPr>
         <w:pStyle w:val="BodyText"/>
         <w:jc w:val="thaiDistribute"/>
-        <w:ind w:firstLine="720"/>
+        <w:ind w:firstLine="992"/>
       </w:pPr>
       <w:r>
         <w:t xml:space="preserve">  การทำงานของระบบก็เหมือนกัน:</w:t>
@@ -4264,7 +4264,7 @@
           <w:numId w:val="1007"/>
         </w:numPr>
         <w:jc w:val="thaiDistribute"/>
-        <w:ind w:firstLine="720"/>
+        <w:ind w:firstLine="992"/>
       </w:pPr>
       <w:r>
         <w:t xml:space="preserve">เราหมุนภาพ 90° เพื่อให้ AI หาตัวเลขได้ง่าย</w:t>
@@ -4278,7 +4278,7 @@
           <w:numId w:val="1007"/>
         </w:numPr>
         <w:jc w:val="thaiDistribute"/>
-        <w:ind w:firstLine="720"/>
+        <w:ind w:firstLine="992"/>
       </w:pPr>
       <w:r>
         <w:t xml:space="preserve">พิกัดกล่อง</w:t>
@@ -4317,7 +4317,7 @@
           <w:numId w:val="1007"/>
         </w:numPr>
         <w:jc w:val="thaiDistribute"/>
-        <w:ind w:firstLine="720"/>
+        <w:ind w:firstLine="992"/>
       </w:pPr>
       <w:r>
         <w:t xml:space="preserve">ถ้าจะเอากล่องไปวาดบน</w:t>
@@ -4391,7 +4391,7 @@
       <w:pPr>
         <w:pStyle w:val="FirstParagraph"/>
         <w:jc w:val="thaiDistribute"/>
-        <w:ind w:firstLine="720"/>
+        <w:ind w:firstLine="992"/>
       </w:pPr>
       <w:r>
         <w:t xml:space="preserve">ดูเวอร์ชันข้อความ</w:t>
@@ -4425,7 +4425,7 @@
       <w:pPr>
         <w:pStyle w:val="FirstParagraph"/>
         <w:jc w:val="thaiDistribute"/>
-        <w:ind w:firstLine="720"/>
+        <w:ind w:firstLine="992"/>
       </w:pPr>
       <w:r>
         <w:t xml:space="preserve">  </w:t>
@@ -4467,7 +4467,7 @@
           <w:numId w:val="1008"/>
         </w:numPr>
         <w:jc w:val="thaiDistribute"/>
-        <w:ind w:firstLine="720"/>
+        <w:ind w:firstLine="992"/>
       </w:pPr>
       <w:r>
         <w:rPr>
@@ -4570,7 +4570,7 @@
           <w:numId w:val="1008"/>
         </w:numPr>
         <w:jc w:val="thaiDistribute"/>
-        <w:ind w:firstLine="720"/>
+        <w:ind w:firstLine="992"/>
       </w:pPr>
       <w:r>
         <w:rPr>
@@ -4682,7 +4682,7 @@
           <w:numId w:val="1008"/>
         </w:numPr>
         <w:jc w:val="thaiDistribute"/>
-        <w:ind w:firstLine="720"/>
+        <w:ind w:firstLine="992"/>
       </w:pPr>
       <w:r>
         <w:rPr>
@@ -4781,7 +4781,7 @@
       <w:pPr>
         <w:pStyle w:val="BlockText"/>
         <w:jc w:val="thaiDistribute"/>
-        <w:ind w:firstLine="720"/>
+        <w:ind w:firstLine="992"/>
       </w:pPr>
       <w:r>
         <w:t xml:space="preserve">หากยังไม่ชัดเจน ขอให้ทดลองวาดรูปสี่เหลี่ยมบนกระดาษ กำหนดจุดมุม แล้วทดลองหมุนกระดาษ — สูตรด้านล่างคือการถ่ายทอดสิ่งที่ท่านสังเกตเห็นให้อยู่ในรูปของรหัสต้นฉบับ</w:t>
@@ -4791,7 +4791,7 @@
       <w:pPr>
         <w:pStyle w:val="FirstParagraph"/>
         <w:jc w:val="thaiDistribute"/>
-        <w:ind w:firstLine="720"/>
+        <w:ind w:firstLine="992"/>
       </w:pPr>
       <w:r>
         <w:t xml:space="preserve">  </w:t>
@@ -4814,7 +4814,7 @@
       <w:pPr>
         <w:pStyle w:val="BodyText"/>
         <w:jc w:val="thaiDistribute"/>
-        <w:ind w:firstLine="720"/>
+        <w:ind w:firstLine="992"/>
       </w:pPr>
       <w:r>
         <w:t xml:space="preserve">  </w:t>
@@ -4867,7 +4867,7 @@
       <w:pPr>
         <w:pStyle w:val="BodyText"/>
         <w:jc w:val="thaiDistribute"/>
-        <w:ind w:firstLine="720"/>
+        <w:ind w:firstLine="992"/>
       </w:pPr>
       <w:r>
         <w:t xml:space="preserve">  </w:t>
@@ -5071,7 +5071,7 @@
       <w:pPr>
         <w:pStyle w:val="FirstParagraph"/>
         <w:jc w:val="thaiDistribute"/>
-        <w:ind w:firstLine="720"/>
+        <w:ind w:firstLine="992"/>
       </w:pPr>
       <w:r>
         <w:t xml:space="preserve">  </w:t>
@@ -5093,7 +5093,7 @@
     <w:p>
       <w:pPr>
         <w:jc w:val="thaiDistribute"/>
-        <w:ind w:firstLine="720"/>
+        <w:ind w:firstLine="992"/>
       </w:pPr>
       <w:r>
         <w:pict>
@@ -5128,7 +5128,7 @@
           <w:numId w:val="1009"/>
         </w:numPr>
         <w:jc w:val="thaiDistribute"/>
-        <w:ind w:firstLine="720"/>
+        <w:ind w:firstLine="992"/>
       </w:pPr>
       <w:r>
         <w:rPr>
@@ -5168,7 +5168,7 @@
           <w:numId w:val="1009"/>
         </w:numPr>
         <w:jc w:val="thaiDistribute"/>
-        <w:ind w:firstLine="720"/>
+        <w:ind w:firstLine="992"/>
       </w:pPr>
       <w:r>
         <w:rPr>
@@ -5208,7 +5208,7 @@
           <w:numId w:val="1009"/>
         </w:numPr>
         <w:jc w:val="thaiDistribute"/>
-        <w:ind w:firstLine="720"/>
+        <w:ind w:firstLine="992"/>
       </w:pPr>
       <w:r>
         <w:rPr>
@@ -5276,7 +5276,7 @@
       <w:pPr>
         <w:pStyle w:val="FirstParagraph"/>
         <w:jc w:val="thaiDistribute"/>
-        <w:ind w:firstLine="720"/>
+        <w:ind w:firstLine="992"/>
       </w:pPr>
       <w:r>
         <w:t xml:space="preserve">  </w:t>
@@ -5299,7 +5299,7 @@
       <w:pPr>
         <w:pStyle w:val="BodyText"/>
         <w:jc w:val="thaiDistribute"/>
-        <w:ind w:firstLine="720"/>
+        <w:ind w:firstLine="992"/>
       </w:pPr>
       <w:r>
         <w:t xml:space="preserve">  </w:t>
@@ -5322,7 +5322,7 @@
       <w:pPr>
         <w:pStyle w:val="BodyText"/>
         <w:jc w:val="thaiDistribute"/>
-        <w:ind w:firstLine="720"/>
+        <w:ind w:firstLine="992"/>
       </w:pPr>
       <w:r>
         <w:t xml:space="preserve">  </w:t>
@@ -5444,7 +5444,7 @@
     <w:p>
       <w:pPr>
         <w:jc w:val="thaiDistribute"/>
-        <w:ind w:firstLine="720"/>
+        <w:ind w:firstLine="992"/>
       </w:pPr>
       <w:r>
         <w:pict>
@@ -5475,7 +5475,7 @@
       <w:pPr>
         <w:pStyle w:val="FirstParagraph"/>
         <w:jc w:val="thaiDistribute"/>
-        <w:ind w:firstLine="720"/>
+        <w:ind w:firstLine="992"/>
       </w:pPr>
       <w:r>
         <w:t xml:space="preserve">  </w:t>
@@ -5510,7 +5510,7 @@
       <w:pPr>
         <w:pStyle w:val="BodyText"/>
         <w:jc w:val="thaiDistribute"/>
-        <w:ind w:firstLine="720"/>
+        <w:ind w:firstLine="992"/>
       </w:pPr>
       <w:r>
         <w:t xml:space="preserve">  ถ้าเราลองแค่มุมเดียวหรือฟิลเตอร์เดียวแล้วพลาด ระบบจะอ่านผิดทันที</w:t>
@@ -5519,7 +5519,7 @@
     <w:p>
       <w:pPr>
         <w:jc w:val="thaiDistribute"/>
-        <w:ind w:firstLine="720"/>
+        <w:ind w:firstLine="992"/>
       </w:pPr>
       <w:r>
         <w:pict>
@@ -5531,7 +5531,7 @@
       <w:pPr>
         <w:pStyle w:val="FirstParagraph"/>
         <w:jc w:val="thaiDistribute"/>
-        <w:ind w:firstLine="720"/>
+        <w:ind w:firstLine="992"/>
       </w:pPr>
       <w:r>
         <w:t xml:space="preserve">  </w:t>
@@ -5594,7 +5594,7 @@
       <w:pPr>
         <w:pStyle w:val="FirstParagraph"/>
         <w:jc w:val="thaiDistribute"/>
-        <w:ind w:firstLine="720"/>
+        <w:ind w:firstLine="992"/>
       </w:pPr>
       <w:r>
         <w:t xml:space="preserve">ดูเวอร์ชันข้อความ</w:t>
@@ -5627,7 +5627,7 @@
     <w:p>
       <w:pPr>
         <w:jc w:val="thaiDistribute"/>
-        <w:ind w:firstLine="720"/>
+        <w:ind w:firstLine="992"/>
       </w:pPr>
       <w:r>
         <w:pict>
@@ -5639,7 +5639,7 @@
       <w:pPr>
         <w:pStyle w:val="FirstParagraph"/>
         <w:jc w:val="thaiDistribute"/>
-        <w:ind w:firstLine="720"/>
+        <w:ind w:firstLine="992"/>
       </w:pPr>
       <w:r>
         <w:t xml:space="preserve">  </w:t>
@@ -5660,7 +5660,7 @@
           <w:numId w:val="1010"/>
         </w:numPr>
         <w:jc w:val="thaiDistribute"/>
-        <w:ind w:firstLine="720"/>
+        <w:ind w:firstLine="992"/>
       </w:pPr>
       <w:r>
         <w:rPr>
@@ -5684,7 +5684,7 @@
           <w:numId w:val="1010"/>
         </w:numPr>
         <w:jc w:val="thaiDistribute"/>
-        <w:ind w:firstLine="720"/>
+        <w:ind w:firstLine="992"/>
       </w:pPr>
       <w:r>
         <w:rPr>
@@ -5708,7 +5708,7 @@
           <w:numId w:val="1010"/>
         </w:numPr>
         <w:jc w:val="thaiDistribute"/>
-        <w:ind w:firstLine="720"/>
+        <w:ind w:firstLine="992"/>
       </w:pPr>
       <w:r>
         <w:rPr>
@@ -5732,7 +5732,7 @@
           <w:numId w:val="1010"/>
         </w:numPr>
         <w:jc w:val="thaiDistribute"/>
-        <w:ind w:firstLine="720"/>
+        <w:ind w:firstLine="992"/>
       </w:pPr>
       <w:r>
         <w:rPr>
@@ -5756,7 +5756,7 @@
           <w:numId w:val="1010"/>
         </w:numPr>
         <w:jc w:val="thaiDistribute"/>
-        <w:ind w:firstLine="720"/>
+        <w:ind w:firstLine="992"/>
       </w:pPr>
       <w:r>
         <w:rPr>
@@ -5780,7 +5780,7 @@
           <w:numId w:val="1010"/>
         </w:numPr>
         <w:jc w:val="thaiDistribute"/>
-        <w:ind w:firstLine="720"/>
+        <w:ind w:firstLine="992"/>
       </w:pPr>
       <w:r>
         <w:rPr>
@@ -5804,7 +5804,7 @@
           <w:numId w:val="1010"/>
         </w:numPr>
         <w:jc w:val="thaiDistribute"/>
-        <w:ind w:firstLine="720"/>
+        <w:ind w:firstLine="992"/>
       </w:pPr>
       <w:r>
         <w:rPr>
@@ -5828,7 +5828,7 @@
           <w:numId w:val="1010"/>
         </w:numPr>
         <w:jc w:val="thaiDistribute"/>
-        <w:ind w:firstLine="720"/>
+        <w:ind w:firstLine="992"/>
       </w:pPr>
       <w:r>
         <w:rPr>
@@ -5852,7 +5852,7 @@
           <w:numId w:val="1010"/>
         </w:numPr>
         <w:jc w:val="thaiDistribute"/>
-        <w:ind w:firstLine="720"/>
+        <w:ind w:firstLine="992"/>
       </w:pPr>
       <w:r>
         <w:rPr>
@@ -5872,7 +5872,7 @@
       <w:pPr>
         <w:pStyle w:val="FirstParagraph"/>
         <w:jc w:val="thaiDistribute"/>
-        <w:ind w:firstLine="720"/>
+        <w:ind w:firstLine="992"/>
       </w:pPr>
       <w:r>
         <w:t xml:space="preserve">  </w:t>
@@ -5893,7 +5893,7 @@
           <w:numId w:val="1011"/>
         </w:numPr>
         <w:jc w:val="thaiDistribute"/>
-        <w:ind w:firstLine="720"/>
+        <w:ind w:firstLine="992"/>
       </w:pPr>
       <w:r>
         <w:rPr>
@@ -5926,7 +5926,7 @@
           <w:numId w:val="1012"/>
         </w:numPr>
         <w:jc w:val="thaiDistribute"/>
-        <w:ind w:firstLine="720"/>
+        <w:ind w:firstLine="992"/>
       </w:pPr>
       <w:r>
         <w:rPr>
@@ -5966,7 +5966,7 @@
           <w:numId w:val="1012"/>
         </w:numPr>
         <w:jc w:val="thaiDistribute"/>
-        <w:ind w:firstLine="720"/>
+        <w:ind w:firstLine="992"/>
       </w:pPr>
       <w:r>
         <w:rPr>
@@ -5990,7 +5990,7 @@
           <w:numId w:val="1013"/>
         </w:numPr>
         <w:jc w:val="thaiDistribute"/>
-        <w:ind w:firstLine="720"/>
+        <w:ind w:firstLine="992"/>
       </w:pPr>
       <w:r>
         <w:rPr>
@@ -6023,7 +6023,7 @@
           <w:numId w:val="1014"/>
         </w:numPr>
         <w:jc w:val="thaiDistribute"/>
-        <w:ind w:firstLine="720"/>
+        <w:ind w:firstLine="992"/>
       </w:pPr>
       <w:r>
         <w:rPr>
@@ -6047,7 +6047,7 @@
           <w:numId w:val="1014"/>
         </w:numPr>
         <w:jc w:val="thaiDistribute"/>
-        <w:ind w:firstLine="720"/>
+        <w:ind w:firstLine="992"/>
       </w:pPr>
       <w:r>
         <w:rPr>
@@ -6124,7 +6124,7 @@
           <w:numId w:val="1015"/>
         </w:numPr>
         <w:jc w:val="thaiDistribute"/>
-        <w:ind w:firstLine="720"/>
+        <w:ind w:firstLine="992"/>
       </w:pPr>
       <w:r>
         <w:rPr>
@@ -6157,7 +6157,7 @@
           <w:numId w:val="1016"/>
         </w:numPr>
         <w:jc w:val="thaiDistribute"/>
-        <w:ind w:firstLine="720"/>
+        <w:ind w:firstLine="992"/>
       </w:pPr>
       <w:r>
         <w:rPr>
@@ -6181,7 +6181,7 @@
           <w:numId w:val="1016"/>
         </w:numPr>
         <w:jc w:val="thaiDistribute"/>
-        <w:ind w:firstLine="720"/>
+        <w:ind w:firstLine="992"/>
       </w:pPr>
       <w:r>
         <w:rPr>
@@ -6265,7 +6265,7 @@
       <w:pPr>
         <w:pStyle w:val="FirstParagraph"/>
         <w:jc w:val="thaiDistribute"/>
-        <w:ind w:firstLine="720"/>
+        <w:ind w:firstLine="992"/>
       </w:pPr>
       <w:r>
         <w:t xml:space="preserve">  </w:t>
@@ -6288,7 +6288,7 @@
       <w:pPr>
         <w:pStyle w:val="BodyText"/>
         <w:jc w:val="thaiDistribute"/>
-        <w:ind w:firstLine="720"/>
+        <w:ind w:firstLine="992"/>
       </w:pPr>
       <w:r>
         <w:t xml:space="preserve">  </w:t>
@@ -6311,7 +6311,7 @@
       <w:pPr>
         <w:pStyle w:val="BodyText"/>
         <w:jc w:val="thaiDistribute"/>
-        <w:ind w:firstLine="720"/>
+        <w:ind w:firstLine="992"/>
       </w:pPr>
       <w:r>
         <w:t xml:space="preserve">  </w:t>
@@ -6393,7 +6393,7 @@
     <w:p>
       <w:pPr>
         <w:jc w:val="thaiDistribute"/>
-        <w:ind w:firstLine="720"/>
+        <w:ind w:firstLine="992"/>
       </w:pPr>
       <w:r>
         <w:pict>
@@ -6451,7 +6451,7 @@
       <w:pPr>
         <w:pStyle w:val="BlockText"/>
         <w:jc w:val="thaiDistribute"/>
-        <w:ind w:firstLine="720"/>
+        <w:ind w:firstLine="992"/>
       </w:pPr>
       <w:r>
         <w:t xml:space="preserve">** สรุปความเข้าใจส่วนที่ 1.5:**</w:t>
@@ -6508,7 +6508,7 @@
     <w:p>
       <w:pPr>
         <w:jc w:val="thaiDistribute"/>
-        <w:ind w:firstLine="720"/>
+        <w:ind w:firstLine="992"/>
       </w:pPr>
       <w:r>
         <w:pict>
@@ -6531,7 +6531,7 @@
     <w:p>
       <w:pPr>
         <w:jc w:val="thaiDistribute"/>
-        <w:ind w:firstLine="720"/>
+        <w:ind w:firstLine="992"/>
       </w:pPr>
       <w:r>
         <w:pict>
@@ -6552,7 +6552,7 @@
       <w:pPr>
         <w:pStyle w:val="FirstParagraph"/>
         <w:jc w:val="thaiDistribute"/>
-        <w:ind w:firstLine="720"/>
+        <w:ind w:firstLine="992"/>
       </w:pPr>
       <w:r>
         <w:t xml:space="preserve">  ระบบที่ดีไม่ใช่แค่อ่านถูก แต่ต้องรู้ว่าเมื่อไหร่ “ไม่ควรเชื่อคำตอบตัวเอง” — ส่วนนี้คือตาข่ายนิรภัย</w:t>
@@ -6586,7 +6586,7 @@
       <w:pPr>
         <w:pStyle w:val="FirstParagraph"/>
         <w:jc w:val="thaiDistribute"/>
-        <w:ind w:firstLine="720"/>
+        <w:ind w:firstLine="992"/>
       </w:pPr>
       <w:r>
         <w:t xml:space="preserve">ดูเวอร์ชันข้อความ</w:t>
@@ -6642,7 +6642,7 @@
           <w:numId w:val="1017"/>
         </w:numPr>
         <w:jc w:val="thaiDistribute"/>
-        <w:ind w:firstLine="720"/>
+        <w:ind w:firstLine="992"/>
       </w:pPr>
       <w:r>
         <w:rPr>
@@ -6738,7 +6738,7 @@
           <w:numId w:val="1017"/>
         </w:numPr>
         <w:jc w:val="thaiDistribute"/>
-        <w:ind w:firstLine="720"/>
+        <w:ind w:firstLine="992"/>
       </w:pPr>
       <w:r>
         <w:rPr>
@@ -6777,7 +6777,7 @@
           <w:numId w:val="1017"/>
         </w:numPr>
         <w:jc w:val="thaiDistribute"/>
-        <w:ind w:firstLine="720"/>
+        <w:ind w:firstLine="992"/>
       </w:pPr>
       <w:r>
         <w:rPr>
@@ -6830,7 +6830,7 @@
       <w:pPr>
         <w:pStyle w:val="FirstParagraph"/>
         <w:jc w:val="thaiDistribute"/>
-        <w:ind w:firstLine="720"/>
+        <w:ind w:firstLine="992"/>
       </w:pPr>
       <w:r>
         <w:t xml:space="preserve">  </w:t>
@@ -6853,7 +6853,7 @@
       <w:pPr>
         <w:pStyle w:val="BodyText"/>
         <w:jc w:val="thaiDistribute"/>
-        <w:ind w:firstLine="720"/>
+        <w:ind w:firstLine="992"/>
       </w:pPr>
       <w:r>
         <w:t xml:space="preserve">  </w:t>
@@ -6891,7 +6891,7 @@
       <w:pPr>
         <w:pStyle w:val="BodyText"/>
         <w:jc w:val="thaiDistribute"/>
-        <w:ind w:firstLine="720"/>
+        <w:ind w:firstLine="992"/>
       </w:pPr>
       <w:r>
         <w:t xml:space="preserve">  </w:t>
@@ -7004,7 +7004,7 @@
     <w:p>
       <w:pPr>
         <w:jc w:val="thaiDistribute"/>
-        <w:ind w:firstLine="720"/>
+        <w:ind w:firstLine="992"/>
       </w:pPr>
       <w:r>
         <w:pict>
@@ -7035,7 +7035,7 @@
       <w:pPr>
         <w:pStyle w:val="FirstParagraph"/>
         <w:jc w:val="thaiDistribute"/>
-        <w:ind w:firstLine="720"/>
+        <w:ind w:firstLine="992"/>
       </w:pPr>
       <w:r>
         <w:t xml:space="preserve">  ฟังก์ชันนี้เป็น “ผู้กำกับ” ที่เรียกทุกขั้นตอนตามลำดับ และสร้าง</w:t>
@@ -7060,7 +7060,7 @@
       <w:pPr>
         <w:pStyle w:val="BodyText"/>
         <w:jc w:val="thaiDistribute"/>
-        <w:ind w:firstLine="720"/>
+        <w:ind w:firstLine="992"/>
       </w:pPr>
       <w:r>
         <w:t xml:space="preserve">  </w:t>
@@ -7092,7 +7092,7 @@
       <w:pPr>
         <w:pStyle w:val="BodyText"/>
         <w:jc w:val="thaiDistribute"/>
-        <w:ind w:firstLine="720"/>
+        <w:ind w:firstLine="992"/>
       </w:pPr>
       <w:r>
         <w:t xml:space="preserve">  </w:t>
@@ -7130,7 +7130,7 @@
       <w:pPr>
         <w:pStyle w:val="BodyText"/>
         <w:jc w:val="thaiDistribute"/>
-        <w:ind w:firstLine="720"/>
+        <w:ind w:firstLine="992"/>
       </w:pPr>
       <w:r>
         <w:t xml:space="preserve">  </w:t>
@@ -7244,7 +7244,7 @@
       <w:pPr>
         <w:pStyle w:val="FirstParagraph"/>
         <w:jc w:val="thaiDistribute"/>
-        <w:ind w:firstLine="720"/>
+        <w:ind w:firstLine="992"/>
       </w:pPr>
       <w:r>
         <w:t xml:space="preserve">  </w:t>
@@ -7356,7 +7356,7 @@
     <w:p>
       <w:pPr>
         <w:jc w:val="thaiDistribute"/>
-        <w:ind w:firstLine="720"/>
+        <w:ind w:firstLine="992"/>
       </w:pPr>
       <w:r>
         <w:pict>
@@ -7379,7 +7379,7 @@
       <w:pPr>
         <w:pStyle w:val="BlockText"/>
         <w:jc w:val="thaiDistribute"/>
-        <w:ind w:firstLine="720"/>
+        <w:ind w:firstLine="992"/>
       </w:pPr>
       <w:r>
         <w:rPr>
@@ -7399,7 +7399,7 @@
       <w:pPr>
         <w:pStyle w:val="FirstParagraph"/>
         <w:jc w:val="thaiDistribute"/>
-        <w:ind w:firstLine="720"/>
+        <w:ind w:firstLine="992"/>
       </w:pPr>
       <w:r>
         <w:t xml:space="preserve">  </w:t>
@@ -7431,7 +7431,7 @@
       <w:pPr>
         <w:pStyle w:val="BodyText"/>
         <w:jc w:val="thaiDistribute"/>
-        <w:ind w:firstLine="720"/>
+        <w:ind w:firstLine="992"/>
       </w:pPr>
       <w:r>
         <w:t xml:space="preserve">  </w:t>
@@ -7484,7 +7484,7 @@
       <w:pPr>
         <w:pStyle w:val="BodyText"/>
         <w:jc w:val="thaiDistribute"/>
-        <w:ind w:firstLine="720"/>
+        <w:ind w:firstLine="992"/>
       </w:pPr>
       <w:r>
         <w:t xml:space="preserve">  </w:t>
@@ -7537,7 +7537,7 @@
       <w:pPr>
         <w:pStyle w:val="BodyText"/>
         <w:jc w:val="thaiDistribute"/>
-        <w:ind w:firstLine="720"/>
+        <w:ind w:firstLine="992"/>
       </w:pPr>
       <w:r>
         <w:t xml:space="preserve">  </w:t>
@@ -7575,7 +7575,7 @@
       <w:pPr>
         <w:pStyle w:val="BodyText"/>
         <w:jc w:val="thaiDistribute"/>
-        <w:ind w:firstLine="720"/>
+        <w:ind w:firstLine="992"/>
       </w:pPr>
       <w:r>
         <w:t xml:space="preserve">  </w:t>
@@ -7686,7 +7686,7 @@
       <w:pPr>
         <w:pStyle w:val="FirstParagraph"/>
         <w:jc w:val="thaiDistribute"/>
-        <w:ind w:firstLine="720"/>
+        <w:ind w:firstLine="992"/>
       </w:pPr>
       <w:r>
         <w:t xml:space="preserve">  </w:t>
@@ -7723,7 +7723,7 @@
     <w:p>
       <w:pPr>
         <w:jc w:val="thaiDistribute"/>
-        <w:ind w:firstLine="720"/>
+        <w:ind w:firstLine="992"/>
       </w:pPr>
       <w:r>
         <w:pict>
@@ -7745,7 +7745,7 @@
       <w:pPr>
         <w:pStyle w:val="BlockText"/>
         <w:jc w:val="thaiDistribute"/>
-        <w:ind w:firstLine="720"/>
+        <w:ind w:firstLine="992"/>
       </w:pPr>
       <w:r>
         <w:rPr>
@@ -7765,7 +7765,7 @@
       <w:pPr>
         <w:pStyle w:val="FirstParagraph"/>
         <w:jc w:val="thaiDistribute"/>
-        <w:ind w:firstLine="720"/>
+        <w:ind w:firstLine="992"/>
       </w:pPr>
       <w:r>
         <w:t xml:space="preserve">  </w:t>
@@ -7788,7 +7788,7 @@
       <w:pPr>
         <w:pStyle w:val="BodyText"/>
         <w:jc w:val="thaiDistribute"/>
-        <w:ind w:firstLine="720"/>
+        <w:ind w:firstLine="992"/>
       </w:pPr>
       <w:r>
         <w:t xml:space="preserve">  </w:t>
@@ -7826,7 +7826,7 @@
       <w:pPr>
         <w:pStyle w:val="BodyText"/>
         <w:jc w:val="thaiDistribute"/>
-        <w:ind w:firstLine="720"/>
+        <w:ind w:firstLine="992"/>
       </w:pPr>
       <w:r>
         <w:t xml:space="preserve">  </w:t>
@@ -7849,7 +7849,7 @@
       <w:pPr>
         <w:pStyle w:val="BodyText"/>
         <w:jc w:val="thaiDistribute"/>
-        <w:ind w:firstLine="720"/>
+        <w:ind w:firstLine="992"/>
       </w:pPr>
       <w:r>
         <w:t xml:space="preserve">  </w:t>
@@ -7872,7 +7872,7 @@
       <w:pPr>
         <w:pStyle w:val="BodyText"/>
         <w:jc w:val="thaiDistribute"/>
-        <w:ind w:firstLine="720"/>
+        <w:ind w:firstLine="992"/>
       </w:pPr>
       <w:r>
         <w:t xml:space="preserve">  </w:t>
@@ -7992,7 +7992,7 @@
       <w:pPr>
         <w:pStyle w:val="FirstParagraph"/>
         <w:jc w:val="thaiDistribute"/>
-        <w:ind w:firstLine="720"/>
+        <w:ind w:firstLine="992"/>
       </w:pPr>
       <w:r>
         <w:t xml:space="preserve">  </w:t>
@@ -8029,7 +8029,7 @@
     <w:p>
       <w:pPr>
         <w:jc w:val="thaiDistribute"/>
-        <w:ind w:firstLine="720"/>
+        <w:ind w:firstLine="992"/>
       </w:pPr>
       <w:r>
         <w:pict>
@@ -8243,7 +8243,7 @@
       <w:pPr>
         <w:pStyle w:val="BlockText"/>
         <w:jc w:val="thaiDistribute"/>
-        <w:ind w:firstLine="720"/>
+        <w:ind w:firstLine="992"/>
       </w:pPr>
       <w:r>
         <w:rPr>
@@ -8262,7 +8262,7 @@
     <w:p>
       <w:pPr>
         <w:jc w:val="thaiDistribute"/>
-        <w:ind w:firstLine="720"/>
+        <w:ind w:firstLine="992"/>
       </w:pPr>
       <w:r>
         <w:pict>
@@ -8284,7 +8284,7 @@
       <w:pPr>
         <w:pStyle w:val="FirstParagraph"/>
         <w:jc w:val="thaiDistribute"/>
-        <w:ind w:firstLine="720"/>
+        <w:ind w:firstLine="992"/>
       </w:pPr>
       <w:r>
         <w:t xml:space="preserve">  อ่านตารางแบบ “อาการ → สาเหตุ → ตรวจตรงไหน → แก้อย่างไร”</w:t>
@@ -8852,7 +8852,7 @@
       <w:pPr>
         <w:pStyle w:val="BlockText"/>
         <w:jc w:val="thaiDistribute"/>
-        <w:ind w:firstLine="720"/>
+        <w:ind w:firstLine="992"/>
       </w:pPr>
       <w:r>
         <w:rPr>
@@ -8907,7 +8907,7 @@
     <w:p>
       <w:pPr>
         <w:jc w:val="thaiDistribute"/>
-        <w:ind w:firstLine="720"/>
+        <w:ind w:firstLine="992"/>
       </w:pPr>
       <w:r>
         <w:pict>
@@ -8930,7 +8930,7 @@
       <w:pPr>
         <w:pStyle w:val="FirstParagraph"/>
         <w:jc w:val="thaiDistribute"/>
-        <w:ind w:firstLine="720"/>
+        <w:ind w:firstLine="992"/>
       </w:pPr>
       <w:r>
         <w:t xml:space="preserve">  ก่อนเอาไปใช้หน้างานจริง ควรคิด 3 เรื่องนี้:</w:t>
@@ -8944,7 +8944,7 @@
           <w:numId w:val="1019"/>
         </w:numPr>
         <w:jc w:val="thaiDistribute"/>
-        <w:ind w:firstLine="720"/>
+        <w:ind w:firstLine="992"/>
       </w:pPr>
       <w:r>
         <w:rPr>
@@ -8968,7 +8968,7 @@
           <w:numId w:val="1019"/>
         </w:numPr>
         <w:jc w:val="thaiDistribute"/>
-        <w:ind w:firstLine="720"/>
+        <w:ind w:firstLine="992"/>
       </w:pPr>
       <w:r>
         <w:rPr>
@@ -8992,7 +8992,7 @@
           <w:numId w:val="1019"/>
         </w:numPr>
         <w:jc w:val="thaiDistribute"/>
-        <w:ind w:firstLine="720"/>
+        <w:ind w:firstLine="992"/>
       </w:pPr>
       <w:r>
         <w:rPr>
@@ -9028,7 +9028,7 @@
       <w:pPr>
         <w:pStyle w:val="BlockText"/>
         <w:jc w:val="thaiDistribute"/>
-        <w:ind w:firstLine="720"/>
+        <w:ind w:firstLine="992"/>
       </w:pPr>
       <w:r>
         <w:t xml:space="preserve">** สรุปความเข้าใจส่วนที่ 2:**</w:t>
@@ -9055,7 +9055,7 @@
     <w:p>
       <w:pPr>
         <w:jc w:val="thaiDistribute"/>
-        <w:ind w:firstLine="720"/>
+        <w:ind w:firstLine="992"/>
       </w:pPr>
       <w:r>
         <w:pict>
@@ -9077,7 +9077,7 @@
       <w:pPr>
         <w:pStyle w:val="FirstParagraph"/>
         <w:jc w:val="thaiDistribute"/>
-        <w:ind w:firstLine="720"/>
+        <w:ind w:firstLine="992"/>
       </w:pPr>
       <w:r>
         <w:t xml:space="preserve">  รวบรวมคำศัพท์ภาษาอังกฤษทางเทคนิคทั้งหมดที่ปรากฏในคู่มือฉบับนี้ พร้อมคำอธิบายที่เข้าใจง่าย:</w:t>
@@ -9100,7 +9100,7 @@
           <w:numId w:val="1020"/>
         </w:numPr>
         <w:jc w:val="thaiDistribute"/>
-        <w:ind w:firstLine="720"/>
+        <w:ind w:firstLine="992"/>
       </w:pPr>
       <w:r>
         <w:rPr>
@@ -9124,7 +9124,7 @@
           <w:numId w:val="1020"/>
         </w:numPr>
         <w:jc w:val="thaiDistribute"/>
-        <w:ind w:firstLine="720"/>
+        <w:ind w:firstLine="992"/>
       </w:pPr>
       <w:r>
         <w:rPr>
@@ -9178,7 +9178,7 @@
           <w:numId w:val="1020"/>
         </w:numPr>
         <w:jc w:val="thaiDistribute"/>
-        <w:ind w:firstLine="720"/>
+        <w:ind w:firstLine="992"/>
       </w:pPr>
       <w:r>
         <w:rPr>
@@ -9202,7 +9202,7 @@
           <w:numId w:val="1020"/>
         </w:numPr>
         <w:jc w:val="thaiDistribute"/>
-        <w:ind w:firstLine="720"/>
+        <w:ind w:firstLine="992"/>
       </w:pPr>
       <w:r>
         <w:rPr>
@@ -9226,7 +9226,7 @@
           <w:numId w:val="1020"/>
         </w:numPr>
         <w:jc w:val="thaiDistribute"/>
-        <w:ind w:firstLine="720"/>
+        <w:ind w:firstLine="992"/>
       </w:pPr>
       <w:r>
         <w:rPr>
@@ -9250,7 +9250,7 @@
           <w:numId w:val="1020"/>
         </w:numPr>
         <w:jc w:val="thaiDistribute"/>
-        <w:ind w:firstLine="720"/>
+        <w:ind w:firstLine="992"/>
       </w:pPr>
       <w:r>
         <w:rPr>
@@ -9274,7 +9274,7 @@
           <w:numId w:val="1020"/>
         </w:numPr>
         <w:jc w:val="thaiDistribute"/>
-        <w:ind w:firstLine="720"/>
+        <w:ind w:firstLine="992"/>
       </w:pPr>
       <w:r>
         <w:rPr>
@@ -9298,7 +9298,7 @@
           <w:numId w:val="1020"/>
         </w:numPr>
         <w:jc w:val="thaiDistribute"/>
-        <w:ind w:firstLine="720"/>
+        <w:ind w:firstLine="992"/>
       </w:pPr>
       <w:r>
         <w:rPr>
@@ -9322,7 +9322,7 @@
           <w:numId w:val="1020"/>
         </w:numPr>
         <w:jc w:val="thaiDistribute"/>
-        <w:ind w:firstLine="720"/>
+        <w:ind w:firstLine="992"/>
       </w:pPr>
       <w:r>
         <w:rPr>
@@ -9346,7 +9346,7 @@
           <w:numId w:val="1020"/>
         </w:numPr>
         <w:jc w:val="thaiDistribute"/>
-        <w:ind w:firstLine="720"/>
+        <w:ind w:firstLine="992"/>
       </w:pPr>
       <w:r>
         <w:rPr>
@@ -9370,7 +9370,7 @@
           <w:numId w:val="1020"/>
         </w:numPr>
         <w:jc w:val="thaiDistribute"/>
-        <w:ind w:firstLine="720"/>
+        <w:ind w:firstLine="992"/>
       </w:pPr>
       <w:r>
         <w:rPr>
@@ -9394,7 +9394,7 @@
           <w:numId w:val="1020"/>
         </w:numPr>
         <w:jc w:val="thaiDistribute"/>
-        <w:ind w:firstLine="720"/>
+        <w:ind w:firstLine="992"/>
       </w:pPr>
       <w:r>
         <w:rPr>
@@ -9418,7 +9418,7 @@
           <w:numId w:val="1020"/>
         </w:numPr>
         <w:jc w:val="thaiDistribute"/>
-        <w:ind w:firstLine="720"/>
+        <w:ind w:firstLine="992"/>
       </w:pPr>
       <w:r>
         <w:rPr>
@@ -9442,7 +9442,7 @@
           <w:numId w:val="1020"/>
         </w:numPr>
         <w:jc w:val="thaiDistribute"/>
-        <w:ind w:firstLine="720"/>
+        <w:ind w:firstLine="992"/>
       </w:pPr>
       <w:r>
         <w:rPr>
@@ -9466,7 +9466,7 @@
           <w:numId w:val="1020"/>
         </w:numPr>
         <w:jc w:val="thaiDistribute"/>
-        <w:ind w:firstLine="720"/>
+        <w:ind w:firstLine="992"/>
       </w:pPr>
       <w:r>
         <w:rPr>
@@ -9490,7 +9490,7 @@
           <w:numId w:val="1020"/>
         </w:numPr>
         <w:jc w:val="thaiDistribute"/>
-        <w:ind w:firstLine="720"/>
+        <w:ind w:firstLine="992"/>
       </w:pPr>
       <w:r>
         <w:rPr>
@@ -9514,7 +9514,7 @@
           <w:numId w:val="1020"/>
         </w:numPr>
         <w:jc w:val="thaiDistribute"/>
-        <w:ind w:firstLine="720"/>
+        <w:ind w:firstLine="992"/>
       </w:pPr>
       <w:r>
         <w:rPr>
@@ -9550,7 +9550,7 @@
           <w:numId w:val="1020"/>
         </w:numPr>
         <w:jc w:val="thaiDistribute"/>
-        <w:ind w:firstLine="720"/>
+        <w:ind w:firstLine="992"/>
       </w:pPr>
       <w:r>
         <w:rPr>
@@ -9574,7 +9574,7 @@
           <w:numId w:val="1020"/>
         </w:numPr>
         <w:jc w:val="thaiDistribute"/>
-        <w:ind w:firstLine="720"/>
+        <w:ind w:firstLine="992"/>
       </w:pPr>
       <w:r>
         <w:rPr>
@@ -9608,7 +9608,7 @@
           <w:numId w:val="1021"/>
         </w:numPr>
         <w:jc w:val="thaiDistribute"/>
-        <w:ind w:firstLine="720"/>
+        <w:ind w:firstLine="992"/>
       </w:pPr>
       <w:r>
         <w:rPr>
@@ -9632,7 +9632,7 @@
           <w:numId w:val="1021"/>
         </w:numPr>
         <w:jc w:val="thaiDistribute"/>
-        <w:ind w:firstLine="720"/>
+        <w:ind w:firstLine="992"/>
       </w:pPr>
       <w:r>
         <w:rPr>
@@ -9650,7 +9650,7 @@
           <w:numId w:val="1021"/>
         </w:numPr>
         <w:jc w:val="thaiDistribute"/>
-        <w:ind w:firstLine="720"/>
+        <w:ind w:firstLine="992"/>
       </w:pPr>
       <w:r>
         <w:rPr>
@@ -9674,7 +9674,7 @@
           <w:numId w:val="1021"/>
         </w:numPr>
         <w:jc w:val="thaiDistribute"/>
-        <w:ind w:firstLine="720"/>
+        <w:ind w:firstLine="992"/>
       </w:pPr>
       <w:r>
         <w:rPr>
@@ -9698,7 +9698,7 @@
           <w:numId w:val="1021"/>
         </w:numPr>
         <w:jc w:val="thaiDistribute"/>
-        <w:ind w:firstLine="720"/>
+        <w:ind w:firstLine="992"/>
       </w:pPr>
       <w:r>
         <w:rPr>
@@ -9722,7 +9722,7 @@
           <w:numId w:val="1021"/>
         </w:numPr>
         <w:jc w:val="thaiDistribute"/>
-        <w:ind w:firstLine="720"/>
+        <w:ind w:firstLine="992"/>
       </w:pPr>
       <w:r>
         <w:rPr>
@@ -9746,7 +9746,7 @@
           <w:numId w:val="1021"/>
         </w:numPr>
         <w:jc w:val="thaiDistribute"/>
-        <w:ind w:firstLine="720"/>
+        <w:ind w:firstLine="992"/>
       </w:pPr>
       <w:r>
         <w:rPr>
@@ -9805,7 +9805,7 @@
           <w:numId w:val="1021"/>
         </w:numPr>
         <w:jc w:val="thaiDistribute"/>
-        <w:ind w:firstLine="720"/>
+        <w:ind w:firstLine="992"/>
       </w:pPr>
       <w:r>
         <w:rPr>
@@ -9829,7 +9829,7 @@
           <w:numId w:val="1021"/>
         </w:numPr>
         <w:jc w:val="thaiDistribute"/>
-        <w:ind w:firstLine="720"/>
+        <w:ind w:firstLine="992"/>
       </w:pPr>
       <w:r>
         <w:rPr>
@@ -9853,7 +9853,7 @@
           <w:numId w:val="1021"/>
         </w:numPr>
         <w:jc w:val="thaiDistribute"/>
-        <w:ind w:firstLine="720"/>
+        <w:ind w:firstLine="992"/>
       </w:pPr>
       <w:r>
         <w:rPr>
@@ -9939,7 +9939,7 @@
           <w:numId w:val="1021"/>
         </w:numPr>
         <w:jc w:val="thaiDistribute"/>
-        <w:ind w:firstLine="720"/>
+        <w:ind w:firstLine="992"/>
       </w:pPr>
       <w:r>
         <w:rPr>
@@ -9978,7 +9978,7 @@
           <w:numId w:val="1021"/>
         </w:numPr>
         <w:jc w:val="thaiDistribute"/>
-        <w:ind w:firstLine="720"/>
+        <w:ind w:firstLine="992"/>
       </w:pPr>
       <w:r>
         <w:rPr>
@@ -10002,7 +10002,7 @@
           <w:numId w:val="1021"/>
         </w:numPr>
         <w:jc w:val="thaiDistribute"/>
-        <w:ind w:firstLine="720"/>
+        <w:ind w:firstLine="992"/>
       </w:pPr>
       <w:r>
         <w:rPr>
@@ -10086,7 +10086,7 @@
           <w:numId w:val="1022"/>
         </w:numPr>
         <w:jc w:val="thaiDistribute"/>
-        <w:ind w:firstLine="720"/>
+        <w:ind w:firstLine="992"/>
       </w:pPr>
       <w:r>
         <w:rPr>
@@ -10110,7 +10110,7 @@
           <w:numId w:val="1022"/>
         </w:numPr>
         <w:jc w:val="thaiDistribute"/>
-        <w:ind w:firstLine="720"/>
+        <w:ind w:firstLine="992"/>
       </w:pPr>
       <w:r>
         <w:rPr>
@@ -10134,7 +10134,7 @@
           <w:numId w:val="1022"/>
         </w:numPr>
         <w:jc w:val="thaiDistribute"/>
-        <w:ind w:firstLine="720"/>
+        <w:ind w:firstLine="992"/>
       </w:pPr>
       <w:r>
         <w:rPr>
@@ -10170,7 +10170,7 @@
           <w:numId w:val="1022"/>
         </w:numPr>
         <w:jc w:val="thaiDistribute"/>
-        <w:ind w:firstLine="720"/>
+        <w:ind w:firstLine="992"/>
       </w:pPr>
       <w:r>
         <w:rPr>
@@ -10194,7 +10194,7 @@
           <w:numId w:val="1022"/>
         </w:numPr>
         <w:jc w:val="thaiDistribute"/>
-        <w:ind w:firstLine="720"/>
+        <w:ind w:firstLine="992"/>
       </w:pPr>
       <w:r>
         <w:rPr>
@@ -10218,7 +10218,7 @@
           <w:numId w:val="1022"/>
         </w:numPr>
         <w:jc w:val="thaiDistribute"/>
-        <w:ind w:firstLine="720"/>
+        <w:ind w:firstLine="992"/>
       </w:pPr>
       <w:r>
         <w:rPr>
@@ -10242,7 +10242,7 @@
           <w:numId w:val="1022"/>
         </w:numPr>
         <w:jc w:val="thaiDistribute"/>
-        <w:ind w:firstLine="720"/>
+        <w:ind w:firstLine="992"/>
       </w:pPr>
       <w:r>
         <w:rPr>
@@ -10266,7 +10266,7 @@
           <w:numId w:val="1022"/>
         </w:numPr>
         <w:jc w:val="thaiDistribute"/>
-        <w:ind w:firstLine="720"/>
+        <w:ind w:firstLine="992"/>
       </w:pPr>
       <w:r>
         <w:rPr>
@@ -10290,7 +10290,7 @@
           <w:numId w:val="1022"/>
         </w:numPr>
         <w:jc w:val="thaiDistribute"/>
-        <w:ind w:firstLine="720"/>
+        <w:ind w:firstLine="992"/>
       </w:pPr>
       <w:r>
         <w:rPr>
@@ -10314,7 +10314,7 @@
           <w:numId w:val="1022"/>
         </w:numPr>
         <w:jc w:val="thaiDistribute"/>
-        <w:ind w:firstLine="720"/>
+        <w:ind w:firstLine="992"/>
       </w:pPr>
       <w:r>
         <w:rPr>
@@ -10338,7 +10338,7 @@
           <w:numId w:val="1022"/>
         </w:numPr>
         <w:jc w:val="thaiDistribute"/>
-        <w:ind w:firstLine="720"/>
+        <w:ind w:firstLine="992"/>
       </w:pPr>
       <w:r>
         <w:rPr>
@@ -10370,7 +10370,7 @@
           <w:numId w:val="1022"/>
         </w:numPr>
         <w:jc w:val="thaiDistribute"/>
-        <w:ind w:firstLine="720"/>
+        <w:ind w:firstLine="992"/>
       </w:pPr>
       <w:r>
         <w:rPr>
@@ -10404,7 +10404,7 @@
     <w:p>
       <w:pPr>
         <w:jc w:val="thaiDistribute"/>
-        <w:ind w:firstLine="720"/>
+        <w:ind w:firstLine="992"/>
       </w:pPr>
       <w:r>
         <w:pict>
@@ -10425,155 +10425,204 @@
     </w:p>
     <w:p>
       <w:pPr>
-        <w:numPr>
-          <w:ilvl w:val="0"/>
-          <w:numId w:val="1023"/>
-        </w:numPr>
-        <w:jc w:val="thaiDistribute"/>
-        <w:ind w:firstLine="720"/>
-      </w:pPr>
-      <w:r>
-        <w:t xml:space="preserve">Tschannen, M., Gritsenko, A., Wang, X., Naeem, M. F., Alabdulmohsin, I., Parthasarathy, N., Evans, T., Beyer, L., Xia, Y., Mustafa, B., Hénaff, O., Harmsen, J., Steiner, A., &amp; Zhai, X. (2025). SigLIP 2: Multilingual vision-language encoders with improved semantic understanding, localization, and dense features.</w:t>
-      </w:r>
-      <w:r>
-        <w:t xml:space="preserve"> </w:t>
-      </w:r>
-      <w:r>
-        <w:rPr>
-          <w:i/>
-          <w:iCs/>
-        </w:rPr>
-        <w:t xml:space="preserve">arXiv</w:t>
-      </w:r>
-      <w:r>
-        <w:t xml:space="preserve">. https://doi.org/10.48550/arXiv.2502.14786</w:t>
-      </w:r>
-    </w:p>
-    <w:p>
-      <w:pPr>
-        <w:numPr>
-          <w:ilvl w:val="0"/>
-          <w:numId w:val="1023"/>
-        </w:numPr>
-        <w:jc w:val="thaiDistribute"/>
-        <w:ind w:firstLine="720"/>
-      </w:pPr>
-      <w:r>
-        <w:t xml:space="preserve">Li, X., et al. (2020). Water meter reading recognition based on computer vision and deep learning.</w:t>
-      </w:r>
-      <w:r>
-        <w:t xml:space="preserve"> </w:t>
-      </w:r>
-      <w:r>
-        <w:rPr>
-          <w:i/>
-          <w:iCs/>
-        </w:rPr>
-        <w:t xml:space="preserve">IEEE Access</w:t>
-      </w:r>
-      <w:r>
-        <w:t xml:space="preserve">.</w:t>
-      </w:r>
-    </w:p>
-    <w:p>
-      <w:pPr>
-        <w:numPr>
-          <w:ilvl w:val="0"/>
-          <w:numId w:val="1023"/>
-        </w:numPr>
-        <w:jc w:val="thaiDistribute"/>
-        <w:ind w:firstLine="720"/>
-      </w:pPr>
-      <w:r>
-        <w:t xml:space="preserve">Ultralytics. (2024).</w:t>
-      </w:r>
-      <w:r>
-        <w:t xml:space="preserve"> </w:t>
-      </w:r>
-      <w:r>
-        <w:rPr>
-          <w:i/>
-          <w:iCs/>
-        </w:rPr>
-        <w:t xml:space="preserve">YOLOv8 &amp; YOLO11: Real-time object detection and image segmentation</w:t>
-      </w:r>
-      <w:r>
-        <w:t xml:space="preserve">. https://docs.ultralytics.com</w:t>
-      </w:r>
-    </w:p>
-    <w:p>
-      <w:pPr>
-        <w:numPr>
-          <w:ilvl w:val="0"/>
-          <w:numId w:val="1023"/>
-        </w:numPr>
-        <w:jc w:val="thaiDistribute"/>
-        <w:ind w:firstLine="720"/>
-      </w:pPr>
-      <w:r>
-        <w:t xml:space="preserve">FastAPI. (2024).</w:t>
-      </w:r>
-      <w:r>
-        <w:t xml:space="preserve"> </w:t>
-      </w:r>
-      <w:r>
-        <w:rPr>
-          <w:i/>
-          <w:iCs/>
-        </w:rPr>
-        <w:t xml:space="preserve">FastAPI framework, high performance, easy to learn, fast to code</w:t>
-      </w:r>
-      <w:r>
-        <w:t xml:space="preserve">. https://fastapi.tiangolo.com</w:t>
-      </w:r>
-    </w:p>
-    <w:p>
-      <w:pPr>
-        <w:numPr>
-          <w:ilvl w:val="0"/>
-          <w:numId w:val="1023"/>
-        </w:numPr>
-        <w:jc w:val="thaiDistribute"/>
-        <w:ind w:firstLine="720"/>
-      </w:pPr>
-      <w:r>
-        <w:t xml:space="preserve">Gradio. (2024).</w:t>
-      </w:r>
-      <w:r>
-        <w:t xml:space="preserve"> </w:t>
-      </w:r>
-      <w:r>
-        <w:rPr>
-          <w:i/>
-          <w:iCs/>
-        </w:rPr>
-        <w:t xml:space="preserve">Build and share delightful machine learning apps</w:t>
-      </w:r>
-      <w:r>
-        <w:t xml:space="preserve">. https://gradio.app</w:t>
-      </w:r>
-    </w:p>
-    <w:p>
-      <w:pPr>
-        <w:numPr>
-          <w:ilvl w:val="0"/>
-          <w:numId w:val="1023"/>
-        </w:numPr>
-        <w:jc w:val="thaiDistribute"/>
-        <w:ind w:firstLine="720"/>
-      </w:pPr>
-      <w:r>
-        <w:t xml:space="preserve">Nguyen Van, B., Nguyen, A., Tran-Trung, K., Ho Huong, T., Duong Thi Hong, H., Nguyen Trung, H., &amp; Truong Hoang, V. (2025). Water meter reading based on text recognition techniques and deep learning.</w:t>
-      </w:r>
-      <w:r>
-        <w:t xml:space="preserve"> </w:t>
-      </w:r>
-      <w:r>
-        <w:rPr>
-          <w:i/>
-          <w:iCs/>
-        </w:rPr>
-        <w:t xml:space="preserve">IEEE Access</w:t>
+        <w:pStyle w:val="Normal"/>
+        <w:spacing w:after="120" w:line="240" w:lineRule="auto"/>
+        <w:jc w:val="left"/>
+      </w:pPr>
+      <w:r>
+        <w:t xml:space="preserve">บรรณานุกรมเรียงตามลำดับอักษร ก-ฮ โดยเอกสารภาษาไทยมาก่อนภาษาอังกฤษ และแหล่งอินเทอร์เน็ตอยู่ท้ายสุด บรรทัดที่สองเป็นต้นไปเยื้องตรงอักษรตัวที่ 9</w:t>
+      </w:r>
+    </w:p>
+    <w:p>
+      <w:pPr>
+        <w:pStyle w:val="Bibliography"/>
+        <w:spacing w:after="120" w:line="240" w:lineRule="auto"/>
+        <w:jc w:val="thaiDistribute"/>
+        <w:ind w:left="720" w:hanging="360" w:firstLine="0"/>
+      </w:pPr>
+      <w:r>
+        <w:t xml:space="preserve">Liang, Y., Liao, Y., Li, S., Wu, W., Qiu, T. และ Zhang, W. (2022). Research on water meter reading recognition based on deep learning. Scientific Reports, 12, 12861. https://doi.org/10.1038/s41598-022-17255-3</w:t>
+      </w:r>
+    </w:p>
+    <w:p>
+      <w:pPr>
+        <w:pStyle w:val="Bibliography"/>
+        <w:spacing w:after="120" w:line="240" w:lineRule="auto"/>
+        <w:jc w:val="thaiDistribute"/>
+        <w:ind w:left="720" w:hanging="360" w:firstLine="0"/>
+      </w:pPr>
+      <w:r>
+        <w:t xml:space="preserve">Li, X. และคณะ. (2020). Water meter reading recognition based on computer vision and deep learning. IEEE Access.</w:t>
+      </w:r>
+    </w:p>
+    <w:p>
+      <w:pPr>
+        <w:pStyle w:val="Bibliography"/>
+        <w:spacing w:after="120" w:line="240" w:lineRule="auto"/>
+        <w:jc w:val="thaiDistribute"/>
+        <w:ind w:left="720" w:hanging="360" w:firstLine="0"/>
+      </w:pPr>
+      <w:r>
+        <w:t xml:space="preserve">Nguyen Van, B. และคณะ. (2025). Water meter reading based on text recognition techniques and deep learning. IEEE Access, 13, 41422–41434. https://doi.org/10.1109/ACCESS.2025.3547225</w:t>
+      </w:r>
+    </w:p>
+    <w:p>
+      <w:pPr>
+        <w:pStyle w:val="Bibliography"/>
+        <w:spacing w:after="120" w:line="240" w:lineRule="auto"/>
+        <w:jc w:val="thaiDistribute"/>
+        <w:ind w:left="720" w:hanging="360" w:firstLine="0"/>
+      </w:pPr>
+      <w:r>
+        <w:t xml:space="preserve">Salomon, G., Laroca, R. และ Menotti, D. (2022). Image-based automatic dial meter reading in unconstrained scenarios. Measurement, 204, 112025. https://doi.org/10.1016/j.measurement.2022.112025</w:t>
+      </w:r>
+    </w:p>
+    <w:p>
+      <w:pPr>
+        <w:pStyle w:val="Bibliography"/>
+        <w:spacing w:after="120" w:line="240" w:lineRule="auto"/>
+        <w:jc w:val="thaiDistribute"/>
+        <w:ind w:left="720" w:hanging="360" w:firstLine="0"/>
+      </w:pPr>
+      <w:r>
+        <w:t xml:space="preserve">Tschannen, M. และคณะ. (2025). SigLIP 2: Multilingual vision-language encoders with improved semantic understanding, localization, and dense features. arXiv. https://doi.org/10.48550/arXiv.2502.14786</w:t>
+      </w:r>
+    </w:p>
+    <w:p>
+      <w:pPr>
+        <w:pStyle w:val="Bibliography"/>
+        <w:spacing w:after="120" w:line="240" w:lineRule="auto"/>
+        <w:jc w:val="thaiDistribute"/>
+        <w:ind w:left="720" w:hanging="360" w:firstLine="0"/>
+      </w:pPr>
+      <w:r>
+        <w:t xml:space="preserve">Wang, Y. และ Xiang, X. (2024). GMS-YOLO: An enhanced algorithm for water meter reading recognition in complex environments. Journal of Real-Time Image Processing, 21(5), 173. https://doi.org/10.1007/s11554-024-01551-4</w:t>
+      </w:r>
+    </w:p>
+    <w:p>
+      <w:pPr>
+        <w:pStyle w:val="Bibliography"/>
+        <w:spacing w:after="120" w:line="240" w:lineRule="auto"/>
+        <w:jc w:val="thaiDistribute"/>
+        <w:ind w:left="720" w:hanging="360" w:firstLine="0"/>
+      </w:pPr>
+      <w:r>
+        <w:t xml:space="preserve">Zhai, X. และคณะ. (2023). Sigmoid loss for language image pre-training. In Proceedings of the IEEE/CVF International Conference on Computer Vision (ICCV) (pp. 11941–11952). https://arxiv.org/abs/2303.15343</w:t>
+      </w:r>
+    </w:p>
+    <w:p>
+      <w:pPr>
+        <w:pStyle w:val="Bibliography"/>
+        <w:spacing w:after="120" w:line="240" w:lineRule="auto"/>
+        <w:jc w:val="thaiDistribute"/>
+        <w:ind w:left="720" w:hanging="360" w:firstLine="0"/>
+      </w:pPr>
+      <w:r>
+        <w:t xml:space="preserve">Zou, Z., Chen, K., Shi, Z., Guo, Y. และ Ye, J. (2023). Object detection in 20 years: A survey. Proceedings of the IEEE, 111(3), 257–276. https://doi.org/10.1109/JPROC.2023.3238524</w:t>
+      </w:r>
+    </w:p>
+    <w:p>
+      <w:pPr>
+        <w:pStyle w:val="Bibliography"/>
+        <w:spacing w:after="120" w:line="240" w:lineRule="auto"/>
+        <w:jc w:val="thaiDistribute"/>
+        <w:ind w:left="720" w:hanging="360" w:firstLine="0"/>
+      </w:pPr>
+      <w:r>
+        <w:t xml:space="preserve">FastAPI. (2024). FastAPI framework, high performance, easy to learn, fast to code. (15 สิงหาคม 2567). Available URL: https://fastapi.tiangolo.com</w:t>
+      </w:r>
+    </w:p>
+    <w:p>
+      <w:pPr>
+        <w:pStyle w:val="Bibliography"/>
+        <w:spacing w:after="120" w:line="240" w:lineRule="auto"/>
+        <w:jc w:val="thaiDistribute"/>
+        <w:ind w:left="720" w:hanging="360" w:firstLine="0"/>
+      </w:pPr>
+      <w:r>
+        <w:t xml:space="preserve">Gradio. (2024). Build and share delightful machine learning apps. (15 สิงหาคม 2567). Available URL: https://gradio.app</w:t>
+      </w:r>
+    </w:p>
+    <w:p>
+      <w:pPr>
+        <w:pStyle w:val="Bibliography"/>
+        <w:spacing w:after="120" w:line="240" w:lineRule="auto"/>
+        <w:jc w:val="thaiDistribute"/>
+        <w:ind w:left="720" w:hanging="360" w:firstLine="0"/>
+      </w:pPr>
+      <w:r>
+        <w:t xml:space="preserve">Ultralytics. (2024). YOLOv8 &amp; YOLO11: Real-time object detection and image segmentation. (15 สิงหาคม 2567). Available URL: https://docs.ultralytics.com</w:t>
+      </w:r>
+    </w:p>
+    <w:p>
+      <w:pPr>
+        <w:pStyle w:val="Heading2"/>
+      </w:pPr>
+      <w:r>
+        <w:t xml:space="preserve">ภาคผนวก: มาตรการด้านความปลอดภัยและความเสถียร (Appendix: Security and Stability Measures)</w:t>
+      </w:r>
+    </w:p>
+    <w:p>
+      <w:pPr>
+        <w:pStyle w:val="FirstParagraph"/>
+        <w:jc w:val="thaiDistribute"/>
+        <w:ind w:firstLine="992"/>
+      </w:pPr>
+      <w:r>
+        <w:t xml:space="preserve">  ภาคผนวกนี้สรุปมาตรการด้านความปลอดภัยและความเสถียรที่พึงดำเนินการเมื่อนำระบบอ่านค่ามาตรวัดน้ำไปใช้งานในสภาพแวดล้อมจริง โดยมีวัตถุประสงค์เพื่อป้องกันความเสี่ยงจากการรับข้อมูลที่ไม่พึงประสงค์ รักษาความลับของระบบ และทำให้การให้บริการมีความต่อเนื่อง ตรวจสอบได้ และกู้คืนได้</w:t>
+      </w:r>
+    </w:p>
+    <w:bookmarkStart w:id="67" w:name="Xd0a0f09d98d6727a4066344ce2bf42fe46fdad0"/>
+    <w:p>
+      <w:pPr>
+        <w:pStyle w:val="Heading3"/>
+      </w:pPr>
+      <w:r>
+        <w:t xml:space="preserve">ก. มาตรการด้านความปลอดภัย (Security Measures)</w:t>
+      </w:r>
+    </w:p>
+    <w:p>
+      <w:pPr>
+        <w:pStyle w:val="FirstParagraph"/>
+        <w:jc w:val="thaiDistribute"/>
+        <w:ind w:firstLine="992"/>
+      </w:pPr>
+      <w:r>
+        <w:t xml:space="preserve">  </w:t>
+      </w:r>
+      <w:r>
+        <w:rPr>
+          <w:b/>
+          <w:bCs/>
+        </w:rPr>
+        <w:t xml:space="preserve">การตรวจสอบและกรองข้อมูลนำเข้า:</w:t>
+      </w:r>
+      <w:r>
+        <w:t xml:space="preserve"> </w:t>
+      </w:r>
+      <w:r>
+        <w:t xml:space="preserve">ระบบตรวจสอบชนิดไฟล์ตาม</w:t>
+      </w:r>
+      <w:r>
+        <w:t xml:space="preserve"> </w:t>
+      </w:r>
+      <w:r>
+        <w:rPr>
+          <w:rStyle w:val="VerbatimChar"/>
+        </w:rPr>
+        <w:t xml:space="preserve">ALLOWED_TYPES</w:t>
+      </w:r>
+      <w:r>
+        <w:t xml:space="preserve"> </w:t>
+      </w:r>
+      <w:r>
+        <w:t xml:space="preserve">(</w:t>
+      </w:r>
+      <w:r>
+        <w:rPr>
+          <w:rStyle w:val="VerbatimChar"/>
+        </w:rPr>
+        <w:t xml:space="preserve">image/jpeg</w:t>
       </w:r>
       <w:r>
         <w:t xml:space="preserve">,</w:t>
@@ -10583,36 +10632,9 @@
       </w:r>
       <w:r>
         <w:rPr>
-          <w:i/>
-          <w:iCs/>
-        </w:rPr>
-        <w:t xml:space="preserve">13</w:t>
-      </w:r>
-      <w:r>
-        <w:t xml:space="preserve">, 41422–41434. https://doi.org/10.1109/ACCESS.2025.3547225</w:t>
-      </w:r>
-    </w:p>
-    <w:p>
-      <w:pPr>
-        <w:numPr>
-          <w:ilvl w:val="0"/>
-          <w:numId w:val="1023"/>
-        </w:numPr>
-        <w:jc w:val="thaiDistribute"/>
-        <w:ind w:firstLine="720"/>
-      </w:pPr>
-      <w:r>
-        <w:t xml:space="preserve">Liang, Y., Liao, Y., Li, S., Wu, W., Qiu, T., &amp; Zhang, W. (2022). Research on water meter reading recognition based on deep learning.</w:t>
-      </w:r>
-      <w:r>
-        <w:t xml:space="preserve"> </w:t>
-      </w:r>
-      <w:r>
-        <w:rPr>
-          <w:i/>
-          <w:iCs/>
-        </w:rPr>
-        <w:t xml:space="preserve">Scientific Reports</w:t>
+          <w:rStyle w:val="VerbatimChar"/>
+        </w:rPr>
+        <w:t xml:space="preserve">image/png</w:t>
       </w:r>
       <w:r>
         <w:t xml:space="preserve">,</w:t>
@@ -10622,36 +10644,9 @@
       </w:r>
       <w:r>
         <w:rPr>
-          <w:i/>
-          <w:iCs/>
-        </w:rPr>
-        <w:t xml:space="preserve">12</w:t>
-      </w:r>
-      <w:r>
-        <w:t xml:space="preserve">, 12861. https://doi.org/10.1038/s41598-022-17255-3</w:t>
-      </w:r>
-    </w:p>
-    <w:p>
-      <w:pPr>
-        <w:numPr>
-          <w:ilvl w:val="0"/>
-          <w:numId w:val="1023"/>
-        </w:numPr>
-        <w:jc w:val="thaiDistribute"/>
-        <w:ind w:firstLine="720"/>
-      </w:pPr>
-      <w:r>
-        <w:t xml:space="preserve">Salomon, G., Laroca, R., &amp; Menotti, D. (2022). Image-based automatic dial meter reading in unconstrained scenarios.</w:t>
-      </w:r>
-      <w:r>
-        <w:t xml:space="preserve"> </w:t>
-      </w:r>
-      <w:r>
-        <w:rPr>
-          <w:i/>
-          <w:iCs/>
-        </w:rPr>
-        <w:t xml:space="preserve">Measurement</w:t>
+          <w:rStyle w:val="VerbatimChar"/>
+        </w:rPr>
+        <w:t xml:space="preserve">image/webp</w:t>
       </w:r>
       <w:r>
         <w:t xml:space="preserve">,</w:t>
@@ -10661,167 +10656,64 @@
       </w:r>
       <w:r>
         <w:rPr>
-          <w:i/>
-          <w:iCs/>
-        </w:rPr>
-        <w:t xml:space="preserve">204</w:t>
-      </w:r>
-      <w:r>
-        <w:t xml:space="preserve">, 112025. https://doi.org/10.1016/j.measurement.2022.112025</w:t>
-      </w:r>
-    </w:p>
-    <w:p>
-      <w:pPr>
-        <w:numPr>
-          <w:ilvl w:val="0"/>
-          <w:numId w:val="1023"/>
-        </w:numPr>
-        <w:jc w:val="thaiDistribute"/>
-        <w:ind w:firstLine="720"/>
-      </w:pPr>
-      <w:r>
-        <w:t xml:space="preserve">Wang, Y., &amp; Xiang, X. (2024). GMS-YOLO: An enhanced algorithm for water meter reading recognition in complex environments.</w:t>
-      </w:r>
-      <w:r>
-        <w:t xml:space="preserve"> </w:t>
-      </w:r>
-      <w:r>
-        <w:rPr>
-          <w:i/>
-          <w:iCs/>
-        </w:rPr>
-        <w:t xml:space="preserve">Journal of Real-Time Image Processing</w:t>
-      </w:r>
-      <w:r>
-        <w:t xml:space="preserve">,</w:t>
-      </w:r>
-      <w:r>
-        <w:t xml:space="preserve"> </w:t>
-      </w:r>
-      <w:r>
-        <w:rPr>
-          <w:i/>
-          <w:iCs/>
-        </w:rPr>
-        <w:t xml:space="preserve">21</w:t>
-      </w:r>
-      <w:r>
-        <w:t xml:space="preserve">(5), 173. https://doi.org/10.1007/s11554-024-01551-4</w:t>
-      </w:r>
-    </w:p>
-    <w:p>
-      <w:pPr>
-        <w:numPr>
-          <w:ilvl w:val="0"/>
-          <w:numId w:val="1023"/>
-        </w:numPr>
-        <w:jc w:val="thaiDistribute"/>
-        <w:ind w:firstLine="720"/>
-      </w:pPr>
-      <w:r>
-        <w:t xml:space="preserve">Zhai, X., Mustafa, B., Kolesnikov, A., &amp; Beyer, L. (2023). Sigmoid loss for language image pre-training. In</w:t>
-      </w:r>
-      <w:r>
-        <w:t xml:space="preserve"> </w:t>
-      </w:r>
-      <w:r>
-        <w:rPr>
-          <w:i/>
-          <w:iCs/>
-        </w:rPr>
-        <w:t xml:space="preserve">Proceedings of the IEEE/CVF International Conference on Computer Vision (ICCV)</w:t>
-      </w:r>
-      <w:r>
-        <w:t xml:space="preserve"> </w:t>
-      </w:r>
-      <w:r>
-        <w:t xml:space="preserve">(pp. 11941–11952). https://arxiv.org/abs/2303.15343</w:t>
-      </w:r>
-    </w:p>
-    <w:p>
-      <w:pPr>
-        <w:numPr>
-          <w:ilvl w:val="0"/>
-          <w:numId w:val="1023"/>
-        </w:numPr>
-        <w:jc w:val="thaiDistribute"/>
-        <w:ind w:firstLine="720"/>
-      </w:pPr>
-      <w:r>
-        <w:t xml:space="preserve">Zou, Z., Chen, K., Shi, Z., Guo, Y., &amp; Ye, J. (2023). Object detection in 20 years: A survey.</w:t>
-      </w:r>
-      <w:r>
-        <w:t xml:space="preserve"> </w:t>
-      </w:r>
-      <w:r>
-        <w:rPr>
-          <w:i/>
-          <w:iCs/>
-        </w:rPr>
-        <w:t xml:space="preserve">Proceedings of the IEEE</w:t>
-      </w:r>
-      <w:r>
-        <w:t xml:space="preserve">,</w:t>
-      </w:r>
-      <w:r>
-        <w:t xml:space="preserve"> </w:t>
-      </w:r>
-      <w:r>
-        <w:rPr>
-          <w:i/>
-          <w:iCs/>
-        </w:rPr>
-        <w:t xml:space="preserve">111</w:t>
-      </w:r>
-      <w:r>
-        <w:t xml:space="preserve">(3), 257–276. https://doi.org/10.1109/JPROC.2023.3238524</w:t>
-      </w:r>
-    </w:p>
-    <w:p>
-      <w:pPr>
-        <w:jc w:val="thaiDistribute"/>
-        <w:ind w:firstLine="720"/>
-      </w:pPr>
-      <w:r>
-        <w:pict>
-          <v:rect style="width:0;height:1.5pt" o:hralign="center" o:hrstd="t" o:hr="t"/>
-        </w:pict>
-      </w:r>
-    </w:p>
-    <w:bookmarkEnd w:id="66"/>
-    <w:bookmarkStart w:id="70" w:name="X22a27a332e537e0634807276ca2350d6fcd1c2b"/>
-    <w:p>
-      <w:pPr>
-        <w:pStyle w:val="Heading2"/>
-      </w:pPr>
-      <w:r>
-        <w:t xml:space="preserve">ภาคผนวก: มาตรการด้านความปลอดภัยและความเสถียร (Appendix: Security and Stability Measures)</w:t>
-      </w:r>
-    </w:p>
-    <w:p>
-      <w:pPr>
-        <w:pStyle w:val="FirstParagraph"/>
-        <w:jc w:val="thaiDistribute"/>
-        <w:ind w:firstLine="720"/>
-      </w:pPr>
-      <w:r>
-        <w:t xml:space="preserve">  ภาคผนวกนี้สรุปมาตรการด้านความปลอดภัยและความเสถียรที่พึงดำเนินการเมื่อนำระบบอ่านค่ามาตรวัดน้ำไปใช้งานในสภาพแวดล้อมจริง โดยมีวัตถุประสงค์เพื่อป้องกันความเสี่ยงจากการรับข้อมูลที่ไม่พึงประสงค์ รักษาความลับของระบบ และทำให้การให้บริการมีความต่อเนื่อง ตรวจสอบได้ และกู้คืนได้</w:t>
-      </w:r>
-    </w:p>
-    <w:bookmarkStart w:id="67" w:name="Xd0a0f09d98d6727a4066344ce2bf42fe46fdad0"/>
-    <w:p>
-      <w:pPr>
-        <w:pStyle w:val="Heading3"/>
-      </w:pPr>
-      <w:r>
-        <w:t xml:space="preserve">ก. มาตรการด้านความปลอดภัย (Security Measures)</w:t>
-      </w:r>
-    </w:p>
-    <w:p>
-      <w:pPr>
-        <w:pStyle w:val="FirstParagraph"/>
-        <w:jc w:val="thaiDistribute"/>
-        <w:ind w:firstLine="720"/>
+          <w:rStyle w:val="VerbatimChar"/>
+        </w:rPr>
+        <w:t xml:space="preserve">image/bmp</w:t>
+      </w:r>
+      <w:r>
+        <w:t xml:space="preserve">) และปฏิเสธด้วยรหัส</w:t>
+      </w:r>
+      <w:r>
+        <w:t xml:space="preserve"> </w:t>
+      </w:r>
+      <w:r>
+        <w:rPr>
+          <w:rStyle w:val="VerbatimChar"/>
+        </w:rPr>
+        <w:t xml:space="preserve">415</w:t>
+      </w:r>
+      <w:r>
+        <w:t xml:space="preserve"> </w:t>
+      </w:r>
+      <w:r>
+        <w:t xml:space="preserve">หากไม่ตรงตามที่กำหนด พร้อมทั้งตรวจสอบความสามารถในการเปิดไฟล์ด้วย</w:t>
+      </w:r>
+      <w:r>
+        <w:t xml:space="preserve"> </w:t>
+      </w:r>
+      <w:r>
+        <w:rPr>
+          <w:rStyle w:val="VerbatimChar"/>
+        </w:rPr>
+        <w:t xml:space="preserve">PIL</w:t>
+      </w:r>
+      <w:r>
+        <w:t xml:space="preserve"> </w:t>
+      </w:r>
+      <w:r>
+        <w:t xml:space="preserve">และปฏิเสธด้วยรหัส</w:t>
+      </w:r>
+      <w:r>
+        <w:t xml:space="preserve"> </w:t>
+      </w:r>
+      <w:r>
+        <w:rPr>
+          <w:rStyle w:val="VerbatimChar"/>
+        </w:rPr>
+        <w:t xml:space="preserve">422</w:t>
+      </w:r>
+      <w:r>
+        <w:t xml:space="preserve"> </w:t>
+      </w:r>
+      <w:r>
+        <w:t xml:space="preserve">หากอ่านไม่ได้ นอกจากนี้ ควรจำกัดขนาดไฟล์ (เช่น ไม่เกิน 10 MB) และความละเอียดสูงสุดเพื่อป้องกันการโจมตีด้วยไฟล์ขนาดใหญ่</w:t>
+      </w:r>
+    </w:p>
+    <w:p>
+      <w:pPr>
+        <w:pStyle w:val="BodyText"/>
+        <w:jc w:val="thaiDistribute"/>
+        <w:ind w:firstLine="992"/>
       </w:pPr>
       <w:r>
         <w:t xml:space="preserve">  </w:t>
@@ -10831,125 +10723,20 @@
           <w:b/>
           <w:bCs/>
         </w:rPr>
-        <w:t xml:space="preserve">การตรวจสอบและกรองข้อมูลนำเข้า:</w:t>
-      </w:r>
-      <w:r>
-        <w:t xml:space="preserve"> </w:t>
-      </w:r>
-      <w:r>
-        <w:t xml:space="preserve">ระบบตรวจสอบชนิดไฟล์ตาม</w:t>
-      </w:r>
-      <w:r>
-        <w:t xml:space="preserve"> </w:t>
-      </w:r>
-      <w:r>
-        <w:rPr>
-          <w:rStyle w:val="VerbatimChar"/>
-        </w:rPr>
-        <w:t xml:space="preserve">ALLOWED_TYPES</w:t>
-      </w:r>
-      <w:r>
-        <w:t xml:space="preserve"> </w:t>
-      </w:r>
-      <w:r>
-        <w:t xml:space="preserve">(</w:t>
-      </w:r>
-      <w:r>
-        <w:rPr>
-          <w:rStyle w:val="VerbatimChar"/>
-        </w:rPr>
-        <w:t xml:space="preserve">image/jpeg</w:t>
-      </w:r>
-      <w:r>
-        <w:t xml:space="preserve">,</w:t>
-      </w:r>
-      <w:r>
-        <w:t xml:space="preserve"> </w:t>
-      </w:r>
-      <w:r>
-        <w:rPr>
-          <w:rStyle w:val="VerbatimChar"/>
-        </w:rPr>
-        <w:t xml:space="preserve">image/png</w:t>
-      </w:r>
-      <w:r>
-        <w:t xml:space="preserve">,</w:t>
-      </w:r>
-      <w:r>
-        <w:t xml:space="preserve"> </w:t>
-      </w:r>
-      <w:r>
-        <w:rPr>
-          <w:rStyle w:val="VerbatimChar"/>
-        </w:rPr>
-        <w:t xml:space="preserve">image/webp</w:t>
-      </w:r>
-      <w:r>
-        <w:t xml:space="preserve">,</w:t>
-      </w:r>
-      <w:r>
-        <w:t xml:space="preserve"> </w:t>
-      </w:r>
-      <w:r>
-        <w:rPr>
-          <w:rStyle w:val="VerbatimChar"/>
-        </w:rPr>
-        <w:t xml:space="preserve">image/bmp</w:t>
-      </w:r>
-      <w:r>
-        <w:t xml:space="preserve">) และปฏิเสธด้วยรหัส</w:t>
-      </w:r>
-      <w:r>
-        <w:t xml:space="preserve"> </w:t>
-      </w:r>
-      <w:r>
-        <w:rPr>
-          <w:rStyle w:val="VerbatimChar"/>
-        </w:rPr>
-        <w:t xml:space="preserve">415</w:t>
-      </w:r>
-      <w:r>
-        <w:t xml:space="preserve"> </w:t>
-      </w:r>
-      <w:r>
-        <w:t xml:space="preserve">หากไม่ตรงตามที่กำหนด พร้อมทั้งตรวจสอบความสามารถในการเปิดไฟล์ด้วย</w:t>
-      </w:r>
-      <w:r>
-        <w:t xml:space="preserve"> </w:t>
-      </w:r>
-      <w:r>
-        <w:rPr>
-          <w:rStyle w:val="VerbatimChar"/>
-        </w:rPr>
-        <w:t xml:space="preserve">PIL</w:t>
-      </w:r>
-      <w:r>
-        <w:t xml:space="preserve"> </w:t>
-      </w:r>
-      <w:r>
-        <w:t xml:space="preserve">และปฏิเสธด้วยรหัส</w:t>
-      </w:r>
-      <w:r>
-        <w:t xml:space="preserve"> </w:t>
-      </w:r>
-      <w:r>
-        <w:rPr>
-          <w:rStyle w:val="VerbatimChar"/>
-        </w:rPr>
-        <w:t xml:space="preserve">422</w:t>
-      </w:r>
-      <w:r>
-        <w:t xml:space="preserve"> </w:t>
-      </w:r>
-      <w:r>
-        <w:t xml:space="preserve">หากอ่านไม่ได้ นอกจากนี้ ควรจำกัดขนาดไฟล์ (เช่น ไม่เกิน 10 MB) และความละเอียดสูงสุดเพื่อป้องกันการโจมตีด้วยไฟล์ขนาดใหญ่</w:t>
+        <w:t xml:space="preserve">การควบคุมการเข้าถึงและการจำกัดอัตรา:</w:t>
+      </w:r>
+      <w:r>
+        <w:t xml:space="preserve"> </w:t>
+      </w:r>
+      <w:r>
+        <w:t xml:space="preserve">สำหรับการใช้งานจริง พึงกำหนดการยืนยันตัวตนด้วย API Key หรือ JWT และใช้กลไกจำกัดอัตราการเรียก (Rate Limiting) เพื่อป้องกันการใช้งานเกินควร รวมถึงการบันทึกประวัติการเข้าถึง</w:t>
       </w:r>
     </w:p>
     <w:p>
       <w:pPr>
         <w:pStyle w:val="BodyText"/>
         <w:jc w:val="thaiDistribute"/>
-        <w:ind w:firstLine="720"/>
+        <w:ind w:firstLine="992"/>
       </w:pPr>
       <w:r>
         <w:t xml:space="preserve">  </w:t>
@@ -10959,20 +10746,65 @@
           <w:b/>
           <w:bCs/>
         </w:rPr>
-        <w:t xml:space="preserve">การควบคุมการเข้าถึงและการจำกัดอัตรา:</w:t>
-      </w:r>
-      <w:r>
-        <w:t xml:space="preserve"> </w:t>
-      </w:r>
-      <w:r>
-        <w:t xml:space="preserve">สำหรับการใช้งานจริง พึงกำหนดการยืนยันตัวตนด้วย API Key หรือ JWT และใช้กลไกจำกัดอัตราการเรียก (Rate Limiting) เพื่อป้องกันการใช้งานเกินควร รวมถึงการบันทึกประวัติการเข้าถึง</w:t>
+        <w:t xml:space="preserve">การจัดการความลับ:</w:t>
+      </w:r>
+      <w:r>
+        <w:t xml:space="preserve"> </w:t>
+      </w:r>
+      <w:r>
+        <w:t xml:space="preserve">ค่า</w:t>
+      </w:r>
+      <w:r>
+        <w:t xml:space="preserve"> </w:t>
+      </w:r>
+      <w:r>
+        <w:rPr>
+          <w:rStyle w:val="VerbatimChar"/>
+        </w:rPr>
+        <w:t xml:space="preserve">ROBOFLOW_API_KEY</w:t>
+      </w:r>
+      <w:r>
+        <w:t xml:space="preserve"> </w:t>
+      </w:r>
+      <w:r>
+        <w:t xml:space="preserve">และข้อมูลสำคัญอื่น ๆ มิควรฝังในรหัสต้นฉบับหรือ commit ขึ้น Git สาธารณะ พึงจัดเก็บในตัวแปรสภาพแวดล้อมหรือ</w:t>
+      </w:r>
+      <w:r>
+        <w:t xml:space="preserve"> </w:t>
+      </w:r>
+      <w:r>
+        <w:rPr>
+          <w:rStyle w:val="VerbatimChar"/>
+        </w:rPr>
+        <w:t xml:space="preserve">Secrets</w:t>
+      </w:r>
+      <w:r>
+        <w:t xml:space="preserve"> </w:t>
+      </w:r>
+      <w:r>
+        <w:t xml:space="preserve">ของ Colab/Kaggle และเรียกใช้ผ่าน</w:t>
+      </w:r>
+      <w:r>
+        <w:t xml:space="preserve"> </w:t>
+      </w:r>
+      <w:r>
+        <w:rPr>
+          <w:rStyle w:val="VerbatimChar"/>
+        </w:rPr>
+        <w:t xml:space="preserve">userdata.get()</w:t>
+      </w:r>
+      <w:r>
+        <w:t xml:space="preserve"> </w:t>
+      </w:r>
+      <w:r>
+        <w:t xml:space="preserve">ตามที่ระบุในหัวข้อ 1.2.1</w:t>
       </w:r>
     </w:p>
     <w:p>
       <w:pPr>
         <w:pStyle w:val="BodyText"/>
         <w:jc w:val="thaiDistribute"/>
-        <w:ind w:firstLine="720"/>
+        <w:ind w:firstLine="992"/>
       </w:pPr>
       <w:r>
         <w:t xml:space="preserve">  </w:t>
@@ -10982,88 +10814,20 @@
           <w:b/>
           <w:bCs/>
         </w:rPr>
-        <w:t xml:space="preserve">การจัดการความลับ:</w:t>
-      </w:r>
-      <w:r>
-        <w:t xml:space="preserve"> </w:t>
-      </w:r>
-      <w:r>
-        <w:t xml:space="preserve">ค่า</w:t>
-      </w:r>
-      <w:r>
-        <w:t xml:space="preserve"> </w:t>
-      </w:r>
-      <w:r>
-        <w:rPr>
-          <w:rStyle w:val="VerbatimChar"/>
-        </w:rPr>
-        <w:t xml:space="preserve">ROBOFLOW_API_KEY</w:t>
-      </w:r>
-      <w:r>
-        <w:t xml:space="preserve"> </w:t>
-      </w:r>
-      <w:r>
-        <w:t xml:space="preserve">และข้อมูลสำคัญอื่น ๆ มิควรฝังในรหัสต้นฉบับหรือ commit ขึ้น Git สาธารณะ พึงจัดเก็บในตัวแปรสภาพแวดล้อมหรือ</w:t>
-      </w:r>
-      <w:r>
-        <w:t xml:space="preserve"> </w:t>
-      </w:r>
-      <w:r>
-        <w:rPr>
-          <w:rStyle w:val="VerbatimChar"/>
-        </w:rPr>
-        <w:t xml:space="preserve">Secrets</w:t>
-      </w:r>
-      <w:r>
-        <w:t xml:space="preserve"> </w:t>
-      </w:r>
-      <w:r>
-        <w:t xml:space="preserve">ของ Colab/Kaggle และเรียกใช้ผ่าน</w:t>
-      </w:r>
-      <w:r>
-        <w:t xml:space="preserve"> </w:t>
-      </w:r>
-      <w:r>
-        <w:rPr>
-          <w:rStyle w:val="VerbatimChar"/>
-        </w:rPr>
-        <w:t xml:space="preserve">userdata.get()</w:t>
-      </w:r>
-      <w:r>
-        <w:t xml:space="preserve"> </w:t>
-      </w:r>
-      <w:r>
-        <w:t xml:space="preserve">ตามที่ระบุในหัวข้อ 1.2.1</w:t>
+        <w:t xml:space="preserve">การคุ้มครองข้อมูลส่วนบุคคล (PDPA):</w:t>
+      </w:r>
+      <w:r>
+        <w:t xml:space="preserve"> </w:t>
+      </w:r>
+      <w:r>
+        <w:t xml:space="preserve">ภาพมาตรวัดน้ำอาจติดข้อมูลระบุตัวตนของครัวเรือน พึงกำหนดนโยบายลบภาพชั่วคราวทันทีหลังประมวลผลเสร็จสิ้น จำกัดการเก็บ log ที่มีภาพ และเข้ารหัสการสื่อสารผ่าน HTTPS</w:t>
       </w:r>
     </w:p>
     <w:p>
       <w:pPr>
         <w:pStyle w:val="BodyText"/>
         <w:jc w:val="thaiDistribute"/>
-        <w:ind w:firstLine="720"/>
-      </w:pPr>
-      <w:r>
-        <w:t xml:space="preserve">  </w:t>
-      </w:r>
-      <w:r>
-        <w:rPr>
-          <w:b/>
-          <w:bCs/>
-        </w:rPr>
-        <w:t xml:space="preserve">การคุ้มครองข้อมูลส่วนบุคคล (PDPA):</w:t>
-      </w:r>
-      <w:r>
-        <w:t xml:space="preserve"> </w:t>
-      </w:r>
-      <w:r>
-        <w:t xml:space="preserve">ภาพมาตรวัดน้ำอาจติดข้อมูลระบุตัวตนของครัวเรือน พึงกำหนดนโยบายลบภาพชั่วคราวทันทีหลังประมวลผลเสร็จสิ้น จำกัดการเก็บ log ที่มีภาพ และเข้ารหัสการสื่อสารผ่าน HTTPS</w:t>
-      </w:r>
-    </w:p>
-    <w:p>
-      <w:pPr>
-        <w:pStyle w:val="BodyText"/>
-        <w:jc w:val="thaiDistribute"/>
-        <w:ind w:firstLine="720"/>
+        <w:ind w:firstLine="992"/>
       </w:pPr>
       <w:r>
         <w:t xml:space="preserve">  </w:t>
@@ -11186,7 +10950,7 @@
       <w:pPr>
         <w:pStyle w:val="FirstParagraph"/>
         <w:jc w:val="thaiDistribute"/>
-        <w:ind w:firstLine="720"/>
+        <w:ind w:firstLine="992"/>
       </w:pPr>
       <w:r>
         <w:t xml:space="preserve">  </w:t>
@@ -11293,7 +11057,7 @@
       <w:pPr>
         <w:pStyle w:val="BodyText"/>
         <w:jc w:val="thaiDistribute"/>
-        <w:ind w:firstLine="720"/>
+        <w:ind w:firstLine="992"/>
       </w:pPr>
       <w:r>
         <w:t xml:space="preserve">  </w:t>
@@ -11394,7 +11158,7 @@
       <w:pPr>
         <w:pStyle w:val="BodyText"/>
         <w:jc w:val="thaiDistribute"/>
-        <w:ind w:firstLine="720"/>
+        <w:ind w:firstLine="992"/>
       </w:pPr>
       <w:r>
         <w:t xml:space="preserve">  </w:t>
@@ -11474,7 +11238,7 @@
       <w:pPr>
         <w:pStyle w:val="BodyText"/>
         <w:jc w:val="thaiDistribute"/>
-        <w:ind w:firstLine="720"/>
+        <w:ind w:firstLine="992"/>
       </w:pPr>
       <w:r>
         <w:t xml:space="preserve">  </w:t>
@@ -11542,7 +11306,7 @@
       <w:pPr>
         <w:pStyle w:val="BodyText"/>
         <w:jc w:val="thaiDistribute"/>
-        <w:ind w:firstLine="720"/>
+        <w:ind w:firstLine="992"/>
       </w:pPr>
       <w:r>
         <w:t xml:space="preserve">  </w:t>
@@ -11901,7 +11665,7 @@
       <w:pPr>
         <w:pStyle w:val="BodyText"/>
         <w:jc w:val="thaiDistribute"/>
-        <w:ind w:firstLine="720"/>
+        <w:ind w:firstLine="992"/>
       </w:pPr>
       <w:r>
         <w:t xml:space="preserve">  การดำเนินการตามมาตรการข้างต้นอย่างครบถ้วนจะช่วยให้ระบบสามารถให้บริการได้อย่างปลอดภัย มีเสถียรภาพ และตรวจสอบได้ในสภาพแวดล้อมการใช้งานจริง</w:t>
@@ -11921,7 +11685,7 @@
       <w:pPr>
         <w:pStyle w:val="FirstParagraph"/>
         <w:jc w:val="thaiDistribute"/>
-        <w:ind w:firstLine="720"/>
+        <w:ind w:firstLine="992"/>
       </w:pPr>
       <w:r>
         <w:t xml:space="preserve">  โครงสร้างไฟล์ที่ปรากฏและได้รับการสอนในคู่มือฉบับนี้ ประกอบด้วยเฉพาะไฟล์หลักที่จำเป็นต่อการเรียนรู้และการใช้งานระบบ:</w:t>
@@ -15329,7 +15093,7 @@
     </w:rPr>
     <w:pPr>
       <w:jc w:val="thaiDistribute"/>
-      <w:ind w:firstLine="720"/>
+      <w:ind w:firstLine="992"/>
     </w:pPr>
   </w:style>
   <w:style w:styleId="Heading1" w:type="paragraph">
@@ -15351,8 +15115,8 @@
       <w:b/>
       <w:bCs/>
       <w:color w:themeColor="text1" w:val="000000"/>
-      <w:sz w:val="40"/>
-      <w:szCs w:val="40"/>
+      <w:sz w:val="36"/>
+      <w:szCs w:val="36"/>
     </w:rPr>
   </w:style>
   <w:style w:styleId="Heading2" w:type="paragraph">
@@ -15786,7 +15550,7 @@
     <w:qFormat/>
     <w:rsid w:val="009A4447"/>
     <w:pPr>
-      <w:ind w:left="720" w:firstLine="720"/>
+      <w:ind w:left="720" w:firstLine="992"/>
       <w:contextualSpacing/>
       <w:jc w:val="thaiDistribute"/>
     </w:pPr>

</xml_diff>